<commit_message>
Version 1.0.0, the first public release
The public version starts at 1.0.0. The change log keeps the private builds under "Before the public release".
</commit_message>
<xml_diff>
--- a/docs/UnmanagedLayerScanner - Technical Reference.docx
+++ b/docs/UnmanagedLayerScanner - Technical Reference.docx
@@ -38,7 +38,7 @@
           <w:noProof/>
         </w:rPr>
         <w:drawing>
-          <wp:inline distT="0" distB="0" distL="0" distR="0" wp14:anchorId="2E1851B0" wp14:editId="76028A27">
+          <wp:inline distT="0" distB="0" distL="0" distR="0" wp14:anchorId="0ED6EA14" wp14:editId="65DEC8F8">
             <wp:extent cx="5943600" cy="4229100"/>
             <wp:effectExtent l="0" t="0" r="0" b="0"/>
             <wp:docPr id="19" name="results.png" descr="The results of a scan" title="The results of a scan"/>
@@ -85,7 +85,7 @@
         <w:rPr>
           <w:color w:val="616161"/>
         </w:rPr>
-        <w:t>Version 6.3.0  ·  2026-10-15</w:t>
+        <w:t>Version 1.0.0  ·  2026-10-15</w:t>
       </w:r>
     </w:p>
     <w:p>
@@ -135,7 +135,7 @@
     <w:sdt>
       <w:sdtPr>
         <w:alias w:val="Contents"/>
-        <w:id w:val="492538807"/>
+        <w:id w:val="-1795438612"/>
       </w:sdtPr>
       <w:sdtEndPr/>
       <w:sdtContent>
@@ -164,7 +164,7 @@
           <w:r>
             <w:fldChar w:fldCharType="separate"/>
           </w:r>
-          <w:hyperlink w:anchor="_Toc242951913" w:history="1">
+          <w:hyperlink w:anchor="_Toc242970840" w:history="1">
             <w:r>
               <w:rPr>
                 <w:rStyle w:val="Hyperlink"/>
@@ -188,7 +188,7 @@
               <w:rPr>
                 <w:noProof/>
               </w:rPr>
-              <w:instrText xml:space="preserve"> PAGEREF _Toc242951913 \h </w:instrText>
+              <w:instrText xml:space="preserve"> PAGEREF _Toc242970840 \h </w:instrText>
             </w:r>
             <w:r>
               <w:rPr>
@@ -231,7 +231,7 @@
               <w14:ligatures w14:val="standardContextual"/>
             </w:rPr>
           </w:pPr>
-          <w:hyperlink w:anchor="_Toc242951914" w:history="1">
+          <w:hyperlink w:anchor="_Toc242970841" w:history="1">
             <w:r>
               <w:rPr>
                 <w:rStyle w:val="Hyperlink"/>
@@ -255,7 +255,7 @@
               <w:rPr>
                 <w:noProof/>
               </w:rPr>
-              <w:instrText xml:space="preserve"> PAGEREF _Toc242951914 \h </w:instrText>
+              <w:instrText xml:space="preserve"> PAGEREF _Toc242970841 \h </w:instrText>
             </w:r>
             <w:r>
               <w:rPr>
@@ -298,7 +298,7 @@
               <w14:ligatures w14:val="standardContextual"/>
             </w:rPr>
           </w:pPr>
-          <w:hyperlink w:anchor="_Toc242951915" w:history="1">
+          <w:hyperlink w:anchor="_Toc242970842" w:history="1">
             <w:r>
               <w:rPr>
                 <w:rStyle w:val="Hyperlink"/>
@@ -322,7 +322,7 @@
               <w:rPr>
                 <w:noProof/>
               </w:rPr>
-              <w:instrText xml:space="preserve"> PAGEREF _Toc242951915 \h </w:instrText>
+              <w:instrText xml:space="preserve"> PAGEREF _Toc242970842 \h </w:instrText>
             </w:r>
             <w:r>
               <w:rPr>
@@ -365,7 +365,7 @@
               <w14:ligatures w14:val="standardContextual"/>
             </w:rPr>
           </w:pPr>
-          <w:hyperlink w:anchor="_Toc242951916" w:history="1">
+          <w:hyperlink w:anchor="_Toc242970843" w:history="1">
             <w:r>
               <w:rPr>
                 <w:rStyle w:val="Hyperlink"/>
@@ -389,7 +389,7 @@
               <w:rPr>
                 <w:noProof/>
               </w:rPr>
-              <w:instrText xml:space="preserve"> PAGEREF _Toc242951916 \h </w:instrText>
+              <w:instrText xml:space="preserve"> PAGEREF _Toc242970843 \h </w:instrText>
             </w:r>
             <w:r>
               <w:rPr>
@@ -432,7 +432,7 @@
               <w14:ligatures w14:val="standardContextual"/>
             </w:rPr>
           </w:pPr>
-          <w:hyperlink w:anchor="_Toc242951917" w:history="1">
+          <w:hyperlink w:anchor="_Toc242970844" w:history="1">
             <w:r>
               <w:rPr>
                 <w:rStyle w:val="Hyperlink"/>
@@ -456,7 +456,7 @@
               <w:rPr>
                 <w:noProof/>
               </w:rPr>
-              <w:instrText xml:space="preserve"> PAGEREF _Toc242951917 \h </w:instrText>
+              <w:instrText xml:space="preserve"> PAGEREF _Toc242970844 \h </w:instrText>
             </w:r>
             <w:r>
               <w:rPr>
@@ -499,7 +499,7 @@
               <w14:ligatures w14:val="standardContextual"/>
             </w:rPr>
           </w:pPr>
-          <w:hyperlink w:anchor="_Toc242951918" w:history="1">
+          <w:hyperlink w:anchor="_Toc242970845" w:history="1">
             <w:r>
               <w:rPr>
                 <w:rStyle w:val="Hyperlink"/>
@@ -523,7 +523,7 @@
               <w:rPr>
                 <w:noProof/>
               </w:rPr>
-              <w:instrText xml:space="preserve"> PAGEREF _Toc242951918 \h </w:instrText>
+              <w:instrText xml:space="preserve"> PAGEREF _Toc242970845 \h </w:instrText>
             </w:r>
             <w:r>
               <w:rPr>
@@ -566,7 +566,7 @@
               <w14:ligatures w14:val="standardContextual"/>
             </w:rPr>
           </w:pPr>
-          <w:hyperlink w:anchor="_Toc242951919" w:history="1">
+          <w:hyperlink w:anchor="_Toc242970846" w:history="1">
             <w:r>
               <w:rPr>
                 <w:rStyle w:val="Hyperlink"/>
@@ -590,7 +590,7 @@
               <w:rPr>
                 <w:noProof/>
               </w:rPr>
-              <w:instrText xml:space="preserve"> PAGEREF _Toc242951919 \h </w:instrText>
+              <w:instrText xml:space="preserve"> PAGEREF _Toc242970846 \h </w:instrText>
             </w:r>
             <w:r>
               <w:rPr>
@@ -633,7 +633,7 @@
               <w14:ligatures w14:val="standardContextual"/>
             </w:rPr>
           </w:pPr>
-          <w:hyperlink w:anchor="_Toc242951920" w:history="1">
+          <w:hyperlink w:anchor="_Toc242970847" w:history="1">
             <w:r>
               <w:rPr>
                 <w:rStyle w:val="Hyperlink"/>
@@ -657,7 +657,7 @@
               <w:rPr>
                 <w:noProof/>
               </w:rPr>
-              <w:instrText xml:space="preserve"> PAGEREF _Toc242951920 \h </w:instrText>
+              <w:instrText xml:space="preserve"> PAGEREF _Toc242970847 \h </w:instrText>
             </w:r>
             <w:r>
               <w:rPr>
@@ -700,7 +700,7 @@
               <w14:ligatures w14:val="standardContextual"/>
             </w:rPr>
           </w:pPr>
-          <w:hyperlink w:anchor="_Toc242951921" w:history="1">
+          <w:hyperlink w:anchor="_Toc242970848" w:history="1">
             <w:r>
               <w:rPr>
                 <w:rStyle w:val="Hyperlink"/>
@@ -724,7 +724,7 @@
               <w:rPr>
                 <w:noProof/>
               </w:rPr>
-              <w:instrText xml:space="preserve"> PAGEREF _Toc242951921 \h </w:instrText>
+              <w:instrText xml:space="preserve"> PAGEREF _Toc242970848 \h </w:instrText>
             </w:r>
             <w:r>
               <w:rPr>
@@ -767,7 +767,7 @@
               <w14:ligatures w14:val="standardContextual"/>
             </w:rPr>
           </w:pPr>
-          <w:hyperlink w:anchor="_Toc242951922" w:history="1">
+          <w:hyperlink w:anchor="_Toc242970849" w:history="1">
             <w:r>
               <w:rPr>
                 <w:rStyle w:val="Hyperlink"/>
@@ -791,7 +791,7 @@
               <w:rPr>
                 <w:noProof/>
               </w:rPr>
-              <w:instrText xml:space="preserve"> PAGEREF _Toc242951922 \h </w:instrText>
+              <w:instrText xml:space="preserve"> PAGEREF _Toc242970849 \h </w:instrText>
             </w:r>
             <w:r>
               <w:rPr>
@@ -834,7 +834,7 @@
               <w14:ligatures w14:val="standardContextual"/>
             </w:rPr>
           </w:pPr>
-          <w:hyperlink w:anchor="_Toc242951923" w:history="1">
+          <w:hyperlink w:anchor="_Toc242970850" w:history="1">
             <w:r>
               <w:rPr>
                 <w:rStyle w:val="Hyperlink"/>
@@ -858,7 +858,7 @@
               <w:rPr>
                 <w:noProof/>
               </w:rPr>
-              <w:instrText xml:space="preserve"> PAGEREF _Toc242951923 \h </w:instrText>
+              <w:instrText xml:space="preserve"> PAGEREF _Toc242970850 \h </w:instrText>
             </w:r>
             <w:r>
               <w:rPr>
@@ -901,7 +901,7 @@
               <w14:ligatures w14:val="standardContextual"/>
             </w:rPr>
           </w:pPr>
-          <w:hyperlink w:anchor="_Toc242951924" w:history="1">
+          <w:hyperlink w:anchor="_Toc242970851" w:history="1">
             <w:r>
               <w:rPr>
                 <w:rStyle w:val="Hyperlink"/>
@@ -925,7 +925,7 @@
               <w:rPr>
                 <w:noProof/>
               </w:rPr>
-              <w:instrText xml:space="preserve"> PAGEREF _Toc242951924 \h </w:instrText>
+              <w:instrText xml:space="preserve"> PAGEREF _Toc242970851 \h </w:instrText>
             </w:r>
             <w:r>
               <w:rPr>
@@ -968,7 +968,7 @@
               <w14:ligatures w14:val="standardContextual"/>
             </w:rPr>
           </w:pPr>
-          <w:hyperlink w:anchor="_Toc242951925" w:history="1">
+          <w:hyperlink w:anchor="_Toc242970852" w:history="1">
             <w:r>
               <w:rPr>
                 <w:rStyle w:val="Hyperlink"/>
@@ -992,7 +992,7 @@
               <w:rPr>
                 <w:noProof/>
               </w:rPr>
-              <w:instrText xml:space="preserve"> PAGEREF _Toc242951925 \h </w:instrText>
+              <w:instrText xml:space="preserve"> PAGEREF _Toc242970852 \h </w:instrText>
             </w:r>
             <w:r>
               <w:rPr>
@@ -1035,7 +1035,7 @@
               <w14:ligatures w14:val="standardContextual"/>
             </w:rPr>
           </w:pPr>
-          <w:hyperlink w:anchor="_Toc242951926" w:history="1">
+          <w:hyperlink w:anchor="_Toc242970853" w:history="1">
             <w:r>
               <w:rPr>
                 <w:rStyle w:val="Hyperlink"/>
@@ -1059,7 +1059,7 @@
               <w:rPr>
                 <w:noProof/>
               </w:rPr>
-              <w:instrText xml:space="preserve"> PAGEREF _Toc242951926 \h </w:instrText>
+              <w:instrText xml:space="preserve"> PAGEREF _Toc242970853 \h </w:instrText>
             </w:r>
             <w:r>
               <w:rPr>
@@ -1102,7 +1102,7 @@
               <w14:ligatures w14:val="standardContextual"/>
             </w:rPr>
           </w:pPr>
-          <w:hyperlink w:anchor="_Toc242951927" w:history="1">
+          <w:hyperlink w:anchor="_Toc242970854" w:history="1">
             <w:r>
               <w:rPr>
                 <w:rStyle w:val="Hyperlink"/>
@@ -1126,7 +1126,7 @@
               <w:rPr>
                 <w:noProof/>
               </w:rPr>
-              <w:instrText xml:space="preserve"> PAGEREF _Toc242951927 \h </w:instrText>
+              <w:instrText xml:space="preserve"> PAGEREF _Toc242970854 \h </w:instrText>
             </w:r>
             <w:r>
               <w:rPr>
@@ -1169,7 +1169,7 @@
               <w14:ligatures w14:val="standardContextual"/>
             </w:rPr>
           </w:pPr>
-          <w:hyperlink w:anchor="_Toc242951928" w:history="1">
+          <w:hyperlink w:anchor="_Toc242970855" w:history="1">
             <w:r>
               <w:rPr>
                 <w:rStyle w:val="Hyperlink"/>
@@ -1193,7 +1193,7 @@
               <w:rPr>
                 <w:noProof/>
               </w:rPr>
-              <w:instrText xml:space="preserve"> PAGEREF _Toc242951928 \h </w:instrText>
+              <w:instrText xml:space="preserve"> PAGEREF _Toc242970855 \h </w:instrText>
             </w:r>
             <w:r>
               <w:rPr>
@@ -1236,7 +1236,7 @@
               <w14:ligatures w14:val="standardContextual"/>
             </w:rPr>
           </w:pPr>
-          <w:hyperlink w:anchor="_Toc242951929" w:history="1">
+          <w:hyperlink w:anchor="_Toc242970856" w:history="1">
             <w:r>
               <w:rPr>
                 <w:rStyle w:val="Hyperlink"/>
@@ -1260,7 +1260,7 @@
               <w:rPr>
                 <w:noProof/>
               </w:rPr>
-              <w:instrText xml:space="preserve"> PAGEREF _Toc242951929 \h </w:instrText>
+              <w:instrText xml:space="preserve"> PAGEREF _Toc242970856 \h </w:instrText>
             </w:r>
             <w:r>
               <w:rPr>
@@ -1303,7 +1303,7 @@
               <w14:ligatures w14:val="standardContextual"/>
             </w:rPr>
           </w:pPr>
-          <w:hyperlink w:anchor="_Toc242951930" w:history="1">
+          <w:hyperlink w:anchor="_Toc242970857" w:history="1">
             <w:r>
               <w:rPr>
                 <w:rStyle w:val="Hyperlink"/>
@@ -1327,7 +1327,7 @@
               <w:rPr>
                 <w:noProof/>
               </w:rPr>
-              <w:instrText xml:space="preserve"> PAGEREF _Toc242951930 \h </w:instrText>
+              <w:instrText xml:space="preserve"> PAGEREF _Toc242970857 \h </w:instrText>
             </w:r>
             <w:r>
               <w:rPr>
@@ -1370,7 +1370,7 @@
               <w14:ligatures w14:val="standardContextual"/>
             </w:rPr>
           </w:pPr>
-          <w:hyperlink w:anchor="_Toc242951931" w:history="1">
+          <w:hyperlink w:anchor="_Toc242970858" w:history="1">
             <w:r>
               <w:rPr>
                 <w:rStyle w:val="Hyperlink"/>
@@ -1394,7 +1394,7 @@
               <w:rPr>
                 <w:noProof/>
               </w:rPr>
-              <w:instrText xml:space="preserve"> PAGEREF _Toc242951931 \h </w:instrText>
+              <w:instrText xml:space="preserve"> PAGEREF _Toc242970858 \h </w:instrText>
             </w:r>
             <w:r>
               <w:rPr>
@@ -1437,7 +1437,7 @@
               <w14:ligatures w14:val="standardContextual"/>
             </w:rPr>
           </w:pPr>
-          <w:hyperlink w:anchor="_Toc242951932" w:history="1">
+          <w:hyperlink w:anchor="_Toc242970859" w:history="1">
             <w:r>
               <w:rPr>
                 <w:rStyle w:val="Hyperlink"/>
@@ -1461,7 +1461,7 @@
               <w:rPr>
                 <w:noProof/>
               </w:rPr>
-              <w:instrText xml:space="preserve"> PAGEREF _Toc242951932 \h </w:instrText>
+              <w:instrText xml:space="preserve"> PAGEREF _Toc242970859 \h </w:instrText>
             </w:r>
             <w:r>
               <w:rPr>
@@ -1504,7 +1504,7 @@
               <w14:ligatures w14:val="standardContextual"/>
             </w:rPr>
           </w:pPr>
-          <w:hyperlink w:anchor="_Toc242951933" w:history="1">
+          <w:hyperlink w:anchor="_Toc242970860" w:history="1">
             <w:r>
               <w:rPr>
                 <w:rStyle w:val="Hyperlink"/>
@@ -1528,7 +1528,7 @@
               <w:rPr>
                 <w:noProof/>
               </w:rPr>
-              <w:instrText xml:space="preserve"> PAGEREF _Toc242951933 \h </w:instrText>
+              <w:instrText xml:space="preserve"> PAGEREF _Toc242970860 \h </w:instrText>
             </w:r>
             <w:r>
               <w:rPr>
@@ -1571,7 +1571,7 @@
               <w14:ligatures w14:val="standardContextual"/>
             </w:rPr>
           </w:pPr>
-          <w:hyperlink w:anchor="_Toc242951934" w:history="1">
+          <w:hyperlink w:anchor="_Toc242970861" w:history="1">
             <w:r>
               <w:rPr>
                 <w:rStyle w:val="Hyperlink"/>
@@ -1595,7 +1595,7 @@
               <w:rPr>
                 <w:noProof/>
               </w:rPr>
-              <w:instrText xml:space="preserve"> PAGEREF _Toc242951934 \h </w:instrText>
+              <w:instrText xml:space="preserve"> PAGEREF _Toc242970861 \h </w:instrText>
             </w:r>
             <w:r>
               <w:rPr>
@@ -1638,7 +1638,7 @@
               <w14:ligatures w14:val="standardContextual"/>
             </w:rPr>
           </w:pPr>
-          <w:hyperlink w:anchor="_Toc242951935" w:history="1">
+          <w:hyperlink w:anchor="_Toc242970862" w:history="1">
             <w:r>
               <w:rPr>
                 <w:rStyle w:val="Hyperlink"/>
@@ -1662,7 +1662,7 @@
               <w:rPr>
                 <w:noProof/>
               </w:rPr>
-              <w:instrText xml:space="preserve"> PAGEREF _Toc242951935 \h </w:instrText>
+              <w:instrText xml:space="preserve"> PAGEREF _Toc242970862 \h </w:instrText>
             </w:r>
             <w:r>
               <w:rPr>
@@ -1705,7 +1705,7 @@
               <w14:ligatures w14:val="standardContextual"/>
             </w:rPr>
           </w:pPr>
-          <w:hyperlink w:anchor="_Toc242951936" w:history="1">
+          <w:hyperlink w:anchor="_Toc242970863" w:history="1">
             <w:r>
               <w:rPr>
                 <w:rStyle w:val="Hyperlink"/>
@@ -1729,7 +1729,7 @@
               <w:rPr>
                 <w:noProof/>
               </w:rPr>
-              <w:instrText xml:space="preserve"> PAGEREF _Toc242951936 \h </w:instrText>
+              <w:instrText xml:space="preserve"> PAGEREF _Toc242970863 \h </w:instrText>
             </w:r>
             <w:r>
               <w:rPr>
@@ -1772,7 +1772,7 @@
               <w14:ligatures w14:val="standardContextual"/>
             </w:rPr>
           </w:pPr>
-          <w:hyperlink w:anchor="_Toc242951937" w:history="1">
+          <w:hyperlink w:anchor="_Toc242970864" w:history="1">
             <w:r>
               <w:rPr>
                 <w:rStyle w:val="Hyperlink"/>
@@ -1796,7 +1796,7 @@
               <w:rPr>
                 <w:noProof/>
               </w:rPr>
-              <w:instrText xml:space="preserve"> PAGEREF _Toc242951937 \h </w:instrText>
+              <w:instrText xml:space="preserve"> PAGEREF _Toc242970864 \h </w:instrText>
             </w:r>
             <w:r>
               <w:rPr>
@@ -1839,7 +1839,7 @@
               <w14:ligatures w14:val="standardContextual"/>
             </w:rPr>
           </w:pPr>
-          <w:hyperlink w:anchor="_Toc242951938" w:history="1">
+          <w:hyperlink w:anchor="_Toc242970865" w:history="1">
             <w:r>
               <w:rPr>
                 <w:rStyle w:val="Hyperlink"/>
@@ -1863,7 +1863,7 @@
               <w:rPr>
                 <w:noProof/>
               </w:rPr>
-              <w:instrText xml:space="preserve"> PAGEREF _Toc242951938 \h </w:instrText>
+              <w:instrText xml:space="preserve"> PAGEREF _Toc242970865 \h </w:instrText>
             </w:r>
             <w:r>
               <w:rPr>
@@ -1906,7 +1906,7 @@
               <w14:ligatures w14:val="standardContextual"/>
             </w:rPr>
           </w:pPr>
-          <w:hyperlink w:anchor="_Toc242951939" w:history="1">
+          <w:hyperlink w:anchor="_Toc242970866" w:history="1">
             <w:r>
               <w:rPr>
                 <w:rStyle w:val="Hyperlink"/>
@@ -1930,7 +1930,7 @@
               <w:rPr>
                 <w:noProof/>
               </w:rPr>
-              <w:instrText xml:space="preserve"> PAGEREF _Toc242951939 \h </w:instrText>
+              <w:instrText xml:space="preserve"> PAGEREF _Toc242970866 \h </w:instrText>
             </w:r>
             <w:r>
               <w:rPr>
@@ -1973,7 +1973,7 @@
               <w14:ligatures w14:val="standardContextual"/>
             </w:rPr>
           </w:pPr>
-          <w:hyperlink w:anchor="_Toc242951940" w:history="1">
+          <w:hyperlink w:anchor="_Toc242970867" w:history="1">
             <w:r>
               <w:rPr>
                 <w:rStyle w:val="Hyperlink"/>
@@ -1997,7 +1997,7 @@
               <w:rPr>
                 <w:noProof/>
               </w:rPr>
-              <w:instrText xml:space="preserve"> PAGEREF _Toc242951940 \h </w:instrText>
+              <w:instrText xml:space="preserve"> PAGEREF _Toc242970867 \h </w:instrText>
             </w:r>
             <w:r>
               <w:rPr>
@@ -2040,7 +2040,7 @@
               <w14:ligatures w14:val="standardContextual"/>
             </w:rPr>
           </w:pPr>
-          <w:hyperlink w:anchor="_Toc242951941" w:history="1">
+          <w:hyperlink w:anchor="_Toc242970868" w:history="1">
             <w:r>
               <w:rPr>
                 <w:rStyle w:val="Hyperlink"/>
@@ -2064,7 +2064,7 @@
               <w:rPr>
                 <w:noProof/>
               </w:rPr>
-              <w:instrText xml:space="preserve"> PAGEREF _Toc242951941 \h </w:instrText>
+              <w:instrText xml:space="preserve"> PAGEREF _Toc242970868 \h </w:instrText>
             </w:r>
             <w:r>
               <w:rPr>
@@ -2107,7 +2107,7 @@
               <w14:ligatures w14:val="standardContextual"/>
             </w:rPr>
           </w:pPr>
-          <w:hyperlink w:anchor="_Toc242951942" w:history="1">
+          <w:hyperlink w:anchor="_Toc242970869" w:history="1">
             <w:r>
               <w:rPr>
                 <w:rStyle w:val="Hyperlink"/>
@@ -2131,7 +2131,7 @@
               <w:rPr>
                 <w:noProof/>
               </w:rPr>
-              <w:instrText xml:space="preserve"> PAGEREF _Toc242951942 \h </w:instrText>
+              <w:instrText xml:space="preserve"> PAGEREF _Toc242970869 \h </w:instrText>
             </w:r>
             <w:r>
               <w:rPr>
@@ -2174,7 +2174,7 @@
               <w14:ligatures w14:val="standardContextual"/>
             </w:rPr>
           </w:pPr>
-          <w:hyperlink w:anchor="_Toc242951943" w:history="1">
+          <w:hyperlink w:anchor="_Toc242970870" w:history="1">
             <w:r>
               <w:rPr>
                 <w:rStyle w:val="Hyperlink"/>
@@ -2198,7 +2198,7 @@
               <w:rPr>
                 <w:noProof/>
               </w:rPr>
-              <w:instrText xml:space="preserve"> PAGEREF _Toc242951943 \h </w:instrText>
+              <w:instrText xml:space="preserve"> PAGEREF _Toc242970870 \h </w:instrText>
             </w:r>
             <w:r>
               <w:rPr>
@@ -2241,7 +2241,7 @@
               <w14:ligatures w14:val="standardContextual"/>
             </w:rPr>
           </w:pPr>
-          <w:hyperlink w:anchor="_Toc242951944" w:history="1">
+          <w:hyperlink w:anchor="_Toc242970871" w:history="1">
             <w:r>
               <w:rPr>
                 <w:rStyle w:val="Hyperlink"/>
@@ -2265,7 +2265,7 @@
               <w:rPr>
                 <w:noProof/>
               </w:rPr>
-              <w:instrText xml:space="preserve"> PAGEREF _Toc242951944 \h </w:instrText>
+              <w:instrText xml:space="preserve"> PAGEREF _Toc242970871 \h </w:instrText>
             </w:r>
             <w:r>
               <w:rPr>
@@ -2308,7 +2308,7 @@
               <w14:ligatures w14:val="standardContextual"/>
             </w:rPr>
           </w:pPr>
-          <w:hyperlink w:anchor="_Toc242951945" w:history="1">
+          <w:hyperlink w:anchor="_Toc242970872" w:history="1">
             <w:r>
               <w:rPr>
                 <w:rStyle w:val="Hyperlink"/>
@@ -2332,7 +2332,7 @@
               <w:rPr>
                 <w:noProof/>
               </w:rPr>
-              <w:instrText xml:space="preserve"> PAGEREF _Toc242951945 \h </w:instrText>
+              <w:instrText xml:space="preserve"> PAGEREF _Toc242970872 \h </w:instrText>
             </w:r>
             <w:r>
               <w:rPr>
@@ -2375,7 +2375,7 @@
               <w14:ligatures w14:val="standardContextual"/>
             </w:rPr>
           </w:pPr>
-          <w:hyperlink w:anchor="_Toc242951946" w:history="1">
+          <w:hyperlink w:anchor="_Toc242970873" w:history="1">
             <w:r>
               <w:rPr>
                 <w:rStyle w:val="Hyperlink"/>
@@ -2399,7 +2399,7 @@
               <w:rPr>
                 <w:noProof/>
               </w:rPr>
-              <w:instrText xml:space="preserve"> PAGEREF _Toc242951946 \h </w:instrText>
+              <w:instrText xml:space="preserve"> PAGEREF _Toc242970873 \h </w:instrText>
             </w:r>
             <w:r>
               <w:rPr>
@@ -2442,7 +2442,7 @@
               <w14:ligatures w14:val="standardContextual"/>
             </w:rPr>
           </w:pPr>
-          <w:hyperlink w:anchor="_Toc242951947" w:history="1">
+          <w:hyperlink w:anchor="_Toc242970874" w:history="1">
             <w:r>
               <w:rPr>
                 <w:rStyle w:val="Hyperlink"/>
@@ -2466,7 +2466,7 @@
               <w:rPr>
                 <w:noProof/>
               </w:rPr>
-              <w:instrText xml:space="preserve"> PAGEREF _Toc242951947 \h </w:instrText>
+              <w:instrText xml:space="preserve"> PAGEREF _Toc242970874 \h </w:instrText>
             </w:r>
             <w:r>
               <w:rPr>
@@ -2509,7 +2509,7 @@
               <w14:ligatures w14:val="standardContextual"/>
             </w:rPr>
           </w:pPr>
-          <w:hyperlink w:anchor="_Toc242951948" w:history="1">
+          <w:hyperlink w:anchor="_Toc242970875" w:history="1">
             <w:r>
               <w:rPr>
                 <w:rStyle w:val="Hyperlink"/>
@@ -2533,7 +2533,7 @@
               <w:rPr>
                 <w:noProof/>
               </w:rPr>
-              <w:instrText xml:space="preserve"> PAGEREF _Toc242951948 \h </w:instrText>
+              <w:instrText xml:space="preserve"> PAGEREF _Toc242970875 \h </w:instrText>
             </w:r>
             <w:r>
               <w:rPr>
@@ -2576,7 +2576,7 @@
               <w14:ligatures w14:val="standardContextual"/>
             </w:rPr>
           </w:pPr>
-          <w:hyperlink w:anchor="_Toc242951949" w:history="1">
+          <w:hyperlink w:anchor="_Toc242970876" w:history="1">
             <w:r>
               <w:rPr>
                 <w:rStyle w:val="Hyperlink"/>
@@ -2600,7 +2600,7 @@
               <w:rPr>
                 <w:noProof/>
               </w:rPr>
-              <w:instrText xml:space="preserve"> PAGEREF _Toc242951949 \h </w:instrText>
+              <w:instrText xml:space="preserve"> PAGEREF _Toc242970876 \h </w:instrText>
             </w:r>
             <w:r>
               <w:rPr>
@@ -2643,7 +2643,7 @@
               <w14:ligatures w14:val="standardContextual"/>
             </w:rPr>
           </w:pPr>
-          <w:hyperlink w:anchor="_Toc242951950" w:history="1">
+          <w:hyperlink w:anchor="_Toc242970877" w:history="1">
             <w:r>
               <w:rPr>
                 <w:rStyle w:val="Hyperlink"/>
@@ -2667,7 +2667,7 @@
               <w:rPr>
                 <w:noProof/>
               </w:rPr>
-              <w:instrText xml:space="preserve"> PAGEREF _Toc242951950 \h </w:instrText>
+              <w:instrText xml:space="preserve"> PAGEREF _Toc242970877 \h </w:instrText>
             </w:r>
             <w:r>
               <w:rPr>
@@ -2710,7 +2710,7 @@
               <w14:ligatures w14:val="standardContextual"/>
             </w:rPr>
           </w:pPr>
-          <w:hyperlink w:anchor="_Toc242951951" w:history="1">
+          <w:hyperlink w:anchor="_Toc242970878" w:history="1">
             <w:r>
               <w:rPr>
                 <w:rStyle w:val="Hyperlink"/>
@@ -2734,7 +2734,7 @@
               <w:rPr>
                 <w:noProof/>
               </w:rPr>
-              <w:instrText xml:space="preserve"> PAGEREF _Toc242951951 \h </w:instrText>
+              <w:instrText xml:space="preserve"> PAGEREF _Toc242970878 \h </w:instrText>
             </w:r>
             <w:r>
               <w:rPr>
@@ -2777,7 +2777,7 @@
               <w14:ligatures w14:val="standardContextual"/>
             </w:rPr>
           </w:pPr>
-          <w:hyperlink w:anchor="_Toc242951952" w:history="1">
+          <w:hyperlink w:anchor="_Toc242970879" w:history="1">
             <w:r>
               <w:rPr>
                 <w:rStyle w:val="Hyperlink"/>
@@ -2801,7 +2801,7 @@
               <w:rPr>
                 <w:noProof/>
               </w:rPr>
-              <w:instrText xml:space="preserve"> PAGEREF _Toc242951952 \h </w:instrText>
+              <w:instrText xml:space="preserve"> PAGEREF _Toc242970879 \h </w:instrText>
             </w:r>
             <w:r>
               <w:rPr>
@@ -2844,7 +2844,7 @@
               <w14:ligatures w14:val="standardContextual"/>
             </w:rPr>
           </w:pPr>
-          <w:hyperlink w:anchor="_Toc242951953" w:history="1">
+          <w:hyperlink w:anchor="_Toc242970880" w:history="1">
             <w:r>
               <w:rPr>
                 <w:rStyle w:val="Hyperlink"/>
@@ -2868,7 +2868,7 @@
               <w:rPr>
                 <w:noProof/>
               </w:rPr>
-              <w:instrText xml:space="preserve"> PAGEREF _Toc242951953 \h </w:instrText>
+              <w:instrText xml:space="preserve"> PAGEREF _Toc242970880 \h </w:instrText>
             </w:r>
             <w:r>
               <w:rPr>
@@ -2911,7 +2911,7 @@
               <w14:ligatures w14:val="standardContextual"/>
             </w:rPr>
           </w:pPr>
-          <w:hyperlink w:anchor="_Toc242951954" w:history="1">
+          <w:hyperlink w:anchor="_Toc242970881" w:history="1">
             <w:r>
               <w:rPr>
                 <w:rStyle w:val="Hyperlink"/>
@@ -2935,7 +2935,7 @@
               <w:rPr>
                 <w:noProof/>
               </w:rPr>
-              <w:instrText xml:space="preserve"> PAGEREF _Toc242951954 \h </w:instrText>
+              <w:instrText xml:space="preserve"> PAGEREF _Toc242970881 \h </w:instrText>
             </w:r>
             <w:r>
               <w:rPr>
@@ -2978,7 +2978,7 @@
               <w14:ligatures w14:val="standardContextual"/>
             </w:rPr>
           </w:pPr>
-          <w:hyperlink w:anchor="_Toc242951955" w:history="1">
+          <w:hyperlink w:anchor="_Toc242970882" w:history="1">
             <w:r>
               <w:rPr>
                 <w:rStyle w:val="Hyperlink"/>
@@ -3002,7 +3002,7 @@
               <w:rPr>
                 <w:noProof/>
               </w:rPr>
-              <w:instrText xml:space="preserve"> PAGEREF _Toc242951955 \h </w:instrText>
+              <w:instrText xml:space="preserve"> PAGEREF _Toc242970882 \h </w:instrText>
             </w:r>
             <w:r>
               <w:rPr>
@@ -3045,7 +3045,7 @@
               <w14:ligatures w14:val="standardContextual"/>
             </w:rPr>
           </w:pPr>
-          <w:hyperlink w:anchor="_Toc242951956" w:history="1">
+          <w:hyperlink w:anchor="_Toc242970883" w:history="1">
             <w:r>
               <w:rPr>
                 <w:rStyle w:val="Hyperlink"/>
@@ -3069,7 +3069,7 @@
               <w:rPr>
                 <w:noProof/>
               </w:rPr>
-              <w:instrText xml:space="preserve"> PAGEREF _Toc242951956 \h </w:instrText>
+              <w:instrText xml:space="preserve"> PAGEREF _Toc242970883 \h </w:instrText>
             </w:r>
             <w:r>
               <w:rPr>
@@ -3112,7 +3112,7 @@
               <w14:ligatures w14:val="standardContextual"/>
             </w:rPr>
           </w:pPr>
-          <w:hyperlink w:anchor="_Toc242951957" w:history="1">
+          <w:hyperlink w:anchor="_Toc242970884" w:history="1">
             <w:r>
               <w:rPr>
                 <w:rStyle w:val="Hyperlink"/>
@@ -3136,7 +3136,7 @@
               <w:rPr>
                 <w:noProof/>
               </w:rPr>
-              <w:instrText xml:space="preserve"> PAGEREF _Toc242951957 \h </w:instrText>
+              <w:instrText xml:space="preserve"> PAGEREF _Toc242970884 \h </w:instrText>
             </w:r>
             <w:r>
               <w:rPr>
@@ -3179,7 +3179,7 @@
               <w14:ligatures w14:val="standardContextual"/>
             </w:rPr>
           </w:pPr>
-          <w:hyperlink w:anchor="_Toc242951958" w:history="1">
+          <w:hyperlink w:anchor="_Toc242970885" w:history="1">
             <w:r>
               <w:rPr>
                 <w:rStyle w:val="Hyperlink"/>
@@ -3203,7 +3203,7 @@
               <w:rPr>
                 <w:noProof/>
               </w:rPr>
-              <w:instrText xml:space="preserve"> PAGEREF _Toc242951958 \h </w:instrText>
+              <w:instrText xml:space="preserve"> PAGEREF _Toc242970885 \h </w:instrText>
             </w:r>
             <w:r>
               <w:rPr>
@@ -3246,7 +3246,7 @@
               <w14:ligatures w14:val="standardContextual"/>
             </w:rPr>
           </w:pPr>
-          <w:hyperlink w:anchor="_Toc242951959" w:history="1">
+          <w:hyperlink w:anchor="_Toc242970886" w:history="1">
             <w:r>
               <w:rPr>
                 <w:rStyle w:val="Hyperlink"/>
@@ -3270,7 +3270,7 @@
               <w:rPr>
                 <w:noProof/>
               </w:rPr>
-              <w:instrText xml:space="preserve"> PAGEREF _Toc242951959 \h </w:instrText>
+              <w:instrText xml:space="preserve"> PAGEREF _Toc242970886 \h </w:instrText>
             </w:r>
             <w:r>
               <w:rPr>
@@ -3340,7 +3340,7 @@
           <w:noProof/>
         </w:rPr>
         <w:drawing>
-          <wp:inline distT="0" distB="0" distL="0" distR="0" wp14:anchorId="5A7AE35E" wp14:editId="377167E3">
+          <wp:inline distT="0" distB="0" distL="0" distR="0" wp14:anchorId="2ED0CBC7" wp14:editId="1B266A89">
             <wp:extent cx="5943600" cy="4210050"/>
             <wp:effectExtent l="0" t="0" r="0" b="0"/>
             <wp:docPr id="1" name="UnmanagedLayerScanner-thumbnail.png" descr="Unmanaged Layer Scanner in action: choosing managed solutions, scanning, filtering by type, comparing the layers of a form and a web resource, and deleting three unmanaged layers" title="Unmanaged Layer Scanner in action: choosing managed solutions, scanning, filtering by type, comparing the layers of a form and a web resource, and deleting three unmanaged layers"/>
@@ -3536,7 +3536,7 @@
                 <w:sz w:val="17"/>
                 <w:szCs w:val="17"/>
               </w:rPr>
-              <w:t>. Version 6.3.0</w:t>
+              <w:t>. Version 1.0.0</w:t>
             </w:r>
           </w:p>
         </w:tc>
@@ -4024,7 +4024,7 @@
         <w:pStyle w:val="Heading1"/>
         <w:keepNext/>
       </w:pPr>
-      <w:bookmarkStart w:id="0" w:name="_Toc242951913"/>
+      <w:bookmarkStart w:id="0" w:name="_Toc242970840"/>
       <w:r>
         <w:t>Features</w:t>
       </w:r>
@@ -4942,7 +4942,7 @@
         <w:pStyle w:val="Heading1"/>
         <w:keepNext/>
       </w:pPr>
-      <w:bookmarkStart w:id="1" w:name="_Toc242951914"/>
+      <w:bookmarkStart w:id="1" w:name="_Toc242970841"/>
       <w:r>
         <w:t>Screenshots</w:t>
       </w:r>
@@ -4971,7 +4971,7 @@
         <w:pStyle w:val="Heading2"/>
         <w:keepNext/>
       </w:pPr>
-      <w:bookmarkStart w:id="2" w:name="_Toc242951915"/>
+      <w:bookmarkStart w:id="2" w:name="_Toc242970842"/>
       <w:r>
         <w:t>Choosing what to check</w:t>
       </w:r>
@@ -5014,7 +5014,7 @@
           <w:noProof/>
         </w:rPr>
         <w:drawing>
-          <wp:inline distT="0" distB="0" distL="0" distR="0" wp14:anchorId="14AB4808" wp14:editId="09F72936">
+          <wp:inline distT="0" distB="0" distL="0" distR="0" wp14:anchorId="2BD1CA0F" wp14:editId="2A417572">
             <wp:extent cx="5943600" cy="4229100"/>
             <wp:effectExtent l="0" t="0" r="0" b="0"/>
             <wp:docPr id="2" name="choose.png" descr="The choice screen: managed solutions, object types and the tables card" title="The choice screen: managed solutions, object types and the tables card"/>
@@ -5101,7 +5101,7 @@
           <w:noProof/>
         </w:rPr>
         <w:drawing>
-          <wp:inline distT="0" distB="0" distL="0" distR="0" wp14:anchorId="69F4A8F9" wp14:editId="6A0346AD">
+          <wp:inline distT="0" distB="0" distL="0" distR="0" wp14:anchorId="2C4361A5" wp14:editId="3005B881">
             <wp:extent cx="5943600" cy="4229100"/>
             <wp:effectExtent l="0" t="0" r="0" b="0"/>
             <wp:docPr id="3" name="tables.png" descr="The Choose tables dialog" title="The Choose tables dialog"/>
@@ -5178,7 +5178,7 @@
           <w:noProof/>
         </w:rPr>
         <w:drawing>
-          <wp:inline distT="0" distB="0" distL="0" distR="0" wp14:anchorId="1ABB3C1B" wp14:editId="1BFDA8CF">
+          <wp:inline distT="0" distB="0" distL="0" distR="0" wp14:anchorId="6684043A" wp14:editId="71A31D54">
             <wp:extent cx="5943600" cy="4229100"/>
             <wp:effectExtent l="0" t="0" r="0" b="0"/>
             <wp:docPr id="4" name="scanning.png" descr="The scan in progress" title="The scan in progress"/>
@@ -5222,7 +5222,7 @@
         <w:pStyle w:val="Heading2"/>
         <w:keepNext/>
       </w:pPr>
-      <w:bookmarkStart w:id="3" w:name="_Toc242951916"/>
+      <w:bookmarkStart w:id="3" w:name="_Toc242970843"/>
       <w:r>
         <w:lastRenderedPageBreak/>
         <w:t>Results and filters</w:t>
@@ -5266,7 +5266,7 @@
           <w:noProof/>
         </w:rPr>
         <w:drawing>
-          <wp:inline distT="0" distB="0" distL="0" distR="0" wp14:anchorId="6D41CE3C" wp14:editId="1091C71D">
+          <wp:inline distT="0" distB="0" distL="0" distR="0" wp14:anchorId="19A90DD0" wp14:editId="0583A66E">
             <wp:extent cx="5943600" cy="4229100"/>
             <wp:effectExtent l="0" t="0" r="0" b="0"/>
             <wp:docPr id="5" name="results.png" descr="The results grid" title="The results grid"/>
@@ -5343,7 +5343,7 @@
           <w:noProof/>
         </w:rPr>
         <w:drawing>
-          <wp:inline distT="0" distB="0" distL="0" distR="0" wp14:anchorId="43906BFE" wp14:editId="168BBB8E">
+          <wp:inline distT="0" distB="0" distL="0" distR="0" wp14:anchorId="2694707A" wp14:editId="27ABB9BC">
             <wp:extent cx="5943600" cy="4229100"/>
             <wp:effectExtent l="0" t="0" r="0" b="0"/>
             <wp:docPr id="6" name="column-filter.png" descr="The What changed column menu" title="The What changed column menu"/>
@@ -5410,7 +5410,7 @@
           <w:noProof/>
         </w:rPr>
         <w:drawing>
-          <wp:inline distT="0" distB="0" distL="0" distR="0" wp14:anchorId="09A6E69E" wp14:editId="62E9FF6E">
+          <wp:inline distT="0" distB="0" distL="0" distR="0" wp14:anchorId="02012ABB" wp14:editId="01D0FBB7">
             <wp:extent cx="5943600" cy="4229100"/>
             <wp:effectExtent l="0" t="0" r="0" b="0"/>
             <wp:docPr id="7" name="export.png" descr="The Export menu" title="The Export menu"/>
@@ -5454,7 +5454,7 @@
         <w:pStyle w:val="Heading2"/>
         <w:keepNext/>
       </w:pPr>
-      <w:bookmarkStart w:id="4" w:name="_Toc242951917"/>
+      <w:bookmarkStart w:id="4" w:name="_Toc242970844"/>
       <w:r>
         <w:lastRenderedPageBreak/>
         <w:t>Details of a component</w:t>
@@ -5498,7 +5498,7 @@
           <w:noProof/>
         </w:rPr>
         <w:drawing>
-          <wp:inline distT="0" distB="0" distL="0" distR="0" wp14:anchorId="45F91C77" wp14:editId="00C5E497">
+          <wp:inline distT="0" distB="0" distL="0" distR="0" wp14:anchorId="49553C4D" wp14:editId="65F735E0">
             <wp:extent cx="5943600" cy="4229100"/>
             <wp:effectExtent l="0" t="0" r="0" b="0"/>
             <wp:docPr id="8" name="details-compare.png" descr="The comparison of a form's layers" title="The comparison of a form's layers"/>
@@ -5565,7 +5565,7 @@
           <w:noProof/>
         </w:rPr>
         <w:drawing>
-          <wp:inline distT="0" distB="0" distL="0" distR="0" wp14:anchorId="42DF22C9" wp14:editId="05466020">
+          <wp:inline distT="0" distB="0" distL="0" distR="0" wp14:anchorId="57DAB7C0" wp14:editId="7CC837BC">
             <wp:extent cx="5943600" cy="4229100"/>
             <wp:effectExtent l="0" t="0" r="0" b="0"/>
             <wp:docPr id="9" name="details-side-by-side.png" descr="A web resource compared side by side" title="A web resource compared side by side"/>
@@ -5632,7 +5632,7 @@
           <w:noProof/>
         </w:rPr>
         <w:drawing>
-          <wp:inline distT="0" distB="0" distL="0" distR="0" wp14:anchorId="77E2682A" wp14:editId="43C30A78">
+          <wp:inline distT="0" distB="0" distL="0" distR="0" wp14:anchorId="280F1239" wp14:editId="653ACFF9">
             <wp:extent cx="5943600" cy="4229100"/>
             <wp:effectExtent l="0" t="0" r="0" b="0"/>
             <wp:docPr id="10" name="details-image.png" descr="Both images of an image web resource" title="Both images of an image web resource"/>
@@ -5728,7 +5728,7 @@
           <w:noProof/>
         </w:rPr>
         <w:drawing>
-          <wp:inline distT="0" distB="0" distL="0" distR="0" wp14:anchorId="2C757722" wp14:editId="31682F84">
+          <wp:inline distT="0" distB="0" distL="0" distR="0" wp14:anchorId="1C49774C" wp14:editId="49727168">
             <wp:extent cx="5943600" cy="4229100"/>
             <wp:effectExtent l="0" t="0" r="0" b="0"/>
             <wp:docPr id="11" name="details-file.png" descr="A web resource whose content is kept as a file: the content in effect shown for the Active layer only" title="A web resource whose content is kept as a file: the content in effect shown for the Active layer only"/>
@@ -5815,7 +5815,7 @@
           <w:noProof/>
         </w:rPr>
         <w:drawing>
-          <wp:inline distT="0" distB="0" distL="0" distR="0" wp14:anchorId="04F39E78" wp14:editId="111307F6">
+          <wp:inline distT="0" distB="0" distL="0" distR="0" wp14:anchorId="4675719B" wp14:editId="22942472">
             <wp:extent cx="5943600" cy="4229100"/>
             <wp:effectExtent l="0" t="0" r="0" b="0"/>
             <wp:docPr id="12" name="details-layers.png" descr="The Layers tab" title="The Layers tab"/>
@@ -5902,7 +5902,7 @@
           <w:noProof/>
         </w:rPr>
         <w:drawing>
-          <wp:inline distT="0" distB="0" distL="0" distR="0" wp14:anchorId="22251BD8" wp14:editId="04A9FF25">
+          <wp:inline distT="0" distB="0" distL="0" distR="0" wp14:anchorId="2846FACA" wp14:editId="460FD4E6">
             <wp:extent cx="5943600" cy="4229100"/>
             <wp:effectExtent l="0" t="0" r="0" b="0"/>
             <wp:docPr id="13" name="details-json.png" descr="The JSON tab showing a layer's Changes" title="The JSON tab showing a layer's Changes"/>
@@ -5969,7 +5969,7 @@
           <w:noProof/>
         </w:rPr>
         <w:drawing>
-          <wp:inline distT="0" distB="0" distL="0" distR="0" wp14:anchorId="08ADE179" wp14:editId="11AF86D2">
+          <wp:inline distT="0" distB="0" distL="0" distR="0" wp14:anchorId="68675A43" wp14:editId="5FFEACF5">
             <wp:extent cx="5943600" cy="4229100"/>
             <wp:effectExtent l="0" t="0" r="0" b="0"/>
             <wp:docPr id="14" name="details-children.png" descr="A role's privileges from Children, shown as a table" title="A role's privileges from Children, shown as a table"/>
@@ -6013,7 +6013,7 @@
         <w:pStyle w:val="Heading2"/>
         <w:keepNext/>
       </w:pPr>
-      <w:bookmarkStart w:id="5" w:name="_Toc242951918"/>
+      <w:bookmarkStart w:id="5" w:name="_Toc242970845"/>
       <w:r>
         <w:lastRenderedPageBreak/>
         <w:t>Deleting layers</w:t>
@@ -6057,7 +6057,7 @@
           <w:noProof/>
         </w:rPr>
         <w:drawing>
-          <wp:inline distT="0" distB="0" distL="0" distR="0" wp14:anchorId="15D3F20B" wp14:editId="7EF95BF8">
+          <wp:inline distT="0" distB="0" distL="0" distR="0" wp14:anchorId="483E0D11" wp14:editId="0F882BC2">
             <wp:extent cx="5943600" cy="4229100"/>
             <wp:effectExtent l="0" t="0" r="0" b="0"/>
             <wp:docPr id="15" name="delete-confirm.png" descr="The delete confirmation" title="The delete confirmation"/>
@@ -6134,7 +6134,7 @@
           <w:noProof/>
         </w:rPr>
         <w:drawing>
-          <wp:inline distT="0" distB="0" distL="0" distR="0" wp14:anchorId="3F4A4057" wp14:editId="1E931E34">
+          <wp:inline distT="0" distB="0" distL="0" distR="0" wp14:anchorId="76035823" wp14:editId="79592C6D">
             <wp:extent cx="5943600" cy="4229100"/>
             <wp:effectExtent l="0" t="0" r="0" b="0"/>
             <wp:docPr id="16" name="deleting.png" descr="Deleting in progress" title="Deleting in progress"/>
@@ -6201,7 +6201,7 @@
           <w:noProof/>
         </w:rPr>
         <w:drawing>
-          <wp:inline distT="0" distB="0" distL="0" distR="0" wp14:anchorId="0CFA6724" wp14:editId="7D539708">
+          <wp:inline distT="0" distB="0" distL="0" distR="0" wp14:anchorId="6D0A3939" wp14:editId="3C4221A4">
             <wp:extent cx="5943600" cy="4229100"/>
             <wp:effectExtent l="0" t="0" r="0" b="0"/>
             <wp:docPr id="17" name="deleted.png" descr="The results after deleting three unmanaged layers" title="The results after deleting three unmanaged layers"/>
@@ -6245,7 +6245,7 @@
         <w:pStyle w:val="Heading2"/>
         <w:keepNext/>
       </w:pPr>
-      <w:bookmarkStart w:id="6" w:name="_Toc242951919"/>
+      <w:bookmarkStart w:id="6" w:name="_Toc242970846"/>
       <w:r>
         <w:lastRenderedPageBreak/>
         <w:t>Narrow window</w:t>
@@ -6289,7 +6289,7 @@
           <w:noProof/>
         </w:rPr>
         <w:drawing>
-          <wp:inline distT="0" distB="0" distL="0" distR="0" wp14:anchorId="0AD60EA3" wp14:editId="50FC3916">
+          <wp:inline distT="0" distB="0" distL="0" distR="0" wp14:anchorId="501153A3" wp14:editId="43C283DC">
             <wp:extent cx="5943600" cy="6524625"/>
             <wp:effectExtent l="0" t="0" r="0" b="0"/>
             <wp:docPr id="18" name="narrow.png" descr="The choice screen in a narrow window" title="The choice screen in a narrow window"/>
@@ -6333,7 +6333,7 @@
         <w:pStyle w:val="Heading1"/>
         <w:keepNext/>
       </w:pPr>
-      <w:bookmarkStart w:id="7" w:name="_Toc242951920"/>
+      <w:bookmarkStart w:id="7" w:name="_Toc242970847"/>
       <w:r>
         <w:t>Download</w:t>
       </w:r>
@@ -6951,7 +6951,7 @@
         <w:pStyle w:val="Heading1"/>
         <w:keepNext/>
       </w:pPr>
-      <w:bookmarkStart w:id="8" w:name="_Toc242951921"/>
+      <w:bookmarkStart w:id="8" w:name="_Toc242970848"/>
       <w:r>
         <w:t>Install</w:t>
       </w:r>
@@ -6962,7 +6962,7 @@
         <w:pStyle w:val="Heading2"/>
         <w:keepNext/>
       </w:pPr>
-      <w:bookmarkStart w:id="9" w:name="_Toc242951922"/>
+      <w:bookmarkStart w:id="9" w:name="_Toc242970849"/>
       <w:r>
         <w:t>Drag the button</w:t>
       </w:r>
@@ -7051,7 +7051,7 @@
         <w:pStyle w:val="Heading2"/>
         <w:keepNext/>
       </w:pPr>
-      <w:bookmarkStart w:id="10" w:name="_Toc242951923"/>
+      <w:bookmarkStart w:id="10" w:name="_Toc242970850"/>
       <w:r>
         <w:t>Create the favourite by hand</w:t>
       </w:r>
@@ -7197,7 +7197,7 @@
         <w:pStyle w:val="Heading2"/>
         <w:keepNext/>
       </w:pPr>
-      <w:bookmarkStart w:id="11" w:name="_Toc242951924"/>
+      <w:bookmarkStart w:id="11" w:name="_Toc242970851"/>
       <w:r>
         <w:t>Run it from the console</w:t>
       </w:r>
@@ -7292,7 +7292,7 @@
         <w:pStyle w:val="Heading2"/>
         <w:keepNext/>
       </w:pPr>
-      <w:bookmarkStart w:id="12" w:name="_Toc242951925"/>
+      <w:bookmarkStart w:id="12" w:name="_Toc242970852"/>
       <w:r>
         <w:t>When bookmarklets are blocked</w:t>
       </w:r>
@@ -7331,7 +7331,7 @@
         <w:pStyle w:val="Heading2"/>
         <w:keepNext/>
       </w:pPr>
-      <w:bookmarkStart w:id="13" w:name="_Toc242951926"/>
+      <w:bookmarkStart w:id="13" w:name="_Toc242970853"/>
       <w:r>
         <w:t>Update to a new version</w:t>
       </w:r>
@@ -7393,7 +7393,7 @@
         <w:t>Unmanaged layers</w:t>
       </w:r>
       <w:r>
-        <w:t xml:space="preserve"> in the window's title bar: the tooltip reads "Unmanaged layer scanner 6.3.0".</w:t>
+        <w:t xml:space="preserve"> in the window's title bar: the tooltip reads "Unmanaged layer scanner 1.0.0".</w:t>
       </w:r>
     </w:p>
     <w:p>
@@ -7401,7 +7401,7 @@
         <w:pStyle w:val="Heading1"/>
         <w:keepNext/>
       </w:pPr>
-      <w:bookmarkStart w:id="14" w:name="_Toc242951927"/>
+      <w:bookmarkStart w:id="14" w:name="_Toc242970854"/>
       <w:r>
         <w:t>Use</w:t>
       </w:r>
@@ -7412,7 +7412,7 @@
         <w:pStyle w:val="Heading2"/>
         <w:keepNext/>
       </w:pPr>
-      <w:bookmarkStart w:id="15" w:name="_Toc242951928"/>
+      <w:bookmarkStart w:id="15" w:name="_Toc242970855"/>
       <w:r>
         <w:t>Open it</w:t>
       </w:r>
@@ -7598,7 +7598,7 @@
         <w:pStyle w:val="Heading2"/>
         <w:keepNext/>
       </w:pPr>
-      <w:bookmarkStart w:id="16" w:name="_Toc242951929"/>
+      <w:bookmarkStart w:id="16" w:name="_Toc242970856"/>
       <w:r>
         <w:t>Choose what to check</w:t>
       </w:r>
@@ -8323,7 +8323,7 @@
         <w:pStyle w:val="Heading2"/>
         <w:keepNext/>
       </w:pPr>
-      <w:bookmarkStart w:id="17" w:name="_Toc242951930"/>
+      <w:bookmarkStart w:id="17" w:name="_Toc242970857"/>
       <w:r>
         <w:t>Scan and stop</w:t>
       </w:r>
@@ -8851,7 +8851,7 @@
         <w:pStyle w:val="Heading2"/>
         <w:keepNext/>
       </w:pPr>
-      <w:bookmarkStart w:id="18" w:name="_Toc242951931"/>
+      <w:bookmarkStart w:id="18" w:name="_Toc242970858"/>
       <w:r>
         <w:t>The results</w:t>
       </w:r>
@@ -9475,7 +9475,7 @@
         <w:pStyle w:val="Heading3"/>
         <w:keepNext/>
       </w:pPr>
-      <w:bookmarkStart w:id="19" w:name="_Toc242951932"/>
+      <w:bookmarkStart w:id="19" w:name="_Toc242970859"/>
       <w:r>
         <w:t>Type bubbles</w:t>
       </w:r>
@@ -9527,7 +9527,7 @@
         <w:pStyle w:val="Heading3"/>
         <w:keepNext/>
       </w:pPr>
-      <w:bookmarkStart w:id="20" w:name="_Toc242951933"/>
+      <w:bookmarkStart w:id="20" w:name="_Toc242970860"/>
       <w:r>
         <w:t>Column menus</w:t>
       </w:r>
@@ -9774,7 +9774,7 @@
         <w:pStyle w:val="Heading3"/>
         <w:keepNext/>
       </w:pPr>
-      <w:bookmarkStart w:id="21" w:name="_Toc242951934"/>
+      <w:bookmarkStart w:id="21" w:name="_Toc242970861"/>
       <w:r>
         <w:lastRenderedPageBreak/>
         <w:t>Which page a row opens</w:t>
@@ -10167,7 +10167,7 @@
         <w:pStyle w:val="Heading3"/>
         <w:keepNext/>
       </w:pPr>
-      <w:bookmarkStart w:id="22" w:name="_Toc242951935"/>
+      <w:bookmarkStart w:id="22" w:name="_Toc242970862"/>
       <w:r>
         <w:t>Banners</w:t>
       </w:r>
@@ -10328,7 +10328,7 @@
         <w:pStyle w:val="Heading2"/>
         <w:keepNext/>
       </w:pPr>
-      <w:bookmarkStart w:id="23" w:name="_Toc242951936"/>
+      <w:bookmarkStart w:id="23" w:name="_Toc242970863"/>
       <w:r>
         <w:t>The details</w:t>
       </w:r>
@@ -10423,7 +10423,7 @@
         <w:pStyle w:val="Heading3"/>
         <w:keepNext/>
       </w:pPr>
-      <w:bookmarkStart w:id="24" w:name="_Toc242951937"/>
+      <w:bookmarkStart w:id="24" w:name="_Toc242970864"/>
       <w:r>
         <w:t>What changed</w:t>
       </w:r>
@@ -11012,7 +11012,7 @@
         <w:pStyle w:val="Heading3"/>
         <w:keepNext/>
       </w:pPr>
-      <w:bookmarkStart w:id="25" w:name="_Toc242951938"/>
+      <w:bookmarkStart w:id="25" w:name="_Toc242970865"/>
       <w:r>
         <w:t>Layers</w:t>
       </w:r>
@@ -11091,7 +11091,7 @@
         <w:pStyle w:val="Heading3"/>
         <w:keepNext/>
       </w:pPr>
-      <w:bookmarkStart w:id="26" w:name="_Toc242951939"/>
+      <w:bookmarkStart w:id="26" w:name="_Toc242970866"/>
       <w:r>
         <w:t>JSON</w:t>
       </w:r>
@@ -11182,7 +11182,7 @@
         <w:pStyle w:val="Heading2"/>
         <w:keepNext/>
       </w:pPr>
-      <w:bookmarkStart w:id="27" w:name="_Toc242951940"/>
+      <w:bookmarkStart w:id="27" w:name="_Toc242970867"/>
       <w:r>
         <w:t>Export</w:t>
       </w:r>
@@ -11794,7 +11794,7 @@
         <w:pStyle w:val="Heading2"/>
         <w:keepNext/>
       </w:pPr>
-      <w:bookmarkStart w:id="28" w:name="_Toc242951941"/>
+      <w:bookmarkStart w:id="28" w:name="_Toc242970868"/>
       <w:r>
         <w:t>Deleting</w:t>
       </w:r>
@@ -12122,7 +12122,7 @@
         <w:pStyle w:val="Heading3"/>
         <w:keepNext/>
       </w:pPr>
-      <w:bookmarkStart w:id="29" w:name="_Toc242951942"/>
+      <w:bookmarkStart w:id="29" w:name="_Toc242970869"/>
       <w:r>
         <w:t>Outcomes</w:t>
       </w:r>
@@ -12798,7 +12798,7 @@
         <w:pStyle w:val="Heading3"/>
         <w:keepNext/>
       </w:pPr>
-      <w:bookmarkStart w:id="30" w:name="_Toc242951943"/>
+      <w:bookmarkStart w:id="30" w:name="_Toc242970870"/>
       <w:r>
         <w:t>The deletion log</w:t>
       </w:r>
@@ -12900,7 +12900,7 @@
         <w:pStyle w:val="Heading2"/>
         <w:keepNext/>
       </w:pPr>
-      <w:bookmarkStart w:id="31" w:name="_Toc242951944"/>
+      <w:bookmarkStart w:id="31" w:name="_Toc242970871"/>
       <w:r>
         <w:t>Keyboard</w:t>
       </w:r>
@@ -13782,7 +13782,7 @@
         <w:pStyle w:val="Heading1"/>
         <w:keepNext/>
       </w:pPr>
-      <w:bookmarkStart w:id="32" w:name="_Toc242951945"/>
+      <w:bookmarkStart w:id="32" w:name="_Toc242970872"/>
       <w:r>
         <w:t>Environment rules (optional)</w:t>
       </w:r>
@@ -14447,7 +14447,7 @@
         <w:pStyle w:val="Heading1"/>
         <w:keepNext/>
       </w:pPr>
-      <w:bookmarkStart w:id="33" w:name="_Toc242951946"/>
+      <w:bookmarkStart w:id="33" w:name="_Toc242970873"/>
       <w:r>
         <w:lastRenderedPageBreak/>
         <w:t>Safety</w:t>
@@ -14984,7 +14984,7 @@
         <w:pStyle w:val="Heading1"/>
         <w:keepNext/>
       </w:pPr>
-      <w:bookmarkStart w:id="34" w:name="_Toc242951947"/>
+      <w:bookmarkStart w:id="34" w:name="_Toc242970874"/>
       <w:r>
         <w:t>Messages</w:t>
       </w:r>
@@ -15015,7 +15015,7 @@
         <w:pStyle w:val="Heading2"/>
         <w:keepNext/>
       </w:pPr>
-      <w:bookmarkStart w:id="35" w:name="_Toc242951948"/>
+      <w:bookmarkStart w:id="35" w:name="_Toc242970875"/>
       <w:r>
         <w:t>Starting</w:t>
       </w:r>
@@ -15642,7 +15642,7 @@
         <w:pStyle w:val="Heading2"/>
         <w:keepNext/>
       </w:pPr>
-      <w:bookmarkStart w:id="36" w:name="_Toc242951949"/>
+      <w:bookmarkStart w:id="36" w:name="_Toc242970876"/>
       <w:r>
         <w:t>Choosing</w:t>
       </w:r>
@@ -16177,7 +16177,7 @@
         <w:pStyle w:val="Heading2"/>
         <w:keepNext/>
       </w:pPr>
-      <w:bookmarkStart w:id="37" w:name="_Toc242951950"/>
+      <w:bookmarkStart w:id="37" w:name="_Toc242970877"/>
       <w:r>
         <w:t>Scanning and results</w:t>
       </w:r>
@@ -17592,7 +17592,7 @@
         <w:pStyle w:val="Heading2"/>
         <w:keepNext/>
       </w:pPr>
-      <w:bookmarkStart w:id="38" w:name="_Toc242951951"/>
+      <w:bookmarkStart w:id="38" w:name="_Toc242970878"/>
       <w:r>
         <w:t>Details</w:t>
       </w:r>
@@ -18583,7 +18583,7 @@
         <w:pStyle w:val="Heading2"/>
         <w:keepNext/>
       </w:pPr>
-      <w:bookmarkStart w:id="39" w:name="_Toc242951952"/>
+      <w:bookmarkStart w:id="39" w:name="_Toc242970879"/>
       <w:r>
         <w:t>Deleting</w:t>
       </w:r>
@@ -19418,7 +19418,7 @@
         <w:pStyle w:val="Heading1"/>
         <w:keepNext/>
       </w:pPr>
-      <w:bookmarkStart w:id="40" w:name="_Toc242951953"/>
+      <w:bookmarkStart w:id="40" w:name="_Toc242970880"/>
       <w:r>
         <w:t>Troubleshooting</w:t>
       </w:r>
@@ -21146,7 +21146,7 @@
         <w:pStyle w:val="Heading1"/>
         <w:keepNext/>
       </w:pPr>
-      <w:bookmarkStart w:id="41" w:name="_Toc242951954"/>
+      <w:bookmarkStart w:id="41" w:name="_Toc242970881"/>
       <w:r>
         <w:t>Limitations</w:t>
       </w:r>
@@ -21558,7 +21558,7 @@
         <w:pStyle w:val="Heading1"/>
         <w:keepNext/>
       </w:pPr>
-      <w:bookmarkStart w:id="42" w:name="_Toc242951955"/>
+      <w:bookmarkStart w:id="42" w:name="_Toc242970882"/>
       <w:r>
         <w:t>How it works</w:t>
       </w:r>
@@ -22673,7 +22673,7 @@
         <w:pStyle w:val="Heading1"/>
         <w:keepNext/>
       </w:pPr>
-      <w:bookmarkStart w:id="43" w:name="_Toc242951956"/>
+      <w:bookmarkStart w:id="43" w:name="_Toc242970883"/>
       <w:r>
         <w:t>Comparison with Solution Layers Explorer</w:t>
       </w:r>
@@ -23631,7 +23631,7 @@
         <w:pStyle w:val="Heading1"/>
         <w:keepNext/>
       </w:pPr>
-      <w:bookmarkStart w:id="44" w:name="_Toc242951957"/>
+      <w:bookmarkStart w:id="44" w:name="_Toc242970884"/>
       <w:r>
         <w:lastRenderedPageBreak/>
         <w:t>Repository layout</w:t>
@@ -24661,7 +24661,7 @@
         <w:pStyle w:val="Heading1"/>
         <w:keepNext/>
       </w:pPr>
-      <w:bookmarkStart w:id="45" w:name="_Toc242951958"/>
+      <w:bookmarkStart w:id="45" w:name="_Toc242970885"/>
       <w:r>
         <w:t>Build</w:t>
       </w:r>
@@ -24944,7 +24944,7 @@
           <w:szCs w:val="18"/>
           <w:shd w:val="clear" w:color="auto" w:fill="F3F2F1"/>
         </w:rPr>
-        <w:t>bookmarklet 6.3.0: 70627 characters (164.0 KB unpacked)</w:t>
+        <w:t>bookmarklet 1.0.0: 70627 characters (164.0 KB unpacked)</w:t>
       </w:r>
       <w:r>
         <w:t>.</w:t>
@@ -25192,7 +25192,7 @@
         <w:pStyle w:val="Heading1"/>
         <w:keepNext/>
       </w:pPr>
-      <w:bookmarkStart w:id="46" w:name="_Toc242951959"/>
+      <w:bookmarkStart w:id="46" w:name="_Toc242970886"/>
       <w:r>
         <w:t>License</w:t>
       </w:r>
@@ -25414,297 +25414,297 @@
 <file path=word/numbering.xml><?xml version="1.0" encoding="utf-8"?>
 <w:numbering xmlns:wpc="http://schemas.microsoft.com/office/word/2010/wordprocessingCanvas" xmlns:cx="http://schemas.microsoft.com/office/drawing/2014/chartex" xmlns:cx1="http://schemas.microsoft.com/office/drawing/2015/9/8/chartex" xmlns:cx2="http://schemas.microsoft.com/office/drawing/2015/10/21/chartex" xmlns:cx3="http://schemas.microsoft.com/office/drawing/2016/5/9/chartex" xmlns:cx4="http://schemas.microsoft.com/office/drawing/2016/5/10/chartex" xmlns:cx5="http://schemas.microsoft.com/office/drawing/2016/5/11/chartex" xmlns:cx6="http://schemas.microsoft.com/office/drawing/2016/5/12/chartex" xmlns:cx7="http://schemas.microsoft.com/office/drawing/2016/5/13/chartex" xmlns:cx8="http://schemas.microsoft.com/office/drawing/2016/5/14/chartex" xmlns:mc="http://schemas.openxmlformats.org/markup-compatibility/2006" xmlns:aink="http://schemas.microsoft.com/office/drawing/2016/ink" xmlns:am3d="http://schemas.microsoft.com/office/drawing/2017/model3d" xmlns:o="urn:schemas-microsoft-com:office:office" xmlns:oel="http://schemas.microsoft.com/office/2019/extlst" xmlns:r="http://schemas.openxmlformats.org/officeDocument/2006/relationships" xmlns:m="http://schemas.openxmlformats.org/officeDocument/2006/math" xmlns:v="urn:schemas-microsoft-com:vml" xmlns:wp14="http://schemas.microsoft.com/office/word/2010/wordprocessingDrawing" xmlns:wp="http://schemas.openxmlformats.org/drawingml/2006/wordprocessingDrawing" xmlns:w10="urn:schemas-microsoft-com:office:word" xmlns:w="http://schemas.openxmlformats.org/wordprocessingml/2006/main" xmlns:w14="http://schemas.microsoft.com/office/word/2010/wordml" xmlns:w15="http://schemas.microsoft.com/office/word/2012/wordml" xmlns:w16cex="http://schemas.microsoft.com/office/word/2018/wordml/cex" xmlns:w16cid="http://schemas.microsoft.com/office/word/2016/wordml/cid" xmlns:w16="http://schemas.microsoft.com/office/word/2018/wordml" xmlns:w16sdtdh="http://schemas.microsoft.com/office/word/2020/wordml/sdtdatahash" xmlns:w16se="http://schemas.microsoft.com/office/word/2015/wordml/symex" xmlns:wpg="http://schemas.microsoft.com/office/word/2010/wordprocessingGroup" xmlns:wpi="http://schemas.microsoft.com/office/word/2010/wordprocessingInk" xmlns:wne="http://schemas.microsoft.com/office/word/2006/wordml" xmlns:wps="http://schemas.microsoft.com/office/word/2010/wordprocessingShape" mc:Ignorable="w14 w15 w16se w16cid w16 w16cex w16sdtdh wp14">
   <w:abstractNum w:abstractNumId="0" w15:restartNumberingAfterBreak="0">
-    <w:nsid w:val="3B9C0267"/>
+    <w:nsid w:val="0E50465A"/>
     <w:multiLevelType w:val="hybridMultilevel"/>
-    <w:tmpl w:val="9162D12A"/>
-    <w:lvl w:ilvl="0" w:tplc="B3ECE232">
+    <w:tmpl w:val="74EE5FDA"/>
+    <w:lvl w:ilvl="0" w:tplc="A9721466" w:tentative="1">
       <w:start w:val="1"/>
       <w:numFmt w:val="bullet"/>
-      <w:lvlText w:val="•"/>
+      <w:lvlText w:val="●"/>
       <w:lvlJc w:val="left"/>
       <w:pPr>
-        <w:ind w:left="360" w:hanging="260"/>
+        <w:ind w:left="720" w:hanging="360"/>
       </w:pPr>
     </w:lvl>
-    <w:lvl w:ilvl="1" w:tplc="4A90D88E" w:tentative="1">
+    <w:lvl w:ilvl="1" w:tplc="F95617F6" w:tentative="1">
       <w:start w:val="1"/>
       <w:numFmt w:val="bullet"/>
-      <w:lvlText w:val="–"/>
+      <w:lvlText w:val="○"/>
       <w:lvlJc w:val="left"/>
       <w:pPr>
-        <w:ind w:left="720" w:hanging="260"/>
+        <w:ind w:left="1440" w:hanging="360"/>
       </w:pPr>
     </w:lvl>
-    <w:lvl w:ilvl="2" w:tplc="750606C0" w:tentative="1">
+    <w:lvl w:ilvl="2" w:tplc="9D9CF79E" w:tentative="1">
       <w:start w:val="1"/>
       <w:numFmt w:val="bullet"/>
-      <w:lvlText w:val="◦"/>
+      <w:lvlText w:val="■"/>
       <w:lvlJc w:val="left"/>
       <w:pPr>
-        <w:ind w:left="1080" w:hanging="260"/>
+        <w:ind w:left="2160" w:hanging="360"/>
       </w:pPr>
     </w:lvl>
-    <w:lvl w:ilvl="3" w:tplc="46188CA8" w:tentative="1">
+    <w:lvl w:ilvl="3" w:tplc="101E8BF4" w:tentative="1">
       <w:start w:val="1"/>
       <w:numFmt w:val="bullet"/>
-      <w:lvlText w:val="•"/>
+      <w:lvlText w:val="●"/>
       <w:lvlJc w:val="left"/>
       <w:pPr>
-        <w:ind w:left="1440" w:hanging="260"/>
+        <w:ind w:left="2880" w:hanging="360"/>
       </w:pPr>
     </w:lvl>
-    <w:lvl w:ilvl="4" w:tplc="89749660">
+    <w:lvl w:ilvl="4" w:tplc="7074A960" w:tentative="1">
+      <w:start w:val="1"/>
+      <w:numFmt w:val="bullet"/>
+      <w:lvlText w:val="○"/>
+      <w:lvlJc w:val="left"/>
+      <w:pPr>
+        <w:ind w:left="3600" w:hanging="360"/>
+      </w:pPr>
+    </w:lvl>
+    <w:lvl w:ilvl="5" w:tplc="3A4E1B6A" w:tentative="1">
+      <w:start w:val="1"/>
+      <w:numFmt w:val="bullet"/>
+      <w:lvlText w:val="■"/>
+      <w:lvlJc w:val="left"/>
+      <w:pPr>
+        <w:ind w:left="4320" w:hanging="360"/>
+      </w:pPr>
+    </w:lvl>
+    <w:lvl w:ilvl="6" w:tplc="2626C352" w:tentative="1">
+      <w:start w:val="1"/>
+      <w:numFmt w:val="bullet"/>
+      <w:lvlText w:val="●"/>
+      <w:lvlJc w:val="left"/>
+      <w:pPr>
+        <w:ind w:left="5040" w:hanging="360"/>
+      </w:pPr>
+    </w:lvl>
+    <w:lvl w:ilvl="7" w:tplc="D122A166" w:tentative="1">
+      <w:start w:val="1"/>
+      <w:numFmt w:val="bullet"/>
+      <w:lvlText w:val="●"/>
+      <w:lvlJc w:val="left"/>
+      <w:pPr>
+        <w:ind w:left="5760" w:hanging="360"/>
+      </w:pPr>
+    </w:lvl>
+    <w:lvl w:ilvl="8" w:tplc="5F907C7E" w:tentative="1">
+      <w:start w:val="1"/>
+      <w:numFmt w:val="bullet"/>
+      <w:lvlText w:val="●"/>
+      <w:lvlJc w:val="left"/>
+      <w:pPr>
+        <w:ind w:left="6480" w:hanging="360"/>
+      </w:pPr>
+    </w:lvl>
+  </w:abstractNum>
+  <w:abstractNum w:abstractNumId="1" w15:restartNumberingAfterBreak="0">
+    <w:nsid w:val="606B24DE"/>
+    <w:multiLevelType w:val="hybridMultilevel"/>
+    <w:tmpl w:val="140C6822"/>
+    <w:lvl w:ilvl="0" w:tplc="53380134">
+      <w:start w:val="1"/>
+      <w:numFmt w:val="decimal"/>
+      <w:lvlText w:val="%1."/>
+      <w:lvlJc w:val="left"/>
+      <w:pPr>
+        <w:ind w:left="360" w:hanging="300"/>
+      </w:pPr>
+    </w:lvl>
+    <w:lvl w:ilvl="1" w:tplc="688071EC" w:tentative="1">
+      <w:start w:val="1"/>
+      <w:numFmt w:val="lowerLetter"/>
+      <w:lvlText w:val="%2."/>
+      <w:lvlJc w:val="left"/>
+      <w:pPr>
+        <w:ind w:left="720" w:hanging="300"/>
+      </w:pPr>
+    </w:lvl>
+    <w:lvl w:ilvl="2" w:tplc="F46EADF6" w:tentative="1">
+      <w:start w:val="1"/>
+      <w:numFmt w:val="lowerRoman"/>
+      <w:lvlText w:val="%3."/>
+      <w:lvlJc w:val="left"/>
+      <w:pPr>
+        <w:ind w:left="1080" w:hanging="300"/>
+      </w:pPr>
+    </w:lvl>
+    <w:lvl w:ilvl="3" w:tplc="3CE22D58" w:tentative="1">
+      <w:start w:val="1"/>
+      <w:numFmt w:val="decimal"/>
+      <w:lvlText w:val="%4."/>
+      <w:lvlJc w:val="left"/>
+      <w:pPr>
+        <w:ind w:left="1440" w:hanging="300"/>
+      </w:pPr>
+    </w:lvl>
+    <w:lvl w:ilvl="4" w:tplc="F55C5036">
       <w:numFmt w:val="decimal"/>
       <w:lvlText w:val=""/>
       <w:lvlJc w:val="left"/>
     </w:lvl>
-    <w:lvl w:ilvl="5" w:tplc="7B68ACBC">
+    <w:lvl w:ilvl="5" w:tplc="B44EB4E6">
       <w:numFmt w:val="decimal"/>
       <w:lvlText w:val=""/>
       <w:lvlJc w:val="left"/>
     </w:lvl>
-    <w:lvl w:ilvl="6" w:tplc="27042CAA">
+    <w:lvl w:ilvl="6" w:tplc="5F469E5E">
       <w:numFmt w:val="decimal"/>
       <w:lvlText w:val=""/>
       <w:lvlJc w:val="left"/>
     </w:lvl>
-    <w:lvl w:ilvl="7" w:tplc="BDD08B28">
+    <w:lvl w:ilvl="7" w:tplc="132E301E">
       <w:numFmt w:val="decimal"/>
       <w:lvlText w:val=""/>
       <w:lvlJc w:val="left"/>
     </w:lvl>
-    <w:lvl w:ilvl="8" w:tplc="01206C20">
+    <w:lvl w:ilvl="8" w:tplc="56A8D2BA">
       <w:numFmt w:val="decimal"/>
       <w:lvlText w:val=""/>
       <w:lvlJc w:val="left"/>
     </w:lvl>
   </w:abstractNum>
-  <w:abstractNum w:abstractNumId="1" w15:restartNumberingAfterBreak="0">
-    <w:nsid w:val="51770A2E"/>
+  <w:abstractNum w:abstractNumId="2" w15:restartNumberingAfterBreak="0">
+    <w:nsid w:val="7EAE1AA4"/>
     <w:multiLevelType w:val="hybridMultilevel"/>
-    <w:tmpl w:val="728CE4F8"/>
-    <w:lvl w:ilvl="0" w:tplc="BED44570" w:tentative="1">
+    <w:tmpl w:val="74763A98"/>
+    <w:lvl w:ilvl="0" w:tplc="3B4A06E4">
       <w:start w:val="1"/>
       <w:numFmt w:val="bullet"/>
-      <w:lvlText w:val="●"/>
+      <w:lvlText w:val="•"/>
       <w:lvlJc w:val="left"/>
       <w:pPr>
-        <w:ind w:left="720" w:hanging="360"/>
+        <w:ind w:left="360" w:hanging="260"/>
       </w:pPr>
     </w:lvl>
-    <w:lvl w:ilvl="1" w:tplc="42BA66F6" w:tentative="1">
+    <w:lvl w:ilvl="1" w:tplc="DDA48F44" w:tentative="1">
       <w:start w:val="1"/>
       <w:numFmt w:val="bullet"/>
-      <w:lvlText w:val="○"/>
+      <w:lvlText w:val="–"/>
       <w:lvlJc w:val="left"/>
       <w:pPr>
-        <w:ind w:left="1440" w:hanging="360"/>
+        <w:ind w:left="720" w:hanging="260"/>
       </w:pPr>
     </w:lvl>
-    <w:lvl w:ilvl="2" w:tplc="840664AC" w:tentative="1">
+    <w:lvl w:ilvl="2" w:tplc="B296D0FC" w:tentative="1">
       <w:start w:val="1"/>
       <w:numFmt w:val="bullet"/>
-      <w:lvlText w:val="■"/>
+      <w:lvlText w:val="◦"/>
       <w:lvlJc w:val="left"/>
       <w:pPr>
-        <w:ind w:left="2160" w:hanging="360"/>
+        <w:ind w:left="1080" w:hanging="260"/>
       </w:pPr>
     </w:lvl>
-    <w:lvl w:ilvl="3" w:tplc="A9746996" w:tentative="1">
+    <w:lvl w:ilvl="3" w:tplc="E8ACD3D2" w:tentative="1">
       <w:start w:val="1"/>
       <w:numFmt w:val="bullet"/>
-      <w:lvlText w:val="●"/>
+      <w:lvlText w:val="•"/>
       <w:lvlJc w:val="left"/>
       <w:pPr>
-        <w:ind w:left="2880" w:hanging="360"/>
+        <w:ind w:left="1440" w:hanging="260"/>
       </w:pPr>
     </w:lvl>
-    <w:lvl w:ilvl="4" w:tplc="03ECBB86" w:tentative="1">
-      <w:start w:val="1"/>
-      <w:numFmt w:val="bullet"/>
-      <w:lvlText w:val="○"/>
-      <w:lvlJc w:val="left"/>
-      <w:pPr>
-        <w:ind w:left="3600" w:hanging="360"/>
-      </w:pPr>
-    </w:lvl>
-    <w:lvl w:ilvl="5" w:tplc="A9CC6FB8" w:tentative="1">
-      <w:start w:val="1"/>
-      <w:numFmt w:val="bullet"/>
-      <w:lvlText w:val="■"/>
-      <w:lvlJc w:val="left"/>
-      <w:pPr>
-        <w:ind w:left="4320" w:hanging="360"/>
-      </w:pPr>
-    </w:lvl>
-    <w:lvl w:ilvl="6" w:tplc="697A0AA6" w:tentative="1">
-      <w:start w:val="1"/>
-      <w:numFmt w:val="bullet"/>
-      <w:lvlText w:val="●"/>
-      <w:lvlJc w:val="left"/>
-      <w:pPr>
-        <w:ind w:left="5040" w:hanging="360"/>
-      </w:pPr>
-    </w:lvl>
-    <w:lvl w:ilvl="7" w:tplc="DFC42092" w:tentative="1">
-      <w:start w:val="1"/>
-      <w:numFmt w:val="bullet"/>
-      <w:lvlText w:val="●"/>
-      <w:lvlJc w:val="left"/>
-      <w:pPr>
-        <w:ind w:left="5760" w:hanging="360"/>
-      </w:pPr>
-    </w:lvl>
-    <w:lvl w:ilvl="8" w:tplc="EF5EB1FA" w:tentative="1">
-      <w:start w:val="1"/>
-      <w:numFmt w:val="bullet"/>
-      <w:lvlText w:val="●"/>
-      <w:lvlJc w:val="left"/>
-      <w:pPr>
-        <w:ind w:left="6480" w:hanging="360"/>
-      </w:pPr>
-    </w:lvl>
-  </w:abstractNum>
-  <w:abstractNum w:abstractNumId="2" w15:restartNumberingAfterBreak="0">
-    <w:nsid w:val="6C971A42"/>
-    <w:multiLevelType w:val="hybridMultilevel"/>
-    <w:tmpl w:val="2EAE1B08"/>
-    <w:lvl w:ilvl="0" w:tplc="58C85A18">
-      <w:start w:val="1"/>
-      <w:numFmt w:val="decimal"/>
-      <w:lvlText w:val="%1."/>
-      <w:lvlJc w:val="left"/>
-      <w:pPr>
-        <w:ind w:left="360" w:hanging="300"/>
-      </w:pPr>
-    </w:lvl>
-    <w:lvl w:ilvl="1" w:tplc="B344D46E" w:tentative="1">
-      <w:start w:val="1"/>
-      <w:numFmt w:val="lowerLetter"/>
-      <w:lvlText w:val="%2."/>
-      <w:lvlJc w:val="left"/>
-      <w:pPr>
-        <w:ind w:left="720" w:hanging="300"/>
-      </w:pPr>
-    </w:lvl>
-    <w:lvl w:ilvl="2" w:tplc="06CE55E2" w:tentative="1">
-      <w:start w:val="1"/>
-      <w:numFmt w:val="lowerRoman"/>
-      <w:lvlText w:val="%3."/>
-      <w:lvlJc w:val="left"/>
-      <w:pPr>
-        <w:ind w:left="1080" w:hanging="300"/>
-      </w:pPr>
-    </w:lvl>
-    <w:lvl w:ilvl="3" w:tplc="5704A400" w:tentative="1">
-      <w:start w:val="1"/>
-      <w:numFmt w:val="decimal"/>
-      <w:lvlText w:val="%4."/>
-      <w:lvlJc w:val="left"/>
-      <w:pPr>
-        <w:ind w:left="1440" w:hanging="300"/>
-      </w:pPr>
-    </w:lvl>
-    <w:lvl w:ilvl="4" w:tplc="0C0452CA">
+    <w:lvl w:ilvl="4" w:tplc="BDB2C4C8">
       <w:numFmt w:val="decimal"/>
       <w:lvlText w:val=""/>
       <w:lvlJc w:val="left"/>
     </w:lvl>
-    <w:lvl w:ilvl="5" w:tplc="A5F893D8">
+    <w:lvl w:ilvl="5" w:tplc="DAF209A2">
       <w:numFmt w:val="decimal"/>
       <w:lvlText w:val=""/>
       <w:lvlJc w:val="left"/>
     </w:lvl>
-    <w:lvl w:ilvl="6" w:tplc="741E03F6">
+    <w:lvl w:ilvl="6" w:tplc="EBC0C9C0">
       <w:numFmt w:val="decimal"/>
       <w:lvlText w:val=""/>
       <w:lvlJc w:val="left"/>
     </w:lvl>
-    <w:lvl w:ilvl="7" w:tplc="66F8B198">
+    <w:lvl w:ilvl="7" w:tplc="773C9AC4">
       <w:numFmt w:val="decimal"/>
       <w:lvlText w:val=""/>
       <w:lvlJc w:val="left"/>
     </w:lvl>
-    <w:lvl w:ilvl="8" w:tplc="962E08CA">
+    <w:lvl w:ilvl="8" w:tplc="B6C8CFA2">
       <w:numFmt w:val="decimal"/>
       <w:lvlText w:val=""/>
       <w:lvlJc w:val="left"/>
     </w:lvl>
   </w:abstractNum>
-  <w:num w:numId="1" w16cid:durableId="2072195840">
+  <w:num w:numId="1" w16cid:durableId="717365827">
+    <w:abstractNumId w:val="0"/>
+    <w:lvlOverride w:ilvl="0">
+      <w:startOverride w:val="1"/>
+    </w:lvlOverride>
+  </w:num>
+  <w:num w:numId="2" w16cid:durableId="212236999">
+    <w:abstractNumId w:val="2"/>
+    <w:lvlOverride w:ilvl="0">
+      <w:startOverride w:val="1"/>
+    </w:lvlOverride>
+  </w:num>
+  <w:num w:numId="3" w16cid:durableId="974725758">
     <w:abstractNumId w:val="1"/>
     <w:lvlOverride w:ilvl="0">
       <w:startOverride w:val="1"/>
     </w:lvlOverride>
   </w:num>
-  <w:num w:numId="2" w16cid:durableId="2117169053">
-    <w:abstractNumId w:val="0"/>
+  <w:num w:numId="4" w16cid:durableId="1307005797">
+    <w:abstractNumId w:val="1"/>
     <w:lvlOverride w:ilvl="0">
       <w:startOverride w:val="1"/>
     </w:lvlOverride>
   </w:num>
-  <w:num w:numId="3" w16cid:durableId="1718971133">
-    <w:abstractNumId w:val="2"/>
+  <w:num w:numId="5" w16cid:durableId="1669747376">
+    <w:abstractNumId w:val="1"/>
     <w:lvlOverride w:ilvl="0">
       <w:startOverride w:val="1"/>
     </w:lvlOverride>
   </w:num>
-  <w:num w:numId="4" w16cid:durableId="573246866">
-    <w:abstractNumId w:val="2"/>
+  <w:num w:numId="6" w16cid:durableId="1324237638">
+    <w:abstractNumId w:val="1"/>
     <w:lvlOverride w:ilvl="0">
       <w:startOverride w:val="1"/>
     </w:lvlOverride>
   </w:num>
-  <w:num w:numId="5" w16cid:durableId="1531719550">
-    <w:abstractNumId w:val="2"/>
+  <w:num w:numId="7" w16cid:durableId="1852836753">
+    <w:abstractNumId w:val="1"/>
     <w:lvlOverride w:ilvl="0">
       <w:startOverride w:val="1"/>
     </w:lvlOverride>
   </w:num>
-  <w:num w:numId="6" w16cid:durableId="2057772294">
-    <w:abstractNumId w:val="2"/>
+  <w:num w:numId="8" w16cid:durableId="796796636">
+    <w:abstractNumId w:val="1"/>
     <w:lvlOverride w:ilvl="0">
       <w:startOverride w:val="1"/>
     </w:lvlOverride>
   </w:num>
-  <w:num w:numId="7" w16cid:durableId="614992864">
-    <w:abstractNumId w:val="2"/>
+  <w:num w:numId="9" w16cid:durableId="1298952261">
+    <w:abstractNumId w:val="1"/>
     <w:lvlOverride w:ilvl="0">
       <w:startOverride w:val="1"/>
     </w:lvlOverride>
   </w:num>
-  <w:num w:numId="8" w16cid:durableId="1911964870">
-    <w:abstractNumId w:val="2"/>
+  <w:num w:numId="10" w16cid:durableId="1547527071">
+    <w:abstractNumId w:val="1"/>
     <w:lvlOverride w:ilvl="0">
       <w:startOverride w:val="1"/>
     </w:lvlOverride>
   </w:num>
-  <w:num w:numId="9" w16cid:durableId="533225963">
-    <w:abstractNumId w:val="2"/>
+  <w:num w:numId="11" w16cid:durableId="2079280923">
+    <w:abstractNumId w:val="1"/>
     <w:lvlOverride w:ilvl="0">
       <w:startOverride w:val="1"/>
     </w:lvlOverride>
   </w:num>
-  <w:num w:numId="10" w16cid:durableId="1678580009">
-    <w:abstractNumId w:val="2"/>
+  <w:num w:numId="12" w16cid:durableId="627128402">
+    <w:abstractNumId w:val="1"/>
     <w:lvlOverride w:ilvl="0">
       <w:startOverride w:val="1"/>
     </w:lvlOverride>
   </w:num>
-  <w:num w:numId="11" w16cid:durableId="1337880585">
-    <w:abstractNumId w:val="2"/>
-    <w:lvlOverride w:ilvl="0">
-      <w:startOverride w:val="1"/>
-    </w:lvlOverride>
-  </w:num>
-  <w:num w:numId="12" w16cid:durableId="1736276111">
-    <w:abstractNumId w:val="2"/>
-    <w:lvlOverride w:ilvl="0">
-      <w:startOverride w:val="1"/>
-    </w:lvlOverride>
-  </w:num>
-  <w:num w:numId="13" w16cid:durableId="2003461232">
-    <w:abstractNumId w:val="2"/>
+  <w:num w:numId="13" w16cid:durableId="766536955">
+    <w:abstractNumId w:val="1"/>
     <w:lvlOverride w:ilvl="0">
       <w:startOverride w:val="1"/>
     </w:lvlOverride>
@@ -26349,7 +26349,7 @@
     <w:autoRedefine/>
     <w:uiPriority w:val="39"/>
     <w:unhideWhenUsed/>
-    <w:rsid w:val="00663ED4"/>
+    <w:rsid w:val="00464AE1"/>
     <w:pPr>
       <w:spacing w:after="100"/>
     </w:pPr>
@@ -26361,7 +26361,7 @@
     <w:autoRedefine/>
     <w:uiPriority w:val="39"/>
     <w:unhideWhenUsed/>
-    <w:rsid w:val="00663ED4"/>
+    <w:rsid w:val="00464AE1"/>
     <w:pPr>
       <w:spacing w:after="100"/>
       <w:ind w:left="200"/>
@@ -26374,7 +26374,7 @@
     <w:autoRedefine/>
     <w:uiPriority w:val="39"/>
     <w:unhideWhenUsed/>
-    <w:rsid w:val="00663ED4"/>
+    <w:rsid w:val="00464AE1"/>
     <w:pPr>
       <w:spacing w:after="100"/>
       <w:ind w:left="400"/>

</xml_diff>

<commit_message>
Skip the image configuration refusal without a note
Column and table image configurations refused with Dataverse's own security error (0x80040256), which some environments give even to System Administrators, are no longer named in the Not checked note. A refusal for a missing privilege is still named; the refusals stay in the JSON export.
</commit_message>
<xml_diff>
--- a/docs/UnmanagedLayerScanner - Technical Reference.docx
+++ b/docs/UnmanagedLayerScanner - Technical Reference.docx
@@ -38,7 +38,7 @@
           <w:noProof/>
         </w:rPr>
         <w:drawing>
-          <wp:inline distT="0" distB="0" distL="0" distR="0" wp14:anchorId="0ED6EA14" wp14:editId="65DEC8F8">
+          <wp:inline distT="0" distB="0" distL="0" distR="0" wp14:anchorId="76C59518" wp14:editId="14F5C2EA">
             <wp:extent cx="5943600" cy="4229100"/>
             <wp:effectExtent l="0" t="0" r="0" b="0"/>
             <wp:docPr id="19" name="results.png" descr="The results of a scan" title="The results of a scan"/>
@@ -135,7 +135,7 @@
     <w:sdt>
       <w:sdtPr>
         <w:alias w:val="Contents"/>
-        <w:id w:val="-1795438612"/>
+        <w:id w:val="1838260141"/>
       </w:sdtPr>
       <w:sdtEndPr/>
       <w:sdtContent>
@@ -164,7 +164,7 @@
           <w:r>
             <w:fldChar w:fldCharType="separate"/>
           </w:r>
-          <w:hyperlink w:anchor="_Toc242970840" w:history="1">
+          <w:hyperlink w:anchor="_Toc242972768" w:history="1">
             <w:r>
               <w:rPr>
                 <w:rStyle w:val="Hyperlink"/>
@@ -188,7 +188,7 @@
               <w:rPr>
                 <w:noProof/>
               </w:rPr>
-              <w:instrText xml:space="preserve"> PAGEREF _Toc242970840 \h </w:instrText>
+              <w:instrText xml:space="preserve"> PAGEREF _Toc242972768 \h </w:instrText>
             </w:r>
             <w:r>
               <w:rPr>
@@ -231,7 +231,7 @@
               <w14:ligatures w14:val="standardContextual"/>
             </w:rPr>
           </w:pPr>
-          <w:hyperlink w:anchor="_Toc242970841" w:history="1">
+          <w:hyperlink w:anchor="_Toc242972769" w:history="1">
             <w:r>
               <w:rPr>
                 <w:rStyle w:val="Hyperlink"/>
@@ -255,7 +255,7 @@
               <w:rPr>
                 <w:noProof/>
               </w:rPr>
-              <w:instrText xml:space="preserve"> PAGEREF _Toc242970841 \h </w:instrText>
+              <w:instrText xml:space="preserve"> PAGEREF _Toc242972769 \h </w:instrText>
             </w:r>
             <w:r>
               <w:rPr>
@@ -298,7 +298,7 @@
               <w14:ligatures w14:val="standardContextual"/>
             </w:rPr>
           </w:pPr>
-          <w:hyperlink w:anchor="_Toc242970842" w:history="1">
+          <w:hyperlink w:anchor="_Toc242972770" w:history="1">
             <w:r>
               <w:rPr>
                 <w:rStyle w:val="Hyperlink"/>
@@ -322,7 +322,7 @@
               <w:rPr>
                 <w:noProof/>
               </w:rPr>
-              <w:instrText xml:space="preserve"> PAGEREF _Toc242970842 \h </w:instrText>
+              <w:instrText xml:space="preserve"> PAGEREF _Toc242972770 \h </w:instrText>
             </w:r>
             <w:r>
               <w:rPr>
@@ -365,7 +365,7 @@
               <w14:ligatures w14:val="standardContextual"/>
             </w:rPr>
           </w:pPr>
-          <w:hyperlink w:anchor="_Toc242970843" w:history="1">
+          <w:hyperlink w:anchor="_Toc242972771" w:history="1">
             <w:r>
               <w:rPr>
                 <w:rStyle w:val="Hyperlink"/>
@@ -389,7 +389,7 @@
               <w:rPr>
                 <w:noProof/>
               </w:rPr>
-              <w:instrText xml:space="preserve"> PAGEREF _Toc242970843 \h </w:instrText>
+              <w:instrText xml:space="preserve"> PAGEREF _Toc242972771 \h </w:instrText>
             </w:r>
             <w:r>
               <w:rPr>
@@ -432,7 +432,7 @@
               <w14:ligatures w14:val="standardContextual"/>
             </w:rPr>
           </w:pPr>
-          <w:hyperlink w:anchor="_Toc242970844" w:history="1">
+          <w:hyperlink w:anchor="_Toc242972772" w:history="1">
             <w:r>
               <w:rPr>
                 <w:rStyle w:val="Hyperlink"/>
@@ -456,7 +456,7 @@
               <w:rPr>
                 <w:noProof/>
               </w:rPr>
-              <w:instrText xml:space="preserve"> PAGEREF _Toc242970844 \h </w:instrText>
+              <w:instrText xml:space="preserve"> PAGEREF _Toc242972772 \h </w:instrText>
             </w:r>
             <w:r>
               <w:rPr>
@@ -499,7 +499,7 @@
               <w14:ligatures w14:val="standardContextual"/>
             </w:rPr>
           </w:pPr>
-          <w:hyperlink w:anchor="_Toc242970845" w:history="1">
+          <w:hyperlink w:anchor="_Toc242972773" w:history="1">
             <w:r>
               <w:rPr>
                 <w:rStyle w:val="Hyperlink"/>
@@ -523,7 +523,7 @@
               <w:rPr>
                 <w:noProof/>
               </w:rPr>
-              <w:instrText xml:space="preserve"> PAGEREF _Toc242970845 \h </w:instrText>
+              <w:instrText xml:space="preserve"> PAGEREF _Toc242972773 \h </w:instrText>
             </w:r>
             <w:r>
               <w:rPr>
@@ -566,7 +566,7 @@
               <w14:ligatures w14:val="standardContextual"/>
             </w:rPr>
           </w:pPr>
-          <w:hyperlink w:anchor="_Toc242970846" w:history="1">
+          <w:hyperlink w:anchor="_Toc242972774" w:history="1">
             <w:r>
               <w:rPr>
                 <w:rStyle w:val="Hyperlink"/>
@@ -590,7 +590,7 @@
               <w:rPr>
                 <w:noProof/>
               </w:rPr>
-              <w:instrText xml:space="preserve"> PAGEREF _Toc242970846 \h </w:instrText>
+              <w:instrText xml:space="preserve"> PAGEREF _Toc242972774 \h </w:instrText>
             </w:r>
             <w:r>
               <w:rPr>
@@ -633,7 +633,7 @@
               <w14:ligatures w14:val="standardContextual"/>
             </w:rPr>
           </w:pPr>
-          <w:hyperlink w:anchor="_Toc242970847" w:history="1">
+          <w:hyperlink w:anchor="_Toc242972775" w:history="1">
             <w:r>
               <w:rPr>
                 <w:rStyle w:val="Hyperlink"/>
@@ -657,7 +657,7 @@
               <w:rPr>
                 <w:noProof/>
               </w:rPr>
-              <w:instrText xml:space="preserve"> PAGEREF _Toc242970847 \h </w:instrText>
+              <w:instrText xml:space="preserve"> PAGEREF _Toc242972775 \h </w:instrText>
             </w:r>
             <w:r>
               <w:rPr>
@@ -700,7 +700,7 @@
               <w14:ligatures w14:val="standardContextual"/>
             </w:rPr>
           </w:pPr>
-          <w:hyperlink w:anchor="_Toc242970848" w:history="1">
+          <w:hyperlink w:anchor="_Toc242972776" w:history="1">
             <w:r>
               <w:rPr>
                 <w:rStyle w:val="Hyperlink"/>
@@ -724,7 +724,7 @@
               <w:rPr>
                 <w:noProof/>
               </w:rPr>
-              <w:instrText xml:space="preserve"> PAGEREF _Toc242970848 \h </w:instrText>
+              <w:instrText xml:space="preserve"> PAGEREF _Toc242972776 \h </w:instrText>
             </w:r>
             <w:r>
               <w:rPr>
@@ -767,7 +767,7 @@
               <w14:ligatures w14:val="standardContextual"/>
             </w:rPr>
           </w:pPr>
-          <w:hyperlink w:anchor="_Toc242970849" w:history="1">
+          <w:hyperlink w:anchor="_Toc242972777" w:history="1">
             <w:r>
               <w:rPr>
                 <w:rStyle w:val="Hyperlink"/>
@@ -791,7 +791,7 @@
               <w:rPr>
                 <w:noProof/>
               </w:rPr>
-              <w:instrText xml:space="preserve"> PAGEREF _Toc242970849 \h </w:instrText>
+              <w:instrText xml:space="preserve"> PAGEREF _Toc242972777 \h </w:instrText>
             </w:r>
             <w:r>
               <w:rPr>
@@ -834,7 +834,7 @@
               <w14:ligatures w14:val="standardContextual"/>
             </w:rPr>
           </w:pPr>
-          <w:hyperlink w:anchor="_Toc242970850" w:history="1">
+          <w:hyperlink w:anchor="_Toc242972778" w:history="1">
             <w:r>
               <w:rPr>
                 <w:rStyle w:val="Hyperlink"/>
@@ -858,7 +858,7 @@
               <w:rPr>
                 <w:noProof/>
               </w:rPr>
-              <w:instrText xml:space="preserve"> PAGEREF _Toc242970850 \h </w:instrText>
+              <w:instrText xml:space="preserve"> PAGEREF _Toc242972778 \h </w:instrText>
             </w:r>
             <w:r>
               <w:rPr>
@@ -901,7 +901,7 @@
               <w14:ligatures w14:val="standardContextual"/>
             </w:rPr>
           </w:pPr>
-          <w:hyperlink w:anchor="_Toc242970851" w:history="1">
+          <w:hyperlink w:anchor="_Toc242972779" w:history="1">
             <w:r>
               <w:rPr>
                 <w:rStyle w:val="Hyperlink"/>
@@ -925,7 +925,7 @@
               <w:rPr>
                 <w:noProof/>
               </w:rPr>
-              <w:instrText xml:space="preserve"> PAGEREF _Toc242970851 \h </w:instrText>
+              <w:instrText xml:space="preserve"> PAGEREF _Toc242972779 \h </w:instrText>
             </w:r>
             <w:r>
               <w:rPr>
@@ -968,7 +968,7 @@
               <w14:ligatures w14:val="standardContextual"/>
             </w:rPr>
           </w:pPr>
-          <w:hyperlink w:anchor="_Toc242970852" w:history="1">
+          <w:hyperlink w:anchor="_Toc242972780" w:history="1">
             <w:r>
               <w:rPr>
                 <w:rStyle w:val="Hyperlink"/>
@@ -992,7 +992,7 @@
               <w:rPr>
                 <w:noProof/>
               </w:rPr>
-              <w:instrText xml:space="preserve"> PAGEREF _Toc242970852 \h </w:instrText>
+              <w:instrText xml:space="preserve"> PAGEREF _Toc242972780 \h </w:instrText>
             </w:r>
             <w:r>
               <w:rPr>
@@ -1035,7 +1035,7 @@
               <w14:ligatures w14:val="standardContextual"/>
             </w:rPr>
           </w:pPr>
-          <w:hyperlink w:anchor="_Toc242970853" w:history="1">
+          <w:hyperlink w:anchor="_Toc242972781" w:history="1">
             <w:r>
               <w:rPr>
                 <w:rStyle w:val="Hyperlink"/>
@@ -1059,7 +1059,7 @@
               <w:rPr>
                 <w:noProof/>
               </w:rPr>
-              <w:instrText xml:space="preserve"> PAGEREF _Toc242970853 \h </w:instrText>
+              <w:instrText xml:space="preserve"> PAGEREF _Toc242972781 \h </w:instrText>
             </w:r>
             <w:r>
               <w:rPr>
@@ -1102,7 +1102,7 @@
               <w14:ligatures w14:val="standardContextual"/>
             </w:rPr>
           </w:pPr>
-          <w:hyperlink w:anchor="_Toc242970854" w:history="1">
+          <w:hyperlink w:anchor="_Toc242972782" w:history="1">
             <w:r>
               <w:rPr>
                 <w:rStyle w:val="Hyperlink"/>
@@ -1126,7 +1126,7 @@
               <w:rPr>
                 <w:noProof/>
               </w:rPr>
-              <w:instrText xml:space="preserve"> PAGEREF _Toc242970854 \h </w:instrText>
+              <w:instrText xml:space="preserve"> PAGEREF _Toc242972782 \h </w:instrText>
             </w:r>
             <w:r>
               <w:rPr>
@@ -1169,7 +1169,7 @@
               <w14:ligatures w14:val="standardContextual"/>
             </w:rPr>
           </w:pPr>
-          <w:hyperlink w:anchor="_Toc242970855" w:history="1">
+          <w:hyperlink w:anchor="_Toc242972783" w:history="1">
             <w:r>
               <w:rPr>
                 <w:rStyle w:val="Hyperlink"/>
@@ -1193,7 +1193,7 @@
               <w:rPr>
                 <w:noProof/>
               </w:rPr>
-              <w:instrText xml:space="preserve"> PAGEREF _Toc242970855 \h </w:instrText>
+              <w:instrText xml:space="preserve"> PAGEREF _Toc242972783 \h </w:instrText>
             </w:r>
             <w:r>
               <w:rPr>
@@ -1236,7 +1236,7 @@
               <w14:ligatures w14:val="standardContextual"/>
             </w:rPr>
           </w:pPr>
-          <w:hyperlink w:anchor="_Toc242970856" w:history="1">
+          <w:hyperlink w:anchor="_Toc242972784" w:history="1">
             <w:r>
               <w:rPr>
                 <w:rStyle w:val="Hyperlink"/>
@@ -1260,7 +1260,7 @@
               <w:rPr>
                 <w:noProof/>
               </w:rPr>
-              <w:instrText xml:space="preserve"> PAGEREF _Toc242970856 \h </w:instrText>
+              <w:instrText xml:space="preserve"> PAGEREF _Toc242972784 \h </w:instrText>
             </w:r>
             <w:r>
               <w:rPr>
@@ -1303,7 +1303,7 @@
               <w14:ligatures w14:val="standardContextual"/>
             </w:rPr>
           </w:pPr>
-          <w:hyperlink w:anchor="_Toc242970857" w:history="1">
+          <w:hyperlink w:anchor="_Toc242972785" w:history="1">
             <w:r>
               <w:rPr>
                 <w:rStyle w:val="Hyperlink"/>
@@ -1327,7 +1327,7 @@
               <w:rPr>
                 <w:noProof/>
               </w:rPr>
-              <w:instrText xml:space="preserve"> PAGEREF _Toc242970857 \h </w:instrText>
+              <w:instrText xml:space="preserve"> PAGEREF _Toc242972785 \h </w:instrText>
             </w:r>
             <w:r>
               <w:rPr>
@@ -1370,7 +1370,7 @@
               <w14:ligatures w14:val="standardContextual"/>
             </w:rPr>
           </w:pPr>
-          <w:hyperlink w:anchor="_Toc242970858" w:history="1">
+          <w:hyperlink w:anchor="_Toc242972786" w:history="1">
             <w:r>
               <w:rPr>
                 <w:rStyle w:val="Hyperlink"/>
@@ -1394,7 +1394,7 @@
               <w:rPr>
                 <w:noProof/>
               </w:rPr>
-              <w:instrText xml:space="preserve"> PAGEREF _Toc242970858 \h </w:instrText>
+              <w:instrText xml:space="preserve"> PAGEREF _Toc242972786 \h </w:instrText>
             </w:r>
             <w:r>
               <w:rPr>
@@ -1437,7 +1437,7 @@
               <w14:ligatures w14:val="standardContextual"/>
             </w:rPr>
           </w:pPr>
-          <w:hyperlink w:anchor="_Toc242970859" w:history="1">
+          <w:hyperlink w:anchor="_Toc242972787" w:history="1">
             <w:r>
               <w:rPr>
                 <w:rStyle w:val="Hyperlink"/>
@@ -1461,7 +1461,7 @@
               <w:rPr>
                 <w:noProof/>
               </w:rPr>
-              <w:instrText xml:space="preserve"> PAGEREF _Toc242970859 \h </w:instrText>
+              <w:instrText xml:space="preserve"> PAGEREF _Toc242972787 \h </w:instrText>
             </w:r>
             <w:r>
               <w:rPr>
@@ -1504,7 +1504,7 @@
               <w14:ligatures w14:val="standardContextual"/>
             </w:rPr>
           </w:pPr>
-          <w:hyperlink w:anchor="_Toc242970860" w:history="1">
+          <w:hyperlink w:anchor="_Toc242972788" w:history="1">
             <w:r>
               <w:rPr>
                 <w:rStyle w:val="Hyperlink"/>
@@ -1528,7 +1528,7 @@
               <w:rPr>
                 <w:noProof/>
               </w:rPr>
-              <w:instrText xml:space="preserve"> PAGEREF _Toc242970860 \h </w:instrText>
+              <w:instrText xml:space="preserve"> PAGEREF _Toc242972788 \h </w:instrText>
             </w:r>
             <w:r>
               <w:rPr>
@@ -1571,7 +1571,7 @@
               <w14:ligatures w14:val="standardContextual"/>
             </w:rPr>
           </w:pPr>
-          <w:hyperlink w:anchor="_Toc242970861" w:history="1">
+          <w:hyperlink w:anchor="_Toc242972789" w:history="1">
             <w:r>
               <w:rPr>
                 <w:rStyle w:val="Hyperlink"/>
@@ -1595,7 +1595,7 @@
               <w:rPr>
                 <w:noProof/>
               </w:rPr>
-              <w:instrText xml:space="preserve"> PAGEREF _Toc242970861 \h </w:instrText>
+              <w:instrText xml:space="preserve"> PAGEREF _Toc242972789 \h </w:instrText>
             </w:r>
             <w:r>
               <w:rPr>
@@ -1638,7 +1638,7 @@
               <w14:ligatures w14:val="standardContextual"/>
             </w:rPr>
           </w:pPr>
-          <w:hyperlink w:anchor="_Toc242970862" w:history="1">
+          <w:hyperlink w:anchor="_Toc242972790" w:history="1">
             <w:r>
               <w:rPr>
                 <w:rStyle w:val="Hyperlink"/>
@@ -1662,7 +1662,7 @@
               <w:rPr>
                 <w:noProof/>
               </w:rPr>
-              <w:instrText xml:space="preserve"> PAGEREF _Toc242970862 \h </w:instrText>
+              <w:instrText xml:space="preserve"> PAGEREF _Toc242972790 \h </w:instrText>
             </w:r>
             <w:r>
               <w:rPr>
@@ -1705,7 +1705,7 @@
               <w14:ligatures w14:val="standardContextual"/>
             </w:rPr>
           </w:pPr>
-          <w:hyperlink w:anchor="_Toc242970863" w:history="1">
+          <w:hyperlink w:anchor="_Toc242972791" w:history="1">
             <w:r>
               <w:rPr>
                 <w:rStyle w:val="Hyperlink"/>
@@ -1729,7 +1729,7 @@
               <w:rPr>
                 <w:noProof/>
               </w:rPr>
-              <w:instrText xml:space="preserve"> PAGEREF _Toc242970863 \h </w:instrText>
+              <w:instrText xml:space="preserve"> PAGEREF _Toc242972791 \h </w:instrText>
             </w:r>
             <w:r>
               <w:rPr>
@@ -1772,7 +1772,7 @@
               <w14:ligatures w14:val="standardContextual"/>
             </w:rPr>
           </w:pPr>
-          <w:hyperlink w:anchor="_Toc242970864" w:history="1">
+          <w:hyperlink w:anchor="_Toc242972792" w:history="1">
             <w:r>
               <w:rPr>
                 <w:rStyle w:val="Hyperlink"/>
@@ -1796,7 +1796,7 @@
               <w:rPr>
                 <w:noProof/>
               </w:rPr>
-              <w:instrText xml:space="preserve"> PAGEREF _Toc242970864 \h </w:instrText>
+              <w:instrText xml:space="preserve"> PAGEREF _Toc242972792 \h </w:instrText>
             </w:r>
             <w:r>
               <w:rPr>
@@ -1839,7 +1839,7 @@
               <w14:ligatures w14:val="standardContextual"/>
             </w:rPr>
           </w:pPr>
-          <w:hyperlink w:anchor="_Toc242970865" w:history="1">
+          <w:hyperlink w:anchor="_Toc242972793" w:history="1">
             <w:r>
               <w:rPr>
                 <w:rStyle w:val="Hyperlink"/>
@@ -1863,7 +1863,7 @@
               <w:rPr>
                 <w:noProof/>
               </w:rPr>
-              <w:instrText xml:space="preserve"> PAGEREF _Toc242970865 \h </w:instrText>
+              <w:instrText xml:space="preserve"> PAGEREF _Toc242972793 \h </w:instrText>
             </w:r>
             <w:r>
               <w:rPr>
@@ -1906,7 +1906,7 @@
               <w14:ligatures w14:val="standardContextual"/>
             </w:rPr>
           </w:pPr>
-          <w:hyperlink w:anchor="_Toc242970866" w:history="1">
+          <w:hyperlink w:anchor="_Toc242972794" w:history="1">
             <w:r>
               <w:rPr>
                 <w:rStyle w:val="Hyperlink"/>
@@ -1930,7 +1930,7 @@
               <w:rPr>
                 <w:noProof/>
               </w:rPr>
-              <w:instrText xml:space="preserve"> PAGEREF _Toc242970866 \h </w:instrText>
+              <w:instrText xml:space="preserve"> PAGEREF _Toc242972794 \h </w:instrText>
             </w:r>
             <w:r>
               <w:rPr>
@@ -1973,7 +1973,7 @@
               <w14:ligatures w14:val="standardContextual"/>
             </w:rPr>
           </w:pPr>
-          <w:hyperlink w:anchor="_Toc242970867" w:history="1">
+          <w:hyperlink w:anchor="_Toc242972795" w:history="1">
             <w:r>
               <w:rPr>
                 <w:rStyle w:val="Hyperlink"/>
@@ -1997,7 +1997,7 @@
               <w:rPr>
                 <w:noProof/>
               </w:rPr>
-              <w:instrText xml:space="preserve"> PAGEREF _Toc242970867 \h </w:instrText>
+              <w:instrText xml:space="preserve"> PAGEREF _Toc242972795 \h </w:instrText>
             </w:r>
             <w:r>
               <w:rPr>
@@ -2040,7 +2040,7 @@
               <w14:ligatures w14:val="standardContextual"/>
             </w:rPr>
           </w:pPr>
-          <w:hyperlink w:anchor="_Toc242970868" w:history="1">
+          <w:hyperlink w:anchor="_Toc242972796" w:history="1">
             <w:r>
               <w:rPr>
                 <w:rStyle w:val="Hyperlink"/>
@@ -2064,7 +2064,7 @@
               <w:rPr>
                 <w:noProof/>
               </w:rPr>
-              <w:instrText xml:space="preserve"> PAGEREF _Toc242970868 \h </w:instrText>
+              <w:instrText xml:space="preserve"> PAGEREF _Toc242972796 \h </w:instrText>
             </w:r>
             <w:r>
               <w:rPr>
@@ -2107,7 +2107,7 @@
               <w14:ligatures w14:val="standardContextual"/>
             </w:rPr>
           </w:pPr>
-          <w:hyperlink w:anchor="_Toc242970869" w:history="1">
+          <w:hyperlink w:anchor="_Toc242972797" w:history="1">
             <w:r>
               <w:rPr>
                 <w:rStyle w:val="Hyperlink"/>
@@ -2131,7 +2131,7 @@
               <w:rPr>
                 <w:noProof/>
               </w:rPr>
-              <w:instrText xml:space="preserve"> PAGEREF _Toc242970869 \h </w:instrText>
+              <w:instrText xml:space="preserve"> PAGEREF _Toc242972797 \h </w:instrText>
             </w:r>
             <w:r>
               <w:rPr>
@@ -2174,7 +2174,7 @@
               <w14:ligatures w14:val="standardContextual"/>
             </w:rPr>
           </w:pPr>
-          <w:hyperlink w:anchor="_Toc242970870" w:history="1">
+          <w:hyperlink w:anchor="_Toc242972798" w:history="1">
             <w:r>
               <w:rPr>
                 <w:rStyle w:val="Hyperlink"/>
@@ -2198,7 +2198,7 @@
               <w:rPr>
                 <w:noProof/>
               </w:rPr>
-              <w:instrText xml:space="preserve"> PAGEREF _Toc242970870 \h </w:instrText>
+              <w:instrText xml:space="preserve"> PAGEREF _Toc242972798 \h </w:instrText>
             </w:r>
             <w:r>
               <w:rPr>
@@ -2241,7 +2241,7 @@
               <w14:ligatures w14:val="standardContextual"/>
             </w:rPr>
           </w:pPr>
-          <w:hyperlink w:anchor="_Toc242970871" w:history="1">
+          <w:hyperlink w:anchor="_Toc242972799" w:history="1">
             <w:r>
               <w:rPr>
                 <w:rStyle w:val="Hyperlink"/>
@@ -2265,7 +2265,7 @@
               <w:rPr>
                 <w:noProof/>
               </w:rPr>
-              <w:instrText xml:space="preserve"> PAGEREF _Toc242970871 \h </w:instrText>
+              <w:instrText xml:space="preserve"> PAGEREF _Toc242972799 \h </w:instrText>
             </w:r>
             <w:r>
               <w:rPr>
@@ -2308,7 +2308,7 @@
               <w14:ligatures w14:val="standardContextual"/>
             </w:rPr>
           </w:pPr>
-          <w:hyperlink w:anchor="_Toc242970872" w:history="1">
+          <w:hyperlink w:anchor="_Toc242972800" w:history="1">
             <w:r>
               <w:rPr>
                 <w:rStyle w:val="Hyperlink"/>
@@ -2332,7 +2332,7 @@
               <w:rPr>
                 <w:noProof/>
               </w:rPr>
-              <w:instrText xml:space="preserve"> PAGEREF _Toc242970872 \h </w:instrText>
+              <w:instrText xml:space="preserve"> PAGEREF _Toc242972800 \h </w:instrText>
             </w:r>
             <w:r>
               <w:rPr>
@@ -2375,7 +2375,7 @@
               <w14:ligatures w14:val="standardContextual"/>
             </w:rPr>
           </w:pPr>
-          <w:hyperlink w:anchor="_Toc242970873" w:history="1">
+          <w:hyperlink w:anchor="_Toc242972801" w:history="1">
             <w:r>
               <w:rPr>
                 <w:rStyle w:val="Hyperlink"/>
@@ -2399,7 +2399,7 @@
               <w:rPr>
                 <w:noProof/>
               </w:rPr>
-              <w:instrText xml:space="preserve"> PAGEREF _Toc242970873 \h </w:instrText>
+              <w:instrText xml:space="preserve"> PAGEREF _Toc242972801 \h </w:instrText>
             </w:r>
             <w:r>
               <w:rPr>
@@ -2442,7 +2442,7 @@
               <w14:ligatures w14:val="standardContextual"/>
             </w:rPr>
           </w:pPr>
-          <w:hyperlink w:anchor="_Toc242970874" w:history="1">
+          <w:hyperlink w:anchor="_Toc242972802" w:history="1">
             <w:r>
               <w:rPr>
                 <w:rStyle w:val="Hyperlink"/>
@@ -2466,7 +2466,7 @@
               <w:rPr>
                 <w:noProof/>
               </w:rPr>
-              <w:instrText xml:space="preserve"> PAGEREF _Toc242970874 \h </w:instrText>
+              <w:instrText xml:space="preserve"> PAGEREF _Toc242972802 \h </w:instrText>
             </w:r>
             <w:r>
               <w:rPr>
@@ -2509,7 +2509,7 @@
               <w14:ligatures w14:val="standardContextual"/>
             </w:rPr>
           </w:pPr>
-          <w:hyperlink w:anchor="_Toc242970875" w:history="1">
+          <w:hyperlink w:anchor="_Toc242972803" w:history="1">
             <w:r>
               <w:rPr>
                 <w:rStyle w:val="Hyperlink"/>
@@ -2533,7 +2533,7 @@
               <w:rPr>
                 <w:noProof/>
               </w:rPr>
-              <w:instrText xml:space="preserve"> PAGEREF _Toc242970875 \h </w:instrText>
+              <w:instrText xml:space="preserve"> PAGEREF _Toc242972803 \h </w:instrText>
             </w:r>
             <w:r>
               <w:rPr>
@@ -2576,7 +2576,7 @@
               <w14:ligatures w14:val="standardContextual"/>
             </w:rPr>
           </w:pPr>
-          <w:hyperlink w:anchor="_Toc242970876" w:history="1">
+          <w:hyperlink w:anchor="_Toc242972804" w:history="1">
             <w:r>
               <w:rPr>
                 <w:rStyle w:val="Hyperlink"/>
@@ -2600,7 +2600,7 @@
               <w:rPr>
                 <w:noProof/>
               </w:rPr>
-              <w:instrText xml:space="preserve"> PAGEREF _Toc242970876 \h </w:instrText>
+              <w:instrText xml:space="preserve"> PAGEREF _Toc242972804 \h </w:instrText>
             </w:r>
             <w:r>
               <w:rPr>
@@ -2643,7 +2643,7 @@
               <w14:ligatures w14:val="standardContextual"/>
             </w:rPr>
           </w:pPr>
-          <w:hyperlink w:anchor="_Toc242970877" w:history="1">
+          <w:hyperlink w:anchor="_Toc242972805" w:history="1">
             <w:r>
               <w:rPr>
                 <w:rStyle w:val="Hyperlink"/>
@@ -2667,7 +2667,7 @@
               <w:rPr>
                 <w:noProof/>
               </w:rPr>
-              <w:instrText xml:space="preserve"> PAGEREF _Toc242970877 \h </w:instrText>
+              <w:instrText xml:space="preserve"> PAGEREF _Toc242972805 \h </w:instrText>
             </w:r>
             <w:r>
               <w:rPr>
@@ -2710,7 +2710,7 @@
               <w14:ligatures w14:val="standardContextual"/>
             </w:rPr>
           </w:pPr>
-          <w:hyperlink w:anchor="_Toc242970878" w:history="1">
+          <w:hyperlink w:anchor="_Toc242972806" w:history="1">
             <w:r>
               <w:rPr>
                 <w:rStyle w:val="Hyperlink"/>
@@ -2734,7 +2734,7 @@
               <w:rPr>
                 <w:noProof/>
               </w:rPr>
-              <w:instrText xml:space="preserve"> PAGEREF _Toc242970878 \h </w:instrText>
+              <w:instrText xml:space="preserve"> PAGEREF _Toc242972806 \h </w:instrText>
             </w:r>
             <w:r>
               <w:rPr>
@@ -2777,7 +2777,7 @@
               <w14:ligatures w14:val="standardContextual"/>
             </w:rPr>
           </w:pPr>
-          <w:hyperlink w:anchor="_Toc242970879" w:history="1">
+          <w:hyperlink w:anchor="_Toc242972807" w:history="1">
             <w:r>
               <w:rPr>
                 <w:rStyle w:val="Hyperlink"/>
@@ -2801,7 +2801,7 @@
               <w:rPr>
                 <w:noProof/>
               </w:rPr>
-              <w:instrText xml:space="preserve"> PAGEREF _Toc242970879 \h </w:instrText>
+              <w:instrText xml:space="preserve"> PAGEREF _Toc242972807 \h </w:instrText>
             </w:r>
             <w:r>
               <w:rPr>
@@ -2818,7 +2818,7 @@
               <w:rPr>
                 <w:noProof/>
               </w:rPr>
-              <w:t>44</w:t>
+              <w:t>45</w:t>
             </w:r>
             <w:r>
               <w:rPr>
@@ -2844,7 +2844,7 @@
               <w14:ligatures w14:val="standardContextual"/>
             </w:rPr>
           </w:pPr>
-          <w:hyperlink w:anchor="_Toc242970880" w:history="1">
+          <w:hyperlink w:anchor="_Toc242972808" w:history="1">
             <w:r>
               <w:rPr>
                 <w:rStyle w:val="Hyperlink"/>
@@ -2868,7 +2868,7 @@
               <w:rPr>
                 <w:noProof/>
               </w:rPr>
-              <w:instrText xml:space="preserve"> PAGEREF _Toc242970880 \h </w:instrText>
+              <w:instrText xml:space="preserve"> PAGEREF _Toc242972808 \h </w:instrText>
             </w:r>
             <w:r>
               <w:rPr>
@@ -2911,7 +2911,7 @@
               <w14:ligatures w14:val="standardContextual"/>
             </w:rPr>
           </w:pPr>
-          <w:hyperlink w:anchor="_Toc242970881" w:history="1">
+          <w:hyperlink w:anchor="_Toc242972809" w:history="1">
             <w:r>
               <w:rPr>
                 <w:rStyle w:val="Hyperlink"/>
@@ -2935,7 +2935,7 @@
               <w:rPr>
                 <w:noProof/>
               </w:rPr>
-              <w:instrText xml:space="preserve"> PAGEREF _Toc242970881 \h </w:instrText>
+              <w:instrText xml:space="preserve"> PAGEREF _Toc242972809 \h </w:instrText>
             </w:r>
             <w:r>
               <w:rPr>
@@ -2978,7 +2978,7 @@
               <w14:ligatures w14:val="standardContextual"/>
             </w:rPr>
           </w:pPr>
-          <w:hyperlink w:anchor="_Toc242970882" w:history="1">
+          <w:hyperlink w:anchor="_Toc242972810" w:history="1">
             <w:r>
               <w:rPr>
                 <w:rStyle w:val="Hyperlink"/>
@@ -3002,7 +3002,7 @@
               <w:rPr>
                 <w:noProof/>
               </w:rPr>
-              <w:instrText xml:space="preserve"> PAGEREF _Toc242970882 \h </w:instrText>
+              <w:instrText xml:space="preserve"> PAGEREF _Toc242972810 \h </w:instrText>
             </w:r>
             <w:r>
               <w:rPr>
@@ -3045,7 +3045,7 @@
               <w14:ligatures w14:val="standardContextual"/>
             </w:rPr>
           </w:pPr>
-          <w:hyperlink w:anchor="_Toc242970883" w:history="1">
+          <w:hyperlink w:anchor="_Toc242972811" w:history="1">
             <w:r>
               <w:rPr>
                 <w:rStyle w:val="Hyperlink"/>
@@ -3069,7 +3069,7 @@
               <w:rPr>
                 <w:noProof/>
               </w:rPr>
-              <w:instrText xml:space="preserve"> PAGEREF _Toc242970883 \h </w:instrText>
+              <w:instrText xml:space="preserve"> PAGEREF _Toc242972811 \h </w:instrText>
             </w:r>
             <w:r>
               <w:rPr>
@@ -3112,7 +3112,7 @@
               <w14:ligatures w14:val="standardContextual"/>
             </w:rPr>
           </w:pPr>
-          <w:hyperlink w:anchor="_Toc242970884" w:history="1">
+          <w:hyperlink w:anchor="_Toc242972812" w:history="1">
             <w:r>
               <w:rPr>
                 <w:rStyle w:val="Hyperlink"/>
@@ -3136,7 +3136,7 @@
               <w:rPr>
                 <w:noProof/>
               </w:rPr>
-              <w:instrText xml:space="preserve"> PAGEREF _Toc242970884 \h </w:instrText>
+              <w:instrText xml:space="preserve"> PAGEREF _Toc242972812 \h </w:instrText>
             </w:r>
             <w:r>
               <w:rPr>
@@ -3179,7 +3179,7 @@
               <w14:ligatures w14:val="standardContextual"/>
             </w:rPr>
           </w:pPr>
-          <w:hyperlink w:anchor="_Toc242970885" w:history="1">
+          <w:hyperlink w:anchor="_Toc242972813" w:history="1">
             <w:r>
               <w:rPr>
                 <w:rStyle w:val="Hyperlink"/>
@@ -3203,7 +3203,7 @@
               <w:rPr>
                 <w:noProof/>
               </w:rPr>
-              <w:instrText xml:space="preserve"> PAGEREF _Toc242970885 \h </w:instrText>
+              <w:instrText xml:space="preserve"> PAGEREF _Toc242972813 \h </w:instrText>
             </w:r>
             <w:r>
               <w:rPr>
@@ -3246,7 +3246,7 @@
               <w14:ligatures w14:val="standardContextual"/>
             </w:rPr>
           </w:pPr>
-          <w:hyperlink w:anchor="_Toc242970886" w:history="1">
+          <w:hyperlink w:anchor="_Toc242972814" w:history="1">
             <w:r>
               <w:rPr>
                 <w:rStyle w:val="Hyperlink"/>
@@ -3270,7 +3270,7 @@
               <w:rPr>
                 <w:noProof/>
               </w:rPr>
-              <w:instrText xml:space="preserve"> PAGEREF _Toc242970886 \h </w:instrText>
+              <w:instrText xml:space="preserve"> PAGEREF _Toc242972814 \h </w:instrText>
             </w:r>
             <w:r>
               <w:rPr>
@@ -3340,7 +3340,7 @@
           <w:noProof/>
         </w:rPr>
         <w:drawing>
-          <wp:inline distT="0" distB="0" distL="0" distR="0" wp14:anchorId="2ED0CBC7" wp14:editId="1B266A89">
+          <wp:inline distT="0" distB="0" distL="0" distR="0" wp14:anchorId="334354F7" wp14:editId="391F45EC">
             <wp:extent cx="5943600" cy="4210050"/>
             <wp:effectExtent l="0" t="0" r="0" b="0"/>
             <wp:docPr id="1" name="UnmanagedLayerScanner-thumbnail.png" descr="Unmanaged Layer Scanner in action: choosing managed solutions, scanning, filtering by type, comparing the layers of a form and a web resource, and deleting three unmanaged layers" title="Unmanaged Layer Scanner in action: choosing managed solutions, scanning, filtering by type, comparing the layers of a form and a web resource, and deleting three unmanaged layers"/>
@@ -4024,7 +4024,7 @@
         <w:pStyle w:val="Heading1"/>
         <w:keepNext/>
       </w:pPr>
-      <w:bookmarkStart w:id="0" w:name="_Toc242970840"/>
+      <w:bookmarkStart w:id="0" w:name="_Toc242972768"/>
       <w:r>
         <w:t>Features</w:t>
       </w:r>
@@ -4942,7 +4942,7 @@
         <w:pStyle w:val="Heading1"/>
         <w:keepNext/>
       </w:pPr>
-      <w:bookmarkStart w:id="1" w:name="_Toc242970841"/>
+      <w:bookmarkStart w:id="1" w:name="_Toc242972769"/>
       <w:r>
         <w:t>Screenshots</w:t>
       </w:r>
@@ -4971,7 +4971,7 @@
         <w:pStyle w:val="Heading2"/>
         <w:keepNext/>
       </w:pPr>
-      <w:bookmarkStart w:id="2" w:name="_Toc242970842"/>
+      <w:bookmarkStart w:id="2" w:name="_Toc242972770"/>
       <w:r>
         <w:t>Choosing what to check</w:t>
       </w:r>
@@ -5014,7 +5014,7 @@
           <w:noProof/>
         </w:rPr>
         <w:drawing>
-          <wp:inline distT="0" distB="0" distL="0" distR="0" wp14:anchorId="2BD1CA0F" wp14:editId="2A417572">
+          <wp:inline distT="0" distB="0" distL="0" distR="0" wp14:anchorId="7FCA3F6E" wp14:editId="0CF050DB">
             <wp:extent cx="5943600" cy="4229100"/>
             <wp:effectExtent l="0" t="0" r="0" b="0"/>
             <wp:docPr id="2" name="choose.png" descr="The choice screen: managed solutions, object types and the tables card" title="The choice screen: managed solutions, object types and the tables card"/>
@@ -5101,7 +5101,7 @@
           <w:noProof/>
         </w:rPr>
         <w:drawing>
-          <wp:inline distT="0" distB="0" distL="0" distR="0" wp14:anchorId="2C4361A5" wp14:editId="3005B881">
+          <wp:inline distT="0" distB="0" distL="0" distR="0" wp14:anchorId="7A5A98A1" wp14:editId="009E45BD">
             <wp:extent cx="5943600" cy="4229100"/>
             <wp:effectExtent l="0" t="0" r="0" b="0"/>
             <wp:docPr id="3" name="tables.png" descr="The Choose tables dialog" title="The Choose tables dialog"/>
@@ -5178,7 +5178,7 @@
           <w:noProof/>
         </w:rPr>
         <w:drawing>
-          <wp:inline distT="0" distB="0" distL="0" distR="0" wp14:anchorId="6684043A" wp14:editId="71A31D54">
+          <wp:inline distT="0" distB="0" distL="0" distR="0" wp14:anchorId="52E610D7" wp14:editId="5F20F640">
             <wp:extent cx="5943600" cy="4229100"/>
             <wp:effectExtent l="0" t="0" r="0" b="0"/>
             <wp:docPr id="4" name="scanning.png" descr="The scan in progress" title="The scan in progress"/>
@@ -5222,7 +5222,7 @@
         <w:pStyle w:val="Heading2"/>
         <w:keepNext/>
       </w:pPr>
-      <w:bookmarkStart w:id="3" w:name="_Toc242970843"/>
+      <w:bookmarkStart w:id="3" w:name="_Toc242972771"/>
       <w:r>
         <w:lastRenderedPageBreak/>
         <w:t>Results and filters</w:t>
@@ -5266,7 +5266,7 @@
           <w:noProof/>
         </w:rPr>
         <w:drawing>
-          <wp:inline distT="0" distB="0" distL="0" distR="0" wp14:anchorId="19A90DD0" wp14:editId="0583A66E">
+          <wp:inline distT="0" distB="0" distL="0" distR="0" wp14:anchorId="0E93DB02" wp14:editId="59458277">
             <wp:extent cx="5943600" cy="4229100"/>
             <wp:effectExtent l="0" t="0" r="0" b="0"/>
             <wp:docPr id="5" name="results.png" descr="The results grid" title="The results grid"/>
@@ -5343,7 +5343,7 @@
           <w:noProof/>
         </w:rPr>
         <w:drawing>
-          <wp:inline distT="0" distB="0" distL="0" distR="0" wp14:anchorId="2694707A" wp14:editId="27ABB9BC">
+          <wp:inline distT="0" distB="0" distL="0" distR="0" wp14:anchorId="5AAAE58C" wp14:editId="69350F49">
             <wp:extent cx="5943600" cy="4229100"/>
             <wp:effectExtent l="0" t="0" r="0" b="0"/>
             <wp:docPr id="6" name="column-filter.png" descr="The What changed column menu" title="The What changed column menu"/>
@@ -5410,7 +5410,7 @@
           <w:noProof/>
         </w:rPr>
         <w:drawing>
-          <wp:inline distT="0" distB="0" distL="0" distR="0" wp14:anchorId="02012ABB" wp14:editId="01D0FBB7">
+          <wp:inline distT="0" distB="0" distL="0" distR="0" wp14:anchorId="33986526" wp14:editId="786D1F6B">
             <wp:extent cx="5943600" cy="4229100"/>
             <wp:effectExtent l="0" t="0" r="0" b="0"/>
             <wp:docPr id="7" name="export.png" descr="The Export menu" title="The Export menu"/>
@@ -5454,7 +5454,7 @@
         <w:pStyle w:val="Heading2"/>
         <w:keepNext/>
       </w:pPr>
-      <w:bookmarkStart w:id="4" w:name="_Toc242970844"/>
+      <w:bookmarkStart w:id="4" w:name="_Toc242972772"/>
       <w:r>
         <w:lastRenderedPageBreak/>
         <w:t>Details of a component</w:t>
@@ -5498,7 +5498,7 @@
           <w:noProof/>
         </w:rPr>
         <w:drawing>
-          <wp:inline distT="0" distB="0" distL="0" distR="0" wp14:anchorId="49553C4D" wp14:editId="65F735E0">
+          <wp:inline distT="0" distB="0" distL="0" distR="0" wp14:anchorId="0D5B4A0E" wp14:editId="0234AA12">
             <wp:extent cx="5943600" cy="4229100"/>
             <wp:effectExtent l="0" t="0" r="0" b="0"/>
             <wp:docPr id="8" name="details-compare.png" descr="The comparison of a form's layers" title="The comparison of a form's layers"/>
@@ -5565,7 +5565,7 @@
           <w:noProof/>
         </w:rPr>
         <w:drawing>
-          <wp:inline distT="0" distB="0" distL="0" distR="0" wp14:anchorId="57DAB7C0" wp14:editId="7CC837BC">
+          <wp:inline distT="0" distB="0" distL="0" distR="0" wp14:anchorId="396D23BF" wp14:editId="2B011A80">
             <wp:extent cx="5943600" cy="4229100"/>
             <wp:effectExtent l="0" t="0" r="0" b="0"/>
             <wp:docPr id="9" name="details-side-by-side.png" descr="A web resource compared side by side" title="A web resource compared side by side"/>
@@ -5632,7 +5632,7 @@
           <w:noProof/>
         </w:rPr>
         <w:drawing>
-          <wp:inline distT="0" distB="0" distL="0" distR="0" wp14:anchorId="280F1239" wp14:editId="653ACFF9">
+          <wp:inline distT="0" distB="0" distL="0" distR="0" wp14:anchorId="64626F3F" wp14:editId="2F52C06B">
             <wp:extent cx="5943600" cy="4229100"/>
             <wp:effectExtent l="0" t="0" r="0" b="0"/>
             <wp:docPr id="10" name="details-image.png" descr="Both images of an image web resource" title="Both images of an image web resource"/>
@@ -5728,7 +5728,7 @@
           <w:noProof/>
         </w:rPr>
         <w:drawing>
-          <wp:inline distT="0" distB="0" distL="0" distR="0" wp14:anchorId="1C49774C" wp14:editId="49727168">
+          <wp:inline distT="0" distB="0" distL="0" distR="0" wp14:anchorId="14AC9E5E" wp14:editId="3D44394A">
             <wp:extent cx="5943600" cy="4229100"/>
             <wp:effectExtent l="0" t="0" r="0" b="0"/>
             <wp:docPr id="11" name="details-file.png" descr="A web resource whose content is kept as a file: the content in effect shown for the Active layer only" title="A web resource whose content is kept as a file: the content in effect shown for the Active layer only"/>
@@ -5815,7 +5815,7 @@
           <w:noProof/>
         </w:rPr>
         <w:drawing>
-          <wp:inline distT="0" distB="0" distL="0" distR="0" wp14:anchorId="4675719B" wp14:editId="22942472">
+          <wp:inline distT="0" distB="0" distL="0" distR="0" wp14:anchorId="7D56AE1C" wp14:editId="01626D66">
             <wp:extent cx="5943600" cy="4229100"/>
             <wp:effectExtent l="0" t="0" r="0" b="0"/>
             <wp:docPr id="12" name="details-layers.png" descr="The Layers tab" title="The Layers tab"/>
@@ -5902,7 +5902,7 @@
           <w:noProof/>
         </w:rPr>
         <w:drawing>
-          <wp:inline distT="0" distB="0" distL="0" distR="0" wp14:anchorId="2846FACA" wp14:editId="460FD4E6">
+          <wp:inline distT="0" distB="0" distL="0" distR="0" wp14:anchorId="380B9408" wp14:editId="2F3AD6AB">
             <wp:extent cx="5943600" cy="4229100"/>
             <wp:effectExtent l="0" t="0" r="0" b="0"/>
             <wp:docPr id="13" name="details-json.png" descr="The JSON tab showing a layer's Changes" title="The JSON tab showing a layer's Changes"/>
@@ -5969,7 +5969,7 @@
           <w:noProof/>
         </w:rPr>
         <w:drawing>
-          <wp:inline distT="0" distB="0" distL="0" distR="0" wp14:anchorId="68675A43" wp14:editId="5FFEACF5">
+          <wp:inline distT="0" distB="0" distL="0" distR="0" wp14:anchorId="7F4A224D" wp14:editId="5A12EF6A">
             <wp:extent cx="5943600" cy="4229100"/>
             <wp:effectExtent l="0" t="0" r="0" b="0"/>
             <wp:docPr id="14" name="details-children.png" descr="A role's privileges from Children, shown as a table" title="A role's privileges from Children, shown as a table"/>
@@ -6013,7 +6013,7 @@
         <w:pStyle w:val="Heading2"/>
         <w:keepNext/>
       </w:pPr>
-      <w:bookmarkStart w:id="5" w:name="_Toc242970845"/>
+      <w:bookmarkStart w:id="5" w:name="_Toc242972773"/>
       <w:r>
         <w:lastRenderedPageBreak/>
         <w:t>Deleting layers</w:t>
@@ -6057,7 +6057,7 @@
           <w:noProof/>
         </w:rPr>
         <w:drawing>
-          <wp:inline distT="0" distB="0" distL="0" distR="0" wp14:anchorId="483E0D11" wp14:editId="0F882BC2">
+          <wp:inline distT="0" distB="0" distL="0" distR="0" wp14:anchorId="237790B3" wp14:editId="3CF6D8AD">
             <wp:extent cx="5943600" cy="4229100"/>
             <wp:effectExtent l="0" t="0" r="0" b="0"/>
             <wp:docPr id="15" name="delete-confirm.png" descr="The delete confirmation" title="The delete confirmation"/>
@@ -6134,7 +6134,7 @@
           <w:noProof/>
         </w:rPr>
         <w:drawing>
-          <wp:inline distT="0" distB="0" distL="0" distR="0" wp14:anchorId="76035823" wp14:editId="79592C6D">
+          <wp:inline distT="0" distB="0" distL="0" distR="0" wp14:anchorId="64E340C8" wp14:editId="7D3933FC">
             <wp:extent cx="5943600" cy="4229100"/>
             <wp:effectExtent l="0" t="0" r="0" b="0"/>
             <wp:docPr id="16" name="deleting.png" descr="Deleting in progress" title="Deleting in progress"/>
@@ -6201,7 +6201,7 @@
           <w:noProof/>
         </w:rPr>
         <w:drawing>
-          <wp:inline distT="0" distB="0" distL="0" distR="0" wp14:anchorId="6D0A3939" wp14:editId="3C4221A4">
+          <wp:inline distT="0" distB="0" distL="0" distR="0" wp14:anchorId="168C4A01" wp14:editId="1EFFBACB">
             <wp:extent cx="5943600" cy="4229100"/>
             <wp:effectExtent l="0" t="0" r="0" b="0"/>
             <wp:docPr id="17" name="deleted.png" descr="The results after deleting three unmanaged layers" title="The results after deleting three unmanaged layers"/>
@@ -6245,7 +6245,7 @@
         <w:pStyle w:val="Heading2"/>
         <w:keepNext/>
       </w:pPr>
-      <w:bookmarkStart w:id="6" w:name="_Toc242970846"/>
+      <w:bookmarkStart w:id="6" w:name="_Toc242972774"/>
       <w:r>
         <w:lastRenderedPageBreak/>
         <w:t>Narrow window</w:t>
@@ -6289,7 +6289,7 @@
           <w:noProof/>
         </w:rPr>
         <w:drawing>
-          <wp:inline distT="0" distB="0" distL="0" distR="0" wp14:anchorId="501153A3" wp14:editId="43C283DC">
+          <wp:inline distT="0" distB="0" distL="0" distR="0" wp14:anchorId="53ADBA96" wp14:editId="4ADBF936">
             <wp:extent cx="5943600" cy="6524625"/>
             <wp:effectExtent l="0" t="0" r="0" b="0"/>
             <wp:docPr id="18" name="narrow.png" descr="The choice screen in a narrow window" title="The choice screen in a narrow window"/>
@@ -6333,7 +6333,7 @@
         <w:pStyle w:val="Heading1"/>
         <w:keepNext/>
       </w:pPr>
-      <w:bookmarkStart w:id="7" w:name="_Toc242970847"/>
+      <w:bookmarkStart w:id="7" w:name="_Toc242972775"/>
       <w:r>
         <w:t>Download</w:t>
       </w:r>
@@ -6951,7 +6951,7 @@
         <w:pStyle w:val="Heading1"/>
         <w:keepNext/>
       </w:pPr>
-      <w:bookmarkStart w:id="8" w:name="_Toc242970848"/>
+      <w:bookmarkStart w:id="8" w:name="_Toc242972776"/>
       <w:r>
         <w:t>Install</w:t>
       </w:r>
@@ -6962,7 +6962,7 @@
         <w:pStyle w:val="Heading2"/>
         <w:keepNext/>
       </w:pPr>
-      <w:bookmarkStart w:id="9" w:name="_Toc242970849"/>
+      <w:bookmarkStart w:id="9" w:name="_Toc242972777"/>
       <w:r>
         <w:t>Drag the button</w:t>
       </w:r>
@@ -7051,7 +7051,7 @@
         <w:pStyle w:val="Heading2"/>
         <w:keepNext/>
       </w:pPr>
-      <w:bookmarkStart w:id="10" w:name="_Toc242970850"/>
+      <w:bookmarkStart w:id="10" w:name="_Toc242972778"/>
       <w:r>
         <w:t>Create the favourite by hand</w:t>
       </w:r>
@@ -7197,7 +7197,7 @@
         <w:pStyle w:val="Heading2"/>
         <w:keepNext/>
       </w:pPr>
-      <w:bookmarkStart w:id="11" w:name="_Toc242970851"/>
+      <w:bookmarkStart w:id="11" w:name="_Toc242972779"/>
       <w:r>
         <w:t>Run it from the console</w:t>
       </w:r>
@@ -7292,7 +7292,7 @@
         <w:pStyle w:val="Heading2"/>
         <w:keepNext/>
       </w:pPr>
-      <w:bookmarkStart w:id="12" w:name="_Toc242970852"/>
+      <w:bookmarkStart w:id="12" w:name="_Toc242972780"/>
       <w:r>
         <w:t>When bookmarklets are blocked</w:t>
       </w:r>
@@ -7331,7 +7331,7 @@
         <w:pStyle w:val="Heading2"/>
         <w:keepNext/>
       </w:pPr>
-      <w:bookmarkStart w:id="13" w:name="_Toc242970853"/>
+      <w:bookmarkStart w:id="13" w:name="_Toc242972781"/>
       <w:r>
         <w:t>Update to a new version</w:t>
       </w:r>
@@ -7401,7 +7401,7 @@
         <w:pStyle w:val="Heading1"/>
         <w:keepNext/>
       </w:pPr>
-      <w:bookmarkStart w:id="14" w:name="_Toc242970854"/>
+      <w:bookmarkStart w:id="14" w:name="_Toc242972782"/>
       <w:r>
         <w:t>Use</w:t>
       </w:r>
@@ -7412,7 +7412,7 @@
         <w:pStyle w:val="Heading2"/>
         <w:keepNext/>
       </w:pPr>
-      <w:bookmarkStart w:id="15" w:name="_Toc242970855"/>
+      <w:bookmarkStart w:id="15" w:name="_Toc242972783"/>
       <w:r>
         <w:t>Open it</w:t>
       </w:r>
@@ -7598,7 +7598,7 @@
         <w:pStyle w:val="Heading2"/>
         <w:keepNext/>
       </w:pPr>
-      <w:bookmarkStart w:id="16" w:name="_Toc242970856"/>
+      <w:bookmarkStart w:id="16" w:name="_Toc242972784"/>
       <w:r>
         <w:t>Choose what to check</w:t>
       </w:r>
@@ -8323,7 +8323,7 @@
         <w:pStyle w:val="Heading2"/>
         <w:keepNext/>
       </w:pPr>
-      <w:bookmarkStart w:id="17" w:name="_Toc242970857"/>
+      <w:bookmarkStart w:id="17" w:name="_Toc242972785"/>
       <w:r>
         <w:t>Scan and stop</w:t>
       </w:r>
@@ -8851,7 +8851,7 @@
         <w:pStyle w:val="Heading2"/>
         <w:keepNext/>
       </w:pPr>
-      <w:bookmarkStart w:id="18" w:name="_Toc242970858"/>
+      <w:bookmarkStart w:id="18" w:name="_Toc242972786"/>
       <w:r>
         <w:t>The results</w:t>
       </w:r>
@@ -9475,7 +9475,7 @@
         <w:pStyle w:val="Heading3"/>
         <w:keepNext/>
       </w:pPr>
-      <w:bookmarkStart w:id="19" w:name="_Toc242970859"/>
+      <w:bookmarkStart w:id="19" w:name="_Toc242972787"/>
       <w:r>
         <w:t>Type bubbles</w:t>
       </w:r>
@@ -9527,7 +9527,7 @@
         <w:pStyle w:val="Heading3"/>
         <w:keepNext/>
       </w:pPr>
-      <w:bookmarkStart w:id="20" w:name="_Toc242970860"/>
+      <w:bookmarkStart w:id="20" w:name="_Toc242972788"/>
       <w:r>
         <w:t>Column menus</w:t>
       </w:r>
@@ -9774,7 +9774,7 @@
         <w:pStyle w:val="Heading3"/>
         <w:keepNext/>
       </w:pPr>
-      <w:bookmarkStart w:id="21" w:name="_Toc242970861"/>
+      <w:bookmarkStart w:id="21" w:name="_Toc242972789"/>
       <w:r>
         <w:lastRenderedPageBreak/>
         <w:t>Which page a row opens</w:t>
@@ -10167,7 +10167,7 @@
         <w:pStyle w:val="Heading3"/>
         <w:keepNext/>
       </w:pPr>
-      <w:bookmarkStart w:id="22" w:name="_Toc242970862"/>
+      <w:bookmarkStart w:id="22" w:name="_Toc242972790"/>
       <w:r>
         <w:t>Banners</w:t>
       </w:r>
@@ -10237,7 +10237,7 @@
         <w:t>Not checked: &lt;types&gt;.</w:t>
       </w:r>
       <w:r>
-        <w:t xml:space="preserve"> Your security role cannot read those types (the privileges are named), so they were skipped. Everything else was checked.</w:t>
+        <w:t xml:space="preserve"> Your security role cannot read those types (the privileges are named), so they were skipped. Everything else was checked. Column and table image configurations are the exception: in some environments Dataverse refuses them even to System Administrators who hold the privileges it names, with its own security error (0x80040256). That refusal is skipped without a note (and the note then leaves out "Everything else was checked"). A role that really lacks those privileges is still told.</w:t>
       </w:r>
     </w:p>
     <w:p>
@@ -10328,7 +10328,7 @@
         <w:pStyle w:val="Heading2"/>
         <w:keepNext/>
       </w:pPr>
-      <w:bookmarkStart w:id="23" w:name="_Toc242970863"/>
+      <w:bookmarkStart w:id="23" w:name="_Toc242972791"/>
       <w:r>
         <w:t>The details</w:t>
       </w:r>
@@ -10423,7 +10423,7 @@
         <w:pStyle w:val="Heading3"/>
         <w:keepNext/>
       </w:pPr>
-      <w:bookmarkStart w:id="24" w:name="_Toc242970864"/>
+      <w:bookmarkStart w:id="24" w:name="_Toc242972792"/>
       <w:r>
         <w:t>What changed</w:t>
       </w:r>
@@ -10471,14 +10471,11 @@
           <w:b/>
           <w:bCs/>
         </w:rPr>
+        <w:lastRenderedPageBreak/>
         <w:t>Hide system values</w:t>
       </w:r>
       <w:r>
-        <w:t xml:space="preserve"> (on by default) hides values Dataverse keeps up to date itself: Modified on, Modified by, Created on, Created by, version number, overwrite time, solution ids, component state, </w:t>
-      </w:r>
-      <w:r>
-        <w:lastRenderedPageBreak/>
-        <w:t xml:space="preserve">managed state, Published on, organization and the </w:t>
+        <w:t xml:space="preserve"> (on by default) hides values Dataverse keeps up to date itself: Modified on, Modified by, Created on, Created by, version number, overwrite time, solution ids, component state, managed state, Published on, organization and the </w:t>
       </w:r>
       <w:r>
         <w:rPr>
@@ -10827,7 +10824,11 @@
         <w:t>, a reference to that file, instead. The two layers compared can hold it in different ways: in tests, right after a web resource's content was saved through the Web API, the Active layer held the content itself while the managed layer held only a file reference; later, Dataverse kept both as files. The Web API gives out only the file in effect now, through</w:t>
       </w:r>
       <w:r>
-        <w:t xml:space="preserve"> the web resource itself; the files of the other layers cannot be read. So, when the details of a web resource with a file reference open, the scanner reads its current content once (</w:t>
+        <w:t xml:space="preserve"> the web resource itself; the files of the other layers cannot be read. So, </w:t>
+      </w:r>
+      <w:r>
+        <w:lastRenderedPageBreak/>
+        <w:t>when the details of a web resource with a file reference open, the scanner reads its current content once (</w:t>
       </w:r>
       <w:r>
         <w:rPr>
@@ -10847,7 +10848,6 @@
         <w:spacing w:after="120"/>
       </w:pPr>
       <w:r>
-        <w:lastRenderedPageBreak/>
         <w:t xml:space="preserve">Whichever way each layer holds it, the content is one property row, </w:t>
       </w:r>
       <w:r>
@@ -11012,7 +11012,7 @@
         <w:pStyle w:val="Heading3"/>
         <w:keepNext/>
       </w:pPr>
-      <w:bookmarkStart w:id="25" w:name="_Toc242970865"/>
+      <w:bookmarkStart w:id="25" w:name="_Toc242972793"/>
       <w:r>
         <w:t>Layers</w:t>
       </w:r>
@@ -11091,7 +11091,7 @@
         <w:pStyle w:val="Heading3"/>
         <w:keepNext/>
       </w:pPr>
-      <w:bookmarkStart w:id="26" w:name="_Toc242970866"/>
+      <w:bookmarkStart w:id="26" w:name="_Toc242972794"/>
       <w:r>
         <w:t>JSON</w:t>
       </w:r>
@@ -11182,7 +11182,7 @@
         <w:pStyle w:val="Heading2"/>
         <w:keepNext/>
       </w:pPr>
-      <w:bookmarkStart w:id="27" w:name="_Toc242970867"/>
+      <w:bookmarkStart w:id="27" w:name="_Toc242972795"/>
       <w:r>
         <w:t>Export</w:t>
       </w:r>
@@ -11794,7 +11794,7 @@
         <w:pStyle w:val="Heading2"/>
         <w:keepNext/>
       </w:pPr>
-      <w:bookmarkStart w:id="28" w:name="_Toc242970868"/>
+      <w:bookmarkStart w:id="28" w:name="_Toc242972796"/>
       <w:r>
         <w:t>Deleting</w:t>
       </w:r>
@@ -12122,7 +12122,7 @@
         <w:pStyle w:val="Heading3"/>
         <w:keepNext/>
       </w:pPr>
-      <w:bookmarkStart w:id="29" w:name="_Toc242970869"/>
+      <w:bookmarkStart w:id="29" w:name="_Toc242972797"/>
       <w:r>
         <w:t>Outcomes</w:t>
       </w:r>
@@ -12798,7 +12798,7 @@
         <w:pStyle w:val="Heading3"/>
         <w:keepNext/>
       </w:pPr>
-      <w:bookmarkStart w:id="30" w:name="_Toc242970870"/>
+      <w:bookmarkStart w:id="30" w:name="_Toc242972798"/>
       <w:r>
         <w:t>The deletion log</w:t>
       </w:r>
@@ -12900,7 +12900,7 @@
         <w:pStyle w:val="Heading2"/>
         <w:keepNext/>
       </w:pPr>
-      <w:bookmarkStart w:id="31" w:name="_Toc242970871"/>
+      <w:bookmarkStart w:id="31" w:name="_Toc242972799"/>
       <w:r>
         <w:t>Keyboard</w:t>
       </w:r>
@@ -13782,7 +13782,7 @@
         <w:pStyle w:val="Heading1"/>
         <w:keepNext/>
       </w:pPr>
-      <w:bookmarkStart w:id="32" w:name="_Toc242970872"/>
+      <w:bookmarkStart w:id="32" w:name="_Toc242972800"/>
       <w:r>
         <w:t>Environment rules (optional)</w:t>
       </w:r>
@@ -14447,7 +14447,7 @@
         <w:pStyle w:val="Heading1"/>
         <w:keepNext/>
       </w:pPr>
-      <w:bookmarkStart w:id="33" w:name="_Toc242970873"/>
+      <w:bookmarkStart w:id="33" w:name="_Toc242972801"/>
       <w:r>
         <w:lastRenderedPageBreak/>
         <w:t>Safety</w:t>
@@ -14984,7 +14984,7 @@
         <w:pStyle w:val="Heading1"/>
         <w:keepNext/>
       </w:pPr>
-      <w:bookmarkStart w:id="34" w:name="_Toc242970874"/>
+      <w:bookmarkStart w:id="34" w:name="_Toc242972802"/>
       <w:r>
         <w:t>Messages</w:t>
       </w:r>
@@ -15015,7 +15015,7 @@
         <w:pStyle w:val="Heading2"/>
         <w:keepNext/>
       </w:pPr>
-      <w:bookmarkStart w:id="35" w:name="_Toc242970875"/>
+      <w:bookmarkStart w:id="35" w:name="_Toc242972803"/>
       <w:r>
         <w:t>Starting</w:t>
       </w:r>
@@ -15642,7 +15642,7 @@
         <w:pStyle w:val="Heading2"/>
         <w:keepNext/>
       </w:pPr>
-      <w:bookmarkStart w:id="36" w:name="_Toc242970876"/>
+      <w:bookmarkStart w:id="36" w:name="_Toc242972804"/>
       <w:r>
         <w:t>Choosing</w:t>
       </w:r>
@@ -16177,7 +16177,7 @@
         <w:pStyle w:val="Heading2"/>
         <w:keepNext/>
       </w:pPr>
-      <w:bookmarkStart w:id="37" w:name="_Toc242970877"/>
+      <w:bookmarkStart w:id="37" w:name="_Toc242972805"/>
       <w:r>
         <w:t>Scanning and results</w:t>
       </w:r>
@@ -16565,7 +16565,7 @@
                 <w:sz w:val="17"/>
                 <w:szCs w:val="17"/>
               </w:rPr>
-              <w:t>Dataverse refused to read those component types to your security role. Scanning again does not help; a role with those privileges would</w:t>
+              <w:t>Dataverse refused to read those component types to your security role. Scanning again does not help; a role with those privileges would. Column and table image configurations refused with Dataverse's own security error (0x80040256, seen in some environments even for System Administrators) are not named here, and the last sentence is then left out</w:t>
             </w:r>
           </w:p>
         </w:tc>
@@ -16909,6 +16909,7 @@
                 <w:sz w:val="17"/>
                 <w:szCs w:val="17"/>
               </w:rPr>
+              <w:lastRenderedPageBreak/>
               <w:t>Only system values</w:t>
             </w:r>
             <w:r>
@@ -16969,7 +16970,6 @@
                 <w:sz w:val="17"/>
                 <w:szCs w:val="17"/>
               </w:rPr>
-              <w:lastRenderedPageBreak/>
               <w:t>Only status or owner</w:t>
             </w:r>
             <w:r>
@@ -17592,7 +17592,7 @@
         <w:pStyle w:val="Heading2"/>
         <w:keepNext/>
       </w:pPr>
-      <w:bookmarkStart w:id="38" w:name="_Toc242970878"/>
+      <w:bookmarkStart w:id="38" w:name="_Toc242972806"/>
       <w:r>
         <w:t>Details</w:t>
       </w:r>
@@ -17756,6 +17756,7 @@
                 <w:sz w:val="17"/>
                 <w:szCs w:val="17"/>
               </w:rPr>
+              <w:lastRenderedPageBreak/>
               <w:t>"No layers"</w:t>
             </w:r>
           </w:p>
@@ -17867,7 +17868,6 @@
                 <w:sz w:val="17"/>
                 <w:szCs w:val="17"/>
               </w:rPr>
-              <w:lastRenderedPageBreak/>
               <w:t>"Only system values differ"</w:t>
             </w:r>
           </w:p>
@@ -18583,8 +18583,9 @@
         <w:pStyle w:val="Heading2"/>
         <w:keepNext/>
       </w:pPr>
-      <w:bookmarkStart w:id="39" w:name="_Toc242970879"/>
-      <w:r>
+      <w:bookmarkStart w:id="39" w:name="_Toc242972807"/>
+      <w:r>
+        <w:lastRenderedPageBreak/>
         <w:t>Deleting</w:t>
       </w:r>
       <w:bookmarkEnd w:id="39"/>
@@ -18746,7 +18747,6 @@
                 <w:sz w:val="17"/>
                 <w:szCs w:val="17"/>
               </w:rPr>
-              <w:lastRenderedPageBreak/>
               <w:t>"The maker portal sign-in ends in about &lt;n&gt; minutes, which might not be enough. Reload the page to renew it, or delete fewer at a time."</w:t>
             </w:r>
           </w:p>
@@ -19418,7 +19418,7 @@
         <w:pStyle w:val="Heading1"/>
         <w:keepNext/>
       </w:pPr>
-      <w:bookmarkStart w:id="40" w:name="_Toc242970880"/>
+      <w:bookmarkStart w:id="40" w:name="_Toc242972808"/>
       <w:r>
         <w:t>Troubleshooting</w:t>
       </w:r>
@@ -21146,7 +21146,7 @@
         <w:pStyle w:val="Heading1"/>
         <w:keepNext/>
       </w:pPr>
-      <w:bookmarkStart w:id="41" w:name="_Toc242970881"/>
+      <w:bookmarkStart w:id="41" w:name="_Toc242972809"/>
       <w:r>
         <w:t>Limitations</w:t>
       </w:r>
@@ -21287,42 +21287,10 @@
           <w:b/>
           <w:bCs/>
         </w:rPr>
-        <w:t>The solution summary</w:t>
-      </w:r>
-      <w:r>
-        <w:t xml:space="preserve"> (</w:t>
-      </w:r>
-      <w:r>
-        <w:rPr>
-          <w:rFonts w:ascii="Consolas" w:eastAsia="Consolas" w:hAnsi="Consolas" w:cs="Consolas"/>
-          <w:sz w:val="18"/>
-          <w:szCs w:val="18"/>
-          <w:shd w:val="clear" w:color="auto" w:fill="F3F2F1"/>
-        </w:rPr>
-        <w:t>msdyn_solutioncomponentsummaries</w:t>
-      </w:r>
-      <w:r>
-        <w:t xml:space="preserve">, the data behind the maker portal's </w:t>
-      </w:r>
-      <w:r>
-        <w:rPr>
-          <w:i/>
-          <w:iCs/>
-        </w:rPr>
-        <w:t>Customized</w:t>
-      </w:r>
-      <w:r>
-        <w:t xml:space="preserve"> flag) is not documented by Microsoft. When it fails, or answers nothing where it should list something (a check query tells), the scan is marked incomplete. It cannot be narrowed to the chosen tables. Components it flags are confirmed by reading their layers, up to 1,000 per scan; the others stay </w:t>
-      </w:r>
-      <w:r>
-        <w:rPr>
-          <w:i/>
-          <w:iCs/>
-        </w:rPr>
-        <w:t>Not read yet</w:t>
-      </w:r>
-      <w:r>
-        <w:t>.</w:t>
+        <w:t>Image configurations.</w:t>
+      </w:r>
+      <w:r>
+        <w:t xml:space="preserve"> Where Dataverse refuses to read column and table image configurations with its own security error (0x80040256, seen in some environments even for System Administrators), they are skipped without a note, so an unmanaged change to an image setting is not found there. Where they can be read, they are checked as usual.</w:t>
       </w:r>
     </w:p>
     <w:p>
@@ -21339,10 +21307,42 @@
           <w:b/>
           <w:bCs/>
         </w:rPr>
-        <w:t>Components without a solution component row</w:t>
-      </w:r>
-      <w:r>
-        <w:t xml:space="preserve"> (a few parts of standard tables) are placed in a solution by their layers: one or two requests each, up to 1,000 per scan. Above that, the scan is incomplete.</w:t>
+        <w:t>The solution summary</w:t>
+      </w:r>
+      <w:r>
+        <w:t xml:space="preserve"> (</w:t>
+      </w:r>
+      <w:r>
+        <w:rPr>
+          <w:rFonts w:ascii="Consolas" w:eastAsia="Consolas" w:hAnsi="Consolas" w:cs="Consolas"/>
+          <w:sz w:val="18"/>
+          <w:szCs w:val="18"/>
+          <w:shd w:val="clear" w:color="auto" w:fill="F3F2F1"/>
+        </w:rPr>
+        <w:t>msdyn_solutioncomponentsummaries</w:t>
+      </w:r>
+      <w:r>
+        <w:t xml:space="preserve">, the data behind the maker portal's </w:t>
+      </w:r>
+      <w:r>
+        <w:rPr>
+          <w:i/>
+          <w:iCs/>
+        </w:rPr>
+        <w:t>Customized</w:t>
+      </w:r>
+      <w:r>
+        <w:t xml:space="preserve"> flag) is not documented by Microsoft. When it fails, or answers nothing where it should list something (a check query tells), the scan is marked incomplete. It cannot be narrowed to the chosen tables. Components it flags are confirmed by reading their layers, up to 1,000 per scan; the others stay </w:t>
+      </w:r>
+      <w:r>
+        <w:rPr>
+          <w:i/>
+          <w:iCs/>
+        </w:rPr>
+        <w:t>Not read yet</w:t>
+      </w:r>
+      <w:r>
+        <w:t>.</w:t>
       </w:r>
     </w:p>
     <w:p>
@@ -21359,10 +21359,10 @@
           <w:b/>
           <w:bCs/>
         </w:rPr>
-        <w:t>Security roles.</w:t>
-      </w:r>
-      <w:r>
-        <w:t xml:space="preserve"> In tests, a role's privilege changes were not in its layer data (no changed properties, no Children), so the comparison showed only system values for it. Solution Layers Explorer reads the same data.</w:t>
+        <w:t>Components without a solution component row</w:t>
+      </w:r>
+      <w:r>
+        <w:t xml:space="preserve"> (a few parts of standard tables) are placed in a solution by their layers: one or two requests each, up to 1,000 per scan. Above that, the scan is incomplete.</w:t>
       </w:r>
     </w:p>
     <w:p>
@@ -21379,20 +21379,10 @@
           <w:b/>
           <w:bCs/>
         </w:rPr>
-        <w:t>The comparison</w:t>
-      </w:r>
-      <w:r>
-        <w:t xml:space="preserve"> is of each layer's </w:t>
-      </w:r>
-      <w:r>
-        <w:rPr>
-          <w:i/>
-          <w:iCs/>
-        </w:rPr>
-        <w:t>All properties</w:t>
-      </w:r>
-      <w:r>
-        <w:t xml:space="preserve"> data. When two values differ by more than 2,000 added or removed lines, it shows the whole old value and then the whole new one; values above 1,000,000 characters and differences above 3,000 lines are not shown in full (copy them).</w:t>
+        <w:t>Security roles.</w:t>
+      </w:r>
+      <w:r>
+        <w:t xml:space="preserve"> In tests, a role's privilege changes were not in its layer data (no changed properties, no Children), so the comparison showed only system values for it. Solution Layers Explorer reads the same data.</w:t>
       </w:r>
     </w:p>
     <w:p>
@@ -21409,22 +21399,20 @@
           <w:b/>
           <w:bCs/>
         </w:rPr>
-        <w:t>Web resources whose content Dataverse keeps as a file</w:t>
-      </w:r>
-      <w:r>
-        <w:t xml:space="preserve"> (</w:t>
-      </w:r>
-      <w:r>
-        <w:rPr>
-          <w:rFonts w:ascii="Consolas" w:eastAsia="Consolas" w:hAnsi="Consolas" w:cs="Consolas"/>
-          <w:sz w:val="18"/>
-          <w:szCs w:val="18"/>
-          <w:shd w:val="clear" w:color="auto" w:fill="F3F2F1"/>
-        </w:rPr>
-        <w:t>contentfileref</w:t>
-      </w:r>
-      <w:r>
-        <w:t>). Of the files, only the one in effect now can be read: the Web API gives out no other layer's file. A layer whose content is in any other file cannot be shown or compared line by line; layers whose content is held in the layer, or is the top layer's file in effect, are compared as usual. The deletion log keeps the unmanaged layer's content when the layer holds it itself, or when its file is the one in effect.</w:t>
+        <w:t>The comparison</w:t>
+      </w:r>
+      <w:r>
+        <w:t xml:space="preserve"> is of each layer's </w:t>
+      </w:r>
+      <w:r>
+        <w:rPr>
+          <w:i/>
+          <w:iCs/>
+        </w:rPr>
+        <w:t>All properties</w:t>
+      </w:r>
+      <w:r>
+        <w:t xml:space="preserve"> data. When two values differ by more than 2,000 added or removed lines, it shows the whole old value and then the whole new one; values above 1,000,000 characters and differences above 3,000 lines are not shown in full (copy them).</w:t>
       </w:r>
     </w:p>
     <w:p>
@@ -21441,10 +21429,22 @@
           <w:b/>
           <w:bCs/>
         </w:rPr>
-        <w:t>The maker portal</w:t>
-      </w:r>
-      <w:r>
-        <w:t xml:space="preserve"> mode depends on how the portal keeps its sign-in in the browser, which is not a documented interface: a future version of the portal could keep it differently, and the scanner then says it has no sign-in (it never guesses). The token is renewed only while the portal is used, so long deletion runs are better made from a page of the environment.</w:t>
+        <w:t>Web resources whose content Dataverse keeps as a file</w:t>
+      </w:r>
+      <w:r>
+        <w:t xml:space="preserve"> (</w:t>
+      </w:r>
+      <w:r>
+        <w:rPr>
+          <w:rFonts w:ascii="Consolas" w:eastAsia="Consolas" w:hAnsi="Consolas" w:cs="Consolas"/>
+          <w:sz w:val="18"/>
+          <w:szCs w:val="18"/>
+          <w:shd w:val="clear" w:color="auto" w:fill="F3F2F1"/>
+        </w:rPr>
+        <w:t>contentfileref</w:t>
+      </w:r>
+      <w:r>
+        <w:t>). Of the files, only the one in effect now can be read: the Web API gives out no other layer's file. A layer whose content is in any other file cannot be shown or compared line by line; layers whose content is held in the layer, or is the top layer's file in effect, are compared as usual. The deletion log keeps the unmanaged layer's content when the layer holds it itself, or when its file is the one in effect.</w:t>
       </w:r>
     </w:p>
     <w:p>
@@ -21461,10 +21461,10 @@
           <w:b/>
           <w:bCs/>
         </w:rPr>
-        <w:t>Links</w:t>
-      </w:r>
-      <w:r>
-        <w:t xml:space="preserve"> to the maker portal take a few seconds to load. A relationship's maker page shows its definition only.</w:t>
+        <w:t>The maker portal</w:t>
+      </w:r>
+      <w:r>
+        <w:t xml:space="preserve"> mode depends on how the portal keeps its sign-in in the browser, which is not a documented interface: a future version of the portal could keep it differently, and the scanner then says it has no sign-in (it never guesses). The token is renewed only while the portal is used, so long deletion runs are better made from a page of the environment.</w:t>
       </w:r>
     </w:p>
     <w:p>
@@ -21481,10 +21481,10 @@
           <w:b/>
           <w:bCs/>
         </w:rPr>
-        <w:t>Deleting.</w:t>
-      </w:r>
-      <w:r>
-        <w:t xml:space="preserve"> Email templates cannot have their unmanaged layer removed. At most 100 components per run, one at a time, about 8 seconds each. The deletion log holds the Active layer as read right before the removal; a change made to the component in the few seconds between that read and the removal is removed too and is not in the log.</w:t>
+        <w:t>Links</w:t>
+      </w:r>
+      <w:r>
+        <w:t xml:space="preserve"> to the maker portal take a few seconds to load. A relationship's maker page shows its definition only.</w:t>
       </w:r>
     </w:p>
     <w:p>
@@ -21501,10 +21501,14 @@
           <w:b/>
           <w:bCs/>
         </w:rPr>
-        <w:t>Grid.</w:t>
-      </w:r>
-      <w:r>
-        <w:t xml:space="preserve"> Up to 2,000 rows are drawn at once.</w:t>
+        <w:t>Deleting.</w:t>
+      </w:r>
+      <w:r>
+        <w:t xml:space="preserve"> Email templates cannot have their unmanaged layer removed. At most 100 components per run, one at a time, about 8 seconds each. The deletion log holds the Active layer as read right before </w:t>
+      </w:r>
+      <w:r>
+        <w:lastRenderedPageBreak/>
+        <w:t>the removal; a change made to the component in the few seconds between that read and the removal is removed too and is not in the log.</w:t>
       </w:r>
     </w:p>
     <w:p>
@@ -21521,11 +21525,10 @@
           <w:b/>
           <w:bCs/>
         </w:rPr>
-        <w:lastRenderedPageBreak/>
-        <w:t>Saved selections, column widths and the window's place</w:t>
-      </w:r>
-      <w:r>
-        <w:t xml:space="preserve"> are kept in the browser's local storage: not shared between people, browsers or profiles.</w:t>
+        <w:t>Grid.</w:t>
+      </w:r>
+      <w:r>
+        <w:t xml:space="preserve"> Up to 2,000 rows are drawn at once.</w:t>
       </w:r>
     </w:p>
     <w:p>
@@ -21542,6 +21545,26 @@
           <w:b/>
           <w:bCs/>
         </w:rPr>
+        <w:t>Saved selections, column widths and the window's place</w:t>
+      </w:r>
+      <w:r>
+        <w:t xml:space="preserve"> are kept in the browser's local storage: not shared between people, browsers or profiles.</w:t>
+      </w:r>
+    </w:p>
+    <w:p>
+      <w:pPr>
+        <w:pStyle w:val="ListParagraph"/>
+        <w:numPr>
+          <w:ilvl w:val="0"/>
+          <w:numId w:val="2"/>
+        </w:numPr>
+        <w:spacing w:after="60" w:line="264" w:lineRule="auto"/>
+      </w:pPr>
+      <w:r>
+        <w:rPr>
+          <w:b/>
+          <w:bCs/>
+        </w:rPr>
         <w:t>The window</w:t>
       </w:r>
       <w:r>
@@ -21558,7 +21581,7 @@
         <w:pStyle w:val="Heading1"/>
         <w:keepNext/>
       </w:pPr>
-      <w:bookmarkStart w:id="42" w:name="_Toc242970882"/>
+      <w:bookmarkStart w:id="42" w:name="_Toc242972810"/>
       <w:r>
         <w:t>How it works</w:t>
       </w:r>
@@ -21893,6 +21916,7 @@
                 <w:sz w:val="17"/>
                 <w:szCs w:val="17"/>
               </w:rPr>
+              <w:lastRenderedPageBreak/>
               <w:t>Fact</w:t>
             </w:r>
           </w:p>
@@ -22032,7 +22056,6 @@
                 <w:szCs w:val="15"/>
                 <w:shd w:val="clear" w:color="auto" w:fill="F3F2F1"/>
               </w:rPr>
-              <w:lastRenderedPageBreak/>
               <w:t>msdyn_solutioncomponentsummaries</w:t>
             </w:r>
             <w:r>
@@ -22673,7 +22696,7 @@
         <w:pStyle w:val="Heading1"/>
         <w:keepNext/>
       </w:pPr>
-      <w:bookmarkStart w:id="43" w:name="_Toc242970883"/>
+      <w:bookmarkStart w:id="43" w:name="_Toc242972811"/>
       <w:r>
         <w:t>Comparison with Solution Layers Explorer</w:t>
       </w:r>
@@ -22956,6 +22979,7 @@
                 <w:sz w:val="17"/>
                 <w:szCs w:val="17"/>
               </w:rPr>
+              <w:lastRenderedPageBreak/>
               <w:t>Items list (name, table), sorted by column</w:t>
             </w:r>
           </w:p>
@@ -23007,7 +23031,6 @@
                 <w:sz w:val="17"/>
                 <w:szCs w:val="17"/>
               </w:rPr>
-              <w:lastRenderedPageBreak/>
               <w:t>Changes tab (the Active layer's changes)</w:t>
             </w:r>
           </w:p>
@@ -23631,7 +23654,7 @@
         <w:pStyle w:val="Heading1"/>
         <w:keepNext/>
       </w:pPr>
-      <w:bookmarkStart w:id="44" w:name="_Toc242970884"/>
+      <w:bookmarkStart w:id="44" w:name="_Toc242972812"/>
       <w:r>
         <w:lastRenderedPageBreak/>
         <w:t>Repository layout</w:t>
@@ -24661,7 +24684,7 @@
         <w:pStyle w:val="Heading1"/>
         <w:keepNext/>
       </w:pPr>
-      <w:bookmarkStart w:id="45" w:name="_Toc242970885"/>
+      <w:bookmarkStart w:id="45" w:name="_Toc242972813"/>
       <w:r>
         <w:t>Build</w:t>
       </w:r>
@@ -24944,7 +24967,7 @@
           <w:szCs w:val="18"/>
           <w:shd w:val="clear" w:color="auto" w:fill="F3F2F1"/>
         </w:rPr>
-        <w:t>bookmarklet 1.0.0: 70627 characters (164.0 KB unpacked)</w:t>
+        <w:t>bookmarklet 1.0.0: 70719 characters (164.3 KB unpacked)</w:t>
       </w:r>
       <w:r>
         <w:t>.</w:t>
@@ -25192,7 +25215,7 @@
         <w:pStyle w:val="Heading1"/>
         <w:keepNext/>
       </w:pPr>
-      <w:bookmarkStart w:id="46" w:name="_Toc242970886"/>
+      <w:bookmarkStart w:id="46" w:name="_Toc242972814"/>
       <w:r>
         <w:t>License</w:t>
       </w:r>
@@ -25414,96 +25437,10 @@
 <file path=word/numbering.xml><?xml version="1.0" encoding="utf-8"?>
 <w:numbering xmlns:wpc="http://schemas.microsoft.com/office/word/2010/wordprocessingCanvas" xmlns:cx="http://schemas.microsoft.com/office/drawing/2014/chartex" xmlns:cx1="http://schemas.microsoft.com/office/drawing/2015/9/8/chartex" xmlns:cx2="http://schemas.microsoft.com/office/drawing/2015/10/21/chartex" xmlns:cx3="http://schemas.microsoft.com/office/drawing/2016/5/9/chartex" xmlns:cx4="http://schemas.microsoft.com/office/drawing/2016/5/10/chartex" xmlns:cx5="http://schemas.microsoft.com/office/drawing/2016/5/11/chartex" xmlns:cx6="http://schemas.microsoft.com/office/drawing/2016/5/12/chartex" xmlns:cx7="http://schemas.microsoft.com/office/drawing/2016/5/13/chartex" xmlns:cx8="http://schemas.microsoft.com/office/drawing/2016/5/14/chartex" xmlns:mc="http://schemas.openxmlformats.org/markup-compatibility/2006" xmlns:aink="http://schemas.microsoft.com/office/drawing/2016/ink" xmlns:am3d="http://schemas.microsoft.com/office/drawing/2017/model3d" xmlns:o="urn:schemas-microsoft-com:office:office" xmlns:oel="http://schemas.microsoft.com/office/2019/extlst" xmlns:r="http://schemas.openxmlformats.org/officeDocument/2006/relationships" xmlns:m="http://schemas.openxmlformats.org/officeDocument/2006/math" xmlns:v="urn:schemas-microsoft-com:vml" xmlns:wp14="http://schemas.microsoft.com/office/word/2010/wordprocessingDrawing" xmlns:wp="http://schemas.openxmlformats.org/drawingml/2006/wordprocessingDrawing" xmlns:w10="urn:schemas-microsoft-com:office:word" xmlns:w="http://schemas.openxmlformats.org/wordprocessingml/2006/main" xmlns:w14="http://schemas.microsoft.com/office/word/2010/wordml" xmlns:w15="http://schemas.microsoft.com/office/word/2012/wordml" xmlns:w16cex="http://schemas.microsoft.com/office/word/2018/wordml/cex" xmlns:w16cid="http://schemas.microsoft.com/office/word/2016/wordml/cid" xmlns:w16="http://schemas.microsoft.com/office/word/2018/wordml" xmlns:w16sdtdh="http://schemas.microsoft.com/office/word/2020/wordml/sdtdatahash" xmlns:w16se="http://schemas.microsoft.com/office/word/2015/wordml/symex" xmlns:wpg="http://schemas.microsoft.com/office/word/2010/wordprocessingGroup" xmlns:wpi="http://schemas.microsoft.com/office/word/2010/wordprocessingInk" xmlns:wne="http://schemas.microsoft.com/office/word/2006/wordml" xmlns:wps="http://schemas.microsoft.com/office/word/2010/wordprocessingShape" mc:Ignorable="w14 w15 w16se w16cid w16 w16cex w16sdtdh wp14">
   <w:abstractNum w:abstractNumId="0" w15:restartNumberingAfterBreak="0">
-    <w:nsid w:val="0E50465A"/>
+    <w:nsid w:val="01DC0A81"/>
     <w:multiLevelType w:val="hybridMultilevel"/>
-    <w:tmpl w:val="74EE5FDA"/>
-    <w:lvl w:ilvl="0" w:tplc="A9721466" w:tentative="1">
-      <w:start w:val="1"/>
-      <w:numFmt w:val="bullet"/>
-      <w:lvlText w:val="●"/>
-      <w:lvlJc w:val="left"/>
-      <w:pPr>
-        <w:ind w:left="720" w:hanging="360"/>
-      </w:pPr>
-    </w:lvl>
-    <w:lvl w:ilvl="1" w:tplc="F95617F6" w:tentative="1">
-      <w:start w:val="1"/>
-      <w:numFmt w:val="bullet"/>
-      <w:lvlText w:val="○"/>
-      <w:lvlJc w:val="left"/>
-      <w:pPr>
-        <w:ind w:left="1440" w:hanging="360"/>
-      </w:pPr>
-    </w:lvl>
-    <w:lvl w:ilvl="2" w:tplc="9D9CF79E" w:tentative="1">
-      <w:start w:val="1"/>
-      <w:numFmt w:val="bullet"/>
-      <w:lvlText w:val="■"/>
-      <w:lvlJc w:val="left"/>
-      <w:pPr>
-        <w:ind w:left="2160" w:hanging="360"/>
-      </w:pPr>
-    </w:lvl>
-    <w:lvl w:ilvl="3" w:tplc="101E8BF4" w:tentative="1">
-      <w:start w:val="1"/>
-      <w:numFmt w:val="bullet"/>
-      <w:lvlText w:val="●"/>
-      <w:lvlJc w:val="left"/>
-      <w:pPr>
-        <w:ind w:left="2880" w:hanging="360"/>
-      </w:pPr>
-    </w:lvl>
-    <w:lvl w:ilvl="4" w:tplc="7074A960" w:tentative="1">
-      <w:start w:val="1"/>
-      <w:numFmt w:val="bullet"/>
-      <w:lvlText w:val="○"/>
-      <w:lvlJc w:val="left"/>
-      <w:pPr>
-        <w:ind w:left="3600" w:hanging="360"/>
-      </w:pPr>
-    </w:lvl>
-    <w:lvl w:ilvl="5" w:tplc="3A4E1B6A" w:tentative="1">
-      <w:start w:val="1"/>
-      <w:numFmt w:val="bullet"/>
-      <w:lvlText w:val="■"/>
-      <w:lvlJc w:val="left"/>
-      <w:pPr>
-        <w:ind w:left="4320" w:hanging="360"/>
-      </w:pPr>
-    </w:lvl>
-    <w:lvl w:ilvl="6" w:tplc="2626C352" w:tentative="1">
-      <w:start w:val="1"/>
-      <w:numFmt w:val="bullet"/>
-      <w:lvlText w:val="●"/>
-      <w:lvlJc w:val="left"/>
-      <w:pPr>
-        <w:ind w:left="5040" w:hanging="360"/>
-      </w:pPr>
-    </w:lvl>
-    <w:lvl w:ilvl="7" w:tplc="D122A166" w:tentative="1">
-      <w:start w:val="1"/>
-      <w:numFmt w:val="bullet"/>
-      <w:lvlText w:val="●"/>
-      <w:lvlJc w:val="left"/>
-      <w:pPr>
-        <w:ind w:left="5760" w:hanging="360"/>
-      </w:pPr>
-    </w:lvl>
-    <w:lvl w:ilvl="8" w:tplc="5F907C7E" w:tentative="1">
-      <w:start w:val="1"/>
-      <w:numFmt w:val="bullet"/>
-      <w:lvlText w:val="●"/>
-      <w:lvlJc w:val="left"/>
-      <w:pPr>
-        <w:ind w:left="6480" w:hanging="360"/>
-      </w:pPr>
-    </w:lvl>
-  </w:abstractNum>
-  <w:abstractNum w:abstractNumId="1" w15:restartNumberingAfterBreak="0">
-    <w:nsid w:val="606B24DE"/>
-    <w:multiLevelType w:val="hybridMultilevel"/>
-    <w:tmpl w:val="140C6822"/>
-    <w:lvl w:ilvl="0" w:tplc="53380134">
+    <w:tmpl w:val="45449686"/>
+    <w:lvl w:ilvl="0" w:tplc="0C0811E2">
       <w:start w:val="1"/>
       <w:numFmt w:val="decimal"/>
       <w:lvlText w:val="%1."/>
@@ -25512,7 +25449,7 @@
         <w:ind w:left="360" w:hanging="300"/>
       </w:pPr>
     </w:lvl>
-    <w:lvl w:ilvl="1" w:tplc="688071EC" w:tentative="1">
+    <w:lvl w:ilvl="1" w:tplc="63F876CA" w:tentative="1">
       <w:start w:val="1"/>
       <w:numFmt w:val="lowerLetter"/>
       <w:lvlText w:val="%2."/>
@@ -25521,7 +25458,7 @@
         <w:ind w:left="720" w:hanging="300"/>
       </w:pPr>
     </w:lvl>
-    <w:lvl w:ilvl="2" w:tplc="F46EADF6" w:tentative="1">
+    <w:lvl w:ilvl="2" w:tplc="90F0F55E" w:tentative="1">
       <w:start w:val="1"/>
       <w:numFmt w:val="lowerRoman"/>
       <w:lvlText w:val="%3."/>
@@ -25530,7 +25467,7 @@
         <w:ind w:left="1080" w:hanging="300"/>
       </w:pPr>
     </w:lvl>
-    <w:lvl w:ilvl="3" w:tplc="3CE22D58" w:tentative="1">
+    <w:lvl w:ilvl="3" w:tplc="9D8EDDA0" w:tentative="1">
       <w:start w:val="1"/>
       <w:numFmt w:val="decimal"/>
       <w:lvlText w:val="%4."/>
@@ -25539,172 +25476,258 @@
         <w:ind w:left="1440" w:hanging="300"/>
       </w:pPr>
     </w:lvl>
-    <w:lvl w:ilvl="4" w:tplc="F55C5036">
+    <w:lvl w:ilvl="4" w:tplc="D190174A">
       <w:numFmt w:val="decimal"/>
       <w:lvlText w:val=""/>
       <w:lvlJc w:val="left"/>
     </w:lvl>
-    <w:lvl w:ilvl="5" w:tplc="B44EB4E6">
+    <w:lvl w:ilvl="5" w:tplc="E1B8CAF2">
       <w:numFmt w:val="decimal"/>
       <w:lvlText w:val=""/>
       <w:lvlJc w:val="left"/>
     </w:lvl>
-    <w:lvl w:ilvl="6" w:tplc="5F469E5E">
+    <w:lvl w:ilvl="6" w:tplc="553E9322">
       <w:numFmt w:val="decimal"/>
       <w:lvlText w:val=""/>
       <w:lvlJc w:val="left"/>
     </w:lvl>
-    <w:lvl w:ilvl="7" w:tplc="132E301E">
+    <w:lvl w:ilvl="7" w:tplc="26FA9212">
       <w:numFmt w:val="decimal"/>
       <w:lvlText w:val=""/>
       <w:lvlJc w:val="left"/>
     </w:lvl>
-    <w:lvl w:ilvl="8" w:tplc="56A8D2BA">
+    <w:lvl w:ilvl="8" w:tplc="24D20DF2">
+      <w:numFmt w:val="decimal"/>
+      <w:lvlText w:val=""/>
+      <w:lvlJc w:val="left"/>
+    </w:lvl>
+  </w:abstractNum>
+  <w:abstractNum w:abstractNumId="1" w15:restartNumberingAfterBreak="0">
+    <w:nsid w:val="186802CF"/>
+    <w:multiLevelType w:val="hybridMultilevel"/>
+    <w:tmpl w:val="F926C286"/>
+    <w:lvl w:ilvl="0" w:tplc="25242A0A">
+      <w:start w:val="1"/>
+      <w:numFmt w:val="bullet"/>
+      <w:lvlText w:val="•"/>
+      <w:lvlJc w:val="left"/>
+      <w:pPr>
+        <w:ind w:left="360" w:hanging="260"/>
+      </w:pPr>
+    </w:lvl>
+    <w:lvl w:ilvl="1" w:tplc="45962024" w:tentative="1">
+      <w:start w:val="1"/>
+      <w:numFmt w:val="bullet"/>
+      <w:lvlText w:val="–"/>
+      <w:lvlJc w:val="left"/>
+      <w:pPr>
+        <w:ind w:left="720" w:hanging="260"/>
+      </w:pPr>
+    </w:lvl>
+    <w:lvl w:ilvl="2" w:tplc="49F4A4BE" w:tentative="1">
+      <w:start w:val="1"/>
+      <w:numFmt w:val="bullet"/>
+      <w:lvlText w:val="◦"/>
+      <w:lvlJc w:val="left"/>
+      <w:pPr>
+        <w:ind w:left="1080" w:hanging="260"/>
+      </w:pPr>
+    </w:lvl>
+    <w:lvl w:ilvl="3" w:tplc="7CEE57DE" w:tentative="1">
+      <w:start w:val="1"/>
+      <w:numFmt w:val="bullet"/>
+      <w:lvlText w:val="•"/>
+      <w:lvlJc w:val="left"/>
+      <w:pPr>
+        <w:ind w:left="1440" w:hanging="260"/>
+      </w:pPr>
+    </w:lvl>
+    <w:lvl w:ilvl="4" w:tplc="7A36FA68">
+      <w:numFmt w:val="decimal"/>
+      <w:lvlText w:val=""/>
+      <w:lvlJc w:val="left"/>
+    </w:lvl>
+    <w:lvl w:ilvl="5" w:tplc="10E0D4A4">
+      <w:numFmt w:val="decimal"/>
+      <w:lvlText w:val=""/>
+      <w:lvlJc w:val="left"/>
+    </w:lvl>
+    <w:lvl w:ilvl="6" w:tplc="4584503E">
+      <w:numFmt w:val="decimal"/>
+      <w:lvlText w:val=""/>
+      <w:lvlJc w:val="left"/>
+    </w:lvl>
+    <w:lvl w:ilvl="7" w:tplc="B5621FFE">
+      <w:numFmt w:val="decimal"/>
+      <w:lvlText w:val=""/>
+      <w:lvlJc w:val="left"/>
+    </w:lvl>
+    <w:lvl w:ilvl="8" w:tplc="98D254B6">
       <w:numFmt w:val="decimal"/>
       <w:lvlText w:val=""/>
       <w:lvlJc w:val="left"/>
     </w:lvl>
   </w:abstractNum>
   <w:abstractNum w:abstractNumId="2" w15:restartNumberingAfterBreak="0">
-    <w:nsid w:val="7EAE1AA4"/>
+    <w:nsid w:val="30E2016B"/>
     <w:multiLevelType w:val="hybridMultilevel"/>
-    <w:tmpl w:val="74763A98"/>
-    <w:lvl w:ilvl="0" w:tplc="3B4A06E4">
+    <w:tmpl w:val="43B60C9E"/>
+    <w:lvl w:ilvl="0" w:tplc="6C00C048" w:tentative="1">
       <w:start w:val="1"/>
       <w:numFmt w:val="bullet"/>
-      <w:lvlText w:val="•"/>
+      <w:lvlText w:val="●"/>
       <w:lvlJc w:val="left"/>
       <w:pPr>
-        <w:ind w:left="360" w:hanging="260"/>
+        <w:ind w:left="720" w:hanging="360"/>
       </w:pPr>
     </w:lvl>
-    <w:lvl w:ilvl="1" w:tplc="DDA48F44" w:tentative="1">
+    <w:lvl w:ilvl="1" w:tplc="FB80F7EA" w:tentative="1">
       <w:start w:val="1"/>
       <w:numFmt w:val="bullet"/>
-      <w:lvlText w:val="–"/>
+      <w:lvlText w:val="○"/>
       <w:lvlJc w:val="left"/>
       <w:pPr>
-        <w:ind w:left="720" w:hanging="260"/>
+        <w:ind w:left="1440" w:hanging="360"/>
       </w:pPr>
     </w:lvl>
-    <w:lvl w:ilvl="2" w:tplc="B296D0FC" w:tentative="1">
+    <w:lvl w:ilvl="2" w:tplc="4F7E1EB0" w:tentative="1">
       <w:start w:val="1"/>
       <w:numFmt w:val="bullet"/>
-      <w:lvlText w:val="◦"/>
+      <w:lvlText w:val="■"/>
       <w:lvlJc w:val="left"/>
       <w:pPr>
-        <w:ind w:left="1080" w:hanging="260"/>
+        <w:ind w:left="2160" w:hanging="360"/>
       </w:pPr>
     </w:lvl>
-    <w:lvl w:ilvl="3" w:tplc="E8ACD3D2" w:tentative="1">
+    <w:lvl w:ilvl="3" w:tplc="8EC46210" w:tentative="1">
       <w:start w:val="1"/>
       <w:numFmt w:val="bullet"/>
-      <w:lvlText w:val="•"/>
+      <w:lvlText w:val="●"/>
       <w:lvlJc w:val="left"/>
       <w:pPr>
-        <w:ind w:left="1440" w:hanging="260"/>
+        <w:ind w:left="2880" w:hanging="360"/>
       </w:pPr>
     </w:lvl>
-    <w:lvl w:ilvl="4" w:tplc="BDB2C4C8">
-      <w:numFmt w:val="decimal"/>
-      <w:lvlText w:val=""/>
+    <w:lvl w:ilvl="4" w:tplc="72EC235E" w:tentative="1">
+      <w:start w:val="1"/>
+      <w:numFmt w:val="bullet"/>
+      <w:lvlText w:val="○"/>
       <w:lvlJc w:val="left"/>
+      <w:pPr>
+        <w:ind w:left="3600" w:hanging="360"/>
+      </w:pPr>
     </w:lvl>
-    <w:lvl w:ilvl="5" w:tplc="DAF209A2">
-      <w:numFmt w:val="decimal"/>
-      <w:lvlText w:val=""/>
+    <w:lvl w:ilvl="5" w:tplc="44283324" w:tentative="1">
+      <w:start w:val="1"/>
+      <w:numFmt w:val="bullet"/>
+      <w:lvlText w:val="■"/>
       <w:lvlJc w:val="left"/>
+      <w:pPr>
+        <w:ind w:left="4320" w:hanging="360"/>
+      </w:pPr>
     </w:lvl>
-    <w:lvl w:ilvl="6" w:tplc="EBC0C9C0">
-      <w:numFmt w:val="decimal"/>
-      <w:lvlText w:val=""/>
+    <w:lvl w:ilvl="6" w:tplc="47F886E6" w:tentative="1">
+      <w:start w:val="1"/>
+      <w:numFmt w:val="bullet"/>
+      <w:lvlText w:val="●"/>
       <w:lvlJc w:val="left"/>
+      <w:pPr>
+        <w:ind w:left="5040" w:hanging="360"/>
+      </w:pPr>
     </w:lvl>
-    <w:lvl w:ilvl="7" w:tplc="773C9AC4">
-      <w:numFmt w:val="decimal"/>
-      <w:lvlText w:val=""/>
+    <w:lvl w:ilvl="7" w:tplc="97EA970A" w:tentative="1">
+      <w:start w:val="1"/>
+      <w:numFmt w:val="bullet"/>
+      <w:lvlText w:val="●"/>
       <w:lvlJc w:val="left"/>
+      <w:pPr>
+        <w:ind w:left="5760" w:hanging="360"/>
+      </w:pPr>
     </w:lvl>
-    <w:lvl w:ilvl="8" w:tplc="B6C8CFA2">
-      <w:numFmt w:val="decimal"/>
-      <w:lvlText w:val=""/>
+    <w:lvl w:ilvl="8" w:tplc="DDDE42C6" w:tentative="1">
+      <w:start w:val="1"/>
+      <w:numFmt w:val="bullet"/>
+      <w:lvlText w:val="●"/>
       <w:lvlJc w:val="left"/>
+      <w:pPr>
+        <w:ind w:left="6480" w:hanging="360"/>
+      </w:pPr>
     </w:lvl>
   </w:abstractNum>
-  <w:num w:numId="1" w16cid:durableId="717365827">
+  <w:num w:numId="1" w16cid:durableId="1992632646">
+    <w:abstractNumId w:val="2"/>
+    <w:lvlOverride w:ilvl="0">
+      <w:startOverride w:val="1"/>
+    </w:lvlOverride>
+  </w:num>
+  <w:num w:numId="2" w16cid:durableId="1713379617">
+    <w:abstractNumId w:val="1"/>
+    <w:lvlOverride w:ilvl="0">
+      <w:startOverride w:val="1"/>
+    </w:lvlOverride>
+  </w:num>
+  <w:num w:numId="3" w16cid:durableId="582954525">
     <w:abstractNumId w:val="0"/>
     <w:lvlOverride w:ilvl="0">
       <w:startOverride w:val="1"/>
     </w:lvlOverride>
   </w:num>
-  <w:num w:numId="2" w16cid:durableId="212236999">
-    <w:abstractNumId w:val="2"/>
+  <w:num w:numId="4" w16cid:durableId="936908063">
+    <w:abstractNumId w:val="0"/>
     <w:lvlOverride w:ilvl="0">
       <w:startOverride w:val="1"/>
     </w:lvlOverride>
   </w:num>
-  <w:num w:numId="3" w16cid:durableId="974725758">
-    <w:abstractNumId w:val="1"/>
+  <w:num w:numId="5" w16cid:durableId="319119226">
+    <w:abstractNumId w:val="0"/>
     <w:lvlOverride w:ilvl="0">
       <w:startOverride w:val="1"/>
     </w:lvlOverride>
   </w:num>
-  <w:num w:numId="4" w16cid:durableId="1307005797">
-    <w:abstractNumId w:val="1"/>
+  <w:num w:numId="6" w16cid:durableId="512036656">
+    <w:abstractNumId w:val="0"/>
     <w:lvlOverride w:ilvl="0">
       <w:startOverride w:val="1"/>
     </w:lvlOverride>
   </w:num>
-  <w:num w:numId="5" w16cid:durableId="1669747376">
-    <w:abstractNumId w:val="1"/>
+  <w:num w:numId="7" w16cid:durableId="300774699">
+    <w:abstractNumId w:val="0"/>
     <w:lvlOverride w:ilvl="0">
       <w:startOverride w:val="1"/>
     </w:lvlOverride>
   </w:num>
-  <w:num w:numId="6" w16cid:durableId="1324237638">
-    <w:abstractNumId w:val="1"/>
+  <w:num w:numId="8" w16cid:durableId="838928232">
+    <w:abstractNumId w:val="0"/>
     <w:lvlOverride w:ilvl="0">
       <w:startOverride w:val="1"/>
     </w:lvlOverride>
   </w:num>
-  <w:num w:numId="7" w16cid:durableId="1852836753">
-    <w:abstractNumId w:val="1"/>
+  <w:num w:numId="9" w16cid:durableId="1843348039">
+    <w:abstractNumId w:val="0"/>
     <w:lvlOverride w:ilvl="0">
       <w:startOverride w:val="1"/>
     </w:lvlOverride>
   </w:num>
-  <w:num w:numId="8" w16cid:durableId="796796636">
-    <w:abstractNumId w:val="1"/>
+  <w:num w:numId="10" w16cid:durableId="346758642">
+    <w:abstractNumId w:val="0"/>
     <w:lvlOverride w:ilvl="0">
       <w:startOverride w:val="1"/>
     </w:lvlOverride>
   </w:num>
-  <w:num w:numId="9" w16cid:durableId="1298952261">
-    <w:abstractNumId w:val="1"/>
+  <w:num w:numId="11" w16cid:durableId="903030386">
+    <w:abstractNumId w:val="0"/>
     <w:lvlOverride w:ilvl="0">
       <w:startOverride w:val="1"/>
     </w:lvlOverride>
   </w:num>
-  <w:num w:numId="10" w16cid:durableId="1547527071">
-    <w:abstractNumId w:val="1"/>
+  <w:num w:numId="12" w16cid:durableId="2008363134">
+    <w:abstractNumId w:val="0"/>
     <w:lvlOverride w:ilvl="0">
       <w:startOverride w:val="1"/>
     </w:lvlOverride>
   </w:num>
-  <w:num w:numId="11" w16cid:durableId="2079280923">
-    <w:abstractNumId w:val="1"/>
-    <w:lvlOverride w:ilvl="0">
-      <w:startOverride w:val="1"/>
-    </w:lvlOverride>
-  </w:num>
-  <w:num w:numId="12" w16cid:durableId="627128402">
-    <w:abstractNumId w:val="1"/>
-    <w:lvlOverride w:ilvl="0">
-      <w:startOverride w:val="1"/>
-    </w:lvlOverride>
-  </w:num>
-  <w:num w:numId="13" w16cid:durableId="766536955">
-    <w:abstractNumId w:val="1"/>
+  <w:num w:numId="13" w16cid:durableId="1080131080">
+    <w:abstractNumId w:val="0"/>
     <w:lvlOverride w:ilvl="0">
       <w:startOverride w:val="1"/>
     </w:lvlOverride>
@@ -26349,7 +26372,7 @@
     <w:autoRedefine/>
     <w:uiPriority w:val="39"/>
     <w:unhideWhenUsed/>
-    <w:rsid w:val="00464AE1"/>
+    <w:rsid w:val="0096254F"/>
     <w:pPr>
       <w:spacing w:after="100"/>
     </w:pPr>
@@ -26361,7 +26384,7 @@
     <w:autoRedefine/>
     <w:uiPriority w:val="39"/>
     <w:unhideWhenUsed/>
-    <w:rsid w:val="00464AE1"/>
+    <w:rsid w:val="0096254F"/>
     <w:pPr>
       <w:spacing w:after="100"/>
       <w:ind w:left="200"/>
@@ -26374,7 +26397,7 @@
     <w:autoRedefine/>
     <w:uiPriority w:val="39"/>
     <w:unhideWhenUsed/>
-    <w:rsid w:val="00464AE1"/>
+    <w:rsid w:val="0096254F"/>
     <w:pPr>
       <w:spacing w:after="100"/>
       <w:ind w:left="400"/>

</xml_diff>

<commit_message>
Show when the unmanaged layer was last changed
Dataverse gives an unmanaged layer no overwrite time. The details' Layers tab now shows, for the unmanaged layer, the component's last save (modifiedon, "Last changed") or a form's last publish (publishedon, "Last published"), from the layer's own data; relationships record no date. Table and column layers write these times without a zone and are read as UTC.
</commit_message>
<xml_diff>
--- a/docs/UnmanagedLayerScanner - Technical Reference.docx
+++ b/docs/UnmanagedLayerScanner - Technical Reference.docx
@@ -38,7 +38,7 @@
           <w:noProof/>
         </w:rPr>
         <w:drawing>
-          <wp:inline distT="0" distB="0" distL="0" distR="0" wp14:anchorId="76C59518" wp14:editId="14F5C2EA">
+          <wp:inline distT="0" distB="0" distL="0" distR="0" wp14:anchorId="0A7C0195" wp14:editId="52555DC9">
             <wp:extent cx="5943600" cy="4229100"/>
             <wp:effectExtent l="0" t="0" r="0" b="0"/>
             <wp:docPr id="19" name="results.png" descr="The results of a scan" title="The results of a scan"/>
@@ -85,7 +85,7 @@
         <w:rPr>
           <w:color w:val="616161"/>
         </w:rPr>
-        <w:t>Version 1.0.0  ·  2026-10-15</w:t>
+        <w:t>Version 1.0.0  ·  2026-10-16</w:t>
       </w:r>
     </w:p>
     <w:p>
@@ -135,7 +135,7 @@
     <w:sdt>
       <w:sdtPr>
         <w:alias w:val="Contents"/>
-        <w:id w:val="1838260141"/>
+        <w:id w:val="1541558952"/>
       </w:sdtPr>
       <w:sdtEndPr/>
       <w:sdtContent>
@@ -164,7 +164,7 @@
           <w:r>
             <w:fldChar w:fldCharType="separate"/>
           </w:r>
-          <w:hyperlink w:anchor="_Toc242972768" w:history="1">
+          <w:hyperlink w:anchor="_Toc242987545" w:history="1">
             <w:r>
               <w:rPr>
                 <w:rStyle w:val="Hyperlink"/>
@@ -188,7 +188,7 @@
               <w:rPr>
                 <w:noProof/>
               </w:rPr>
-              <w:instrText xml:space="preserve"> PAGEREF _Toc242972768 \h </w:instrText>
+              <w:instrText xml:space="preserve"> PAGEREF _Toc242987545 \h </w:instrText>
             </w:r>
             <w:r>
               <w:rPr>
@@ -231,7 +231,7 @@
               <w14:ligatures w14:val="standardContextual"/>
             </w:rPr>
           </w:pPr>
-          <w:hyperlink w:anchor="_Toc242972769" w:history="1">
+          <w:hyperlink w:anchor="_Toc242987546" w:history="1">
             <w:r>
               <w:rPr>
                 <w:rStyle w:val="Hyperlink"/>
@@ -255,7 +255,7 @@
               <w:rPr>
                 <w:noProof/>
               </w:rPr>
-              <w:instrText xml:space="preserve"> PAGEREF _Toc242972769 \h </w:instrText>
+              <w:instrText xml:space="preserve"> PAGEREF _Toc242987546 \h </w:instrText>
             </w:r>
             <w:r>
               <w:rPr>
@@ -298,7 +298,7 @@
               <w14:ligatures w14:val="standardContextual"/>
             </w:rPr>
           </w:pPr>
-          <w:hyperlink w:anchor="_Toc242972770" w:history="1">
+          <w:hyperlink w:anchor="_Toc242987547" w:history="1">
             <w:r>
               <w:rPr>
                 <w:rStyle w:val="Hyperlink"/>
@@ -322,7 +322,7 @@
               <w:rPr>
                 <w:noProof/>
               </w:rPr>
-              <w:instrText xml:space="preserve"> PAGEREF _Toc242972770 \h </w:instrText>
+              <w:instrText xml:space="preserve"> PAGEREF _Toc242987547 \h </w:instrText>
             </w:r>
             <w:r>
               <w:rPr>
@@ -365,7 +365,7 @@
               <w14:ligatures w14:val="standardContextual"/>
             </w:rPr>
           </w:pPr>
-          <w:hyperlink w:anchor="_Toc242972771" w:history="1">
+          <w:hyperlink w:anchor="_Toc242987548" w:history="1">
             <w:r>
               <w:rPr>
                 <w:rStyle w:val="Hyperlink"/>
@@ -389,7 +389,7 @@
               <w:rPr>
                 <w:noProof/>
               </w:rPr>
-              <w:instrText xml:space="preserve"> PAGEREF _Toc242972771 \h </w:instrText>
+              <w:instrText xml:space="preserve"> PAGEREF _Toc242987548 \h </w:instrText>
             </w:r>
             <w:r>
               <w:rPr>
@@ -432,7 +432,7 @@
               <w14:ligatures w14:val="standardContextual"/>
             </w:rPr>
           </w:pPr>
-          <w:hyperlink w:anchor="_Toc242972772" w:history="1">
+          <w:hyperlink w:anchor="_Toc242987549" w:history="1">
             <w:r>
               <w:rPr>
                 <w:rStyle w:val="Hyperlink"/>
@@ -456,7 +456,7 @@
               <w:rPr>
                 <w:noProof/>
               </w:rPr>
-              <w:instrText xml:space="preserve"> PAGEREF _Toc242972772 \h </w:instrText>
+              <w:instrText xml:space="preserve"> PAGEREF _Toc242987549 \h </w:instrText>
             </w:r>
             <w:r>
               <w:rPr>
@@ -499,7 +499,7 @@
               <w14:ligatures w14:val="standardContextual"/>
             </w:rPr>
           </w:pPr>
-          <w:hyperlink w:anchor="_Toc242972773" w:history="1">
+          <w:hyperlink w:anchor="_Toc242987550" w:history="1">
             <w:r>
               <w:rPr>
                 <w:rStyle w:val="Hyperlink"/>
@@ -523,7 +523,7 @@
               <w:rPr>
                 <w:noProof/>
               </w:rPr>
-              <w:instrText xml:space="preserve"> PAGEREF _Toc242972773 \h </w:instrText>
+              <w:instrText xml:space="preserve"> PAGEREF _Toc242987550 \h </w:instrText>
             </w:r>
             <w:r>
               <w:rPr>
@@ -566,7 +566,7 @@
               <w14:ligatures w14:val="standardContextual"/>
             </w:rPr>
           </w:pPr>
-          <w:hyperlink w:anchor="_Toc242972774" w:history="1">
+          <w:hyperlink w:anchor="_Toc242987551" w:history="1">
             <w:r>
               <w:rPr>
                 <w:rStyle w:val="Hyperlink"/>
@@ -590,7 +590,7 @@
               <w:rPr>
                 <w:noProof/>
               </w:rPr>
-              <w:instrText xml:space="preserve"> PAGEREF _Toc242972774 \h </w:instrText>
+              <w:instrText xml:space="preserve"> PAGEREF _Toc242987551 \h </w:instrText>
             </w:r>
             <w:r>
               <w:rPr>
@@ -633,7 +633,7 @@
               <w14:ligatures w14:val="standardContextual"/>
             </w:rPr>
           </w:pPr>
-          <w:hyperlink w:anchor="_Toc242972775" w:history="1">
+          <w:hyperlink w:anchor="_Toc242987552" w:history="1">
             <w:r>
               <w:rPr>
                 <w:rStyle w:val="Hyperlink"/>
@@ -657,7 +657,7 @@
               <w:rPr>
                 <w:noProof/>
               </w:rPr>
-              <w:instrText xml:space="preserve"> PAGEREF _Toc242972775 \h </w:instrText>
+              <w:instrText xml:space="preserve"> PAGEREF _Toc242987552 \h </w:instrText>
             </w:r>
             <w:r>
               <w:rPr>
@@ -700,7 +700,7 @@
               <w14:ligatures w14:val="standardContextual"/>
             </w:rPr>
           </w:pPr>
-          <w:hyperlink w:anchor="_Toc242972776" w:history="1">
+          <w:hyperlink w:anchor="_Toc242987553" w:history="1">
             <w:r>
               <w:rPr>
                 <w:rStyle w:val="Hyperlink"/>
@@ -724,7 +724,7 @@
               <w:rPr>
                 <w:noProof/>
               </w:rPr>
-              <w:instrText xml:space="preserve"> PAGEREF _Toc242972776 \h </w:instrText>
+              <w:instrText xml:space="preserve"> PAGEREF _Toc242987553 \h </w:instrText>
             </w:r>
             <w:r>
               <w:rPr>
@@ -767,7 +767,7 @@
               <w14:ligatures w14:val="standardContextual"/>
             </w:rPr>
           </w:pPr>
-          <w:hyperlink w:anchor="_Toc242972777" w:history="1">
+          <w:hyperlink w:anchor="_Toc242987554" w:history="1">
             <w:r>
               <w:rPr>
                 <w:rStyle w:val="Hyperlink"/>
@@ -791,7 +791,7 @@
               <w:rPr>
                 <w:noProof/>
               </w:rPr>
-              <w:instrText xml:space="preserve"> PAGEREF _Toc242972777 \h </w:instrText>
+              <w:instrText xml:space="preserve"> PAGEREF _Toc242987554 \h </w:instrText>
             </w:r>
             <w:r>
               <w:rPr>
@@ -834,7 +834,7 @@
               <w14:ligatures w14:val="standardContextual"/>
             </w:rPr>
           </w:pPr>
-          <w:hyperlink w:anchor="_Toc242972778" w:history="1">
+          <w:hyperlink w:anchor="_Toc242987555" w:history="1">
             <w:r>
               <w:rPr>
                 <w:rStyle w:val="Hyperlink"/>
@@ -858,7 +858,7 @@
               <w:rPr>
                 <w:noProof/>
               </w:rPr>
-              <w:instrText xml:space="preserve"> PAGEREF _Toc242972778 \h </w:instrText>
+              <w:instrText xml:space="preserve"> PAGEREF _Toc242987555 \h </w:instrText>
             </w:r>
             <w:r>
               <w:rPr>
@@ -901,7 +901,7 @@
               <w14:ligatures w14:val="standardContextual"/>
             </w:rPr>
           </w:pPr>
-          <w:hyperlink w:anchor="_Toc242972779" w:history="1">
+          <w:hyperlink w:anchor="_Toc242987556" w:history="1">
             <w:r>
               <w:rPr>
                 <w:rStyle w:val="Hyperlink"/>
@@ -925,7 +925,7 @@
               <w:rPr>
                 <w:noProof/>
               </w:rPr>
-              <w:instrText xml:space="preserve"> PAGEREF _Toc242972779 \h </w:instrText>
+              <w:instrText xml:space="preserve"> PAGEREF _Toc242987556 \h </w:instrText>
             </w:r>
             <w:r>
               <w:rPr>
@@ -968,7 +968,7 @@
               <w14:ligatures w14:val="standardContextual"/>
             </w:rPr>
           </w:pPr>
-          <w:hyperlink w:anchor="_Toc242972780" w:history="1">
+          <w:hyperlink w:anchor="_Toc242987557" w:history="1">
             <w:r>
               <w:rPr>
                 <w:rStyle w:val="Hyperlink"/>
@@ -992,7 +992,7 @@
               <w:rPr>
                 <w:noProof/>
               </w:rPr>
-              <w:instrText xml:space="preserve"> PAGEREF _Toc242972780 \h </w:instrText>
+              <w:instrText xml:space="preserve"> PAGEREF _Toc242987557 \h </w:instrText>
             </w:r>
             <w:r>
               <w:rPr>
@@ -1035,7 +1035,7 @@
               <w14:ligatures w14:val="standardContextual"/>
             </w:rPr>
           </w:pPr>
-          <w:hyperlink w:anchor="_Toc242972781" w:history="1">
+          <w:hyperlink w:anchor="_Toc242987558" w:history="1">
             <w:r>
               <w:rPr>
                 <w:rStyle w:val="Hyperlink"/>
@@ -1059,7 +1059,7 @@
               <w:rPr>
                 <w:noProof/>
               </w:rPr>
-              <w:instrText xml:space="preserve"> PAGEREF _Toc242972781 \h </w:instrText>
+              <w:instrText xml:space="preserve"> PAGEREF _Toc242987558 \h </w:instrText>
             </w:r>
             <w:r>
               <w:rPr>
@@ -1102,7 +1102,7 @@
               <w14:ligatures w14:val="standardContextual"/>
             </w:rPr>
           </w:pPr>
-          <w:hyperlink w:anchor="_Toc242972782" w:history="1">
+          <w:hyperlink w:anchor="_Toc242987559" w:history="1">
             <w:r>
               <w:rPr>
                 <w:rStyle w:val="Hyperlink"/>
@@ -1126,7 +1126,7 @@
               <w:rPr>
                 <w:noProof/>
               </w:rPr>
-              <w:instrText xml:space="preserve"> PAGEREF _Toc242972782 \h </w:instrText>
+              <w:instrText xml:space="preserve"> PAGEREF _Toc242987559 \h </w:instrText>
             </w:r>
             <w:r>
               <w:rPr>
@@ -1169,7 +1169,7 @@
               <w14:ligatures w14:val="standardContextual"/>
             </w:rPr>
           </w:pPr>
-          <w:hyperlink w:anchor="_Toc242972783" w:history="1">
+          <w:hyperlink w:anchor="_Toc242987560" w:history="1">
             <w:r>
               <w:rPr>
                 <w:rStyle w:val="Hyperlink"/>
@@ -1193,7 +1193,7 @@
               <w:rPr>
                 <w:noProof/>
               </w:rPr>
-              <w:instrText xml:space="preserve"> PAGEREF _Toc242972783 \h </w:instrText>
+              <w:instrText xml:space="preserve"> PAGEREF _Toc242987560 \h </w:instrText>
             </w:r>
             <w:r>
               <w:rPr>
@@ -1236,7 +1236,7 @@
               <w14:ligatures w14:val="standardContextual"/>
             </w:rPr>
           </w:pPr>
-          <w:hyperlink w:anchor="_Toc242972784" w:history="1">
+          <w:hyperlink w:anchor="_Toc242987561" w:history="1">
             <w:r>
               <w:rPr>
                 <w:rStyle w:val="Hyperlink"/>
@@ -1260,7 +1260,7 @@
               <w:rPr>
                 <w:noProof/>
               </w:rPr>
-              <w:instrText xml:space="preserve"> PAGEREF _Toc242972784 \h </w:instrText>
+              <w:instrText xml:space="preserve"> PAGEREF _Toc242987561 \h </w:instrText>
             </w:r>
             <w:r>
               <w:rPr>
@@ -1303,7 +1303,7 @@
               <w14:ligatures w14:val="standardContextual"/>
             </w:rPr>
           </w:pPr>
-          <w:hyperlink w:anchor="_Toc242972785" w:history="1">
+          <w:hyperlink w:anchor="_Toc242987562" w:history="1">
             <w:r>
               <w:rPr>
                 <w:rStyle w:val="Hyperlink"/>
@@ -1327,7 +1327,7 @@
               <w:rPr>
                 <w:noProof/>
               </w:rPr>
-              <w:instrText xml:space="preserve"> PAGEREF _Toc242972785 \h </w:instrText>
+              <w:instrText xml:space="preserve"> PAGEREF _Toc242987562 \h </w:instrText>
             </w:r>
             <w:r>
               <w:rPr>
@@ -1370,7 +1370,7 @@
               <w14:ligatures w14:val="standardContextual"/>
             </w:rPr>
           </w:pPr>
-          <w:hyperlink w:anchor="_Toc242972786" w:history="1">
+          <w:hyperlink w:anchor="_Toc242987563" w:history="1">
             <w:r>
               <w:rPr>
                 <w:rStyle w:val="Hyperlink"/>
@@ -1394,7 +1394,7 @@
               <w:rPr>
                 <w:noProof/>
               </w:rPr>
-              <w:instrText xml:space="preserve"> PAGEREF _Toc242972786 \h </w:instrText>
+              <w:instrText xml:space="preserve"> PAGEREF _Toc242987563 \h </w:instrText>
             </w:r>
             <w:r>
               <w:rPr>
@@ -1437,7 +1437,7 @@
               <w14:ligatures w14:val="standardContextual"/>
             </w:rPr>
           </w:pPr>
-          <w:hyperlink w:anchor="_Toc242972787" w:history="1">
+          <w:hyperlink w:anchor="_Toc242987564" w:history="1">
             <w:r>
               <w:rPr>
                 <w:rStyle w:val="Hyperlink"/>
@@ -1461,7 +1461,7 @@
               <w:rPr>
                 <w:noProof/>
               </w:rPr>
-              <w:instrText xml:space="preserve"> PAGEREF _Toc242972787 \h </w:instrText>
+              <w:instrText xml:space="preserve"> PAGEREF _Toc242987564 \h </w:instrText>
             </w:r>
             <w:r>
               <w:rPr>
@@ -1504,7 +1504,7 @@
               <w14:ligatures w14:val="standardContextual"/>
             </w:rPr>
           </w:pPr>
-          <w:hyperlink w:anchor="_Toc242972788" w:history="1">
+          <w:hyperlink w:anchor="_Toc242987565" w:history="1">
             <w:r>
               <w:rPr>
                 <w:rStyle w:val="Hyperlink"/>
@@ -1528,7 +1528,7 @@
               <w:rPr>
                 <w:noProof/>
               </w:rPr>
-              <w:instrText xml:space="preserve"> PAGEREF _Toc242972788 \h </w:instrText>
+              <w:instrText xml:space="preserve"> PAGEREF _Toc242987565 \h </w:instrText>
             </w:r>
             <w:r>
               <w:rPr>
@@ -1571,7 +1571,7 @@
               <w14:ligatures w14:val="standardContextual"/>
             </w:rPr>
           </w:pPr>
-          <w:hyperlink w:anchor="_Toc242972789" w:history="1">
+          <w:hyperlink w:anchor="_Toc242987566" w:history="1">
             <w:r>
               <w:rPr>
                 <w:rStyle w:val="Hyperlink"/>
@@ -1595,7 +1595,7 @@
               <w:rPr>
                 <w:noProof/>
               </w:rPr>
-              <w:instrText xml:space="preserve"> PAGEREF _Toc242972789 \h </w:instrText>
+              <w:instrText xml:space="preserve"> PAGEREF _Toc242987566 \h </w:instrText>
             </w:r>
             <w:r>
               <w:rPr>
@@ -1638,7 +1638,7 @@
               <w14:ligatures w14:val="standardContextual"/>
             </w:rPr>
           </w:pPr>
-          <w:hyperlink w:anchor="_Toc242972790" w:history="1">
+          <w:hyperlink w:anchor="_Toc242987567" w:history="1">
             <w:r>
               <w:rPr>
                 <w:rStyle w:val="Hyperlink"/>
@@ -1662,7 +1662,7 @@
               <w:rPr>
                 <w:noProof/>
               </w:rPr>
-              <w:instrText xml:space="preserve"> PAGEREF _Toc242972790 \h </w:instrText>
+              <w:instrText xml:space="preserve"> PAGEREF _Toc242987567 \h </w:instrText>
             </w:r>
             <w:r>
               <w:rPr>
@@ -1705,7 +1705,7 @@
               <w14:ligatures w14:val="standardContextual"/>
             </w:rPr>
           </w:pPr>
-          <w:hyperlink w:anchor="_Toc242972791" w:history="1">
+          <w:hyperlink w:anchor="_Toc242987568" w:history="1">
             <w:r>
               <w:rPr>
                 <w:rStyle w:val="Hyperlink"/>
@@ -1729,7 +1729,7 @@
               <w:rPr>
                 <w:noProof/>
               </w:rPr>
-              <w:instrText xml:space="preserve"> PAGEREF _Toc242972791 \h </w:instrText>
+              <w:instrText xml:space="preserve"> PAGEREF _Toc242987568 \h </w:instrText>
             </w:r>
             <w:r>
               <w:rPr>
@@ -1772,7 +1772,7 @@
               <w14:ligatures w14:val="standardContextual"/>
             </w:rPr>
           </w:pPr>
-          <w:hyperlink w:anchor="_Toc242972792" w:history="1">
+          <w:hyperlink w:anchor="_Toc242987569" w:history="1">
             <w:r>
               <w:rPr>
                 <w:rStyle w:val="Hyperlink"/>
@@ -1796,7 +1796,7 @@
               <w:rPr>
                 <w:noProof/>
               </w:rPr>
-              <w:instrText xml:space="preserve"> PAGEREF _Toc242972792 \h </w:instrText>
+              <w:instrText xml:space="preserve"> PAGEREF _Toc242987569 \h </w:instrText>
             </w:r>
             <w:r>
               <w:rPr>
@@ -1839,7 +1839,7 @@
               <w14:ligatures w14:val="standardContextual"/>
             </w:rPr>
           </w:pPr>
-          <w:hyperlink w:anchor="_Toc242972793" w:history="1">
+          <w:hyperlink w:anchor="_Toc242987570" w:history="1">
             <w:r>
               <w:rPr>
                 <w:rStyle w:val="Hyperlink"/>
@@ -1863,7 +1863,7 @@
               <w:rPr>
                 <w:noProof/>
               </w:rPr>
-              <w:instrText xml:space="preserve"> PAGEREF _Toc242972793 \h </w:instrText>
+              <w:instrText xml:space="preserve"> PAGEREF _Toc242987570 \h </w:instrText>
             </w:r>
             <w:r>
               <w:rPr>
@@ -1906,7 +1906,7 @@
               <w14:ligatures w14:val="standardContextual"/>
             </w:rPr>
           </w:pPr>
-          <w:hyperlink w:anchor="_Toc242972794" w:history="1">
+          <w:hyperlink w:anchor="_Toc242987571" w:history="1">
             <w:r>
               <w:rPr>
                 <w:rStyle w:val="Hyperlink"/>
@@ -1930,7 +1930,7 @@
               <w:rPr>
                 <w:noProof/>
               </w:rPr>
-              <w:instrText xml:space="preserve"> PAGEREF _Toc242972794 \h </w:instrText>
+              <w:instrText xml:space="preserve"> PAGEREF _Toc242987571 \h </w:instrText>
             </w:r>
             <w:r>
               <w:rPr>
@@ -1973,7 +1973,7 @@
               <w14:ligatures w14:val="standardContextual"/>
             </w:rPr>
           </w:pPr>
-          <w:hyperlink w:anchor="_Toc242972795" w:history="1">
+          <w:hyperlink w:anchor="_Toc242987572" w:history="1">
             <w:r>
               <w:rPr>
                 <w:rStyle w:val="Hyperlink"/>
@@ -1997,7 +1997,7 @@
               <w:rPr>
                 <w:noProof/>
               </w:rPr>
-              <w:instrText xml:space="preserve"> PAGEREF _Toc242972795 \h </w:instrText>
+              <w:instrText xml:space="preserve"> PAGEREF _Toc242987572 \h </w:instrText>
             </w:r>
             <w:r>
               <w:rPr>
@@ -2040,7 +2040,7 @@
               <w14:ligatures w14:val="standardContextual"/>
             </w:rPr>
           </w:pPr>
-          <w:hyperlink w:anchor="_Toc242972796" w:history="1">
+          <w:hyperlink w:anchor="_Toc242987573" w:history="1">
             <w:r>
               <w:rPr>
                 <w:rStyle w:val="Hyperlink"/>
@@ -2064,7 +2064,7 @@
               <w:rPr>
                 <w:noProof/>
               </w:rPr>
-              <w:instrText xml:space="preserve"> PAGEREF _Toc242972796 \h </w:instrText>
+              <w:instrText xml:space="preserve"> PAGEREF _Toc242987573 \h </w:instrText>
             </w:r>
             <w:r>
               <w:rPr>
@@ -2107,7 +2107,7 @@
               <w14:ligatures w14:val="standardContextual"/>
             </w:rPr>
           </w:pPr>
-          <w:hyperlink w:anchor="_Toc242972797" w:history="1">
+          <w:hyperlink w:anchor="_Toc242987574" w:history="1">
             <w:r>
               <w:rPr>
                 <w:rStyle w:val="Hyperlink"/>
@@ -2131,7 +2131,7 @@
               <w:rPr>
                 <w:noProof/>
               </w:rPr>
-              <w:instrText xml:space="preserve"> PAGEREF _Toc242972797 \h </w:instrText>
+              <w:instrText xml:space="preserve"> PAGEREF _Toc242987574 \h </w:instrText>
             </w:r>
             <w:r>
               <w:rPr>
@@ -2174,7 +2174,7 @@
               <w14:ligatures w14:val="standardContextual"/>
             </w:rPr>
           </w:pPr>
-          <w:hyperlink w:anchor="_Toc242972798" w:history="1">
+          <w:hyperlink w:anchor="_Toc242987575" w:history="1">
             <w:r>
               <w:rPr>
                 <w:rStyle w:val="Hyperlink"/>
@@ -2198,7 +2198,7 @@
               <w:rPr>
                 <w:noProof/>
               </w:rPr>
-              <w:instrText xml:space="preserve"> PAGEREF _Toc242972798 \h </w:instrText>
+              <w:instrText xml:space="preserve"> PAGEREF _Toc242987575 \h </w:instrText>
             </w:r>
             <w:r>
               <w:rPr>
@@ -2241,7 +2241,7 @@
               <w14:ligatures w14:val="standardContextual"/>
             </w:rPr>
           </w:pPr>
-          <w:hyperlink w:anchor="_Toc242972799" w:history="1">
+          <w:hyperlink w:anchor="_Toc242987576" w:history="1">
             <w:r>
               <w:rPr>
                 <w:rStyle w:val="Hyperlink"/>
@@ -2265,7 +2265,7 @@
               <w:rPr>
                 <w:noProof/>
               </w:rPr>
-              <w:instrText xml:space="preserve"> PAGEREF _Toc242972799 \h </w:instrText>
+              <w:instrText xml:space="preserve"> PAGEREF _Toc242987576 \h </w:instrText>
             </w:r>
             <w:r>
               <w:rPr>
@@ -2308,7 +2308,7 @@
               <w14:ligatures w14:val="standardContextual"/>
             </w:rPr>
           </w:pPr>
-          <w:hyperlink w:anchor="_Toc242972800" w:history="1">
+          <w:hyperlink w:anchor="_Toc242987577" w:history="1">
             <w:r>
               <w:rPr>
                 <w:rStyle w:val="Hyperlink"/>
@@ -2332,7 +2332,7 @@
               <w:rPr>
                 <w:noProof/>
               </w:rPr>
-              <w:instrText xml:space="preserve"> PAGEREF _Toc242972800 \h </w:instrText>
+              <w:instrText xml:space="preserve"> PAGEREF _Toc242987577 \h </w:instrText>
             </w:r>
             <w:r>
               <w:rPr>
@@ -2375,7 +2375,7 @@
               <w14:ligatures w14:val="standardContextual"/>
             </w:rPr>
           </w:pPr>
-          <w:hyperlink w:anchor="_Toc242972801" w:history="1">
+          <w:hyperlink w:anchor="_Toc242987578" w:history="1">
             <w:r>
               <w:rPr>
                 <w:rStyle w:val="Hyperlink"/>
@@ -2399,7 +2399,7 @@
               <w:rPr>
                 <w:noProof/>
               </w:rPr>
-              <w:instrText xml:space="preserve"> PAGEREF _Toc242972801 \h </w:instrText>
+              <w:instrText xml:space="preserve"> PAGEREF _Toc242987578 \h </w:instrText>
             </w:r>
             <w:r>
               <w:rPr>
@@ -2442,7 +2442,7 @@
               <w14:ligatures w14:val="standardContextual"/>
             </w:rPr>
           </w:pPr>
-          <w:hyperlink w:anchor="_Toc242972802" w:history="1">
+          <w:hyperlink w:anchor="_Toc242987579" w:history="1">
             <w:r>
               <w:rPr>
                 <w:rStyle w:val="Hyperlink"/>
@@ -2466,7 +2466,7 @@
               <w:rPr>
                 <w:noProof/>
               </w:rPr>
-              <w:instrText xml:space="preserve"> PAGEREF _Toc242972802 \h </w:instrText>
+              <w:instrText xml:space="preserve"> PAGEREF _Toc242987579 \h </w:instrText>
             </w:r>
             <w:r>
               <w:rPr>
@@ -2509,7 +2509,7 @@
               <w14:ligatures w14:val="standardContextual"/>
             </w:rPr>
           </w:pPr>
-          <w:hyperlink w:anchor="_Toc242972803" w:history="1">
+          <w:hyperlink w:anchor="_Toc242987580" w:history="1">
             <w:r>
               <w:rPr>
                 <w:rStyle w:val="Hyperlink"/>
@@ -2533,7 +2533,7 @@
               <w:rPr>
                 <w:noProof/>
               </w:rPr>
-              <w:instrText xml:space="preserve"> PAGEREF _Toc242972803 \h </w:instrText>
+              <w:instrText xml:space="preserve"> PAGEREF _Toc242987580 \h </w:instrText>
             </w:r>
             <w:r>
               <w:rPr>
@@ -2576,7 +2576,7 @@
               <w14:ligatures w14:val="standardContextual"/>
             </w:rPr>
           </w:pPr>
-          <w:hyperlink w:anchor="_Toc242972804" w:history="1">
+          <w:hyperlink w:anchor="_Toc242987581" w:history="1">
             <w:r>
               <w:rPr>
                 <w:rStyle w:val="Hyperlink"/>
@@ -2600,7 +2600,7 @@
               <w:rPr>
                 <w:noProof/>
               </w:rPr>
-              <w:instrText xml:space="preserve"> PAGEREF _Toc242972804 \h </w:instrText>
+              <w:instrText xml:space="preserve"> PAGEREF _Toc242987581 \h </w:instrText>
             </w:r>
             <w:r>
               <w:rPr>
@@ -2643,7 +2643,7 @@
               <w14:ligatures w14:val="standardContextual"/>
             </w:rPr>
           </w:pPr>
-          <w:hyperlink w:anchor="_Toc242972805" w:history="1">
+          <w:hyperlink w:anchor="_Toc242987582" w:history="1">
             <w:r>
               <w:rPr>
                 <w:rStyle w:val="Hyperlink"/>
@@ -2667,7 +2667,7 @@
               <w:rPr>
                 <w:noProof/>
               </w:rPr>
-              <w:instrText xml:space="preserve"> PAGEREF _Toc242972805 \h </w:instrText>
+              <w:instrText xml:space="preserve"> PAGEREF _Toc242987582 \h </w:instrText>
             </w:r>
             <w:r>
               <w:rPr>
@@ -2710,7 +2710,7 @@
               <w14:ligatures w14:val="standardContextual"/>
             </w:rPr>
           </w:pPr>
-          <w:hyperlink w:anchor="_Toc242972806" w:history="1">
+          <w:hyperlink w:anchor="_Toc242987583" w:history="1">
             <w:r>
               <w:rPr>
                 <w:rStyle w:val="Hyperlink"/>
@@ -2734,7 +2734,7 @@
               <w:rPr>
                 <w:noProof/>
               </w:rPr>
-              <w:instrText xml:space="preserve"> PAGEREF _Toc242972806 \h </w:instrText>
+              <w:instrText xml:space="preserve"> PAGEREF _Toc242987583 \h </w:instrText>
             </w:r>
             <w:r>
               <w:rPr>
@@ -2777,7 +2777,7 @@
               <w14:ligatures w14:val="standardContextual"/>
             </w:rPr>
           </w:pPr>
-          <w:hyperlink w:anchor="_Toc242972807" w:history="1">
+          <w:hyperlink w:anchor="_Toc242987584" w:history="1">
             <w:r>
               <w:rPr>
                 <w:rStyle w:val="Hyperlink"/>
@@ -2801,7 +2801,7 @@
               <w:rPr>
                 <w:noProof/>
               </w:rPr>
-              <w:instrText xml:space="preserve"> PAGEREF _Toc242972807 \h </w:instrText>
+              <w:instrText xml:space="preserve"> PAGEREF _Toc242987584 \h </w:instrText>
             </w:r>
             <w:r>
               <w:rPr>
@@ -2844,7 +2844,7 @@
               <w14:ligatures w14:val="standardContextual"/>
             </w:rPr>
           </w:pPr>
-          <w:hyperlink w:anchor="_Toc242972808" w:history="1">
+          <w:hyperlink w:anchor="_Toc242987585" w:history="1">
             <w:r>
               <w:rPr>
                 <w:rStyle w:val="Hyperlink"/>
@@ -2868,7 +2868,7 @@
               <w:rPr>
                 <w:noProof/>
               </w:rPr>
-              <w:instrText xml:space="preserve"> PAGEREF _Toc242972808 \h </w:instrText>
+              <w:instrText xml:space="preserve"> PAGEREF _Toc242987585 \h </w:instrText>
             </w:r>
             <w:r>
               <w:rPr>
@@ -2911,7 +2911,7 @@
               <w14:ligatures w14:val="standardContextual"/>
             </w:rPr>
           </w:pPr>
-          <w:hyperlink w:anchor="_Toc242972809" w:history="1">
+          <w:hyperlink w:anchor="_Toc242987586" w:history="1">
             <w:r>
               <w:rPr>
                 <w:rStyle w:val="Hyperlink"/>
@@ -2935,7 +2935,7 @@
               <w:rPr>
                 <w:noProof/>
               </w:rPr>
-              <w:instrText xml:space="preserve"> PAGEREF _Toc242972809 \h </w:instrText>
+              <w:instrText xml:space="preserve"> PAGEREF _Toc242987586 \h </w:instrText>
             </w:r>
             <w:r>
               <w:rPr>
@@ -2978,7 +2978,7 @@
               <w14:ligatures w14:val="standardContextual"/>
             </w:rPr>
           </w:pPr>
-          <w:hyperlink w:anchor="_Toc242972810" w:history="1">
+          <w:hyperlink w:anchor="_Toc242987587" w:history="1">
             <w:r>
               <w:rPr>
                 <w:rStyle w:val="Hyperlink"/>
@@ -3002,7 +3002,7 @@
               <w:rPr>
                 <w:noProof/>
               </w:rPr>
-              <w:instrText xml:space="preserve"> PAGEREF _Toc242972810 \h </w:instrText>
+              <w:instrText xml:space="preserve"> PAGEREF _Toc242987587 \h </w:instrText>
             </w:r>
             <w:r>
               <w:rPr>
@@ -3045,7 +3045,7 @@
               <w14:ligatures w14:val="standardContextual"/>
             </w:rPr>
           </w:pPr>
-          <w:hyperlink w:anchor="_Toc242972811" w:history="1">
+          <w:hyperlink w:anchor="_Toc242987588" w:history="1">
             <w:r>
               <w:rPr>
                 <w:rStyle w:val="Hyperlink"/>
@@ -3069,7 +3069,7 @@
               <w:rPr>
                 <w:noProof/>
               </w:rPr>
-              <w:instrText xml:space="preserve"> PAGEREF _Toc242972811 \h </w:instrText>
+              <w:instrText xml:space="preserve"> PAGEREF _Toc242987588 \h </w:instrText>
             </w:r>
             <w:r>
               <w:rPr>
@@ -3112,7 +3112,7 @@
               <w14:ligatures w14:val="standardContextual"/>
             </w:rPr>
           </w:pPr>
-          <w:hyperlink w:anchor="_Toc242972812" w:history="1">
+          <w:hyperlink w:anchor="_Toc242987589" w:history="1">
             <w:r>
               <w:rPr>
                 <w:rStyle w:val="Hyperlink"/>
@@ -3136,7 +3136,7 @@
               <w:rPr>
                 <w:noProof/>
               </w:rPr>
-              <w:instrText xml:space="preserve"> PAGEREF _Toc242972812 \h </w:instrText>
+              <w:instrText xml:space="preserve"> PAGEREF _Toc242987589 \h </w:instrText>
             </w:r>
             <w:r>
               <w:rPr>
@@ -3179,7 +3179,7 @@
               <w14:ligatures w14:val="standardContextual"/>
             </w:rPr>
           </w:pPr>
-          <w:hyperlink w:anchor="_Toc242972813" w:history="1">
+          <w:hyperlink w:anchor="_Toc242987590" w:history="1">
             <w:r>
               <w:rPr>
                 <w:rStyle w:val="Hyperlink"/>
@@ -3203,7 +3203,7 @@
               <w:rPr>
                 <w:noProof/>
               </w:rPr>
-              <w:instrText xml:space="preserve"> PAGEREF _Toc242972813 \h </w:instrText>
+              <w:instrText xml:space="preserve"> PAGEREF _Toc242987590 \h </w:instrText>
             </w:r>
             <w:r>
               <w:rPr>
@@ -3246,7 +3246,7 @@
               <w14:ligatures w14:val="standardContextual"/>
             </w:rPr>
           </w:pPr>
-          <w:hyperlink w:anchor="_Toc242972814" w:history="1">
+          <w:hyperlink w:anchor="_Toc242987591" w:history="1">
             <w:r>
               <w:rPr>
                 <w:rStyle w:val="Hyperlink"/>
@@ -3270,7 +3270,7 @@
               <w:rPr>
                 <w:noProof/>
               </w:rPr>
-              <w:instrText xml:space="preserve"> PAGEREF _Toc242972814 \h </w:instrText>
+              <w:instrText xml:space="preserve"> PAGEREF _Toc242987591 \h </w:instrText>
             </w:r>
             <w:r>
               <w:rPr>
@@ -3340,7 +3340,7 @@
           <w:noProof/>
         </w:rPr>
         <w:drawing>
-          <wp:inline distT="0" distB="0" distL="0" distR="0" wp14:anchorId="334354F7" wp14:editId="391F45EC">
+          <wp:inline distT="0" distB="0" distL="0" distR="0" wp14:anchorId="2FFBCBC0" wp14:editId="69C45585">
             <wp:extent cx="5943600" cy="4210050"/>
             <wp:effectExtent l="0" t="0" r="0" b="0"/>
             <wp:docPr id="1" name="UnmanagedLayerScanner-thumbnail.png" descr="Unmanaged Layer Scanner in action: choosing managed solutions, scanning, filtering by type, comparing the layers of a form and a web resource, and deleting three unmanaged layers" title="Unmanaged Layer Scanner in action: choosing managed solutions, scanning, filtering by type, comparing the layers of a form and a web resource, and deleting three unmanaged layers"/>
@@ -3740,7 +3740,7 @@
                 <w:sz w:val="17"/>
                 <w:szCs w:val="17"/>
               </w:rPr>
-              <w:t>About 70,500 characters: the code is compressed inside the link and unpacked by the browser</w:t>
+              <w:t>About 71,000 characters: the code is compressed inside the link and unpacked by the browser</w:t>
             </w:r>
           </w:p>
         </w:tc>
@@ -4024,7 +4024,7 @@
         <w:pStyle w:val="Heading1"/>
         <w:keepNext/>
       </w:pPr>
-      <w:bookmarkStart w:id="0" w:name="_Toc242972768"/>
+      <w:bookmarkStart w:id="0" w:name="_Toc242987545"/>
       <w:r>
         <w:t>Features</w:t>
       </w:r>
@@ -4942,7 +4942,7 @@
         <w:pStyle w:val="Heading1"/>
         <w:keepNext/>
       </w:pPr>
-      <w:bookmarkStart w:id="1" w:name="_Toc242972769"/>
+      <w:bookmarkStart w:id="1" w:name="_Toc242987546"/>
       <w:r>
         <w:t>Screenshots</w:t>
       </w:r>
@@ -4971,7 +4971,7 @@
         <w:pStyle w:val="Heading2"/>
         <w:keepNext/>
       </w:pPr>
-      <w:bookmarkStart w:id="2" w:name="_Toc242972770"/>
+      <w:bookmarkStart w:id="2" w:name="_Toc242987547"/>
       <w:r>
         <w:t>Choosing what to check</w:t>
       </w:r>
@@ -5014,7 +5014,7 @@
           <w:noProof/>
         </w:rPr>
         <w:drawing>
-          <wp:inline distT="0" distB="0" distL="0" distR="0" wp14:anchorId="7FCA3F6E" wp14:editId="0CF050DB">
+          <wp:inline distT="0" distB="0" distL="0" distR="0" wp14:anchorId="2C11C82D" wp14:editId="41393FAA">
             <wp:extent cx="5943600" cy="4229100"/>
             <wp:effectExtent l="0" t="0" r="0" b="0"/>
             <wp:docPr id="2" name="choose.png" descr="The choice screen: managed solutions, object types and the tables card" title="The choice screen: managed solutions, object types and the tables card"/>
@@ -5101,7 +5101,7 @@
           <w:noProof/>
         </w:rPr>
         <w:drawing>
-          <wp:inline distT="0" distB="0" distL="0" distR="0" wp14:anchorId="7A5A98A1" wp14:editId="009E45BD">
+          <wp:inline distT="0" distB="0" distL="0" distR="0" wp14:anchorId="4C4C2404" wp14:editId="200E7D54">
             <wp:extent cx="5943600" cy="4229100"/>
             <wp:effectExtent l="0" t="0" r="0" b="0"/>
             <wp:docPr id="3" name="tables.png" descr="The Choose tables dialog" title="The Choose tables dialog"/>
@@ -5178,7 +5178,7 @@
           <w:noProof/>
         </w:rPr>
         <w:drawing>
-          <wp:inline distT="0" distB="0" distL="0" distR="0" wp14:anchorId="52E610D7" wp14:editId="5F20F640">
+          <wp:inline distT="0" distB="0" distL="0" distR="0" wp14:anchorId="66EACB1E" wp14:editId="587F224D">
             <wp:extent cx="5943600" cy="4229100"/>
             <wp:effectExtent l="0" t="0" r="0" b="0"/>
             <wp:docPr id="4" name="scanning.png" descr="The scan in progress" title="The scan in progress"/>
@@ -5222,7 +5222,7 @@
         <w:pStyle w:val="Heading2"/>
         <w:keepNext/>
       </w:pPr>
-      <w:bookmarkStart w:id="3" w:name="_Toc242972771"/>
+      <w:bookmarkStart w:id="3" w:name="_Toc242987548"/>
       <w:r>
         <w:lastRenderedPageBreak/>
         <w:t>Results and filters</w:t>
@@ -5266,7 +5266,7 @@
           <w:noProof/>
         </w:rPr>
         <w:drawing>
-          <wp:inline distT="0" distB="0" distL="0" distR="0" wp14:anchorId="0E93DB02" wp14:editId="59458277">
+          <wp:inline distT="0" distB="0" distL="0" distR="0" wp14:anchorId="2053CD19" wp14:editId="49F00BDA">
             <wp:extent cx="5943600" cy="4229100"/>
             <wp:effectExtent l="0" t="0" r="0" b="0"/>
             <wp:docPr id="5" name="results.png" descr="The results grid" title="The results grid"/>
@@ -5343,7 +5343,7 @@
           <w:noProof/>
         </w:rPr>
         <w:drawing>
-          <wp:inline distT="0" distB="0" distL="0" distR="0" wp14:anchorId="5AAAE58C" wp14:editId="69350F49">
+          <wp:inline distT="0" distB="0" distL="0" distR="0" wp14:anchorId="190386E2" wp14:editId="375A5A07">
             <wp:extent cx="5943600" cy="4229100"/>
             <wp:effectExtent l="0" t="0" r="0" b="0"/>
             <wp:docPr id="6" name="column-filter.png" descr="The What changed column menu" title="The What changed column menu"/>
@@ -5410,7 +5410,7 @@
           <w:noProof/>
         </w:rPr>
         <w:drawing>
-          <wp:inline distT="0" distB="0" distL="0" distR="0" wp14:anchorId="33986526" wp14:editId="786D1F6B">
+          <wp:inline distT="0" distB="0" distL="0" distR="0" wp14:anchorId="203C94CA" wp14:editId="4F24BF7B">
             <wp:extent cx="5943600" cy="4229100"/>
             <wp:effectExtent l="0" t="0" r="0" b="0"/>
             <wp:docPr id="7" name="export.png" descr="The Export menu" title="The Export menu"/>
@@ -5454,7 +5454,7 @@
         <w:pStyle w:val="Heading2"/>
         <w:keepNext/>
       </w:pPr>
-      <w:bookmarkStart w:id="4" w:name="_Toc242972772"/>
+      <w:bookmarkStart w:id="4" w:name="_Toc242987549"/>
       <w:r>
         <w:lastRenderedPageBreak/>
         <w:t>Details of a component</w:t>
@@ -5498,7 +5498,7 @@
           <w:noProof/>
         </w:rPr>
         <w:drawing>
-          <wp:inline distT="0" distB="0" distL="0" distR="0" wp14:anchorId="0D5B4A0E" wp14:editId="0234AA12">
+          <wp:inline distT="0" distB="0" distL="0" distR="0" wp14:anchorId="4FD2B111" wp14:editId="60DFBBC8">
             <wp:extent cx="5943600" cy="4229100"/>
             <wp:effectExtent l="0" t="0" r="0" b="0"/>
             <wp:docPr id="8" name="details-compare.png" descr="The comparison of a form's layers" title="The comparison of a form's layers"/>
@@ -5565,7 +5565,7 @@
           <w:noProof/>
         </w:rPr>
         <w:drawing>
-          <wp:inline distT="0" distB="0" distL="0" distR="0" wp14:anchorId="396D23BF" wp14:editId="2B011A80">
+          <wp:inline distT="0" distB="0" distL="0" distR="0" wp14:anchorId="0233C2FF" wp14:editId="16CC743A">
             <wp:extent cx="5943600" cy="4229100"/>
             <wp:effectExtent l="0" t="0" r="0" b="0"/>
             <wp:docPr id="9" name="details-side-by-side.png" descr="A web resource compared side by side" title="A web resource compared side by side"/>
@@ -5632,7 +5632,7 @@
           <w:noProof/>
         </w:rPr>
         <w:drawing>
-          <wp:inline distT="0" distB="0" distL="0" distR="0" wp14:anchorId="64626F3F" wp14:editId="2F52C06B">
+          <wp:inline distT="0" distB="0" distL="0" distR="0" wp14:anchorId="3C938268" wp14:editId="01FE9625">
             <wp:extent cx="5943600" cy="4229100"/>
             <wp:effectExtent l="0" t="0" r="0" b="0"/>
             <wp:docPr id="10" name="details-image.png" descr="Both images of an image web resource" title="Both images of an image web resource"/>
@@ -5728,7 +5728,7 @@
           <w:noProof/>
         </w:rPr>
         <w:drawing>
-          <wp:inline distT="0" distB="0" distL="0" distR="0" wp14:anchorId="14AC9E5E" wp14:editId="3D44394A">
+          <wp:inline distT="0" distB="0" distL="0" distR="0" wp14:anchorId="1ED2AC10" wp14:editId="131F9226">
             <wp:extent cx="5943600" cy="4229100"/>
             <wp:effectExtent l="0" t="0" r="0" b="0"/>
             <wp:docPr id="11" name="details-file.png" descr="A web resource whose content is kept as a file: the content in effect shown for the Active layer only" title="A web resource whose content is kept as a file: the content in effect shown for the Active layer only"/>
@@ -5782,7 +5782,27 @@
         <w:t>The Layers tab</w:t>
       </w:r>
       <w:r>
-        <w:t xml:space="preserve">: every layer of the component, top first, with its solution, publisher, kind, version, overwrite time and number of changed properties. </w:t>
+        <w:t>: every layer of the component, top first, with its solution, publisher, kind, version, overwrite time and number of changed properties. Dataverse gives the unmanaged layer no overwrite time, so its row shows when the component was last changed instead (</w:t>
+      </w:r>
+      <w:r>
+        <w:rPr>
+          <w:i/>
+          <w:iCs/>
+        </w:rPr>
+        <w:t>Last changed</w:t>
+      </w:r>
+      <w:r>
+        <w:t>), or for a form when it was last published (</w:t>
+      </w:r>
+      <w:r>
+        <w:rPr>
+          <w:i/>
+          <w:iCs/>
+        </w:rPr>
+        <w:t>Last published</w:t>
+      </w:r>
+      <w:r>
+        <w:t xml:space="preserve">). </w:t>
       </w:r>
       <w:r>
         <w:rPr>
@@ -5815,7 +5835,7 @@
           <w:noProof/>
         </w:rPr>
         <w:drawing>
-          <wp:inline distT="0" distB="0" distL="0" distR="0" wp14:anchorId="7D56AE1C" wp14:editId="01626D66">
+          <wp:inline distT="0" distB="0" distL="0" distR="0" wp14:anchorId="3D3665FD" wp14:editId="6AF37EDD">
             <wp:extent cx="5943600" cy="4229100"/>
             <wp:effectExtent l="0" t="0" r="0" b="0"/>
             <wp:docPr id="12" name="details-layers.png" descr="The Layers tab" title="The Layers tab"/>
@@ -5902,7 +5922,7 @@
           <w:noProof/>
         </w:rPr>
         <w:drawing>
-          <wp:inline distT="0" distB="0" distL="0" distR="0" wp14:anchorId="380B9408" wp14:editId="2F3AD6AB">
+          <wp:inline distT="0" distB="0" distL="0" distR="0" wp14:anchorId="1A56C9F7" wp14:editId="0E8ECEF1">
             <wp:extent cx="5943600" cy="4229100"/>
             <wp:effectExtent l="0" t="0" r="0" b="0"/>
             <wp:docPr id="13" name="details-json.png" descr="The JSON tab showing a layer's Changes" title="The JSON tab showing a layer's Changes"/>
@@ -5969,7 +5989,7 @@
           <w:noProof/>
         </w:rPr>
         <w:drawing>
-          <wp:inline distT="0" distB="0" distL="0" distR="0" wp14:anchorId="7F4A224D" wp14:editId="5A12EF6A">
+          <wp:inline distT="0" distB="0" distL="0" distR="0" wp14:anchorId="17A5AE99" wp14:editId="4A27DC27">
             <wp:extent cx="5943600" cy="4229100"/>
             <wp:effectExtent l="0" t="0" r="0" b="0"/>
             <wp:docPr id="14" name="details-children.png" descr="A role's privileges from Children, shown as a table" title="A role's privileges from Children, shown as a table"/>
@@ -6013,7 +6033,7 @@
         <w:pStyle w:val="Heading2"/>
         <w:keepNext/>
       </w:pPr>
-      <w:bookmarkStart w:id="5" w:name="_Toc242972773"/>
+      <w:bookmarkStart w:id="5" w:name="_Toc242987550"/>
       <w:r>
         <w:lastRenderedPageBreak/>
         <w:t>Deleting layers</w:t>
@@ -6057,7 +6077,7 @@
           <w:noProof/>
         </w:rPr>
         <w:drawing>
-          <wp:inline distT="0" distB="0" distL="0" distR="0" wp14:anchorId="237790B3" wp14:editId="3CF6D8AD">
+          <wp:inline distT="0" distB="0" distL="0" distR="0" wp14:anchorId="7635A353" wp14:editId="02C79B38">
             <wp:extent cx="5943600" cy="4229100"/>
             <wp:effectExtent l="0" t="0" r="0" b="0"/>
             <wp:docPr id="15" name="delete-confirm.png" descr="The delete confirmation" title="The delete confirmation"/>
@@ -6134,7 +6154,7 @@
           <w:noProof/>
         </w:rPr>
         <w:drawing>
-          <wp:inline distT="0" distB="0" distL="0" distR="0" wp14:anchorId="64E340C8" wp14:editId="7D3933FC">
+          <wp:inline distT="0" distB="0" distL="0" distR="0" wp14:anchorId="3E9A74C2" wp14:editId="467DFFE9">
             <wp:extent cx="5943600" cy="4229100"/>
             <wp:effectExtent l="0" t="0" r="0" b="0"/>
             <wp:docPr id="16" name="deleting.png" descr="Deleting in progress" title="Deleting in progress"/>
@@ -6201,7 +6221,7 @@
           <w:noProof/>
         </w:rPr>
         <w:drawing>
-          <wp:inline distT="0" distB="0" distL="0" distR="0" wp14:anchorId="168C4A01" wp14:editId="1EFFBACB">
+          <wp:inline distT="0" distB="0" distL="0" distR="0" wp14:anchorId="6ACF586C" wp14:editId="2F800BB7">
             <wp:extent cx="5943600" cy="4229100"/>
             <wp:effectExtent l="0" t="0" r="0" b="0"/>
             <wp:docPr id="17" name="deleted.png" descr="The results after deleting three unmanaged layers" title="The results after deleting three unmanaged layers"/>
@@ -6245,7 +6265,7 @@
         <w:pStyle w:val="Heading2"/>
         <w:keepNext/>
       </w:pPr>
-      <w:bookmarkStart w:id="6" w:name="_Toc242972774"/>
+      <w:bookmarkStart w:id="6" w:name="_Toc242987551"/>
       <w:r>
         <w:lastRenderedPageBreak/>
         <w:t>Narrow window</w:t>
@@ -6289,7 +6309,7 @@
           <w:noProof/>
         </w:rPr>
         <w:drawing>
-          <wp:inline distT="0" distB="0" distL="0" distR="0" wp14:anchorId="53ADBA96" wp14:editId="4ADBF936">
+          <wp:inline distT="0" distB="0" distL="0" distR="0" wp14:anchorId="5E4E3549" wp14:editId="795F0822">
             <wp:extent cx="5943600" cy="6524625"/>
             <wp:effectExtent l="0" t="0" r="0" b="0"/>
             <wp:docPr id="18" name="narrow.png" descr="The choice screen in a narrow window" title="The choice screen in a narrow window"/>
@@ -6333,7 +6353,7 @@
         <w:pStyle w:val="Heading1"/>
         <w:keepNext/>
       </w:pPr>
-      <w:bookmarkStart w:id="7" w:name="_Toc242972775"/>
+      <w:bookmarkStart w:id="7" w:name="_Toc242987552"/>
       <w:r>
         <w:t>Download</w:t>
       </w:r>
@@ -6951,7 +6971,7 @@
         <w:pStyle w:val="Heading1"/>
         <w:keepNext/>
       </w:pPr>
-      <w:bookmarkStart w:id="8" w:name="_Toc242972776"/>
+      <w:bookmarkStart w:id="8" w:name="_Toc242987553"/>
       <w:r>
         <w:t>Install</w:t>
       </w:r>
@@ -6962,7 +6982,7 @@
         <w:pStyle w:val="Heading2"/>
         <w:keepNext/>
       </w:pPr>
-      <w:bookmarkStart w:id="9" w:name="_Toc242972777"/>
+      <w:bookmarkStart w:id="9" w:name="_Toc242987554"/>
       <w:r>
         <w:t>Drag the button</w:t>
       </w:r>
@@ -7051,7 +7071,7 @@
         <w:pStyle w:val="Heading2"/>
         <w:keepNext/>
       </w:pPr>
-      <w:bookmarkStart w:id="10" w:name="_Toc242972778"/>
+      <w:bookmarkStart w:id="10" w:name="_Toc242987555"/>
       <w:r>
         <w:t>Create the favourite by hand</w:t>
       </w:r>
@@ -7197,7 +7217,7 @@
         <w:pStyle w:val="Heading2"/>
         <w:keepNext/>
       </w:pPr>
-      <w:bookmarkStart w:id="11" w:name="_Toc242972779"/>
+      <w:bookmarkStart w:id="11" w:name="_Toc242987556"/>
       <w:r>
         <w:t>Run it from the console</w:t>
       </w:r>
@@ -7292,7 +7312,7 @@
         <w:pStyle w:val="Heading2"/>
         <w:keepNext/>
       </w:pPr>
-      <w:bookmarkStart w:id="12" w:name="_Toc242972780"/>
+      <w:bookmarkStart w:id="12" w:name="_Toc242987557"/>
       <w:r>
         <w:t>When bookmarklets are blocked</w:t>
       </w:r>
@@ -7331,7 +7351,7 @@
         <w:pStyle w:val="Heading2"/>
         <w:keepNext/>
       </w:pPr>
-      <w:bookmarkStart w:id="13" w:name="_Toc242972781"/>
+      <w:bookmarkStart w:id="13" w:name="_Toc242987558"/>
       <w:r>
         <w:t>Update to a new version</w:t>
       </w:r>
@@ -7401,7 +7421,7 @@
         <w:pStyle w:val="Heading1"/>
         <w:keepNext/>
       </w:pPr>
-      <w:bookmarkStart w:id="14" w:name="_Toc242972782"/>
+      <w:bookmarkStart w:id="14" w:name="_Toc242987559"/>
       <w:r>
         <w:t>Use</w:t>
       </w:r>
@@ -7412,7 +7432,7 @@
         <w:pStyle w:val="Heading2"/>
         <w:keepNext/>
       </w:pPr>
-      <w:bookmarkStart w:id="15" w:name="_Toc242972783"/>
+      <w:bookmarkStart w:id="15" w:name="_Toc242987560"/>
       <w:r>
         <w:t>Open it</w:t>
       </w:r>
@@ -7598,7 +7618,7 @@
         <w:pStyle w:val="Heading2"/>
         <w:keepNext/>
       </w:pPr>
-      <w:bookmarkStart w:id="16" w:name="_Toc242972784"/>
+      <w:bookmarkStart w:id="16" w:name="_Toc242987561"/>
       <w:r>
         <w:t>Choose what to check</w:t>
       </w:r>
@@ -8323,7 +8343,7 @@
         <w:pStyle w:val="Heading2"/>
         <w:keepNext/>
       </w:pPr>
-      <w:bookmarkStart w:id="17" w:name="_Toc242972785"/>
+      <w:bookmarkStart w:id="17" w:name="_Toc242987562"/>
       <w:r>
         <w:t>Scan and stop</w:t>
       </w:r>
@@ -8851,7 +8871,7 @@
         <w:pStyle w:val="Heading2"/>
         <w:keepNext/>
       </w:pPr>
-      <w:bookmarkStart w:id="18" w:name="_Toc242972786"/>
+      <w:bookmarkStart w:id="18" w:name="_Toc242987563"/>
       <w:r>
         <w:t>The results</w:t>
       </w:r>
@@ -9475,7 +9495,7 @@
         <w:pStyle w:val="Heading3"/>
         <w:keepNext/>
       </w:pPr>
-      <w:bookmarkStart w:id="19" w:name="_Toc242972787"/>
+      <w:bookmarkStart w:id="19" w:name="_Toc242987564"/>
       <w:r>
         <w:t>Type bubbles</w:t>
       </w:r>
@@ -9527,7 +9547,7 @@
         <w:pStyle w:val="Heading3"/>
         <w:keepNext/>
       </w:pPr>
-      <w:bookmarkStart w:id="20" w:name="_Toc242972788"/>
+      <w:bookmarkStart w:id="20" w:name="_Toc242987565"/>
       <w:r>
         <w:t>Column menus</w:t>
       </w:r>
@@ -9774,7 +9794,7 @@
         <w:pStyle w:val="Heading3"/>
         <w:keepNext/>
       </w:pPr>
-      <w:bookmarkStart w:id="21" w:name="_Toc242972789"/>
+      <w:bookmarkStart w:id="21" w:name="_Toc242987566"/>
       <w:r>
         <w:lastRenderedPageBreak/>
         <w:t>Which page a row opens</w:t>
@@ -10167,7 +10187,7 @@
         <w:pStyle w:val="Heading3"/>
         <w:keepNext/>
       </w:pPr>
-      <w:bookmarkStart w:id="22" w:name="_Toc242972790"/>
+      <w:bookmarkStart w:id="22" w:name="_Toc242987567"/>
       <w:r>
         <w:t>Banners</w:t>
       </w:r>
@@ -10328,7 +10348,7 @@
         <w:pStyle w:val="Heading2"/>
         <w:keepNext/>
       </w:pPr>
-      <w:bookmarkStart w:id="23" w:name="_Toc242972791"/>
+      <w:bookmarkStart w:id="23" w:name="_Toc242987568"/>
       <w:r>
         <w:t>The details</w:t>
       </w:r>
@@ -10423,7 +10443,7 @@
         <w:pStyle w:val="Heading3"/>
         <w:keepNext/>
       </w:pPr>
-      <w:bookmarkStart w:id="24" w:name="_Toc242972792"/>
+      <w:bookmarkStart w:id="24" w:name="_Toc242987569"/>
       <w:r>
         <w:t>What changed</w:t>
       </w:r>
@@ -11012,7 +11032,7 @@
         <w:pStyle w:val="Heading3"/>
         <w:keepNext/>
       </w:pPr>
-      <w:bookmarkStart w:id="25" w:name="_Toc242972793"/>
+      <w:bookmarkStart w:id="25" w:name="_Toc242987570"/>
       <w:r>
         <w:t>Layers</w:t>
       </w:r>
@@ -11053,7 +11073,27 @@
         <w:t>Unmanaged</w:t>
       </w:r>
       <w:r>
-        <w:t xml:space="preserve">, the solution's version, the overwrite time and how many properties the layer changes. </w:t>
+        <w:t>, the solution's version, the overwrite time and how many properties the layer changes. The unmanaged layer has no overwrite time: its row shows the last time the component was saved (</w:t>
+      </w:r>
+      <w:r>
+        <w:rPr>
+          <w:i/>
+          <w:iCs/>
+        </w:rPr>
+        <w:t>Last changed</w:t>
+      </w:r>
+      <w:r>
+        <w:t xml:space="preserve">; for a form, the last publish, </w:t>
+      </w:r>
+      <w:r>
+        <w:rPr>
+          <w:i/>
+          <w:iCs/>
+        </w:rPr>
+        <w:t>Last published</w:t>
+      </w:r>
+      <w:r>
+        <w:t xml:space="preserve">), usually the unmanaged change, though a later import or publish also sets it. Relationships record no date, so theirs shows a dash. </w:t>
       </w:r>
       <w:r>
         <w:rPr>
@@ -11073,7 +11113,10 @@
         <w:t>What changed</w:t>
       </w:r>
       <w:r>
-        <w:t xml:space="preserve"> with that layer against the Active layer; </w:t>
+        <w:t xml:space="preserve"> with that layer against the Activ</w:t>
+      </w:r>
+      <w:r>
+        <w:t xml:space="preserve">e layer; </w:t>
       </w:r>
       <w:r>
         <w:rPr>
@@ -11091,7 +11134,7 @@
         <w:pStyle w:val="Heading3"/>
         <w:keepNext/>
       </w:pPr>
-      <w:bookmarkStart w:id="26" w:name="_Toc242972794"/>
+      <w:bookmarkStart w:id="26" w:name="_Toc242987571"/>
       <w:r>
         <w:t>JSON</w:t>
       </w:r>
@@ -11182,7 +11225,7 @@
         <w:pStyle w:val="Heading2"/>
         <w:keepNext/>
       </w:pPr>
-      <w:bookmarkStart w:id="27" w:name="_Toc242972795"/>
+      <w:bookmarkStart w:id="27" w:name="_Toc242987572"/>
       <w:r>
         <w:t>Export</w:t>
       </w:r>
@@ -11794,7 +11837,7 @@
         <w:pStyle w:val="Heading2"/>
         <w:keepNext/>
       </w:pPr>
-      <w:bookmarkStart w:id="28" w:name="_Toc242972796"/>
+      <w:bookmarkStart w:id="28" w:name="_Toc242987573"/>
       <w:r>
         <w:t>Deleting</w:t>
       </w:r>
@@ -12122,7 +12165,7 @@
         <w:pStyle w:val="Heading3"/>
         <w:keepNext/>
       </w:pPr>
-      <w:bookmarkStart w:id="29" w:name="_Toc242972797"/>
+      <w:bookmarkStart w:id="29" w:name="_Toc242987574"/>
       <w:r>
         <w:t>Outcomes</w:t>
       </w:r>
@@ -12798,7 +12841,7 @@
         <w:pStyle w:val="Heading3"/>
         <w:keepNext/>
       </w:pPr>
-      <w:bookmarkStart w:id="30" w:name="_Toc242972798"/>
+      <w:bookmarkStart w:id="30" w:name="_Toc242987575"/>
       <w:r>
         <w:t>The deletion log</w:t>
       </w:r>
@@ -12900,7 +12943,7 @@
         <w:pStyle w:val="Heading2"/>
         <w:keepNext/>
       </w:pPr>
-      <w:bookmarkStart w:id="31" w:name="_Toc242972799"/>
+      <w:bookmarkStart w:id="31" w:name="_Toc242987576"/>
       <w:r>
         <w:t>Keyboard</w:t>
       </w:r>
@@ -13782,7 +13825,7 @@
         <w:pStyle w:val="Heading1"/>
         <w:keepNext/>
       </w:pPr>
-      <w:bookmarkStart w:id="32" w:name="_Toc242972800"/>
+      <w:bookmarkStart w:id="32" w:name="_Toc242987577"/>
       <w:r>
         <w:t>Environment rules (optional)</w:t>
       </w:r>
@@ -14447,7 +14490,7 @@
         <w:pStyle w:val="Heading1"/>
         <w:keepNext/>
       </w:pPr>
-      <w:bookmarkStart w:id="33" w:name="_Toc242972801"/>
+      <w:bookmarkStart w:id="33" w:name="_Toc242987578"/>
       <w:r>
         <w:lastRenderedPageBreak/>
         <w:t>Safety</w:t>
@@ -14984,7 +15027,7 @@
         <w:pStyle w:val="Heading1"/>
         <w:keepNext/>
       </w:pPr>
-      <w:bookmarkStart w:id="34" w:name="_Toc242972802"/>
+      <w:bookmarkStart w:id="34" w:name="_Toc242987579"/>
       <w:r>
         <w:t>Messages</w:t>
       </w:r>
@@ -15015,7 +15058,7 @@
         <w:pStyle w:val="Heading2"/>
         <w:keepNext/>
       </w:pPr>
-      <w:bookmarkStart w:id="35" w:name="_Toc242972803"/>
+      <w:bookmarkStart w:id="35" w:name="_Toc242987580"/>
       <w:r>
         <w:t>Starting</w:t>
       </w:r>
@@ -15642,7 +15685,7 @@
         <w:pStyle w:val="Heading2"/>
         <w:keepNext/>
       </w:pPr>
-      <w:bookmarkStart w:id="36" w:name="_Toc242972804"/>
+      <w:bookmarkStart w:id="36" w:name="_Toc242987581"/>
       <w:r>
         <w:t>Choosing</w:t>
       </w:r>
@@ -16177,7 +16220,7 @@
         <w:pStyle w:val="Heading2"/>
         <w:keepNext/>
       </w:pPr>
-      <w:bookmarkStart w:id="37" w:name="_Toc242972805"/>
+      <w:bookmarkStart w:id="37" w:name="_Toc242987582"/>
       <w:r>
         <w:t>Scanning and results</w:t>
       </w:r>
@@ -17592,7 +17635,7 @@
         <w:pStyle w:val="Heading2"/>
         <w:keepNext/>
       </w:pPr>
-      <w:bookmarkStart w:id="38" w:name="_Toc242972806"/>
+      <w:bookmarkStart w:id="38" w:name="_Toc242987583"/>
       <w:r>
         <w:t>Details</w:t>
       </w:r>
@@ -18583,7 +18626,7 @@
         <w:pStyle w:val="Heading2"/>
         <w:keepNext/>
       </w:pPr>
-      <w:bookmarkStart w:id="39" w:name="_Toc242972807"/>
+      <w:bookmarkStart w:id="39" w:name="_Toc242987584"/>
       <w:r>
         <w:lastRenderedPageBreak/>
         <w:t>Deleting</w:t>
@@ -19418,7 +19461,7 @@
         <w:pStyle w:val="Heading1"/>
         <w:keepNext/>
       </w:pPr>
-      <w:bookmarkStart w:id="40" w:name="_Toc242972808"/>
+      <w:bookmarkStart w:id="40" w:name="_Toc242987585"/>
       <w:r>
         <w:t>Troubleshooting</w:t>
       </w:r>
@@ -21146,7 +21189,7 @@
         <w:pStyle w:val="Heading1"/>
         <w:keepNext/>
       </w:pPr>
-      <w:bookmarkStart w:id="41" w:name="_Toc242972809"/>
+      <w:bookmarkStart w:id="41" w:name="_Toc242987586"/>
       <w:r>
         <w:t>Limitations</w:t>
       </w:r>
@@ -21581,7 +21624,7 @@
         <w:pStyle w:val="Heading1"/>
         <w:keepNext/>
       </w:pPr>
-      <w:bookmarkStart w:id="42" w:name="_Toc242972810"/>
+      <w:bookmarkStart w:id="42" w:name="_Toc242987587"/>
       <w:r>
         <w:t>How it works</w:t>
       </w:r>
@@ -21694,10 +21737,7 @@
         <w:t>ismanaged</w:t>
       </w:r>
       <w:r>
-        <w:t xml:space="preserve"> column; their rows are matched to their definitions (100 tables per request) to keep the managed ones. Only the component types the chosen o</w:t>
-      </w:r>
-      <w:r>
-        <w:t>bject types and tables need are read.</w:t>
+        <w:t xml:space="preserve"> column; their rows are matched to their definitions (100 tables per request) to keep the managed ones. Only the component types the chosen object types and tables need are read.</w:t>
       </w:r>
     </w:p>
     <w:p>
@@ -22696,7 +22736,7 @@
         <w:pStyle w:val="Heading1"/>
         <w:keepNext/>
       </w:pPr>
-      <w:bookmarkStart w:id="43" w:name="_Toc242972811"/>
+      <w:bookmarkStart w:id="43" w:name="_Toc242987588"/>
       <w:r>
         <w:t>Comparison with Solution Layers Explorer</w:t>
       </w:r>
@@ -23654,7 +23694,7 @@
         <w:pStyle w:val="Heading1"/>
         <w:keepNext/>
       </w:pPr>
-      <w:bookmarkStart w:id="44" w:name="_Toc242972812"/>
+      <w:bookmarkStart w:id="44" w:name="_Toc242987589"/>
       <w:r>
         <w:lastRenderedPageBreak/>
         <w:t>Repository layout</w:t>
@@ -24684,7 +24724,7 @@
         <w:pStyle w:val="Heading1"/>
         <w:keepNext/>
       </w:pPr>
-      <w:bookmarkStart w:id="45" w:name="_Toc242972813"/>
+      <w:bookmarkStart w:id="45" w:name="_Toc242987590"/>
       <w:r>
         <w:t>Build</w:t>
       </w:r>
@@ -24967,7 +25007,7 @@
           <w:szCs w:val="18"/>
           <w:shd w:val="clear" w:color="auto" w:fill="F3F2F1"/>
         </w:rPr>
-        <w:t>bookmarklet 1.0.0: 70719 characters (164.3 KB unpacked)</w:t>
+        <w:t>bookmarklet 1.0.0: 71063 characters (164.9 KB unpacked)</w:t>
       </w:r>
       <w:r>
         <w:t>.</w:t>
@@ -25215,7 +25255,7 @@
         <w:pStyle w:val="Heading1"/>
         <w:keepNext/>
       </w:pPr>
-      <w:bookmarkStart w:id="46" w:name="_Toc242972814"/>
+      <w:bookmarkStart w:id="46" w:name="_Toc242987591"/>
       <w:r>
         <w:t>License</w:t>
       </w:r>
@@ -25437,10 +25477,96 @@
 <file path=word/numbering.xml><?xml version="1.0" encoding="utf-8"?>
 <w:numbering xmlns:wpc="http://schemas.microsoft.com/office/word/2010/wordprocessingCanvas" xmlns:cx="http://schemas.microsoft.com/office/drawing/2014/chartex" xmlns:cx1="http://schemas.microsoft.com/office/drawing/2015/9/8/chartex" xmlns:cx2="http://schemas.microsoft.com/office/drawing/2015/10/21/chartex" xmlns:cx3="http://schemas.microsoft.com/office/drawing/2016/5/9/chartex" xmlns:cx4="http://schemas.microsoft.com/office/drawing/2016/5/10/chartex" xmlns:cx5="http://schemas.microsoft.com/office/drawing/2016/5/11/chartex" xmlns:cx6="http://schemas.microsoft.com/office/drawing/2016/5/12/chartex" xmlns:cx7="http://schemas.microsoft.com/office/drawing/2016/5/13/chartex" xmlns:cx8="http://schemas.microsoft.com/office/drawing/2016/5/14/chartex" xmlns:mc="http://schemas.openxmlformats.org/markup-compatibility/2006" xmlns:aink="http://schemas.microsoft.com/office/drawing/2016/ink" xmlns:am3d="http://schemas.microsoft.com/office/drawing/2017/model3d" xmlns:o="urn:schemas-microsoft-com:office:office" xmlns:oel="http://schemas.microsoft.com/office/2019/extlst" xmlns:r="http://schemas.openxmlformats.org/officeDocument/2006/relationships" xmlns:m="http://schemas.openxmlformats.org/officeDocument/2006/math" xmlns:v="urn:schemas-microsoft-com:vml" xmlns:wp14="http://schemas.microsoft.com/office/word/2010/wordprocessingDrawing" xmlns:wp="http://schemas.openxmlformats.org/drawingml/2006/wordprocessingDrawing" xmlns:w10="urn:schemas-microsoft-com:office:word" xmlns:w="http://schemas.openxmlformats.org/wordprocessingml/2006/main" xmlns:w14="http://schemas.microsoft.com/office/word/2010/wordml" xmlns:w15="http://schemas.microsoft.com/office/word/2012/wordml" xmlns:w16cex="http://schemas.microsoft.com/office/word/2018/wordml/cex" xmlns:w16cid="http://schemas.microsoft.com/office/word/2016/wordml/cid" xmlns:w16="http://schemas.microsoft.com/office/word/2018/wordml" xmlns:w16sdtdh="http://schemas.microsoft.com/office/word/2020/wordml/sdtdatahash" xmlns:w16se="http://schemas.microsoft.com/office/word/2015/wordml/symex" xmlns:wpg="http://schemas.microsoft.com/office/word/2010/wordprocessingGroup" xmlns:wpi="http://schemas.microsoft.com/office/word/2010/wordprocessingInk" xmlns:wne="http://schemas.microsoft.com/office/word/2006/wordml" xmlns:wps="http://schemas.microsoft.com/office/word/2010/wordprocessingShape" mc:Ignorable="w14 w15 w16se w16cid w16 w16cex w16sdtdh wp14">
   <w:abstractNum w:abstractNumId="0" w15:restartNumberingAfterBreak="0">
-    <w:nsid w:val="01DC0A81"/>
+    <w:nsid w:val="10D01BF8"/>
     <w:multiLevelType w:val="hybridMultilevel"/>
-    <w:tmpl w:val="45449686"/>
-    <w:lvl w:ilvl="0" w:tplc="0C0811E2">
+    <w:tmpl w:val="83DAC234"/>
+    <w:lvl w:ilvl="0" w:tplc="FA589E46" w:tentative="1">
+      <w:start w:val="1"/>
+      <w:numFmt w:val="bullet"/>
+      <w:lvlText w:val="●"/>
+      <w:lvlJc w:val="left"/>
+      <w:pPr>
+        <w:ind w:left="720" w:hanging="360"/>
+      </w:pPr>
+    </w:lvl>
+    <w:lvl w:ilvl="1" w:tplc="6568B178" w:tentative="1">
+      <w:start w:val="1"/>
+      <w:numFmt w:val="bullet"/>
+      <w:lvlText w:val="○"/>
+      <w:lvlJc w:val="left"/>
+      <w:pPr>
+        <w:ind w:left="1440" w:hanging="360"/>
+      </w:pPr>
+    </w:lvl>
+    <w:lvl w:ilvl="2" w:tplc="E37212D4" w:tentative="1">
+      <w:start w:val="1"/>
+      <w:numFmt w:val="bullet"/>
+      <w:lvlText w:val="■"/>
+      <w:lvlJc w:val="left"/>
+      <w:pPr>
+        <w:ind w:left="2160" w:hanging="360"/>
+      </w:pPr>
+    </w:lvl>
+    <w:lvl w:ilvl="3" w:tplc="C7E645B2" w:tentative="1">
+      <w:start w:val="1"/>
+      <w:numFmt w:val="bullet"/>
+      <w:lvlText w:val="●"/>
+      <w:lvlJc w:val="left"/>
+      <w:pPr>
+        <w:ind w:left="2880" w:hanging="360"/>
+      </w:pPr>
+    </w:lvl>
+    <w:lvl w:ilvl="4" w:tplc="45FE7218" w:tentative="1">
+      <w:start w:val="1"/>
+      <w:numFmt w:val="bullet"/>
+      <w:lvlText w:val="○"/>
+      <w:lvlJc w:val="left"/>
+      <w:pPr>
+        <w:ind w:left="3600" w:hanging="360"/>
+      </w:pPr>
+    </w:lvl>
+    <w:lvl w:ilvl="5" w:tplc="6B88BEDA" w:tentative="1">
+      <w:start w:val="1"/>
+      <w:numFmt w:val="bullet"/>
+      <w:lvlText w:val="■"/>
+      <w:lvlJc w:val="left"/>
+      <w:pPr>
+        <w:ind w:left="4320" w:hanging="360"/>
+      </w:pPr>
+    </w:lvl>
+    <w:lvl w:ilvl="6" w:tplc="37D452E8" w:tentative="1">
+      <w:start w:val="1"/>
+      <w:numFmt w:val="bullet"/>
+      <w:lvlText w:val="●"/>
+      <w:lvlJc w:val="left"/>
+      <w:pPr>
+        <w:ind w:left="5040" w:hanging="360"/>
+      </w:pPr>
+    </w:lvl>
+    <w:lvl w:ilvl="7" w:tplc="21A64C70" w:tentative="1">
+      <w:start w:val="1"/>
+      <w:numFmt w:val="bullet"/>
+      <w:lvlText w:val="●"/>
+      <w:lvlJc w:val="left"/>
+      <w:pPr>
+        <w:ind w:left="5760" w:hanging="360"/>
+      </w:pPr>
+    </w:lvl>
+    <w:lvl w:ilvl="8" w:tplc="B94E57B2" w:tentative="1">
+      <w:start w:val="1"/>
+      <w:numFmt w:val="bullet"/>
+      <w:lvlText w:val="●"/>
+      <w:lvlJc w:val="left"/>
+      <w:pPr>
+        <w:ind w:left="6480" w:hanging="360"/>
+      </w:pPr>
+    </w:lvl>
+  </w:abstractNum>
+  <w:abstractNum w:abstractNumId="1" w15:restartNumberingAfterBreak="0">
+    <w:nsid w:val="1A19693E"/>
+    <w:multiLevelType w:val="hybridMultilevel"/>
+    <w:tmpl w:val="73F4C65C"/>
+    <w:lvl w:ilvl="0" w:tplc="317E2B82">
       <w:start w:val="1"/>
       <w:numFmt w:val="decimal"/>
       <w:lvlText w:val="%1."/>
@@ -25449,7 +25575,7 @@
         <w:ind w:left="360" w:hanging="300"/>
       </w:pPr>
     </w:lvl>
-    <w:lvl w:ilvl="1" w:tplc="63F876CA" w:tentative="1">
+    <w:lvl w:ilvl="1" w:tplc="A5D67954" w:tentative="1">
       <w:start w:val="1"/>
       <w:numFmt w:val="lowerLetter"/>
       <w:lvlText w:val="%2."/>
@@ -25458,7 +25584,7 @@
         <w:ind w:left="720" w:hanging="300"/>
       </w:pPr>
     </w:lvl>
-    <w:lvl w:ilvl="2" w:tplc="90F0F55E" w:tentative="1">
+    <w:lvl w:ilvl="2" w:tplc="19567352" w:tentative="1">
       <w:start w:val="1"/>
       <w:numFmt w:val="lowerRoman"/>
       <w:lvlText w:val="%3."/>
@@ -25467,7 +25593,7 @@
         <w:ind w:left="1080" w:hanging="300"/>
       </w:pPr>
     </w:lvl>
-    <w:lvl w:ilvl="3" w:tplc="9D8EDDA0" w:tentative="1">
+    <w:lvl w:ilvl="3" w:tplc="AD5C1B46" w:tentative="1">
       <w:start w:val="1"/>
       <w:numFmt w:val="decimal"/>
       <w:lvlText w:val="%4."/>
@@ -25476,258 +25602,172 @@
         <w:ind w:left="1440" w:hanging="300"/>
       </w:pPr>
     </w:lvl>
-    <w:lvl w:ilvl="4" w:tplc="D190174A">
+    <w:lvl w:ilvl="4" w:tplc="A5900BA4">
       <w:numFmt w:val="decimal"/>
       <w:lvlText w:val=""/>
       <w:lvlJc w:val="left"/>
     </w:lvl>
-    <w:lvl w:ilvl="5" w:tplc="E1B8CAF2">
+    <w:lvl w:ilvl="5" w:tplc="FE00CC12">
       <w:numFmt w:val="decimal"/>
       <w:lvlText w:val=""/>
       <w:lvlJc w:val="left"/>
     </w:lvl>
-    <w:lvl w:ilvl="6" w:tplc="553E9322">
+    <w:lvl w:ilvl="6" w:tplc="495EF042">
       <w:numFmt w:val="decimal"/>
       <w:lvlText w:val=""/>
       <w:lvlJc w:val="left"/>
     </w:lvl>
-    <w:lvl w:ilvl="7" w:tplc="26FA9212">
+    <w:lvl w:ilvl="7" w:tplc="D6CE2712">
       <w:numFmt w:val="decimal"/>
       <w:lvlText w:val=""/>
       <w:lvlJc w:val="left"/>
     </w:lvl>
-    <w:lvl w:ilvl="8" w:tplc="24D20DF2">
-      <w:numFmt w:val="decimal"/>
-      <w:lvlText w:val=""/>
-      <w:lvlJc w:val="left"/>
-    </w:lvl>
-  </w:abstractNum>
-  <w:abstractNum w:abstractNumId="1" w15:restartNumberingAfterBreak="0">
-    <w:nsid w:val="186802CF"/>
-    <w:multiLevelType w:val="hybridMultilevel"/>
-    <w:tmpl w:val="F926C286"/>
-    <w:lvl w:ilvl="0" w:tplc="25242A0A">
-      <w:start w:val="1"/>
-      <w:numFmt w:val="bullet"/>
-      <w:lvlText w:val="•"/>
-      <w:lvlJc w:val="left"/>
-      <w:pPr>
-        <w:ind w:left="360" w:hanging="260"/>
-      </w:pPr>
-    </w:lvl>
-    <w:lvl w:ilvl="1" w:tplc="45962024" w:tentative="1">
-      <w:start w:val="1"/>
-      <w:numFmt w:val="bullet"/>
-      <w:lvlText w:val="–"/>
-      <w:lvlJc w:val="left"/>
-      <w:pPr>
-        <w:ind w:left="720" w:hanging="260"/>
-      </w:pPr>
-    </w:lvl>
-    <w:lvl w:ilvl="2" w:tplc="49F4A4BE" w:tentative="1">
-      <w:start w:val="1"/>
-      <w:numFmt w:val="bullet"/>
-      <w:lvlText w:val="◦"/>
-      <w:lvlJc w:val="left"/>
-      <w:pPr>
-        <w:ind w:left="1080" w:hanging="260"/>
-      </w:pPr>
-    </w:lvl>
-    <w:lvl w:ilvl="3" w:tplc="7CEE57DE" w:tentative="1">
-      <w:start w:val="1"/>
-      <w:numFmt w:val="bullet"/>
-      <w:lvlText w:val="•"/>
-      <w:lvlJc w:val="left"/>
-      <w:pPr>
-        <w:ind w:left="1440" w:hanging="260"/>
-      </w:pPr>
-    </w:lvl>
-    <w:lvl w:ilvl="4" w:tplc="7A36FA68">
-      <w:numFmt w:val="decimal"/>
-      <w:lvlText w:val=""/>
-      <w:lvlJc w:val="left"/>
-    </w:lvl>
-    <w:lvl w:ilvl="5" w:tplc="10E0D4A4">
-      <w:numFmt w:val="decimal"/>
-      <w:lvlText w:val=""/>
-      <w:lvlJc w:val="left"/>
-    </w:lvl>
-    <w:lvl w:ilvl="6" w:tplc="4584503E">
-      <w:numFmt w:val="decimal"/>
-      <w:lvlText w:val=""/>
-      <w:lvlJc w:val="left"/>
-    </w:lvl>
-    <w:lvl w:ilvl="7" w:tplc="B5621FFE">
-      <w:numFmt w:val="decimal"/>
-      <w:lvlText w:val=""/>
-      <w:lvlJc w:val="left"/>
-    </w:lvl>
-    <w:lvl w:ilvl="8" w:tplc="98D254B6">
+    <w:lvl w:ilvl="8" w:tplc="42F65E68">
       <w:numFmt w:val="decimal"/>
       <w:lvlText w:val=""/>
       <w:lvlJc w:val="left"/>
     </w:lvl>
   </w:abstractNum>
   <w:abstractNum w:abstractNumId="2" w15:restartNumberingAfterBreak="0">
-    <w:nsid w:val="30E2016B"/>
+    <w:nsid w:val="6B7D7B17"/>
     <w:multiLevelType w:val="hybridMultilevel"/>
-    <w:tmpl w:val="43B60C9E"/>
-    <w:lvl w:ilvl="0" w:tplc="6C00C048" w:tentative="1">
+    <w:tmpl w:val="DF0A0AFE"/>
+    <w:lvl w:ilvl="0" w:tplc="177A0388">
       <w:start w:val="1"/>
       <w:numFmt w:val="bullet"/>
-      <w:lvlText w:val="●"/>
+      <w:lvlText w:val="•"/>
       <w:lvlJc w:val="left"/>
       <w:pPr>
-        <w:ind w:left="720" w:hanging="360"/>
+        <w:ind w:left="360" w:hanging="260"/>
       </w:pPr>
     </w:lvl>
-    <w:lvl w:ilvl="1" w:tplc="FB80F7EA" w:tentative="1">
+    <w:lvl w:ilvl="1" w:tplc="B93A862E" w:tentative="1">
       <w:start w:val="1"/>
       <w:numFmt w:val="bullet"/>
-      <w:lvlText w:val="○"/>
+      <w:lvlText w:val="–"/>
       <w:lvlJc w:val="left"/>
       <w:pPr>
-        <w:ind w:left="1440" w:hanging="360"/>
+        <w:ind w:left="720" w:hanging="260"/>
       </w:pPr>
     </w:lvl>
-    <w:lvl w:ilvl="2" w:tplc="4F7E1EB0" w:tentative="1">
+    <w:lvl w:ilvl="2" w:tplc="352C6436" w:tentative="1">
       <w:start w:val="1"/>
       <w:numFmt w:val="bullet"/>
-      <w:lvlText w:val="■"/>
+      <w:lvlText w:val="◦"/>
       <w:lvlJc w:val="left"/>
       <w:pPr>
-        <w:ind w:left="2160" w:hanging="360"/>
+        <w:ind w:left="1080" w:hanging="260"/>
       </w:pPr>
     </w:lvl>
-    <w:lvl w:ilvl="3" w:tplc="8EC46210" w:tentative="1">
+    <w:lvl w:ilvl="3" w:tplc="DC9E49B2" w:tentative="1">
       <w:start w:val="1"/>
       <w:numFmt w:val="bullet"/>
-      <w:lvlText w:val="●"/>
+      <w:lvlText w:val="•"/>
       <w:lvlJc w:val="left"/>
       <w:pPr>
-        <w:ind w:left="2880" w:hanging="360"/>
+        <w:ind w:left="1440" w:hanging="260"/>
       </w:pPr>
     </w:lvl>
-    <w:lvl w:ilvl="4" w:tplc="72EC235E" w:tentative="1">
-      <w:start w:val="1"/>
-      <w:numFmt w:val="bullet"/>
-      <w:lvlText w:val="○"/>
+    <w:lvl w:ilvl="4" w:tplc="B16E584C">
+      <w:numFmt w:val="decimal"/>
+      <w:lvlText w:val=""/>
       <w:lvlJc w:val="left"/>
-      <w:pPr>
-        <w:ind w:left="3600" w:hanging="360"/>
-      </w:pPr>
     </w:lvl>
-    <w:lvl w:ilvl="5" w:tplc="44283324" w:tentative="1">
-      <w:start w:val="1"/>
-      <w:numFmt w:val="bullet"/>
-      <w:lvlText w:val="■"/>
+    <w:lvl w:ilvl="5" w:tplc="ED6C0CBC">
+      <w:numFmt w:val="decimal"/>
+      <w:lvlText w:val=""/>
       <w:lvlJc w:val="left"/>
-      <w:pPr>
-        <w:ind w:left="4320" w:hanging="360"/>
-      </w:pPr>
     </w:lvl>
-    <w:lvl w:ilvl="6" w:tplc="47F886E6" w:tentative="1">
-      <w:start w:val="1"/>
-      <w:numFmt w:val="bullet"/>
-      <w:lvlText w:val="●"/>
+    <w:lvl w:ilvl="6" w:tplc="F42243F4">
+      <w:numFmt w:val="decimal"/>
+      <w:lvlText w:val=""/>
       <w:lvlJc w:val="left"/>
-      <w:pPr>
-        <w:ind w:left="5040" w:hanging="360"/>
-      </w:pPr>
     </w:lvl>
-    <w:lvl w:ilvl="7" w:tplc="97EA970A" w:tentative="1">
-      <w:start w:val="1"/>
-      <w:numFmt w:val="bullet"/>
-      <w:lvlText w:val="●"/>
+    <w:lvl w:ilvl="7" w:tplc="618804DE">
+      <w:numFmt w:val="decimal"/>
+      <w:lvlText w:val=""/>
       <w:lvlJc w:val="left"/>
-      <w:pPr>
-        <w:ind w:left="5760" w:hanging="360"/>
-      </w:pPr>
     </w:lvl>
-    <w:lvl w:ilvl="8" w:tplc="DDDE42C6" w:tentative="1">
-      <w:start w:val="1"/>
-      <w:numFmt w:val="bullet"/>
-      <w:lvlText w:val="●"/>
+    <w:lvl w:ilvl="8" w:tplc="F3A0D498">
+      <w:numFmt w:val="decimal"/>
+      <w:lvlText w:val=""/>
       <w:lvlJc w:val="left"/>
-      <w:pPr>
-        <w:ind w:left="6480" w:hanging="360"/>
-      </w:pPr>
     </w:lvl>
   </w:abstractNum>
-  <w:num w:numId="1" w16cid:durableId="1992632646">
+  <w:num w:numId="1" w16cid:durableId="623392381">
+    <w:abstractNumId w:val="0"/>
+    <w:lvlOverride w:ilvl="0">
+      <w:startOverride w:val="1"/>
+    </w:lvlOverride>
+  </w:num>
+  <w:num w:numId="2" w16cid:durableId="1920752545">
     <w:abstractNumId w:val="2"/>
     <w:lvlOverride w:ilvl="0">
       <w:startOverride w:val="1"/>
     </w:lvlOverride>
   </w:num>
-  <w:num w:numId="2" w16cid:durableId="1713379617">
+  <w:num w:numId="3" w16cid:durableId="1390575109">
     <w:abstractNumId w:val="1"/>
     <w:lvlOverride w:ilvl="0">
       <w:startOverride w:val="1"/>
     </w:lvlOverride>
   </w:num>
-  <w:num w:numId="3" w16cid:durableId="582954525">
-    <w:abstractNumId w:val="0"/>
+  <w:num w:numId="4" w16cid:durableId="1782720506">
+    <w:abstractNumId w:val="1"/>
     <w:lvlOverride w:ilvl="0">
       <w:startOverride w:val="1"/>
     </w:lvlOverride>
   </w:num>
-  <w:num w:numId="4" w16cid:durableId="936908063">
-    <w:abstractNumId w:val="0"/>
+  <w:num w:numId="5" w16cid:durableId="1263075716">
+    <w:abstractNumId w:val="1"/>
     <w:lvlOverride w:ilvl="0">
       <w:startOverride w:val="1"/>
     </w:lvlOverride>
   </w:num>
-  <w:num w:numId="5" w16cid:durableId="319119226">
-    <w:abstractNumId w:val="0"/>
+  <w:num w:numId="6" w16cid:durableId="533734355">
+    <w:abstractNumId w:val="1"/>
     <w:lvlOverride w:ilvl="0">
       <w:startOverride w:val="1"/>
     </w:lvlOverride>
   </w:num>
-  <w:num w:numId="6" w16cid:durableId="512036656">
-    <w:abstractNumId w:val="0"/>
+  <w:num w:numId="7" w16cid:durableId="373383582">
+    <w:abstractNumId w:val="1"/>
     <w:lvlOverride w:ilvl="0">
       <w:startOverride w:val="1"/>
     </w:lvlOverride>
   </w:num>
-  <w:num w:numId="7" w16cid:durableId="300774699">
-    <w:abstractNumId w:val="0"/>
+  <w:num w:numId="8" w16cid:durableId="1667127316">
+    <w:abstractNumId w:val="1"/>
     <w:lvlOverride w:ilvl="0">
       <w:startOverride w:val="1"/>
     </w:lvlOverride>
   </w:num>
-  <w:num w:numId="8" w16cid:durableId="838928232">
-    <w:abstractNumId w:val="0"/>
+  <w:num w:numId="9" w16cid:durableId="378943183">
+    <w:abstractNumId w:val="1"/>
     <w:lvlOverride w:ilvl="0">
       <w:startOverride w:val="1"/>
     </w:lvlOverride>
   </w:num>
-  <w:num w:numId="9" w16cid:durableId="1843348039">
-    <w:abstractNumId w:val="0"/>
+  <w:num w:numId="10" w16cid:durableId="214507976">
+    <w:abstractNumId w:val="1"/>
     <w:lvlOverride w:ilvl="0">
       <w:startOverride w:val="1"/>
     </w:lvlOverride>
   </w:num>
-  <w:num w:numId="10" w16cid:durableId="346758642">
-    <w:abstractNumId w:val="0"/>
+  <w:num w:numId="11" w16cid:durableId="1102729468">
+    <w:abstractNumId w:val="1"/>
     <w:lvlOverride w:ilvl="0">
       <w:startOverride w:val="1"/>
     </w:lvlOverride>
   </w:num>
-  <w:num w:numId="11" w16cid:durableId="903030386">
-    <w:abstractNumId w:val="0"/>
+  <w:num w:numId="12" w16cid:durableId="1656685836">
+    <w:abstractNumId w:val="1"/>
     <w:lvlOverride w:ilvl="0">
       <w:startOverride w:val="1"/>
     </w:lvlOverride>
   </w:num>
-  <w:num w:numId="12" w16cid:durableId="2008363134">
-    <w:abstractNumId w:val="0"/>
-    <w:lvlOverride w:ilvl="0">
-      <w:startOverride w:val="1"/>
-    </w:lvlOverride>
-  </w:num>
-  <w:num w:numId="13" w16cid:durableId="1080131080">
-    <w:abstractNumId w:val="0"/>
+  <w:num w:numId="13" w16cid:durableId="316570840">
+    <w:abstractNumId w:val="1"/>
     <w:lvlOverride w:ilvl="0">
       <w:startOverride w:val="1"/>
     </w:lvlOverride>
@@ -26372,7 +26412,7 @@
     <w:autoRedefine/>
     <w:uiPriority w:val="39"/>
     <w:unhideWhenUsed/>
-    <w:rsid w:val="0096254F"/>
+    <w:rsid w:val="009A20B1"/>
     <w:pPr>
       <w:spacing w:after="100"/>
     </w:pPr>
@@ -26384,7 +26424,7 @@
     <w:autoRedefine/>
     <w:uiPriority w:val="39"/>
     <w:unhideWhenUsed/>
-    <w:rsid w:val="0096254F"/>
+    <w:rsid w:val="009A20B1"/>
     <w:pPr>
       <w:spacing w:after="100"/>
       <w:ind w:left="200"/>
@@ -26397,7 +26437,7 @@
     <w:autoRedefine/>
     <w:uiPriority w:val="39"/>
     <w:unhideWhenUsed/>
-    <w:rsid w:val="0096254F"/>
+    <w:rsid w:val="009A20B1"/>
     <w:pPr>
       <w:spacing w:after="100"/>
       <w:ind w:left="400"/>

</xml_diff>

<commit_message>
Show who last changed the component next to the unmanaged layer's date
In the details' Layers tab the unmanaged layer's row reads "Last changed by <name>" where the layer's data names the user (modifiedby, for most components that are records); the name is read once per user, waited for 3 seconds at most. Every read of the details now finishes before anything is drawn. Long names wrap to two lines at most.
</commit_message>
<xml_diff>
--- a/docs/UnmanagedLayerScanner - Technical Reference.docx
+++ b/docs/UnmanagedLayerScanner - Technical Reference.docx
@@ -38,7 +38,7 @@
           <w:noProof/>
         </w:rPr>
         <w:drawing>
-          <wp:inline distT="0" distB="0" distL="0" distR="0" wp14:anchorId="0A7C0195" wp14:editId="52555DC9">
+          <wp:inline distT="0" distB="0" distL="0" distR="0" wp14:anchorId="2490E56C" wp14:editId="65BE1488">
             <wp:extent cx="5943600" cy="4229100"/>
             <wp:effectExtent l="0" t="0" r="0" b="0"/>
             <wp:docPr id="19" name="results.png" descr="The results of a scan" title="The results of a scan"/>
@@ -135,7 +135,7 @@
     <w:sdt>
       <w:sdtPr>
         <w:alias w:val="Contents"/>
-        <w:id w:val="1541558952"/>
+        <w:id w:val="-357048162"/>
       </w:sdtPr>
       <w:sdtEndPr/>
       <w:sdtContent>
@@ -164,7 +164,7 @@
           <w:r>
             <w:fldChar w:fldCharType="separate"/>
           </w:r>
-          <w:hyperlink w:anchor="_Toc242987545" w:history="1">
+          <w:hyperlink w:anchor="_Toc242991173" w:history="1">
             <w:r>
               <w:rPr>
                 <w:rStyle w:val="Hyperlink"/>
@@ -188,7 +188,7 @@
               <w:rPr>
                 <w:noProof/>
               </w:rPr>
-              <w:instrText xml:space="preserve"> PAGEREF _Toc242987545 \h </w:instrText>
+              <w:instrText xml:space="preserve"> PAGEREF _Toc242991173 \h </w:instrText>
             </w:r>
             <w:r>
               <w:rPr>
@@ -231,7 +231,7 @@
               <w14:ligatures w14:val="standardContextual"/>
             </w:rPr>
           </w:pPr>
-          <w:hyperlink w:anchor="_Toc242987546" w:history="1">
+          <w:hyperlink w:anchor="_Toc242991174" w:history="1">
             <w:r>
               <w:rPr>
                 <w:rStyle w:val="Hyperlink"/>
@@ -255,7 +255,7 @@
               <w:rPr>
                 <w:noProof/>
               </w:rPr>
-              <w:instrText xml:space="preserve"> PAGEREF _Toc242987546 \h </w:instrText>
+              <w:instrText xml:space="preserve"> PAGEREF _Toc242991174 \h </w:instrText>
             </w:r>
             <w:r>
               <w:rPr>
@@ -298,7 +298,7 @@
               <w14:ligatures w14:val="standardContextual"/>
             </w:rPr>
           </w:pPr>
-          <w:hyperlink w:anchor="_Toc242987547" w:history="1">
+          <w:hyperlink w:anchor="_Toc242991175" w:history="1">
             <w:r>
               <w:rPr>
                 <w:rStyle w:val="Hyperlink"/>
@@ -322,7 +322,7 @@
               <w:rPr>
                 <w:noProof/>
               </w:rPr>
-              <w:instrText xml:space="preserve"> PAGEREF _Toc242987547 \h </w:instrText>
+              <w:instrText xml:space="preserve"> PAGEREF _Toc242991175 \h </w:instrText>
             </w:r>
             <w:r>
               <w:rPr>
@@ -365,7 +365,7 @@
               <w14:ligatures w14:val="standardContextual"/>
             </w:rPr>
           </w:pPr>
-          <w:hyperlink w:anchor="_Toc242987548" w:history="1">
+          <w:hyperlink w:anchor="_Toc242991176" w:history="1">
             <w:r>
               <w:rPr>
                 <w:rStyle w:val="Hyperlink"/>
@@ -389,7 +389,7 @@
               <w:rPr>
                 <w:noProof/>
               </w:rPr>
-              <w:instrText xml:space="preserve"> PAGEREF _Toc242987548 \h </w:instrText>
+              <w:instrText xml:space="preserve"> PAGEREF _Toc242991176 \h </w:instrText>
             </w:r>
             <w:r>
               <w:rPr>
@@ -432,7 +432,7 @@
               <w14:ligatures w14:val="standardContextual"/>
             </w:rPr>
           </w:pPr>
-          <w:hyperlink w:anchor="_Toc242987549" w:history="1">
+          <w:hyperlink w:anchor="_Toc242991177" w:history="1">
             <w:r>
               <w:rPr>
                 <w:rStyle w:val="Hyperlink"/>
@@ -456,7 +456,7 @@
               <w:rPr>
                 <w:noProof/>
               </w:rPr>
-              <w:instrText xml:space="preserve"> PAGEREF _Toc242987549 \h </w:instrText>
+              <w:instrText xml:space="preserve"> PAGEREF _Toc242991177 \h </w:instrText>
             </w:r>
             <w:r>
               <w:rPr>
@@ -499,7 +499,7 @@
               <w14:ligatures w14:val="standardContextual"/>
             </w:rPr>
           </w:pPr>
-          <w:hyperlink w:anchor="_Toc242987550" w:history="1">
+          <w:hyperlink w:anchor="_Toc242991178" w:history="1">
             <w:r>
               <w:rPr>
                 <w:rStyle w:val="Hyperlink"/>
@@ -523,7 +523,7 @@
               <w:rPr>
                 <w:noProof/>
               </w:rPr>
-              <w:instrText xml:space="preserve"> PAGEREF _Toc242987550 \h </w:instrText>
+              <w:instrText xml:space="preserve"> PAGEREF _Toc242991178 \h </w:instrText>
             </w:r>
             <w:r>
               <w:rPr>
@@ -566,7 +566,7 @@
               <w14:ligatures w14:val="standardContextual"/>
             </w:rPr>
           </w:pPr>
-          <w:hyperlink w:anchor="_Toc242987551" w:history="1">
+          <w:hyperlink w:anchor="_Toc242991179" w:history="1">
             <w:r>
               <w:rPr>
                 <w:rStyle w:val="Hyperlink"/>
@@ -590,7 +590,7 @@
               <w:rPr>
                 <w:noProof/>
               </w:rPr>
-              <w:instrText xml:space="preserve"> PAGEREF _Toc242987551 \h </w:instrText>
+              <w:instrText xml:space="preserve"> PAGEREF _Toc242991179 \h </w:instrText>
             </w:r>
             <w:r>
               <w:rPr>
@@ -633,7 +633,7 @@
               <w14:ligatures w14:val="standardContextual"/>
             </w:rPr>
           </w:pPr>
-          <w:hyperlink w:anchor="_Toc242987552" w:history="1">
+          <w:hyperlink w:anchor="_Toc242991180" w:history="1">
             <w:r>
               <w:rPr>
                 <w:rStyle w:val="Hyperlink"/>
@@ -657,7 +657,7 @@
               <w:rPr>
                 <w:noProof/>
               </w:rPr>
-              <w:instrText xml:space="preserve"> PAGEREF _Toc242987552 \h </w:instrText>
+              <w:instrText xml:space="preserve"> PAGEREF _Toc242991180 \h </w:instrText>
             </w:r>
             <w:r>
               <w:rPr>
@@ -700,7 +700,7 @@
               <w14:ligatures w14:val="standardContextual"/>
             </w:rPr>
           </w:pPr>
-          <w:hyperlink w:anchor="_Toc242987553" w:history="1">
+          <w:hyperlink w:anchor="_Toc242991181" w:history="1">
             <w:r>
               <w:rPr>
                 <w:rStyle w:val="Hyperlink"/>
@@ -724,7 +724,7 @@
               <w:rPr>
                 <w:noProof/>
               </w:rPr>
-              <w:instrText xml:space="preserve"> PAGEREF _Toc242987553 \h </w:instrText>
+              <w:instrText xml:space="preserve"> PAGEREF _Toc242991181 \h </w:instrText>
             </w:r>
             <w:r>
               <w:rPr>
@@ -767,7 +767,7 @@
               <w14:ligatures w14:val="standardContextual"/>
             </w:rPr>
           </w:pPr>
-          <w:hyperlink w:anchor="_Toc242987554" w:history="1">
+          <w:hyperlink w:anchor="_Toc242991182" w:history="1">
             <w:r>
               <w:rPr>
                 <w:rStyle w:val="Hyperlink"/>
@@ -791,7 +791,7 @@
               <w:rPr>
                 <w:noProof/>
               </w:rPr>
-              <w:instrText xml:space="preserve"> PAGEREF _Toc242987554 \h </w:instrText>
+              <w:instrText xml:space="preserve"> PAGEREF _Toc242991182 \h </w:instrText>
             </w:r>
             <w:r>
               <w:rPr>
@@ -834,7 +834,7 @@
               <w14:ligatures w14:val="standardContextual"/>
             </w:rPr>
           </w:pPr>
-          <w:hyperlink w:anchor="_Toc242987555" w:history="1">
+          <w:hyperlink w:anchor="_Toc242991183" w:history="1">
             <w:r>
               <w:rPr>
                 <w:rStyle w:val="Hyperlink"/>
@@ -858,7 +858,7 @@
               <w:rPr>
                 <w:noProof/>
               </w:rPr>
-              <w:instrText xml:space="preserve"> PAGEREF _Toc242987555 \h </w:instrText>
+              <w:instrText xml:space="preserve"> PAGEREF _Toc242991183 \h </w:instrText>
             </w:r>
             <w:r>
               <w:rPr>
@@ -901,7 +901,7 @@
               <w14:ligatures w14:val="standardContextual"/>
             </w:rPr>
           </w:pPr>
-          <w:hyperlink w:anchor="_Toc242987556" w:history="1">
+          <w:hyperlink w:anchor="_Toc242991184" w:history="1">
             <w:r>
               <w:rPr>
                 <w:rStyle w:val="Hyperlink"/>
@@ -925,7 +925,7 @@
               <w:rPr>
                 <w:noProof/>
               </w:rPr>
-              <w:instrText xml:space="preserve"> PAGEREF _Toc242987556 \h </w:instrText>
+              <w:instrText xml:space="preserve"> PAGEREF _Toc242991184 \h </w:instrText>
             </w:r>
             <w:r>
               <w:rPr>
@@ -968,7 +968,7 @@
               <w14:ligatures w14:val="standardContextual"/>
             </w:rPr>
           </w:pPr>
-          <w:hyperlink w:anchor="_Toc242987557" w:history="1">
+          <w:hyperlink w:anchor="_Toc242991185" w:history="1">
             <w:r>
               <w:rPr>
                 <w:rStyle w:val="Hyperlink"/>
@@ -992,7 +992,7 @@
               <w:rPr>
                 <w:noProof/>
               </w:rPr>
-              <w:instrText xml:space="preserve"> PAGEREF _Toc242987557 \h </w:instrText>
+              <w:instrText xml:space="preserve"> PAGEREF _Toc242991185 \h </w:instrText>
             </w:r>
             <w:r>
               <w:rPr>
@@ -1035,7 +1035,7 @@
               <w14:ligatures w14:val="standardContextual"/>
             </w:rPr>
           </w:pPr>
-          <w:hyperlink w:anchor="_Toc242987558" w:history="1">
+          <w:hyperlink w:anchor="_Toc242991186" w:history="1">
             <w:r>
               <w:rPr>
                 <w:rStyle w:val="Hyperlink"/>
@@ -1059,7 +1059,7 @@
               <w:rPr>
                 <w:noProof/>
               </w:rPr>
-              <w:instrText xml:space="preserve"> PAGEREF _Toc242987558 \h </w:instrText>
+              <w:instrText xml:space="preserve"> PAGEREF _Toc242991186 \h </w:instrText>
             </w:r>
             <w:r>
               <w:rPr>
@@ -1102,7 +1102,7 @@
               <w14:ligatures w14:val="standardContextual"/>
             </w:rPr>
           </w:pPr>
-          <w:hyperlink w:anchor="_Toc242987559" w:history="1">
+          <w:hyperlink w:anchor="_Toc242991187" w:history="1">
             <w:r>
               <w:rPr>
                 <w:rStyle w:val="Hyperlink"/>
@@ -1126,7 +1126,7 @@
               <w:rPr>
                 <w:noProof/>
               </w:rPr>
-              <w:instrText xml:space="preserve"> PAGEREF _Toc242987559 \h </w:instrText>
+              <w:instrText xml:space="preserve"> PAGEREF _Toc242991187 \h </w:instrText>
             </w:r>
             <w:r>
               <w:rPr>
@@ -1169,7 +1169,7 @@
               <w14:ligatures w14:val="standardContextual"/>
             </w:rPr>
           </w:pPr>
-          <w:hyperlink w:anchor="_Toc242987560" w:history="1">
+          <w:hyperlink w:anchor="_Toc242991188" w:history="1">
             <w:r>
               <w:rPr>
                 <w:rStyle w:val="Hyperlink"/>
@@ -1193,7 +1193,7 @@
               <w:rPr>
                 <w:noProof/>
               </w:rPr>
-              <w:instrText xml:space="preserve"> PAGEREF _Toc242987560 \h </w:instrText>
+              <w:instrText xml:space="preserve"> PAGEREF _Toc242991188 \h </w:instrText>
             </w:r>
             <w:r>
               <w:rPr>
@@ -1236,7 +1236,7 @@
               <w14:ligatures w14:val="standardContextual"/>
             </w:rPr>
           </w:pPr>
-          <w:hyperlink w:anchor="_Toc242987561" w:history="1">
+          <w:hyperlink w:anchor="_Toc242991189" w:history="1">
             <w:r>
               <w:rPr>
                 <w:rStyle w:val="Hyperlink"/>
@@ -1260,7 +1260,7 @@
               <w:rPr>
                 <w:noProof/>
               </w:rPr>
-              <w:instrText xml:space="preserve"> PAGEREF _Toc242987561 \h </w:instrText>
+              <w:instrText xml:space="preserve"> PAGEREF _Toc242991189 \h </w:instrText>
             </w:r>
             <w:r>
               <w:rPr>
@@ -1303,7 +1303,7 @@
               <w14:ligatures w14:val="standardContextual"/>
             </w:rPr>
           </w:pPr>
-          <w:hyperlink w:anchor="_Toc242987562" w:history="1">
+          <w:hyperlink w:anchor="_Toc242991190" w:history="1">
             <w:r>
               <w:rPr>
                 <w:rStyle w:val="Hyperlink"/>
@@ -1327,7 +1327,7 @@
               <w:rPr>
                 <w:noProof/>
               </w:rPr>
-              <w:instrText xml:space="preserve"> PAGEREF _Toc242987562 \h </w:instrText>
+              <w:instrText xml:space="preserve"> PAGEREF _Toc242991190 \h </w:instrText>
             </w:r>
             <w:r>
               <w:rPr>
@@ -1370,7 +1370,7 @@
               <w14:ligatures w14:val="standardContextual"/>
             </w:rPr>
           </w:pPr>
-          <w:hyperlink w:anchor="_Toc242987563" w:history="1">
+          <w:hyperlink w:anchor="_Toc242991191" w:history="1">
             <w:r>
               <w:rPr>
                 <w:rStyle w:val="Hyperlink"/>
@@ -1394,7 +1394,7 @@
               <w:rPr>
                 <w:noProof/>
               </w:rPr>
-              <w:instrText xml:space="preserve"> PAGEREF _Toc242987563 \h </w:instrText>
+              <w:instrText xml:space="preserve"> PAGEREF _Toc242991191 \h </w:instrText>
             </w:r>
             <w:r>
               <w:rPr>
@@ -1437,7 +1437,7 @@
               <w14:ligatures w14:val="standardContextual"/>
             </w:rPr>
           </w:pPr>
-          <w:hyperlink w:anchor="_Toc242987564" w:history="1">
+          <w:hyperlink w:anchor="_Toc242991192" w:history="1">
             <w:r>
               <w:rPr>
                 <w:rStyle w:val="Hyperlink"/>
@@ -1461,7 +1461,7 @@
               <w:rPr>
                 <w:noProof/>
               </w:rPr>
-              <w:instrText xml:space="preserve"> PAGEREF _Toc242987564 \h </w:instrText>
+              <w:instrText xml:space="preserve"> PAGEREF _Toc242991192 \h </w:instrText>
             </w:r>
             <w:r>
               <w:rPr>
@@ -1504,7 +1504,7 @@
               <w14:ligatures w14:val="standardContextual"/>
             </w:rPr>
           </w:pPr>
-          <w:hyperlink w:anchor="_Toc242987565" w:history="1">
+          <w:hyperlink w:anchor="_Toc242991193" w:history="1">
             <w:r>
               <w:rPr>
                 <w:rStyle w:val="Hyperlink"/>
@@ -1528,7 +1528,7 @@
               <w:rPr>
                 <w:noProof/>
               </w:rPr>
-              <w:instrText xml:space="preserve"> PAGEREF _Toc242987565 \h </w:instrText>
+              <w:instrText xml:space="preserve"> PAGEREF _Toc242991193 \h </w:instrText>
             </w:r>
             <w:r>
               <w:rPr>
@@ -1571,7 +1571,7 @@
               <w14:ligatures w14:val="standardContextual"/>
             </w:rPr>
           </w:pPr>
-          <w:hyperlink w:anchor="_Toc242987566" w:history="1">
+          <w:hyperlink w:anchor="_Toc242991194" w:history="1">
             <w:r>
               <w:rPr>
                 <w:rStyle w:val="Hyperlink"/>
@@ -1595,7 +1595,7 @@
               <w:rPr>
                 <w:noProof/>
               </w:rPr>
-              <w:instrText xml:space="preserve"> PAGEREF _Toc242987566 \h </w:instrText>
+              <w:instrText xml:space="preserve"> PAGEREF _Toc242991194 \h </w:instrText>
             </w:r>
             <w:r>
               <w:rPr>
@@ -1638,7 +1638,7 @@
               <w14:ligatures w14:val="standardContextual"/>
             </w:rPr>
           </w:pPr>
-          <w:hyperlink w:anchor="_Toc242987567" w:history="1">
+          <w:hyperlink w:anchor="_Toc242991195" w:history="1">
             <w:r>
               <w:rPr>
                 <w:rStyle w:val="Hyperlink"/>
@@ -1662,7 +1662,7 @@
               <w:rPr>
                 <w:noProof/>
               </w:rPr>
-              <w:instrText xml:space="preserve"> PAGEREF _Toc242987567 \h </w:instrText>
+              <w:instrText xml:space="preserve"> PAGEREF _Toc242991195 \h </w:instrText>
             </w:r>
             <w:r>
               <w:rPr>
@@ -1705,7 +1705,7 @@
               <w14:ligatures w14:val="standardContextual"/>
             </w:rPr>
           </w:pPr>
-          <w:hyperlink w:anchor="_Toc242987568" w:history="1">
+          <w:hyperlink w:anchor="_Toc242991196" w:history="1">
             <w:r>
               <w:rPr>
                 <w:rStyle w:val="Hyperlink"/>
@@ -1729,7 +1729,7 @@
               <w:rPr>
                 <w:noProof/>
               </w:rPr>
-              <w:instrText xml:space="preserve"> PAGEREF _Toc242987568 \h </w:instrText>
+              <w:instrText xml:space="preserve"> PAGEREF _Toc242991196 \h </w:instrText>
             </w:r>
             <w:r>
               <w:rPr>
@@ -1772,7 +1772,7 @@
               <w14:ligatures w14:val="standardContextual"/>
             </w:rPr>
           </w:pPr>
-          <w:hyperlink w:anchor="_Toc242987569" w:history="1">
+          <w:hyperlink w:anchor="_Toc242991197" w:history="1">
             <w:r>
               <w:rPr>
                 <w:rStyle w:val="Hyperlink"/>
@@ -1796,7 +1796,7 @@
               <w:rPr>
                 <w:noProof/>
               </w:rPr>
-              <w:instrText xml:space="preserve"> PAGEREF _Toc242987569 \h </w:instrText>
+              <w:instrText xml:space="preserve"> PAGEREF _Toc242991197 \h </w:instrText>
             </w:r>
             <w:r>
               <w:rPr>
@@ -1839,7 +1839,7 @@
               <w14:ligatures w14:val="standardContextual"/>
             </w:rPr>
           </w:pPr>
-          <w:hyperlink w:anchor="_Toc242987570" w:history="1">
+          <w:hyperlink w:anchor="_Toc242991198" w:history="1">
             <w:r>
               <w:rPr>
                 <w:rStyle w:val="Hyperlink"/>
@@ -1863,7 +1863,7 @@
               <w:rPr>
                 <w:noProof/>
               </w:rPr>
-              <w:instrText xml:space="preserve"> PAGEREF _Toc242987570 \h </w:instrText>
+              <w:instrText xml:space="preserve"> PAGEREF _Toc242991198 \h </w:instrText>
             </w:r>
             <w:r>
               <w:rPr>
@@ -1906,7 +1906,7 @@
               <w14:ligatures w14:val="standardContextual"/>
             </w:rPr>
           </w:pPr>
-          <w:hyperlink w:anchor="_Toc242987571" w:history="1">
+          <w:hyperlink w:anchor="_Toc242991199" w:history="1">
             <w:r>
               <w:rPr>
                 <w:rStyle w:val="Hyperlink"/>
@@ -1930,7 +1930,7 @@
               <w:rPr>
                 <w:noProof/>
               </w:rPr>
-              <w:instrText xml:space="preserve"> PAGEREF _Toc242987571 \h </w:instrText>
+              <w:instrText xml:space="preserve"> PAGEREF _Toc242991199 \h </w:instrText>
             </w:r>
             <w:r>
               <w:rPr>
@@ -1973,7 +1973,7 @@
               <w14:ligatures w14:val="standardContextual"/>
             </w:rPr>
           </w:pPr>
-          <w:hyperlink w:anchor="_Toc242987572" w:history="1">
+          <w:hyperlink w:anchor="_Toc242991200" w:history="1">
             <w:r>
               <w:rPr>
                 <w:rStyle w:val="Hyperlink"/>
@@ -1997,7 +1997,7 @@
               <w:rPr>
                 <w:noProof/>
               </w:rPr>
-              <w:instrText xml:space="preserve"> PAGEREF _Toc242987572 \h </w:instrText>
+              <w:instrText xml:space="preserve"> PAGEREF _Toc242991200 \h </w:instrText>
             </w:r>
             <w:r>
               <w:rPr>
@@ -2014,7 +2014,7 @@
               <w:rPr>
                 <w:noProof/>
               </w:rPr>
-              <w:t>33</w:t>
+              <w:t>34</w:t>
             </w:r>
             <w:r>
               <w:rPr>
@@ -2040,7 +2040,7 @@
               <w14:ligatures w14:val="standardContextual"/>
             </w:rPr>
           </w:pPr>
-          <w:hyperlink w:anchor="_Toc242987573" w:history="1">
+          <w:hyperlink w:anchor="_Toc242991201" w:history="1">
             <w:r>
               <w:rPr>
                 <w:rStyle w:val="Hyperlink"/>
@@ -2064,7 +2064,7 @@
               <w:rPr>
                 <w:noProof/>
               </w:rPr>
-              <w:instrText xml:space="preserve"> PAGEREF _Toc242987573 \h </w:instrText>
+              <w:instrText xml:space="preserve"> PAGEREF _Toc242991201 \h </w:instrText>
             </w:r>
             <w:r>
               <w:rPr>
@@ -2107,7 +2107,7 @@
               <w14:ligatures w14:val="standardContextual"/>
             </w:rPr>
           </w:pPr>
-          <w:hyperlink w:anchor="_Toc242987574" w:history="1">
+          <w:hyperlink w:anchor="_Toc242991202" w:history="1">
             <w:r>
               <w:rPr>
                 <w:rStyle w:val="Hyperlink"/>
@@ -2131,7 +2131,7 @@
               <w:rPr>
                 <w:noProof/>
               </w:rPr>
-              <w:instrText xml:space="preserve"> PAGEREF _Toc242987574 \h </w:instrText>
+              <w:instrText xml:space="preserve"> PAGEREF _Toc242991202 \h </w:instrText>
             </w:r>
             <w:r>
               <w:rPr>
@@ -2174,7 +2174,7 @@
               <w14:ligatures w14:val="standardContextual"/>
             </w:rPr>
           </w:pPr>
-          <w:hyperlink w:anchor="_Toc242987575" w:history="1">
+          <w:hyperlink w:anchor="_Toc242991203" w:history="1">
             <w:r>
               <w:rPr>
                 <w:rStyle w:val="Hyperlink"/>
@@ -2198,7 +2198,7 @@
               <w:rPr>
                 <w:noProof/>
               </w:rPr>
-              <w:instrText xml:space="preserve"> PAGEREF _Toc242987575 \h </w:instrText>
+              <w:instrText xml:space="preserve"> PAGEREF _Toc242991203 \h </w:instrText>
             </w:r>
             <w:r>
               <w:rPr>
@@ -2241,7 +2241,7 @@
               <w14:ligatures w14:val="standardContextual"/>
             </w:rPr>
           </w:pPr>
-          <w:hyperlink w:anchor="_Toc242987576" w:history="1">
+          <w:hyperlink w:anchor="_Toc242991204" w:history="1">
             <w:r>
               <w:rPr>
                 <w:rStyle w:val="Hyperlink"/>
@@ -2265,7 +2265,7 @@
               <w:rPr>
                 <w:noProof/>
               </w:rPr>
-              <w:instrText xml:space="preserve"> PAGEREF _Toc242987576 \h </w:instrText>
+              <w:instrText xml:space="preserve"> PAGEREF _Toc242991204 \h </w:instrText>
             </w:r>
             <w:r>
               <w:rPr>
@@ -2308,7 +2308,7 @@
               <w14:ligatures w14:val="standardContextual"/>
             </w:rPr>
           </w:pPr>
-          <w:hyperlink w:anchor="_Toc242987577" w:history="1">
+          <w:hyperlink w:anchor="_Toc242991205" w:history="1">
             <w:r>
               <w:rPr>
                 <w:rStyle w:val="Hyperlink"/>
@@ -2332,7 +2332,7 @@
               <w:rPr>
                 <w:noProof/>
               </w:rPr>
-              <w:instrText xml:space="preserve"> PAGEREF _Toc242987577 \h </w:instrText>
+              <w:instrText xml:space="preserve"> PAGEREF _Toc242991205 \h </w:instrText>
             </w:r>
             <w:r>
               <w:rPr>
@@ -2375,7 +2375,7 @@
               <w14:ligatures w14:val="standardContextual"/>
             </w:rPr>
           </w:pPr>
-          <w:hyperlink w:anchor="_Toc242987578" w:history="1">
+          <w:hyperlink w:anchor="_Toc242991206" w:history="1">
             <w:r>
               <w:rPr>
                 <w:rStyle w:val="Hyperlink"/>
@@ -2399,7 +2399,7 @@
               <w:rPr>
                 <w:noProof/>
               </w:rPr>
-              <w:instrText xml:space="preserve"> PAGEREF _Toc242987578 \h </w:instrText>
+              <w:instrText xml:space="preserve"> PAGEREF _Toc242991206 \h </w:instrText>
             </w:r>
             <w:r>
               <w:rPr>
@@ -2442,7 +2442,7 @@
               <w14:ligatures w14:val="standardContextual"/>
             </w:rPr>
           </w:pPr>
-          <w:hyperlink w:anchor="_Toc242987579" w:history="1">
+          <w:hyperlink w:anchor="_Toc242991207" w:history="1">
             <w:r>
               <w:rPr>
                 <w:rStyle w:val="Hyperlink"/>
@@ -2466,7 +2466,7 @@
               <w:rPr>
                 <w:noProof/>
               </w:rPr>
-              <w:instrText xml:space="preserve"> PAGEREF _Toc242987579 \h </w:instrText>
+              <w:instrText xml:space="preserve"> PAGEREF _Toc242991207 \h </w:instrText>
             </w:r>
             <w:r>
               <w:rPr>
@@ -2509,7 +2509,7 @@
               <w14:ligatures w14:val="standardContextual"/>
             </w:rPr>
           </w:pPr>
-          <w:hyperlink w:anchor="_Toc242987580" w:history="1">
+          <w:hyperlink w:anchor="_Toc242991208" w:history="1">
             <w:r>
               <w:rPr>
                 <w:rStyle w:val="Hyperlink"/>
@@ -2533,7 +2533,7 @@
               <w:rPr>
                 <w:noProof/>
               </w:rPr>
-              <w:instrText xml:space="preserve"> PAGEREF _Toc242987580 \h </w:instrText>
+              <w:instrText xml:space="preserve"> PAGEREF _Toc242991208 \h </w:instrText>
             </w:r>
             <w:r>
               <w:rPr>
@@ -2576,7 +2576,7 @@
               <w14:ligatures w14:val="standardContextual"/>
             </w:rPr>
           </w:pPr>
-          <w:hyperlink w:anchor="_Toc242987581" w:history="1">
+          <w:hyperlink w:anchor="_Toc242991209" w:history="1">
             <w:r>
               <w:rPr>
                 <w:rStyle w:val="Hyperlink"/>
@@ -2600,7 +2600,7 @@
               <w:rPr>
                 <w:noProof/>
               </w:rPr>
-              <w:instrText xml:space="preserve"> PAGEREF _Toc242987581 \h </w:instrText>
+              <w:instrText xml:space="preserve"> PAGEREF _Toc242991209 \h </w:instrText>
             </w:r>
             <w:r>
               <w:rPr>
@@ -2643,7 +2643,7 @@
               <w14:ligatures w14:val="standardContextual"/>
             </w:rPr>
           </w:pPr>
-          <w:hyperlink w:anchor="_Toc242987582" w:history="1">
+          <w:hyperlink w:anchor="_Toc242991210" w:history="1">
             <w:r>
               <w:rPr>
                 <w:rStyle w:val="Hyperlink"/>
@@ -2667,7 +2667,7 @@
               <w:rPr>
                 <w:noProof/>
               </w:rPr>
-              <w:instrText xml:space="preserve"> PAGEREF _Toc242987582 \h </w:instrText>
+              <w:instrText xml:space="preserve"> PAGEREF _Toc242991210 \h </w:instrText>
             </w:r>
             <w:r>
               <w:rPr>
@@ -2710,7 +2710,7 @@
               <w14:ligatures w14:val="standardContextual"/>
             </w:rPr>
           </w:pPr>
-          <w:hyperlink w:anchor="_Toc242987583" w:history="1">
+          <w:hyperlink w:anchor="_Toc242991211" w:history="1">
             <w:r>
               <w:rPr>
                 <w:rStyle w:val="Hyperlink"/>
@@ -2734,7 +2734,7 @@
               <w:rPr>
                 <w:noProof/>
               </w:rPr>
-              <w:instrText xml:space="preserve"> PAGEREF _Toc242987583 \h </w:instrText>
+              <w:instrText xml:space="preserve"> PAGEREF _Toc242991211 \h </w:instrText>
             </w:r>
             <w:r>
               <w:rPr>
@@ -2777,7 +2777,7 @@
               <w14:ligatures w14:val="standardContextual"/>
             </w:rPr>
           </w:pPr>
-          <w:hyperlink w:anchor="_Toc242987584" w:history="1">
+          <w:hyperlink w:anchor="_Toc242991212" w:history="1">
             <w:r>
               <w:rPr>
                 <w:rStyle w:val="Hyperlink"/>
@@ -2801,7 +2801,7 @@
               <w:rPr>
                 <w:noProof/>
               </w:rPr>
-              <w:instrText xml:space="preserve"> PAGEREF _Toc242987584 \h </w:instrText>
+              <w:instrText xml:space="preserve"> PAGEREF _Toc242991212 \h </w:instrText>
             </w:r>
             <w:r>
               <w:rPr>
@@ -2844,7 +2844,7 @@
               <w14:ligatures w14:val="standardContextual"/>
             </w:rPr>
           </w:pPr>
-          <w:hyperlink w:anchor="_Toc242987585" w:history="1">
+          <w:hyperlink w:anchor="_Toc242991213" w:history="1">
             <w:r>
               <w:rPr>
                 <w:rStyle w:val="Hyperlink"/>
@@ -2868,7 +2868,7 @@
               <w:rPr>
                 <w:noProof/>
               </w:rPr>
-              <w:instrText xml:space="preserve"> PAGEREF _Toc242987585 \h </w:instrText>
+              <w:instrText xml:space="preserve"> PAGEREF _Toc242991213 \h </w:instrText>
             </w:r>
             <w:r>
               <w:rPr>
@@ -2911,7 +2911,7 @@
               <w14:ligatures w14:val="standardContextual"/>
             </w:rPr>
           </w:pPr>
-          <w:hyperlink w:anchor="_Toc242987586" w:history="1">
+          <w:hyperlink w:anchor="_Toc242991214" w:history="1">
             <w:r>
               <w:rPr>
                 <w:rStyle w:val="Hyperlink"/>
@@ -2935,7 +2935,7 @@
               <w:rPr>
                 <w:noProof/>
               </w:rPr>
-              <w:instrText xml:space="preserve"> PAGEREF _Toc242987586 \h </w:instrText>
+              <w:instrText xml:space="preserve"> PAGEREF _Toc242991214 \h </w:instrText>
             </w:r>
             <w:r>
               <w:rPr>
@@ -2978,7 +2978,7 @@
               <w14:ligatures w14:val="standardContextual"/>
             </w:rPr>
           </w:pPr>
-          <w:hyperlink w:anchor="_Toc242987587" w:history="1">
+          <w:hyperlink w:anchor="_Toc242991215" w:history="1">
             <w:r>
               <w:rPr>
                 <w:rStyle w:val="Hyperlink"/>
@@ -3002,7 +3002,7 @@
               <w:rPr>
                 <w:noProof/>
               </w:rPr>
-              <w:instrText xml:space="preserve"> PAGEREF _Toc242987587 \h </w:instrText>
+              <w:instrText xml:space="preserve"> PAGEREF _Toc242991215 \h </w:instrText>
             </w:r>
             <w:r>
               <w:rPr>
@@ -3045,7 +3045,7 @@
               <w14:ligatures w14:val="standardContextual"/>
             </w:rPr>
           </w:pPr>
-          <w:hyperlink w:anchor="_Toc242987588" w:history="1">
+          <w:hyperlink w:anchor="_Toc242991216" w:history="1">
             <w:r>
               <w:rPr>
                 <w:rStyle w:val="Hyperlink"/>
@@ -3069,7 +3069,7 @@
               <w:rPr>
                 <w:noProof/>
               </w:rPr>
-              <w:instrText xml:space="preserve"> PAGEREF _Toc242987588 \h </w:instrText>
+              <w:instrText xml:space="preserve"> PAGEREF _Toc242991216 \h </w:instrText>
             </w:r>
             <w:r>
               <w:rPr>
@@ -3112,7 +3112,7 @@
               <w14:ligatures w14:val="standardContextual"/>
             </w:rPr>
           </w:pPr>
-          <w:hyperlink w:anchor="_Toc242987589" w:history="1">
+          <w:hyperlink w:anchor="_Toc242991217" w:history="1">
             <w:r>
               <w:rPr>
                 <w:rStyle w:val="Hyperlink"/>
@@ -3136,7 +3136,7 @@
               <w:rPr>
                 <w:noProof/>
               </w:rPr>
-              <w:instrText xml:space="preserve"> PAGEREF _Toc242987589 \h </w:instrText>
+              <w:instrText xml:space="preserve"> PAGEREF _Toc242991217 \h </w:instrText>
             </w:r>
             <w:r>
               <w:rPr>
@@ -3179,7 +3179,7 @@
               <w14:ligatures w14:val="standardContextual"/>
             </w:rPr>
           </w:pPr>
-          <w:hyperlink w:anchor="_Toc242987590" w:history="1">
+          <w:hyperlink w:anchor="_Toc242991218" w:history="1">
             <w:r>
               <w:rPr>
                 <w:rStyle w:val="Hyperlink"/>
@@ -3203,7 +3203,7 @@
               <w:rPr>
                 <w:noProof/>
               </w:rPr>
-              <w:instrText xml:space="preserve"> PAGEREF _Toc242987590 \h </w:instrText>
+              <w:instrText xml:space="preserve"> PAGEREF _Toc242991218 \h </w:instrText>
             </w:r>
             <w:r>
               <w:rPr>
@@ -3246,7 +3246,7 @@
               <w14:ligatures w14:val="standardContextual"/>
             </w:rPr>
           </w:pPr>
-          <w:hyperlink w:anchor="_Toc242987591" w:history="1">
+          <w:hyperlink w:anchor="_Toc242991219" w:history="1">
             <w:r>
               <w:rPr>
                 <w:rStyle w:val="Hyperlink"/>
@@ -3270,7 +3270,7 @@
               <w:rPr>
                 <w:noProof/>
               </w:rPr>
-              <w:instrText xml:space="preserve"> PAGEREF _Toc242987591 \h </w:instrText>
+              <w:instrText xml:space="preserve"> PAGEREF _Toc242991219 \h </w:instrText>
             </w:r>
             <w:r>
               <w:rPr>
@@ -3340,7 +3340,7 @@
           <w:noProof/>
         </w:rPr>
         <w:drawing>
-          <wp:inline distT="0" distB="0" distL="0" distR="0" wp14:anchorId="2FFBCBC0" wp14:editId="69C45585">
+          <wp:inline distT="0" distB="0" distL="0" distR="0" wp14:anchorId="48269D5E" wp14:editId="0C6FF193">
             <wp:extent cx="5943600" cy="4210050"/>
             <wp:effectExtent l="0" t="0" r="0" b="0"/>
             <wp:docPr id="1" name="UnmanagedLayerScanner-thumbnail.png" descr="Unmanaged Layer Scanner in action: choosing managed solutions, scanning, filtering by type, comparing the layers of a form and a web resource, and deleting three unmanaged layers" title="Unmanaged Layer Scanner in action: choosing managed solutions, scanning, filtering by type, comparing the layers of a form and a web resource, and deleting three unmanaged layers"/>
@@ -3740,7 +3740,7 @@
                 <w:sz w:val="17"/>
                 <w:szCs w:val="17"/>
               </w:rPr>
-              <w:t>About 71,000 characters: the code is compressed inside the link and unpacked by the browser</w:t>
+              <w:t>About 71,500 characters: the code is compressed inside the link and unpacked by the browser</w:t>
             </w:r>
           </w:p>
         </w:tc>
@@ -4024,7 +4024,7 @@
         <w:pStyle w:val="Heading1"/>
         <w:keepNext/>
       </w:pPr>
-      <w:bookmarkStart w:id="0" w:name="_Toc242987545"/>
+      <w:bookmarkStart w:id="0" w:name="_Toc242991173"/>
       <w:r>
         <w:t>Features</w:t>
       </w:r>
@@ -4942,7 +4942,7 @@
         <w:pStyle w:val="Heading1"/>
         <w:keepNext/>
       </w:pPr>
-      <w:bookmarkStart w:id="1" w:name="_Toc242987546"/>
+      <w:bookmarkStart w:id="1" w:name="_Toc242991174"/>
       <w:r>
         <w:t>Screenshots</w:t>
       </w:r>
@@ -4971,7 +4971,7 @@
         <w:pStyle w:val="Heading2"/>
         <w:keepNext/>
       </w:pPr>
-      <w:bookmarkStart w:id="2" w:name="_Toc242987547"/>
+      <w:bookmarkStart w:id="2" w:name="_Toc242991175"/>
       <w:r>
         <w:t>Choosing what to check</w:t>
       </w:r>
@@ -5014,7 +5014,7 @@
           <w:noProof/>
         </w:rPr>
         <w:drawing>
-          <wp:inline distT="0" distB="0" distL="0" distR="0" wp14:anchorId="2C11C82D" wp14:editId="41393FAA">
+          <wp:inline distT="0" distB="0" distL="0" distR="0" wp14:anchorId="3D934063" wp14:editId="5519E157">
             <wp:extent cx="5943600" cy="4229100"/>
             <wp:effectExtent l="0" t="0" r="0" b="0"/>
             <wp:docPr id="2" name="choose.png" descr="The choice screen: managed solutions, object types and the tables card" title="The choice screen: managed solutions, object types and the tables card"/>
@@ -5101,7 +5101,7 @@
           <w:noProof/>
         </w:rPr>
         <w:drawing>
-          <wp:inline distT="0" distB="0" distL="0" distR="0" wp14:anchorId="4C4C2404" wp14:editId="200E7D54">
+          <wp:inline distT="0" distB="0" distL="0" distR="0" wp14:anchorId="5CE6BC77" wp14:editId="1AD916B8">
             <wp:extent cx="5943600" cy="4229100"/>
             <wp:effectExtent l="0" t="0" r="0" b="0"/>
             <wp:docPr id="3" name="tables.png" descr="The Choose tables dialog" title="The Choose tables dialog"/>
@@ -5178,7 +5178,7 @@
           <w:noProof/>
         </w:rPr>
         <w:drawing>
-          <wp:inline distT="0" distB="0" distL="0" distR="0" wp14:anchorId="66EACB1E" wp14:editId="587F224D">
+          <wp:inline distT="0" distB="0" distL="0" distR="0" wp14:anchorId="1549637E" wp14:editId="3B7A99A9">
             <wp:extent cx="5943600" cy="4229100"/>
             <wp:effectExtent l="0" t="0" r="0" b="0"/>
             <wp:docPr id="4" name="scanning.png" descr="The scan in progress" title="The scan in progress"/>
@@ -5222,7 +5222,7 @@
         <w:pStyle w:val="Heading2"/>
         <w:keepNext/>
       </w:pPr>
-      <w:bookmarkStart w:id="3" w:name="_Toc242987548"/>
+      <w:bookmarkStart w:id="3" w:name="_Toc242991176"/>
       <w:r>
         <w:lastRenderedPageBreak/>
         <w:t>Results and filters</w:t>
@@ -5266,7 +5266,7 @@
           <w:noProof/>
         </w:rPr>
         <w:drawing>
-          <wp:inline distT="0" distB="0" distL="0" distR="0" wp14:anchorId="2053CD19" wp14:editId="49F00BDA">
+          <wp:inline distT="0" distB="0" distL="0" distR="0" wp14:anchorId="6965CDC5" wp14:editId="0193F58F">
             <wp:extent cx="5943600" cy="4229100"/>
             <wp:effectExtent l="0" t="0" r="0" b="0"/>
             <wp:docPr id="5" name="results.png" descr="The results grid" title="The results grid"/>
@@ -5343,7 +5343,7 @@
           <w:noProof/>
         </w:rPr>
         <w:drawing>
-          <wp:inline distT="0" distB="0" distL="0" distR="0" wp14:anchorId="190386E2" wp14:editId="375A5A07">
+          <wp:inline distT="0" distB="0" distL="0" distR="0" wp14:anchorId="24400D26" wp14:editId="48452600">
             <wp:extent cx="5943600" cy="4229100"/>
             <wp:effectExtent l="0" t="0" r="0" b="0"/>
             <wp:docPr id="6" name="column-filter.png" descr="The What changed column menu" title="The What changed column menu"/>
@@ -5410,7 +5410,7 @@
           <w:noProof/>
         </w:rPr>
         <w:drawing>
-          <wp:inline distT="0" distB="0" distL="0" distR="0" wp14:anchorId="203C94CA" wp14:editId="4F24BF7B">
+          <wp:inline distT="0" distB="0" distL="0" distR="0" wp14:anchorId="1FCFA003" wp14:editId="7B3A5253">
             <wp:extent cx="5943600" cy="4229100"/>
             <wp:effectExtent l="0" t="0" r="0" b="0"/>
             <wp:docPr id="7" name="export.png" descr="The Export menu" title="The Export menu"/>
@@ -5454,7 +5454,7 @@
         <w:pStyle w:val="Heading2"/>
         <w:keepNext/>
       </w:pPr>
-      <w:bookmarkStart w:id="4" w:name="_Toc242987549"/>
+      <w:bookmarkStart w:id="4" w:name="_Toc242991177"/>
       <w:r>
         <w:lastRenderedPageBreak/>
         <w:t>Details of a component</w:t>
@@ -5498,7 +5498,7 @@
           <w:noProof/>
         </w:rPr>
         <w:drawing>
-          <wp:inline distT="0" distB="0" distL="0" distR="0" wp14:anchorId="4FD2B111" wp14:editId="60DFBBC8">
+          <wp:inline distT="0" distB="0" distL="0" distR="0" wp14:anchorId="0775460C" wp14:editId="390CF2A2">
             <wp:extent cx="5943600" cy="4229100"/>
             <wp:effectExtent l="0" t="0" r="0" b="0"/>
             <wp:docPr id="8" name="details-compare.png" descr="The comparison of a form's layers" title="The comparison of a form's layers"/>
@@ -5565,7 +5565,7 @@
           <w:noProof/>
         </w:rPr>
         <w:drawing>
-          <wp:inline distT="0" distB="0" distL="0" distR="0" wp14:anchorId="0233C2FF" wp14:editId="16CC743A">
+          <wp:inline distT="0" distB="0" distL="0" distR="0" wp14:anchorId="40C4F423" wp14:editId="5ED6C0E6">
             <wp:extent cx="5943600" cy="4229100"/>
             <wp:effectExtent l="0" t="0" r="0" b="0"/>
             <wp:docPr id="9" name="details-side-by-side.png" descr="A web resource compared side by side" title="A web resource compared side by side"/>
@@ -5632,7 +5632,7 @@
           <w:noProof/>
         </w:rPr>
         <w:drawing>
-          <wp:inline distT="0" distB="0" distL="0" distR="0" wp14:anchorId="3C938268" wp14:editId="01FE9625">
+          <wp:inline distT="0" distB="0" distL="0" distR="0" wp14:anchorId="6FB31DC1" wp14:editId="45896C06">
             <wp:extent cx="5943600" cy="4229100"/>
             <wp:effectExtent l="0" t="0" r="0" b="0"/>
             <wp:docPr id="10" name="details-image.png" descr="Both images of an image web resource" title="Both images of an image web resource"/>
@@ -5728,7 +5728,7 @@
           <w:noProof/>
         </w:rPr>
         <w:drawing>
-          <wp:inline distT="0" distB="0" distL="0" distR="0" wp14:anchorId="1ED2AC10" wp14:editId="131F9226">
+          <wp:inline distT="0" distB="0" distL="0" distR="0" wp14:anchorId="44020636" wp14:editId="1CB50BE7">
             <wp:extent cx="5943600" cy="4229100"/>
             <wp:effectExtent l="0" t="0" r="0" b="0"/>
             <wp:docPr id="11" name="details-file.png" descr="A web resource whose content is kept as a file: the content in effect shown for the Active layer only" title="A web resource whose content is kept as a file: the content in effect shown for the Active layer only"/>
@@ -5782,14 +5782,14 @@
         <w:t>The Layers tab</w:t>
       </w:r>
       <w:r>
-        <w:t>: every layer of the component, top first, with its solution, publisher, kind, version, overwrite time and number of changed properties. Dataverse gives the unmanaged layer no overwrite time, so its row shows when the component was last changed instead (</w:t>
+        <w:t>: every layer of the component, top first, with its solution, publisher, kind, version, overwrite time and number of changed properties. Dataverse gives the unmanaged layer no overwrite time, so its row shows when the component was last changed instead, and by whom where Dataverse records it (</w:t>
       </w:r>
       <w:r>
         <w:rPr>
           <w:i/>
           <w:iCs/>
         </w:rPr>
-        <w:t>Last changed</w:t>
+        <w:t>Last changed by &lt;name&gt;</w:t>
       </w:r>
       <w:r>
         <w:t>), or for a form when it was last published (</w:t>
@@ -5835,7 +5835,7 @@
           <w:noProof/>
         </w:rPr>
         <w:drawing>
-          <wp:inline distT="0" distB="0" distL="0" distR="0" wp14:anchorId="3D3665FD" wp14:editId="6AF37EDD">
+          <wp:inline distT="0" distB="0" distL="0" distR="0" wp14:anchorId="68965EED" wp14:editId="6BC4AB46">
             <wp:extent cx="5943600" cy="4229100"/>
             <wp:effectExtent l="0" t="0" r="0" b="0"/>
             <wp:docPr id="12" name="details-layers.png" descr="The Layers tab" title="The Layers tab"/>
@@ -5922,7 +5922,7 @@
           <w:noProof/>
         </w:rPr>
         <w:drawing>
-          <wp:inline distT="0" distB="0" distL="0" distR="0" wp14:anchorId="1A56C9F7" wp14:editId="0E8ECEF1">
+          <wp:inline distT="0" distB="0" distL="0" distR="0" wp14:anchorId="72EB7BF6" wp14:editId="4EFF7CFC">
             <wp:extent cx="5943600" cy="4229100"/>
             <wp:effectExtent l="0" t="0" r="0" b="0"/>
             <wp:docPr id="13" name="details-json.png" descr="The JSON tab showing a layer's Changes" title="The JSON tab showing a layer's Changes"/>
@@ -5989,7 +5989,7 @@
           <w:noProof/>
         </w:rPr>
         <w:drawing>
-          <wp:inline distT="0" distB="0" distL="0" distR="0" wp14:anchorId="17A5AE99" wp14:editId="4A27DC27">
+          <wp:inline distT="0" distB="0" distL="0" distR="0" wp14:anchorId="3A6AA9B0" wp14:editId="28FC8C1F">
             <wp:extent cx="5943600" cy="4229100"/>
             <wp:effectExtent l="0" t="0" r="0" b="0"/>
             <wp:docPr id="14" name="details-children.png" descr="A role's privileges from Children, shown as a table" title="A role's privileges from Children, shown as a table"/>
@@ -6033,7 +6033,7 @@
         <w:pStyle w:val="Heading2"/>
         <w:keepNext/>
       </w:pPr>
-      <w:bookmarkStart w:id="5" w:name="_Toc242987550"/>
+      <w:bookmarkStart w:id="5" w:name="_Toc242991178"/>
       <w:r>
         <w:lastRenderedPageBreak/>
         <w:t>Deleting layers</w:t>
@@ -6077,7 +6077,7 @@
           <w:noProof/>
         </w:rPr>
         <w:drawing>
-          <wp:inline distT="0" distB="0" distL="0" distR="0" wp14:anchorId="7635A353" wp14:editId="02C79B38">
+          <wp:inline distT="0" distB="0" distL="0" distR="0" wp14:anchorId="7B984A2A" wp14:editId="1C622359">
             <wp:extent cx="5943600" cy="4229100"/>
             <wp:effectExtent l="0" t="0" r="0" b="0"/>
             <wp:docPr id="15" name="delete-confirm.png" descr="The delete confirmation" title="The delete confirmation"/>
@@ -6154,7 +6154,7 @@
           <w:noProof/>
         </w:rPr>
         <w:drawing>
-          <wp:inline distT="0" distB="0" distL="0" distR="0" wp14:anchorId="3E9A74C2" wp14:editId="467DFFE9">
+          <wp:inline distT="0" distB="0" distL="0" distR="0" wp14:anchorId="7BF2CAFF" wp14:editId="2C628549">
             <wp:extent cx="5943600" cy="4229100"/>
             <wp:effectExtent l="0" t="0" r="0" b="0"/>
             <wp:docPr id="16" name="deleting.png" descr="Deleting in progress" title="Deleting in progress"/>
@@ -6221,7 +6221,7 @@
           <w:noProof/>
         </w:rPr>
         <w:drawing>
-          <wp:inline distT="0" distB="0" distL="0" distR="0" wp14:anchorId="6ACF586C" wp14:editId="2F800BB7">
+          <wp:inline distT="0" distB="0" distL="0" distR="0" wp14:anchorId="5AA003AE" wp14:editId="47BA12F6">
             <wp:extent cx="5943600" cy="4229100"/>
             <wp:effectExtent l="0" t="0" r="0" b="0"/>
             <wp:docPr id="17" name="deleted.png" descr="The results after deleting three unmanaged layers" title="The results after deleting three unmanaged layers"/>
@@ -6265,7 +6265,7 @@
         <w:pStyle w:val="Heading2"/>
         <w:keepNext/>
       </w:pPr>
-      <w:bookmarkStart w:id="6" w:name="_Toc242987551"/>
+      <w:bookmarkStart w:id="6" w:name="_Toc242991179"/>
       <w:r>
         <w:lastRenderedPageBreak/>
         <w:t>Narrow window</w:t>
@@ -6309,7 +6309,7 @@
           <w:noProof/>
         </w:rPr>
         <w:drawing>
-          <wp:inline distT="0" distB="0" distL="0" distR="0" wp14:anchorId="5E4E3549" wp14:editId="795F0822">
+          <wp:inline distT="0" distB="0" distL="0" distR="0" wp14:anchorId="48763EA9" wp14:editId="7B4EA452">
             <wp:extent cx="5943600" cy="6524625"/>
             <wp:effectExtent l="0" t="0" r="0" b="0"/>
             <wp:docPr id="18" name="narrow.png" descr="The choice screen in a narrow window" title="The choice screen in a narrow window"/>
@@ -6353,7 +6353,7 @@
         <w:pStyle w:val="Heading1"/>
         <w:keepNext/>
       </w:pPr>
-      <w:bookmarkStart w:id="7" w:name="_Toc242987552"/>
+      <w:bookmarkStart w:id="7" w:name="_Toc242991180"/>
       <w:r>
         <w:t>Download</w:t>
       </w:r>
@@ -6971,7 +6971,7 @@
         <w:pStyle w:val="Heading1"/>
         <w:keepNext/>
       </w:pPr>
-      <w:bookmarkStart w:id="8" w:name="_Toc242987553"/>
+      <w:bookmarkStart w:id="8" w:name="_Toc242991181"/>
       <w:r>
         <w:t>Install</w:t>
       </w:r>
@@ -6982,7 +6982,7 @@
         <w:pStyle w:val="Heading2"/>
         <w:keepNext/>
       </w:pPr>
-      <w:bookmarkStart w:id="9" w:name="_Toc242987554"/>
+      <w:bookmarkStart w:id="9" w:name="_Toc242991182"/>
       <w:r>
         <w:t>Drag the button</w:t>
       </w:r>
@@ -7071,7 +7071,7 @@
         <w:pStyle w:val="Heading2"/>
         <w:keepNext/>
       </w:pPr>
-      <w:bookmarkStart w:id="10" w:name="_Toc242987555"/>
+      <w:bookmarkStart w:id="10" w:name="_Toc242991183"/>
       <w:r>
         <w:t>Create the favourite by hand</w:t>
       </w:r>
@@ -7217,7 +7217,7 @@
         <w:pStyle w:val="Heading2"/>
         <w:keepNext/>
       </w:pPr>
-      <w:bookmarkStart w:id="11" w:name="_Toc242987556"/>
+      <w:bookmarkStart w:id="11" w:name="_Toc242991184"/>
       <w:r>
         <w:t>Run it from the console</w:t>
       </w:r>
@@ -7312,7 +7312,7 @@
         <w:pStyle w:val="Heading2"/>
         <w:keepNext/>
       </w:pPr>
-      <w:bookmarkStart w:id="12" w:name="_Toc242987557"/>
+      <w:bookmarkStart w:id="12" w:name="_Toc242991185"/>
       <w:r>
         <w:t>When bookmarklets are blocked</w:t>
       </w:r>
@@ -7351,7 +7351,7 @@
         <w:pStyle w:val="Heading2"/>
         <w:keepNext/>
       </w:pPr>
-      <w:bookmarkStart w:id="13" w:name="_Toc242987558"/>
+      <w:bookmarkStart w:id="13" w:name="_Toc242991186"/>
       <w:r>
         <w:t>Update to a new version</w:t>
       </w:r>
@@ -7421,7 +7421,7 @@
         <w:pStyle w:val="Heading1"/>
         <w:keepNext/>
       </w:pPr>
-      <w:bookmarkStart w:id="14" w:name="_Toc242987559"/>
+      <w:bookmarkStart w:id="14" w:name="_Toc242991187"/>
       <w:r>
         <w:t>Use</w:t>
       </w:r>
@@ -7432,7 +7432,7 @@
         <w:pStyle w:val="Heading2"/>
         <w:keepNext/>
       </w:pPr>
-      <w:bookmarkStart w:id="15" w:name="_Toc242987560"/>
+      <w:bookmarkStart w:id="15" w:name="_Toc242991188"/>
       <w:r>
         <w:t>Open it</w:t>
       </w:r>
@@ -7618,7 +7618,7 @@
         <w:pStyle w:val="Heading2"/>
         <w:keepNext/>
       </w:pPr>
-      <w:bookmarkStart w:id="16" w:name="_Toc242987561"/>
+      <w:bookmarkStart w:id="16" w:name="_Toc242991189"/>
       <w:r>
         <w:t>Choose what to check</w:t>
       </w:r>
@@ -8343,7 +8343,7 @@
         <w:pStyle w:val="Heading2"/>
         <w:keepNext/>
       </w:pPr>
-      <w:bookmarkStart w:id="17" w:name="_Toc242987562"/>
+      <w:bookmarkStart w:id="17" w:name="_Toc242991190"/>
       <w:r>
         <w:t>Scan and stop</w:t>
       </w:r>
@@ -8871,7 +8871,7 @@
         <w:pStyle w:val="Heading2"/>
         <w:keepNext/>
       </w:pPr>
-      <w:bookmarkStart w:id="18" w:name="_Toc242987563"/>
+      <w:bookmarkStart w:id="18" w:name="_Toc242991191"/>
       <w:r>
         <w:t>The results</w:t>
       </w:r>
@@ -9495,7 +9495,7 @@
         <w:pStyle w:val="Heading3"/>
         <w:keepNext/>
       </w:pPr>
-      <w:bookmarkStart w:id="19" w:name="_Toc242987564"/>
+      <w:bookmarkStart w:id="19" w:name="_Toc242991192"/>
       <w:r>
         <w:t>Type bubbles</w:t>
       </w:r>
@@ -9547,7 +9547,7 @@
         <w:pStyle w:val="Heading3"/>
         <w:keepNext/>
       </w:pPr>
-      <w:bookmarkStart w:id="20" w:name="_Toc242987565"/>
+      <w:bookmarkStart w:id="20" w:name="_Toc242991193"/>
       <w:r>
         <w:t>Column menus</w:t>
       </w:r>
@@ -9794,7 +9794,7 @@
         <w:pStyle w:val="Heading3"/>
         <w:keepNext/>
       </w:pPr>
-      <w:bookmarkStart w:id="21" w:name="_Toc242987566"/>
+      <w:bookmarkStart w:id="21" w:name="_Toc242991194"/>
       <w:r>
         <w:lastRenderedPageBreak/>
         <w:t>Which page a row opens</w:t>
@@ -10187,7 +10187,7 @@
         <w:pStyle w:val="Heading3"/>
         <w:keepNext/>
       </w:pPr>
-      <w:bookmarkStart w:id="22" w:name="_Toc242987567"/>
+      <w:bookmarkStart w:id="22" w:name="_Toc242991195"/>
       <w:r>
         <w:t>Banners</w:t>
       </w:r>
@@ -10348,7 +10348,7 @@
         <w:pStyle w:val="Heading2"/>
         <w:keepNext/>
       </w:pPr>
-      <w:bookmarkStart w:id="23" w:name="_Toc242987568"/>
+      <w:bookmarkStart w:id="23" w:name="_Toc242991196"/>
       <w:r>
         <w:t>The details</w:t>
       </w:r>
@@ -10443,7 +10443,7 @@
         <w:pStyle w:val="Heading3"/>
         <w:keepNext/>
       </w:pPr>
-      <w:bookmarkStart w:id="24" w:name="_Toc242987569"/>
+      <w:bookmarkStart w:id="24" w:name="_Toc242991197"/>
       <w:r>
         <w:t>What changed</w:t>
       </w:r>
@@ -11032,7 +11032,7 @@
         <w:pStyle w:val="Heading3"/>
         <w:keepNext/>
       </w:pPr>
-      <w:bookmarkStart w:id="25" w:name="_Toc242987570"/>
+      <w:bookmarkStart w:id="25" w:name="_Toc242991198"/>
       <w:r>
         <w:t>Layers</w:t>
       </w:r>
@@ -11093,7 +11093,20 @@
         <w:t>Last published</w:t>
       </w:r>
       <w:r>
-        <w:t xml:space="preserve">), usually the unmanaged change, though a later import or publish also sets it. Relationships record no date, so theirs shows a dash. </w:t>
+        <w:t>), usually the unmanaged change, though a later import or publish also sets it. For most components (views, charts, processes, web resources, templates, environment variables, roles and others) it also name</w:t>
+      </w:r>
+      <w:r>
+        <w:t>s the user who saved it last (</w:t>
+      </w:r>
+      <w:r>
+        <w:rPr>
+          <w:i/>
+          <w:iCs/>
+        </w:rPr>
+        <w:t>Last changed by &lt;name&gt;</w:t>
+      </w:r>
+      <w:r>
+        <w:t xml:space="preserve">; a long name takes two lines at most, the whole name is in the tooltip); forms, tables, columns and relationships record no user. Relationships record no date, so theirs shows a dash. </w:t>
       </w:r>
       <w:r>
         <w:rPr>
@@ -11113,10 +11126,7 @@
         <w:t>What changed</w:t>
       </w:r>
       <w:r>
-        <w:t xml:space="preserve"> with that layer against the Activ</w:t>
-      </w:r>
-      <w:r>
-        <w:t xml:space="preserve">e layer; </w:t>
+        <w:t xml:space="preserve"> with that layer against the Active layer; </w:t>
       </w:r>
       <w:r>
         <w:rPr>
@@ -11134,7 +11144,7 @@
         <w:pStyle w:val="Heading3"/>
         <w:keepNext/>
       </w:pPr>
-      <w:bookmarkStart w:id="26" w:name="_Toc242987571"/>
+      <w:bookmarkStart w:id="26" w:name="_Toc242991199"/>
       <w:r>
         <w:t>JSON</w:t>
       </w:r>
@@ -11225,8 +11235,9 @@
         <w:pStyle w:val="Heading2"/>
         <w:keepNext/>
       </w:pPr>
-      <w:bookmarkStart w:id="27" w:name="_Toc242987572"/>
-      <w:r>
+      <w:bookmarkStart w:id="27" w:name="_Toc242991200"/>
+      <w:r>
+        <w:lastRenderedPageBreak/>
         <w:t>Export</w:t>
       </w:r>
       <w:bookmarkEnd w:id="27"/>
@@ -11291,7 +11302,6 @@
                 <w:sz w:val="17"/>
                 <w:szCs w:val="17"/>
               </w:rPr>
-              <w:lastRenderedPageBreak/>
               <w:t>Option</w:t>
             </w:r>
           </w:p>
@@ -11837,7 +11847,7 @@
         <w:pStyle w:val="Heading2"/>
         <w:keepNext/>
       </w:pPr>
-      <w:bookmarkStart w:id="28" w:name="_Toc242987573"/>
+      <w:bookmarkStart w:id="28" w:name="_Toc242991201"/>
       <w:r>
         <w:t>Deleting</w:t>
       </w:r>
@@ -11939,6 +11949,7 @@
         <w:rPr>
           <w:color w:val="0F6CBD"/>
         </w:rPr>
+        <w:lastRenderedPageBreak/>
         <w:t>Environment rules</w:t>
       </w:r>
       <w:r>
@@ -11959,7 +11970,6 @@
           <w:b/>
           <w:bCs/>
         </w:rPr>
-        <w:lastRenderedPageBreak/>
         <w:t>Delete</w:t>
       </w:r>
       <w:r>
@@ -12165,7 +12175,7 @@
         <w:pStyle w:val="Heading3"/>
         <w:keepNext/>
       </w:pPr>
-      <w:bookmarkStart w:id="29" w:name="_Toc242987574"/>
+      <w:bookmarkStart w:id="29" w:name="_Toc242991202"/>
       <w:r>
         <w:t>Outcomes</w:t>
       </w:r>
@@ -12234,6 +12244,7 @@
                 <w:sz w:val="17"/>
                 <w:szCs w:val="17"/>
               </w:rPr>
+              <w:lastRenderedPageBreak/>
               <w:t>In the row</w:t>
             </w:r>
           </w:p>
@@ -12388,7 +12399,6 @@
                 <w:sz w:val="17"/>
                 <w:szCs w:val="17"/>
               </w:rPr>
-              <w:lastRenderedPageBreak/>
               <w:t>Deleted (not checked)</w:t>
             </w:r>
           </w:p>
@@ -12841,7 +12851,7 @@
         <w:pStyle w:val="Heading3"/>
         <w:keepNext/>
       </w:pPr>
-      <w:bookmarkStart w:id="30" w:name="_Toc242987575"/>
+      <w:bookmarkStart w:id="30" w:name="_Toc242991203"/>
       <w:r>
         <w:t>The deletion log</w:t>
       </w:r>
@@ -12923,10 +12933,11 @@
         <w:t>contentNote</w:t>
       </w:r>
       <w:r>
-        <w:t xml:space="preserve">: "the content of the unmanaged layer could not be read before the removal". When the unmanaged layer holds </w:t>
-      </w:r>
-      <w:r>
-        <w:t>the content itself, its changes already contain it, and nothing more is read.</w:t>
+        <w:t xml:space="preserve">: "the content of the unmanaged layer could not be read before the </w:t>
+      </w:r>
+      <w:r>
+        <w:lastRenderedPageBreak/>
+        <w:t>removal". When the unmanaged layer holds the content itself, its changes already contain it, and nothing more is read.</w:t>
       </w:r>
     </w:p>
     <w:p>
@@ -12934,7 +12945,6 @@
         <w:spacing w:after="120"/>
       </w:pPr>
       <w:r>
-        <w:lastRenderedPageBreak/>
         <w:t>The log is kept only in the page's memory, not in the browser's storage. Reloading the page, or clicking the favourite in another environment of the maker portal, loses it, so download it before you do.</w:t>
       </w:r>
     </w:p>
@@ -12943,7 +12953,7 @@
         <w:pStyle w:val="Heading2"/>
         <w:keepNext/>
       </w:pPr>
-      <w:bookmarkStart w:id="31" w:name="_Toc242987576"/>
+      <w:bookmarkStart w:id="31" w:name="_Toc242991204"/>
       <w:r>
         <w:t>Keyboard</w:t>
       </w:r>
@@ -13825,7 +13835,7 @@
         <w:pStyle w:val="Heading1"/>
         <w:keepNext/>
       </w:pPr>
-      <w:bookmarkStart w:id="32" w:name="_Toc242987577"/>
+      <w:bookmarkStart w:id="32" w:name="_Toc242991205"/>
       <w:r>
         <w:t>Environment rules (optional)</w:t>
       </w:r>
@@ -14490,7 +14500,7 @@
         <w:pStyle w:val="Heading1"/>
         <w:keepNext/>
       </w:pPr>
-      <w:bookmarkStart w:id="33" w:name="_Toc242987578"/>
+      <w:bookmarkStart w:id="33" w:name="_Toc242991206"/>
       <w:r>
         <w:lastRenderedPageBreak/>
         <w:t>Safety</w:t>
@@ -14693,7 +14703,10 @@
         <w:t>connectMaker</w:t>
       </w:r>
       <w:r>
-        <w:t xml:space="preserve"> reads the environment id of the Dataverse addresses the portal holds a token for, until it finds the open environment (see below). The details read only layers (and, for a web resource with a layer whose content Dataverse keeps as a file, its current content), and the exports read nothing: they use what was already read. In the developer guide, </w:t>
+        <w:t xml:space="preserve"> reads the environment id of the Dataverse addresses the portal holds a token for, until it finds the open environment (see below). The details read only layers (and, for a web resource with a layer whose content Dataverse keeps as a file, its current content; and the full name of the user who saved a component last, when its unmanaged layer names one, once per user), and the exports read nothing: they use what was already read.</w:t>
+      </w:r>
+      <w:r>
+        <w:t xml:space="preserve"> In the developer guide, </w:t>
       </w:r>
       <w:hyperlink r:id="rId41" w:anchor="5-the-request-layer" w:history="1">
         <w:r>
@@ -14822,6 +14835,7 @@
         <w:spacing w:after="60" w:line="264" w:lineRule="auto"/>
       </w:pPr>
       <w:r>
+        <w:lastRenderedPageBreak/>
         <w:t>It reads the token again for each request, so a token the portal renews is picked up, and sends it only to the confirmed environment's Web API.</w:t>
       </w:r>
     </w:p>
@@ -14835,7 +14849,6 @@
         <w:spacing w:after="60" w:line="264" w:lineRule="auto"/>
       </w:pPr>
       <w:r>
-        <w:lastRenderedPageBreak/>
         <w:t>The token is never stored, shown, logged or put in an export or the deletion log.</w:t>
       </w:r>
     </w:p>
@@ -15027,7 +15040,7 @@
         <w:pStyle w:val="Heading1"/>
         <w:keepNext/>
       </w:pPr>
-      <w:bookmarkStart w:id="34" w:name="_Toc242987579"/>
+      <w:bookmarkStart w:id="34" w:name="_Toc242991207"/>
       <w:r>
         <w:t>Messages</w:t>
       </w:r>
@@ -15058,7 +15071,7 @@
         <w:pStyle w:val="Heading2"/>
         <w:keepNext/>
       </w:pPr>
-      <w:bookmarkStart w:id="35" w:name="_Toc242987580"/>
+      <w:bookmarkStart w:id="35" w:name="_Toc242991208"/>
       <w:r>
         <w:t>Starting</w:t>
       </w:r>
@@ -15685,7 +15698,7 @@
         <w:pStyle w:val="Heading2"/>
         <w:keepNext/>
       </w:pPr>
-      <w:bookmarkStart w:id="36" w:name="_Toc242987581"/>
+      <w:bookmarkStart w:id="36" w:name="_Toc242991209"/>
       <w:r>
         <w:t>Choosing</w:t>
       </w:r>
@@ -16220,7 +16233,7 @@
         <w:pStyle w:val="Heading2"/>
         <w:keepNext/>
       </w:pPr>
-      <w:bookmarkStart w:id="37" w:name="_Toc242987582"/>
+      <w:bookmarkStart w:id="37" w:name="_Toc242991210"/>
       <w:r>
         <w:t>Scanning and results</w:t>
       </w:r>
@@ -17635,7 +17648,7 @@
         <w:pStyle w:val="Heading2"/>
         <w:keepNext/>
       </w:pPr>
-      <w:bookmarkStart w:id="38" w:name="_Toc242987583"/>
+      <w:bookmarkStart w:id="38" w:name="_Toc242991211"/>
       <w:r>
         <w:t>Details</w:t>
       </w:r>
@@ -18626,7 +18639,7 @@
         <w:pStyle w:val="Heading2"/>
         <w:keepNext/>
       </w:pPr>
-      <w:bookmarkStart w:id="39" w:name="_Toc242987584"/>
+      <w:bookmarkStart w:id="39" w:name="_Toc242991212"/>
       <w:r>
         <w:lastRenderedPageBreak/>
         <w:t>Deleting</w:t>
@@ -19461,7 +19474,7 @@
         <w:pStyle w:val="Heading1"/>
         <w:keepNext/>
       </w:pPr>
-      <w:bookmarkStart w:id="40" w:name="_Toc242987585"/>
+      <w:bookmarkStart w:id="40" w:name="_Toc242991213"/>
       <w:r>
         <w:t>Troubleshooting</w:t>
       </w:r>
@@ -21189,7 +21202,7 @@
         <w:pStyle w:val="Heading1"/>
         <w:keepNext/>
       </w:pPr>
-      <w:bookmarkStart w:id="41" w:name="_Toc242987586"/>
+      <w:bookmarkStart w:id="41" w:name="_Toc242991214"/>
       <w:r>
         <w:t>Limitations</w:t>
       </w:r>
@@ -21330,10 +21343,22 @@
           <w:b/>
           <w:bCs/>
         </w:rPr>
-        <w:t>Image configurations.</w:t>
-      </w:r>
-      <w:r>
-        <w:t xml:space="preserve"> Where Dataverse refuses to read column and table image configurations with its own security error (0x80040256, seen in some environments even for System Administrators), they are skipped without a note, so an unmanaged change to an image setting is not found there. Where they can be read, they are checked as usual.</w:t>
+        <w:t>Who changed a component</w:t>
+      </w:r>
+      <w:r>
+        <w:t xml:space="preserve"> is approximate: the user who saved it last (</w:t>
+      </w:r>
+      <w:r>
+        <w:rPr>
+          <w:rFonts w:ascii="Consolas" w:eastAsia="Consolas" w:hAnsi="Consolas" w:cs="Consolas"/>
+          <w:sz w:val="18"/>
+          <w:szCs w:val="18"/>
+          <w:shd w:val="clear" w:color="auto" w:fill="F3F2F1"/>
+        </w:rPr>
+        <w:t>modifiedby</w:t>
+      </w:r>
+      <w:r>
+        <w:t>), which is usually but not always the author of the unmanaged change, and only for the components that record it (views, charts, processes, web resources, templates, environment variables, roles and others). Forms, tables, columns and relationships record no user. The audit log is not read: auditing cannot be turned on for forms, web resources, plug-ins, site maps or connection references, and it only helps where it was on when the change was made.</w:t>
       </w:r>
     </w:p>
     <w:p>
@@ -21350,42 +21375,10 @@
           <w:b/>
           <w:bCs/>
         </w:rPr>
-        <w:t>The solution summary</w:t>
-      </w:r>
-      <w:r>
-        <w:t xml:space="preserve"> (</w:t>
-      </w:r>
-      <w:r>
-        <w:rPr>
-          <w:rFonts w:ascii="Consolas" w:eastAsia="Consolas" w:hAnsi="Consolas" w:cs="Consolas"/>
-          <w:sz w:val="18"/>
-          <w:szCs w:val="18"/>
-          <w:shd w:val="clear" w:color="auto" w:fill="F3F2F1"/>
-        </w:rPr>
-        <w:t>msdyn_solutioncomponentsummaries</w:t>
-      </w:r>
-      <w:r>
-        <w:t xml:space="preserve">, the data behind the maker portal's </w:t>
-      </w:r>
-      <w:r>
-        <w:rPr>
-          <w:i/>
-          <w:iCs/>
-        </w:rPr>
-        <w:t>Customized</w:t>
-      </w:r>
-      <w:r>
-        <w:t xml:space="preserve"> flag) is not documented by Microsoft. When it fails, or answers nothing where it should list something (a check query tells), the scan is marked incomplete. It cannot be narrowed to the chosen tables. Components it flags are confirmed by reading their layers, up to 1,000 per scan; the others stay </w:t>
-      </w:r>
-      <w:r>
-        <w:rPr>
-          <w:i/>
-          <w:iCs/>
-        </w:rPr>
-        <w:t>Not read yet</w:t>
-      </w:r>
-      <w:r>
-        <w:t>.</w:t>
+        <w:t>Image configurations.</w:t>
+      </w:r>
+      <w:r>
+        <w:t xml:space="preserve"> Where Dataverse refuses to read column and table image configurations with its own security error (0x80040256, seen in some environments even for System Administrators), they are skipped without a note, so an unmanaged change to an image setting is not found there. Where they can be read, they are checked as usual.</w:t>
       </w:r>
     </w:p>
     <w:p>
@@ -21402,10 +21395,42 @@
           <w:b/>
           <w:bCs/>
         </w:rPr>
-        <w:t>Components without a solution component row</w:t>
-      </w:r>
-      <w:r>
-        <w:t xml:space="preserve"> (a few parts of standard tables) are placed in a solution by their layers: one or two requests each, up to 1,000 per scan. Above that, the scan is incomplete.</w:t>
+        <w:t>The solution summary</w:t>
+      </w:r>
+      <w:r>
+        <w:t xml:space="preserve"> (</w:t>
+      </w:r>
+      <w:r>
+        <w:rPr>
+          <w:rFonts w:ascii="Consolas" w:eastAsia="Consolas" w:hAnsi="Consolas" w:cs="Consolas"/>
+          <w:sz w:val="18"/>
+          <w:szCs w:val="18"/>
+          <w:shd w:val="clear" w:color="auto" w:fill="F3F2F1"/>
+        </w:rPr>
+        <w:t>msdyn_solutioncomponentsummaries</w:t>
+      </w:r>
+      <w:r>
+        <w:t xml:space="preserve">, the data behind the maker portal's </w:t>
+      </w:r>
+      <w:r>
+        <w:rPr>
+          <w:i/>
+          <w:iCs/>
+        </w:rPr>
+        <w:t>Customized</w:t>
+      </w:r>
+      <w:r>
+        <w:t xml:space="preserve"> flag) is not documented by Microsoft. When it fails, or answers nothing where it should list something (a check query tells), the scan is marked incomplete. It cannot be narrowed to the chosen tables. Components it flags are confirmed by reading their layers, up to 1,000 per scan; the others stay </w:t>
+      </w:r>
+      <w:r>
+        <w:rPr>
+          <w:i/>
+          <w:iCs/>
+        </w:rPr>
+        <w:t>Not read yet</w:t>
+      </w:r>
+      <w:r>
+        <w:t>.</w:t>
       </w:r>
     </w:p>
     <w:p>
@@ -21422,10 +21447,10 @@
           <w:b/>
           <w:bCs/>
         </w:rPr>
-        <w:t>Security roles.</w:t>
-      </w:r>
-      <w:r>
-        <w:t xml:space="preserve"> In tests, a role's privilege changes were not in its layer data (no changed properties, no Children), so the comparison showed only system values for it. Solution Layers Explorer reads the same data.</w:t>
+        <w:t>Components without a solution component row</w:t>
+      </w:r>
+      <w:r>
+        <w:t xml:space="preserve"> (a few parts of standard tables) are placed in a solution by their layers: one or two requests each, up to 1,000 per scan. Above that, the scan is incomplete.</w:t>
       </w:r>
     </w:p>
     <w:p>
@@ -21442,20 +21467,10 @@
           <w:b/>
           <w:bCs/>
         </w:rPr>
-        <w:t>The comparison</w:t>
-      </w:r>
-      <w:r>
-        <w:t xml:space="preserve"> is of each layer's </w:t>
-      </w:r>
-      <w:r>
-        <w:rPr>
-          <w:i/>
-          <w:iCs/>
-        </w:rPr>
-        <w:t>All properties</w:t>
-      </w:r>
-      <w:r>
-        <w:t xml:space="preserve"> data. When two values differ by more than 2,000 added or removed lines, it shows the whole old value and then the whole new one; values above 1,000,000 characters and differences above 3,000 lines are not shown in full (copy them).</w:t>
+        <w:t>Security roles.</w:t>
+      </w:r>
+      <w:r>
+        <w:t xml:space="preserve"> In tests, a role's privilege changes were not in its layer data (no changed properties, no Children), so the comparison showed only system values for it. Solution Layers Explorer reads the same data.</w:t>
       </w:r>
     </w:p>
     <w:p>
@@ -21472,22 +21487,20 @@
           <w:b/>
           <w:bCs/>
         </w:rPr>
-        <w:t>Web resources whose content Dataverse keeps as a file</w:t>
-      </w:r>
-      <w:r>
-        <w:t xml:space="preserve"> (</w:t>
-      </w:r>
-      <w:r>
-        <w:rPr>
-          <w:rFonts w:ascii="Consolas" w:eastAsia="Consolas" w:hAnsi="Consolas" w:cs="Consolas"/>
-          <w:sz w:val="18"/>
-          <w:szCs w:val="18"/>
-          <w:shd w:val="clear" w:color="auto" w:fill="F3F2F1"/>
-        </w:rPr>
-        <w:t>contentfileref</w:t>
-      </w:r>
-      <w:r>
-        <w:t>). Of the files, only the one in effect now can be read: the Web API gives out no other layer's file. A layer whose content is in any other file cannot be shown or compared line by line; layers whose content is held in the layer, or is the top layer's file in effect, are compared as usual. The deletion log keeps the unmanaged layer's content when the layer holds it itself, or when its file is the one in effect.</w:t>
+        <w:t>The comparison</w:t>
+      </w:r>
+      <w:r>
+        <w:t xml:space="preserve"> is of each layer's </w:t>
+      </w:r>
+      <w:r>
+        <w:rPr>
+          <w:i/>
+          <w:iCs/>
+        </w:rPr>
+        <w:t>All properties</w:t>
+      </w:r>
+      <w:r>
+        <w:t xml:space="preserve"> data. When two values differ by more than 2,000 added or removed lines, it shows the whole old value and then the whole new one; values above 1,000,000 characters and differences above 3,000 lines are not shown in full (copy them).</w:t>
       </w:r>
     </w:p>
     <w:p>
@@ -21504,10 +21517,22 @@
           <w:b/>
           <w:bCs/>
         </w:rPr>
-        <w:t>The maker portal</w:t>
-      </w:r>
-      <w:r>
-        <w:t xml:space="preserve"> mode depends on how the portal keeps its sign-in in the browser, which is not a documented interface: a future version of the portal could keep it differently, and the scanner then says it has no sign-in (it never guesses). The token is renewed only while the portal is used, so long deletion runs are better made from a page of the environment.</w:t>
+        <w:t>Web resources whose content Dataverse keeps as a file</w:t>
+      </w:r>
+      <w:r>
+        <w:t xml:space="preserve"> (</w:t>
+      </w:r>
+      <w:r>
+        <w:rPr>
+          <w:rFonts w:ascii="Consolas" w:eastAsia="Consolas" w:hAnsi="Consolas" w:cs="Consolas"/>
+          <w:sz w:val="18"/>
+          <w:szCs w:val="18"/>
+          <w:shd w:val="clear" w:color="auto" w:fill="F3F2F1"/>
+        </w:rPr>
+        <w:t>contentfileref</w:t>
+      </w:r>
+      <w:r>
+        <w:t>). Of the files, only the one in effect now can be read: the Web API gives out no other layer's file. A layer whose content is in any other file cannot be shown or compared line by line; layers whose content is held in the layer, or is the top layer's file in effect, are compared as usual. The deletion log keeps the unmanaged layer's content when the layer holds it itself, or when its file is the one in effect.</w:t>
       </w:r>
     </w:p>
     <w:p>
@@ -21524,10 +21549,14 @@
           <w:b/>
           <w:bCs/>
         </w:rPr>
-        <w:t>Links</w:t>
-      </w:r>
-      <w:r>
-        <w:t xml:space="preserve"> to the maker portal take a few seconds to load. A relationship's maker page shows its definition only.</w:t>
+        <w:t>The maker portal</w:t>
+      </w:r>
+      <w:r>
+        <w:t xml:space="preserve"> mode depends on how the portal keeps its sign-in in the browser, which is not a documented interface: a future version of the portal could keep it differently, and the scanner then </w:t>
+      </w:r>
+      <w:r>
+        <w:lastRenderedPageBreak/>
+        <w:t>says it has no sign-in (it never guesses). The token is renewed only while the portal is used, so long deletion runs are better made from a page of the environment.</w:t>
       </w:r>
     </w:p>
     <w:p>
@@ -21544,14 +21573,10 @@
           <w:b/>
           <w:bCs/>
         </w:rPr>
-        <w:t>Deleting.</w:t>
-      </w:r>
-      <w:r>
-        <w:t xml:space="preserve"> Email templates cannot have their unmanaged layer removed. At most 100 components per run, one at a time, about 8 seconds each. The deletion log holds the Active layer as read right before </w:t>
-      </w:r>
-      <w:r>
-        <w:lastRenderedPageBreak/>
-        <w:t>the removal; a change made to the component in the few seconds between that read and the removal is removed too and is not in the log.</w:t>
+        <w:t>Links</w:t>
+      </w:r>
+      <w:r>
+        <w:t xml:space="preserve"> to the maker portal take a few seconds to load. A relationship's maker page shows its definition only.</w:t>
       </w:r>
     </w:p>
     <w:p>
@@ -21568,10 +21593,10 @@
           <w:b/>
           <w:bCs/>
         </w:rPr>
-        <w:t>Grid.</w:t>
-      </w:r>
-      <w:r>
-        <w:t xml:space="preserve"> Up to 2,000 rows are drawn at once.</w:t>
+        <w:t>Deleting.</w:t>
+      </w:r>
+      <w:r>
+        <w:t xml:space="preserve"> Email templates cannot have their unmanaged layer removed. At most 100 components per run, one at a time, about 8 seconds each. The deletion log holds the Active layer as read right before the removal; a change made to the component in the few seconds between that read and the removal is removed too and is not in the log.</w:t>
       </w:r>
     </w:p>
     <w:p>
@@ -21588,10 +21613,10 @@
           <w:b/>
           <w:bCs/>
         </w:rPr>
-        <w:t>Saved selections, column widths and the window's place</w:t>
-      </w:r>
-      <w:r>
-        <w:t xml:space="preserve"> are kept in the browser's local storage: not shared between people, browsers or profiles.</w:t>
+        <w:t>Grid.</w:t>
+      </w:r>
+      <w:r>
+        <w:t xml:space="preserve"> Up to 2,000 rows are drawn at once.</w:t>
       </w:r>
     </w:p>
     <w:p>
@@ -21608,6 +21633,26 @@
           <w:b/>
           <w:bCs/>
         </w:rPr>
+        <w:t>Saved selections, column widths and the window's place</w:t>
+      </w:r>
+      <w:r>
+        <w:t xml:space="preserve"> are kept in the browser's local storage: not shared between people, browsers or profiles.</w:t>
+      </w:r>
+    </w:p>
+    <w:p>
+      <w:pPr>
+        <w:pStyle w:val="ListParagraph"/>
+        <w:numPr>
+          <w:ilvl w:val="0"/>
+          <w:numId w:val="2"/>
+        </w:numPr>
+        <w:spacing w:after="60" w:line="264" w:lineRule="auto"/>
+      </w:pPr>
+      <w:r>
+        <w:rPr>
+          <w:b/>
+          <w:bCs/>
+        </w:rPr>
         <w:t>The window</w:t>
       </w:r>
       <w:r>
@@ -21624,7 +21669,7 @@
         <w:pStyle w:val="Heading1"/>
         <w:keepNext/>
       </w:pPr>
-      <w:bookmarkStart w:id="42" w:name="_Toc242987587"/>
+      <w:bookmarkStart w:id="42" w:name="_Toc242991215"/>
       <w:r>
         <w:t>How it works</w:t>
       </w:r>
@@ -21868,6 +21913,7 @@
         <w:spacing w:after="120"/>
       </w:pPr>
       <w:r>
+        <w:lastRenderedPageBreak/>
         <w:t xml:space="preserve">The cost follows the number of component types (about 110 to 250) and the number of components that have an unmanaged layer, not the size of the environment. Deleting calls </w:t>
       </w:r>
       <w:r>
@@ -21956,7 +22002,6 @@
                 <w:sz w:val="17"/>
                 <w:szCs w:val="17"/>
               </w:rPr>
-              <w:lastRenderedPageBreak/>
               <w:t>Fact</w:t>
             </w:r>
           </w:p>
@@ -22736,7 +22781,7 @@
         <w:pStyle w:val="Heading1"/>
         <w:keepNext/>
       </w:pPr>
-      <w:bookmarkStart w:id="43" w:name="_Toc242987588"/>
+      <w:bookmarkStart w:id="43" w:name="_Toc242991216"/>
       <w:r>
         <w:t>Comparison with Solution Layers Explorer</w:t>
       </w:r>
@@ -22803,6 +22848,7 @@
                 <w:sz w:val="17"/>
                 <w:szCs w:val="17"/>
               </w:rPr>
+              <w:lastRenderedPageBreak/>
               <w:t>Solution Layers Explorer</w:t>
             </w:r>
           </w:p>
@@ -23019,7 +23065,6 @@
                 <w:sz w:val="17"/>
                 <w:szCs w:val="17"/>
               </w:rPr>
-              <w:lastRenderedPageBreak/>
               <w:t>Items list (name, table), sorted by column</w:t>
             </w:r>
           </w:p>
@@ -23686,6 +23731,7 @@
         <w:spacing w:after="120"/>
       </w:pPr>
       <w:r>
+        <w:lastRenderedPageBreak/>
         <w:t>In a test environment, the scanner found the same components as reading the layers of every component one by one (135 of 135, none wrongly). On a managed test solution with 17 changed components, it found all 17, and Solution Layers Explorer's way of looking up layers found 14: it missed an email template, a connection reference and a relationship's cascade settings.</w:t>
       </w:r>
     </w:p>
@@ -23694,9 +23740,8 @@
         <w:pStyle w:val="Heading1"/>
         <w:keepNext/>
       </w:pPr>
-      <w:bookmarkStart w:id="44" w:name="_Toc242987589"/>
-      <w:r>
-        <w:lastRenderedPageBreak/>
+      <w:bookmarkStart w:id="44" w:name="_Toc242991217"/>
+      <w:r>
         <w:t>Repository layout</w:t>
       </w:r>
       <w:bookmarkEnd w:id="44"/>
@@ -24724,7 +24769,7 @@
         <w:pStyle w:val="Heading1"/>
         <w:keepNext/>
       </w:pPr>
-      <w:bookmarkStart w:id="45" w:name="_Toc242987590"/>
+      <w:bookmarkStart w:id="45" w:name="_Toc242991218"/>
       <w:r>
         <w:t>Build</w:t>
       </w:r>
@@ -24790,6 +24835,7 @@
           <w:szCs w:val="18"/>
           <w:shd w:val="clear" w:color="auto" w:fill="F3F2F1"/>
         </w:rPr>
+        <w:lastRenderedPageBreak/>
         <w:t>npm ci</w:t>
       </w:r>
       <w:r>
@@ -24854,7 +24900,6 @@
         <w:spacing w:after="60" w:line="264" w:lineRule="auto"/>
       </w:pPr>
       <w:r>
-        <w:lastRenderedPageBreak/>
         <w:t xml:space="preserve">Writes the version from </w:t>
       </w:r>
       <w:r>
@@ -25007,7 +25052,7 @@
           <w:szCs w:val="18"/>
           <w:shd w:val="clear" w:color="auto" w:fill="F3F2F1"/>
         </w:rPr>
-        <w:t>bookmarklet 1.0.0: 71063 characters (164.9 KB unpacked)</w:t>
+        <w:t>bookmarklet 1.0.0: 71483 characters (165.6 KB unpacked)</w:t>
       </w:r>
       <w:r>
         <w:t>.</w:t>
@@ -25255,7 +25300,7 @@
         <w:pStyle w:val="Heading1"/>
         <w:keepNext/>
       </w:pPr>
-      <w:bookmarkStart w:id="46" w:name="_Toc242987591"/>
+      <w:bookmarkStart w:id="46" w:name="_Toc242991219"/>
       <w:r>
         <w:t>License</w:t>
       </w:r>
@@ -25477,96 +25522,76 @@
 <file path=word/numbering.xml><?xml version="1.0" encoding="utf-8"?>
 <w:numbering xmlns:wpc="http://schemas.microsoft.com/office/word/2010/wordprocessingCanvas" xmlns:cx="http://schemas.microsoft.com/office/drawing/2014/chartex" xmlns:cx1="http://schemas.microsoft.com/office/drawing/2015/9/8/chartex" xmlns:cx2="http://schemas.microsoft.com/office/drawing/2015/10/21/chartex" xmlns:cx3="http://schemas.microsoft.com/office/drawing/2016/5/9/chartex" xmlns:cx4="http://schemas.microsoft.com/office/drawing/2016/5/10/chartex" xmlns:cx5="http://schemas.microsoft.com/office/drawing/2016/5/11/chartex" xmlns:cx6="http://schemas.microsoft.com/office/drawing/2016/5/12/chartex" xmlns:cx7="http://schemas.microsoft.com/office/drawing/2016/5/13/chartex" xmlns:cx8="http://schemas.microsoft.com/office/drawing/2016/5/14/chartex" xmlns:mc="http://schemas.openxmlformats.org/markup-compatibility/2006" xmlns:aink="http://schemas.microsoft.com/office/drawing/2016/ink" xmlns:am3d="http://schemas.microsoft.com/office/drawing/2017/model3d" xmlns:o="urn:schemas-microsoft-com:office:office" xmlns:oel="http://schemas.microsoft.com/office/2019/extlst" xmlns:r="http://schemas.openxmlformats.org/officeDocument/2006/relationships" xmlns:m="http://schemas.openxmlformats.org/officeDocument/2006/math" xmlns:v="urn:schemas-microsoft-com:vml" xmlns:wp14="http://schemas.microsoft.com/office/word/2010/wordprocessingDrawing" xmlns:wp="http://schemas.openxmlformats.org/drawingml/2006/wordprocessingDrawing" xmlns:w10="urn:schemas-microsoft-com:office:word" xmlns:w="http://schemas.openxmlformats.org/wordprocessingml/2006/main" xmlns:w14="http://schemas.microsoft.com/office/word/2010/wordml" xmlns:w15="http://schemas.microsoft.com/office/word/2012/wordml" xmlns:w16cex="http://schemas.microsoft.com/office/word/2018/wordml/cex" xmlns:w16cid="http://schemas.microsoft.com/office/word/2016/wordml/cid" xmlns:w16="http://schemas.microsoft.com/office/word/2018/wordml" xmlns:w16sdtdh="http://schemas.microsoft.com/office/word/2020/wordml/sdtdatahash" xmlns:w16se="http://schemas.microsoft.com/office/word/2015/wordml/symex" xmlns:wpg="http://schemas.microsoft.com/office/word/2010/wordprocessingGroup" xmlns:wpi="http://schemas.microsoft.com/office/word/2010/wordprocessingInk" xmlns:wne="http://schemas.microsoft.com/office/word/2006/wordml" xmlns:wps="http://schemas.microsoft.com/office/word/2010/wordprocessingShape" mc:Ignorable="w14 w15 w16se w16cid w16 w16cex w16sdtdh wp14">
   <w:abstractNum w:abstractNumId="0" w15:restartNumberingAfterBreak="0">
-    <w:nsid w:val="10D01BF8"/>
+    <w:nsid w:val="03AF0193"/>
     <w:multiLevelType w:val="hybridMultilevel"/>
-    <w:tmpl w:val="83DAC234"/>
-    <w:lvl w:ilvl="0" w:tplc="FA589E46" w:tentative="1">
+    <w:tmpl w:val="003C5796"/>
+    <w:lvl w:ilvl="0" w:tplc="ACB2B534">
       <w:start w:val="1"/>
       <w:numFmt w:val="bullet"/>
-      <w:lvlText w:val="●"/>
+      <w:lvlText w:val="•"/>
       <w:lvlJc w:val="left"/>
       <w:pPr>
-        <w:ind w:left="720" w:hanging="360"/>
+        <w:ind w:left="360" w:hanging="260"/>
       </w:pPr>
     </w:lvl>
-    <w:lvl w:ilvl="1" w:tplc="6568B178" w:tentative="1">
+    <w:lvl w:ilvl="1" w:tplc="18CC89A4" w:tentative="1">
       <w:start w:val="1"/>
       <w:numFmt w:val="bullet"/>
-      <w:lvlText w:val="○"/>
+      <w:lvlText w:val="–"/>
       <w:lvlJc w:val="left"/>
       <w:pPr>
-        <w:ind w:left="1440" w:hanging="360"/>
+        <w:ind w:left="720" w:hanging="260"/>
       </w:pPr>
     </w:lvl>
-    <w:lvl w:ilvl="2" w:tplc="E37212D4" w:tentative="1">
+    <w:lvl w:ilvl="2" w:tplc="D12ADECE" w:tentative="1">
       <w:start w:val="1"/>
       <w:numFmt w:val="bullet"/>
-      <w:lvlText w:val="■"/>
+      <w:lvlText w:val="◦"/>
       <w:lvlJc w:val="left"/>
       <w:pPr>
-        <w:ind w:left="2160" w:hanging="360"/>
+        <w:ind w:left="1080" w:hanging="260"/>
       </w:pPr>
     </w:lvl>
-    <w:lvl w:ilvl="3" w:tplc="C7E645B2" w:tentative="1">
+    <w:lvl w:ilvl="3" w:tplc="36B07D2E" w:tentative="1">
       <w:start w:val="1"/>
       <w:numFmt w:val="bullet"/>
-      <w:lvlText w:val="●"/>
+      <w:lvlText w:val="•"/>
       <w:lvlJc w:val="left"/>
       <w:pPr>
-        <w:ind w:left="2880" w:hanging="360"/>
+        <w:ind w:left="1440" w:hanging="260"/>
       </w:pPr>
     </w:lvl>
-    <w:lvl w:ilvl="4" w:tplc="45FE7218" w:tentative="1">
-      <w:start w:val="1"/>
-      <w:numFmt w:val="bullet"/>
-      <w:lvlText w:val="○"/>
+    <w:lvl w:ilvl="4" w:tplc="B9A81570">
+      <w:numFmt w:val="decimal"/>
+      <w:lvlText w:val=""/>
       <w:lvlJc w:val="left"/>
-      <w:pPr>
-        <w:ind w:left="3600" w:hanging="360"/>
-      </w:pPr>
     </w:lvl>
-    <w:lvl w:ilvl="5" w:tplc="6B88BEDA" w:tentative="1">
-      <w:start w:val="1"/>
-      <w:numFmt w:val="bullet"/>
-      <w:lvlText w:val="■"/>
+    <w:lvl w:ilvl="5" w:tplc="E1B46A64">
+      <w:numFmt w:val="decimal"/>
+      <w:lvlText w:val=""/>
       <w:lvlJc w:val="left"/>
-      <w:pPr>
-        <w:ind w:left="4320" w:hanging="360"/>
-      </w:pPr>
     </w:lvl>
-    <w:lvl w:ilvl="6" w:tplc="37D452E8" w:tentative="1">
-      <w:start w:val="1"/>
-      <w:numFmt w:val="bullet"/>
-      <w:lvlText w:val="●"/>
+    <w:lvl w:ilvl="6" w:tplc="FC04AF08">
+      <w:numFmt w:val="decimal"/>
+      <w:lvlText w:val=""/>
       <w:lvlJc w:val="left"/>
-      <w:pPr>
-        <w:ind w:left="5040" w:hanging="360"/>
-      </w:pPr>
     </w:lvl>
-    <w:lvl w:ilvl="7" w:tplc="21A64C70" w:tentative="1">
-      <w:start w:val="1"/>
-      <w:numFmt w:val="bullet"/>
-      <w:lvlText w:val="●"/>
+    <w:lvl w:ilvl="7" w:tplc="6A78D98E">
+      <w:numFmt w:val="decimal"/>
+      <w:lvlText w:val=""/>
       <w:lvlJc w:val="left"/>
-      <w:pPr>
-        <w:ind w:left="5760" w:hanging="360"/>
-      </w:pPr>
     </w:lvl>
-    <w:lvl w:ilvl="8" w:tplc="B94E57B2" w:tentative="1">
-      <w:start w:val="1"/>
-      <w:numFmt w:val="bullet"/>
-      <w:lvlText w:val="●"/>
+    <w:lvl w:ilvl="8" w:tplc="BF1C219E">
+      <w:numFmt w:val="decimal"/>
+      <w:lvlText w:val=""/>
       <w:lvlJc w:val="left"/>
-      <w:pPr>
-        <w:ind w:left="6480" w:hanging="360"/>
-      </w:pPr>
     </w:lvl>
   </w:abstractNum>
   <w:abstractNum w:abstractNumId="1" w15:restartNumberingAfterBreak="0">
-    <w:nsid w:val="1A19693E"/>
+    <w:nsid w:val="4CD418EC"/>
     <w:multiLevelType w:val="hybridMultilevel"/>
-    <w:tmpl w:val="73F4C65C"/>
-    <w:lvl w:ilvl="0" w:tplc="317E2B82">
+    <w:tmpl w:val="A25E979C"/>
+    <w:lvl w:ilvl="0" w:tplc="E7568C98">
       <w:start w:val="1"/>
       <w:numFmt w:val="decimal"/>
       <w:lvlText w:val="%1."/>
@@ -25575,7 +25600,7 @@
         <w:ind w:left="360" w:hanging="300"/>
       </w:pPr>
     </w:lvl>
-    <w:lvl w:ilvl="1" w:tplc="A5D67954" w:tentative="1">
+    <w:lvl w:ilvl="1" w:tplc="445CE150" w:tentative="1">
       <w:start w:val="1"/>
       <w:numFmt w:val="lowerLetter"/>
       <w:lvlText w:val="%2."/>
@@ -25584,7 +25609,7 @@
         <w:ind w:left="720" w:hanging="300"/>
       </w:pPr>
     </w:lvl>
-    <w:lvl w:ilvl="2" w:tplc="19567352" w:tentative="1">
+    <w:lvl w:ilvl="2" w:tplc="3AA6623A" w:tentative="1">
       <w:start w:val="1"/>
       <w:numFmt w:val="lowerRoman"/>
       <w:lvlText w:val="%3."/>
@@ -25593,7 +25618,7 @@
         <w:ind w:left="1080" w:hanging="300"/>
       </w:pPr>
     </w:lvl>
-    <w:lvl w:ilvl="3" w:tplc="AD5C1B46" w:tentative="1">
+    <w:lvl w:ilvl="3" w:tplc="B4CEBAE8" w:tentative="1">
       <w:start w:val="1"/>
       <w:numFmt w:val="decimal"/>
       <w:lvlText w:val="%4."/>
@@ -25602,171 +25627,191 @@
         <w:ind w:left="1440" w:hanging="300"/>
       </w:pPr>
     </w:lvl>
-    <w:lvl w:ilvl="4" w:tplc="A5900BA4">
+    <w:lvl w:ilvl="4" w:tplc="E4A8AFC6">
       <w:numFmt w:val="decimal"/>
       <w:lvlText w:val=""/>
       <w:lvlJc w:val="left"/>
     </w:lvl>
-    <w:lvl w:ilvl="5" w:tplc="FE00CC12">
+    <w:lvl w:ilvl="5" w:tplc="AEC8D764">
       <w:numFmt w:val="decimal"/>
       <w:lvlText w:val=""/>
       <w:lvlJc w:val="left"/>
     </w:lvl>
-    <w:lvl w:ilvl="6" w:tplc="495EF042">
+    <w:lvl w:ilvl="6" w:tplc="985A5FA4">
       <w:numFmt w:val="decimal"/>
       <w:lvlText w:val=""/>
       <w:lvlJc w:val="left"/>
     </w:lvl>
-    <w:lvl w:ilvl="7" w:tplc="D6CE2712">
+    <w:lvl w:ilvl="7" w:tplc="94C24688">
       <w:numFmt w:val="decimal"/>
       <w:lvlText w:val=""/>
       <w:lvlJc w:val="left"/>
     </w:lvl>
-    <w:lvl w:ilvl="8" w:tplc="42F65E68">
+    <w:lvl w:ilvl="8" w:tplc="377AA408">
       <w:numFmt w:val="decimal"/>
       <w:lvlText w:val=""/>
       <w:lvlJc w:val="left"/>
     </w:lvl>
   </w:abstractNum>
   <w:abstractNum w:abstractNumId="2" w15:restartNumberingAfterBreak="0">
-    <w:nsid w:val="6B7D7B17"/>
+    <w:nsid w:val="60805810"/>
     <w:multiLevelType w:val="hybridMultilevel"/>
-    <w:tmpl w:val="DF0A0AFE"/>
-    <w:lvl w:ilvl="0" w:tplc="177A0388">
+    <w:tmpl w:val="5A88A5DE"/>
+    <w:lvl w:ilvl="0" w:tplc="A9BAF77A" w:tentative="1">
       <w:start w:val="1"/>
       <w:numFmt w:val="bullet"/>
-      <w:lvlText w:val="•"/>
+      <w:lvlText w:val="●"/>
       <w:lvlJc w:val="left"/>
       <w:pPr>
-        <w:ind w:left="360" w:hanging="260"/>
+        <w:ind w:left="720" w:hanging="360"/>
       </w:pPr>
     </w:lvl>
-    <w:lvl w:ilvl="1" w:tplc="B93A862E" w:tentative="1">
+    <w:lvl w:ilvl="1" w:tplc="BE78BB9E" w:tentative="1">
       <w:start w:val="1"/>
       <w:numFmt w:val="bullet"/>
-      <w:lvlText w:val="–"/>
+      <w:lvlText w:val="○"/>
       <w:lvlJc w:val="left"/>
       <w:pPr>
-        <w:ind w:left="720" w:hanging="260"/>
+        <w:ind w:left="1440" w:hanging="360"/>
       </w:pPr>
     </w:lvl>
-    <w:lvl w:ilvl="2" w:tplc="352C6436" w:tentative="1">
+    <w:lvl w:ilvl="2" w:tplc="1B04B774" w:tentative="1">
       <w:start w:val="1"/>
       <w:numFmt w:val="bullet"/>
-      <w:lvlText w:val="◦"/>
+      <w:lvlText w:val="■"/>
       <w:lvlJc w:val="left"/>
       <w:pPr>
-        <w:ind w:left="1080" w:hanging="260"/>
+        <w:ind w:left="2160" w:hanging="360"/>
       </w:pPr>
     </w:lvl>
-    <w:lvl w:ilvl="3" w:tplc="DC9E49B2" w:tentative="1">
+    <w:lvl w:ilvl="3" w:tplc="857C4606" w:tentative="1">
       <w:start w:val="1"/>
       <w:numFmt w:val="bullet"/>
-      <w:lvlText w:val="•"/>
+      <w:lvlText w:val="●"/>
       <w:lvlJc w:val="left"/>
       <w:pPr>
-        <w:ind w:left="1440" w:hanging="260"/>
+        <w:ind w:left="2880" w:hanging="360"/>
       </w:pPr>
     </w:lvl>
-    <w:lvl w:ilvl="4" w:tplc="B16E584C">
-      <w:numFmt w:val="decimal"/>
-      <w:lvlText w:val=""/>
+    <w:lvl w:ilvl="4" w:tplc="A28C431E" w:tentative="1">
+      <w:start w:val="1"/>
+      <w:numFmt w:val="bullet"/>
+      <w:lvlText w:val="○"/>
       <w:lvlJc w:val="left"/>
+      <w:pPr>
+        <w:ind w:left="3600" w:hanging="360"/>
+      </w:pPr>
     </w:lvl>
-    <w:lvl w:ilvl="5" w:tplc="ED6C0CBC">
-      <w:numFmt w:val="decimal"/>
-      <w:lvlText w:val=""/>
+    <w:lvl w:ilvl="5" w:tplc="5B4032B6" w:tentative="1">
+      <w:start w:val="1"/>
+      <w:numFmt w:val="bullet"/>
+      <w:lvlText w:val="■"/>
       <w:lvlJc w:val="left"/>
+      <w:pPr>
+        <w:ind w:left="4320" w:hanging="360"/>
+      </w:pPr>
     </w:lvl>
-    <w:lvl w:ilvl="6" w:tplc="F42243F4">
-      <w:numFmt w:val="decimal"/>
-      <w:lvlText w:val=""/>
+    <w:lvl w:ilvl="6" w:tplc="D04EC436" w:tentative="1">
+      <w:start w:val="1"/>
+      <w:numFmt w:val="bullet"/>
+      <w:lvlText w:val="●"/>
       <w:lvlJc w:val="left"/>
+      <w:pPr>
+        <w:ind w:left="5040" w:hanging="360"/>
+      </w:pPr>
     </w:lvl>
-    <w:lvl w:ilvl="7" w:tplc="618804DE">
-      <w:numFmt w:val="decimal"/>
-      <w:lvlText w:val=""/>
+    <w:lvl w:ilvl="7" w:tplc="D2606A60" w:tentative="1">
+      <w:start w:val="1"/>
+      <w:numFmt w:val="bullet"/>
+      <w:lvlText w:val="●"/>
       <w:lvlJc w:val="left"/>
+      <w:pPr>
+        <w:ind w:left="5760" w:hanging="360"/>
+      </w:pPr>
     </w:lvl>
-    <w:lvl w:ilvl="8" w:tplc="F3A0D498">
-      <w:numFmt w:val="decimal"/>
-      <w:lvlText w:val=""/>
+    <w:lvl w:ilvl="8" w:tplc="7C1E1D46" w:tentative="1">
+      <w:start w:val="1"/>
+      <w:numFmt w:val="bullet"/>
+      <w:lvlText w:val="●"/>
       <w:lvlJc w:val="left"/>
+      <w:pPr>
+        <w:ind w:left="6480" w:hanging="360"/>
+      </w:pPr>
     </w:lvl>
   </w:abstractNum>
-  <w:num w:numId="1" w16cid:durableId="623392381">
+  <w:num w:numId="1" w16cid:durableId="1636521418">
+    <w:abstractNumId w:val="2"/>
+    <w:lvlOverride w:ilvl="0">
+      <w:startOverride w:val="1"/>
+    </w:lvlOverride>
+  </w:num>
+  <w:num w:numId="2" w16cid:durableId="1568683184">
     <w:abstractNumId w:val="0"/>
     <w:lvlOverride w:ilvl="0">
       <w:startOverride w:val="1"/>
     </w:lvlOverride>
   </w:num>
-  <w:num w:numId="2" w16cid:durableId="1920752545">
-    <w:abstractNumId w:val="2"/>
-    <w:lvlOverride w:ilvl="0">
-      <w:startOverride w:val="1"/>
-    </w:lvlOverride>
-  </w:num>
-  <w:num w:numId="3" w16cid:durableId="1390575109">
+  <w:num w:numId="3" w16cid:durableId="191311893">
     <w:abstractNumId w:val="1"/>
     <w:lvlOverride w:ilvl="0">
       <w:startOverride w:val="1"/>
     </w:lvlOverride>
   </w:num>
-  <w:num w:numId="4" w16cid:durableId="1782720506">
+  <w:num w:numId="4" w16cid:durableId="2129886063">
     <w:abstractNumId w:val="1"/>
     <w:lvlOverride w:ilvl="0">
       <w:startOverride w:val="1"/>
     </w:lvlOverride>
   </w:num>
-  <w:num w:numId="5" w16cid:durableId="1263075716">
+  <w:num w:numId="5" w16cid:durableId="106580465">
     <w:abstractNumId w:val="1"/>
     <w:lvlOverride w:ilvl="0">
       <w:startOverride w:val="1"/>
     </w:lvlOverride>
   </w:num>
-  <w:num w:numId="6" w16cid:durableId="533734355">
+  <w:num w:numId="6" w16cid:durableId="1827355388">
     <w:abstractNumId w:val="1"/>
     <w:lvlOverride w:ilvl="0">
       <w:startOverride w:val="1"/>
     </w:lvlOverride>
   </w:num>
-  <w:num w:numId="7" w16cid:durableId="373383582">
+  <w:num w:numId="7" w16cid:durableId="1955017924">
     <w:abstractNumId w:val="1"/>
     <w:lvlOverride w:ilvl="0">
       <w:startOverride w:val="1"/>
     </w:lvlOverride>
   </w:num>
-  <w:num w:numId="8" w16cid:durableId="1667127316">
+  <w:num w:numId="8" w16cid:durableId="855537982">
     <w:abstractNumId w:val="1"/>
     <w:lvlOverride w:ilvl="0">
       <w:startOverride w:val="1"/>
     </w:lvlOverride>
   </w:num>
-  <w:num w:numId="9" w16cid:durableId="378943183">
+  <w:num w:numId="9" w16cid:durableId="720859190">
     <w:abstractNumId w:val="1"/>
     <w:lvlOverride w:ilvl="0">
       <w:startOverride w:val="1"/>
     </w:lvlOverride>
   </w:num>
-  <w:num w:numId="10" w16cid:durableId="214507976">
+  <w:num w:numId="10" w16cid:durableId="535241582">
     <w:abstractNumId w:val="1"/>
     <w:lvlOverride w:ilvl="0">
       <w:startOverride w:val="1"/>
     </w:lvlOverride>
   </w:num>
-  <w:num w:numId="11" w16cid:durableId="1102729468">
+  <w:num w:numId="11" w16cid:durableId="1655640435">
     <w:abstractNumId w:val="1"/>
     <w:lvlOverride w:ilvl="0">
       <w:startOverride w:val="1"/>
     </w:lvlOverride>
   </w:num>
-  <w:num w:numId="12" w16cid:durableId="1656685836">
+  <w:num w:numId="12" w16cid:durableId="1045180498">
     <w:abstractNumId w:val="1"/>
     <w:lvlOverride w:ilvl="0">
       <w:startOverride w:val="1"/>
     </w:lvlOverride>
   </w:num>
-  <w:num w:numId="13" w16cid:durableId="316570840">
+  <w:num w:numId="13" w16cid:durableId="789054922">
     <w:abstractNumId w:val="1"/>
     <w:lvlOverride w:ilvl="0">
       <w:startOverride w:val="1"/>
@@ -26412,7 +26457,7 @@
     <w:autoRedefine/>
     <w:uiPriority w:val="39"/>
     <w:unhideWhenUsed/>
-    <w:rsid w:val="009A20B1"/>
+    <w:rsid w:val="00706994"/>
     <w:pPr>
       <w:spacing w:after="100"/>
     </w:pPr>
@@ -26424,7 +26469,7 @@
     <w:autoRedefine/>
     <w:uiPriority w:val="39"/>
     <w:unhideWhenUsed/>
-    <w:rsid w:val="009A20B1"/>
+    <w:rsid w:val="00706994"/>
     <w:pPr>
       <w:spacing w:after="100"/>
       <w:ind w:left="200"/>
@@ -26437,7 +26482,7 @@
     <w:autoRedefine/>
     <w:uiPriority w:val="39"/>
     <w:unhideWhenUsed/>
-    <w:rsid w:val="009A20B1"/>
+    <w:rsid w:val="00706994"/>
     <w:pPr>
       <w:spacing w:after="100"/>
       <w:ind w:left="400"/>

</xml_diff>

<commit_message>
Fit the Layers tab to narrow windows
The table no longer scrolls sideways: headers, dates and links wrap where they read well, long names end with an ellipsis, and below 860 px Publisher and Version go under the solution's name (CSS container queries); below 700 px the comparison link reads Compare.
</commit_message>
<xml_diff>
--- a/docs/UnmanagedLayerScanner - Technical Reference.docx
+++ b/docs/UnmanagedLayerScanner - Technical Reference.docx
@@ -38,7 +38,7 @@
           <w:noProof/>
         </w:rPr>
         <w:drawing>
-          <wp:inline distT="0" distB="0" distL="0" distR="0" wp14:anchorId="2490E56C" wp14:editId="65BE1488">
+          <wp:inline distT="0" distB="0" distL="0" distR="0" wp14:anchorId="2514493D" wp14:editId="164A7045">
             <wp:extent cx="5943600" cy="4229100"/>
             <wp:effectExtent l="0" t="0" r="0" b="0"/>
             <wp:docPr id="19" name="results.png" descr="The results of a scan" title="The results of a scan"/>
@@ -135,7 +135,7 @@
     <w:sdt>
       <w:sdtPr>
         <w:alias w:val="Contents"/>
-        <w:id w:val="-357048162"/>
+        <w:id w:val="-750035678"/>
       </w:sdtPr>
       <w:sdtEndPr/>
       <w:sdtContent>
@@ -164,7 +164,7 @@
           <w:r>
             <w:fldChar w:fldCharType="separate"/>
           </w:r>
-          <w:hyperlink w:anchor="_Toc242991173" w:history="1">
+          <w:hyperlink w:anchor="_Toc242992529" w:history="1">
             <w:r>
               <w:rPr>
                 <w:rStyle w:val="Hyperlink"/>
@@ -188,7 +188,7 @@
               <w:rPr>
                 <w:noProof/>
               </w:rPr>
-              <w:instrText xml:space="preserve"> PAGEREF _Toc242991173 \h </w:instrText>
+              <w:instrText xml:space="preserve"> PAGEREF _Toc242992529 \h </w:instrText>
             </w:r>
             <w:r>
               <w:rPr>
@@ -231,7 +231,7 @@
               <w14:ligatures w14:val="standardContextual"/>
             </w:rPr>
           </w:pPr>
-          <w:hyperlink w:anchor="_Toc242991174" w:history="1">
+          <w:hyperlink w:anchor="_Toc242992530" w:history="1">
             <w:r>
               <w:rPr>
                 <w:rStyle w:val="Hyperlink"/>
@@ -255,7 +255,7 @@
               <w:rPr>
                 <w:noProof/>
               </w:rPr>
-              <w:instrText xml:space="preserve"> PAGEREF _Toc242991174 \h </w:instrText>
+              <w:instrText xml:space="preserve"> PAGEREF _Toc242992530 \h </w:instrText>
             </w:r>
             <w:r>
               <w:rPr>
@@ -298,7 +298,7 @@
               <w14:ligatures w14:val="standardContextual"/>
             </w:rPr>
           </w:pPr>
-          <w:hyperlink w:anchor="_Toc242991175" w:history="1">
+          <w:hyperlink w:anchor="_Toc242992531" w:history="1">
             <w:r>
               <w:rPr>
                 <w:rStyle w:val="Hyperlink"/>
@@ -322,7 +322,7 @@
               <w:rPr>
                 <w:noProof/>
               </w:rPr>
-              <w:instrText xml:space="preserve"> PAGEREF _Toc242991175 \h </w:instrText>
+              <w:instrText xml:space="preserve"> PAGEREF _Toc242992531 \h </w:instrText>
             </w:r>
             <w:r>
               <w:rPr>
@@ -365,7 +365,7 @@
               <w14:ligatures w14:val="standardContextual"/>
             </w:rPr>
           </w:pPr>
-          <w:hyperlink w:anchor="_Toc242991176" w:history="1">
+          <w:hyperlink w:anchor="_Toc242992532" w:history="1">
             <w:r>
               <w:rPr>
                 <w:rStyle w:val="Hyperlink"/>
@@ -389,7 +389,7 @@
               <w:rPr>
                 <w:noProof/>
               </w:rPr>
-              <w:instrText xml:space="preserve"> PAGEREF _Toc242991176 \h </w:instrText>
+              <w:instrText xml:space="preserve"> PAGEREF _Toc242992532 \h </w:instrText>
             </w:r>
             <w:r>
               <w:rPr>
@@ -432,7 +432,7 @@
               <w14:ligatures w14:val="standardContextual"/>
             </w:rPr>
           </w:pPr>
-          <w:hyperlink w:anchor="_Toc242991177" w:history="1">
+          <w:hyperlink w:anchor="_Toc242992533" w:history="1">
             <w:r>
               <w:rPr>
                 <w:rStyle w:val="Hyperlink"/>
@@ -456,7 +456,7 @@
               <w:rPr>
                 <w:noProof/>
               </w:rPr>
-              <w:instrText xml:space="preserve"> PAGEREF _Toc242991177 \h </w:instrText>
+              <w:instrText xml:space="preserve"> PAGEREF _Toc242992533 \h </w:instrText>
             </w:r>
             <w:r>
               <w:rPr>
@@ -499,7 +499,7 @@
               <w14:ligatures w14:val="standardContextual"/>
             </w:rPr>
           </w:pPr>
-          <w:hyperlink w:anchor="_Toc242991178" w:history="1">
+          <w:hyperlink w:anchor="_Toc242992534" w:history="1">
             <w:r>
               <w:rPr>
                 <w:rStyle w:val="Hyperlink"/>
@@ -523,7 +523,7 @@
               <w:rPr>
                 <w:noProof/>
               </w:rPr>
-              <w:instrText xml:space="preserve"> PAGEREF _Toc242991178 \h </w:instrText>
+              <w:instrText xml:space="preserve"> PAGEREF _Toc242992534 \h </w:instrText>
             </w:r>
             <w:r>
               <w:rPr>
@@ -566,7 +566,7 @@
               <w14:ligatures w14:val="standardContextual"/>
             </w:rPr>
           </w:pPr>
-          <w:hyperlink w:anchor="_Toc242991179" w:history="1">
+          <w:hyperlink w:anchor="_Toc242992535" w:history="1">
             <w:r>
               <w:rPr>
                 <w:rStyle w:val="Hyperlink"/>
@@ -590,7 +590,7 @@
               <w:rPr>
                 <w:noProof/>
               </w:rPr>
-              <w:instrText xml:space="preserve"> PAGEREF _Toc242991179 \h </w:instrText>
+              <w:instrText xml:space="preserve"> PAGEREF _Toc242992535 \h </w:instrText>
             </w:r>
             <w:r>
               <w:rPr>
@@ -633,7 +633,7 @@
               <w14:ligatures w14:val="standardContextual"/>
             </w:rPr>
           </w:pPr>
-          <w:hyperlink w:anchor="_Toc242991180" w:history="1">
+          <w:hyperlink w:anchor="_Toc242992536" w:history="1">
             <w:r>
               <w:rPr>
                 <w:rStyle w:val="Hyperlink"/>
@@ -657,7 +657,7 @@
               <w:rPr>
                 <w:noProof/>
               </w:rPr>
-              <w:instrText xml:space="preserve"> PAGEREF _Toc242991180 \h </w:instrText>
+              <w:instrText xml:space="preserve"> PAGEREF _Toc242992536 \h </w:instrText>
             </w:r>
             <w:r>
               <w:rPr>
@@ -700,7 +700,7 @@
               <w14:ligatures w14:val="standardContextual"/>
             </w:rPr>
           </w:pPr>
-          <w:hyperlink w:anchor="_Toc242991181" w:history="1">
+          <w:hyperlink w:anchor="_Toc242992537" w:history="1">
             <w:r>
               <w:rPr>
                 <w:rStyle w:val="Hyperlink"/>
@@ -724,7 +724,7 @@
               <w:rPr>
                 <w:noProof/>
               </w:rPr>
-              <w:instrText xml:space="preserve"> PAGEREF _Toc242991181 \h </w:instrText>
+              <w:instrText xml:space="preserve"> PAGEREF _Toc242992537 \h </w:instrText>
             </w:r>
             <w:r>
               <w:rPr>
@@ -767,7 +767,7 @@
               <w14:ligatures w14:val="standardContextual"/>
             </w:rPr>
           </w:pPr>
-          <w:hyperlink w:anchor="_Toc242991182" w:history="1">
+          <w:hyperlink w:anchor="_Toc242992538" w:history="1">
             <w:r>
               <w:rPr>
                 <w:rStyle w:val="Hyperlink"/>
@@ -791,7 +791,7 @@
               <w:rPr>
                 <w:noProof/>
               </w:rPr>
-              <w:instrText xml:space="preserve"> PAGEREF _Toc242991182 \h </w:instrText>
+              <w:instrText xml:space="preserve"> PAGEREF _Toc242992538 \h </w:instrText>
             </w:r>
             <w:r>
               <w:rPr>
@@ -834,7 +834,7 @@
               <w14:ligatures w14:val="standardContextual"/>
             </w:rPr>
           </w:pPr>
-          <w:hyperlink w:anchor="_Toc242991183" w:history="1">
+          <w:hyperlink w:anchor="_Toc242992539" w:history="1">
             <w:r>
               <w:rPr>
                 <w:rStyle w:val="Hyperlink"/>
@@ -858,7 +858,7 @@
               <w:rPr>
                 <w:noProof/>
               </w:rPr>
-              <w:instrText xml:space="preserve"> PAGEREF _Toc242991183 \h </w:instrText>
+              <w:instrText xml:space="preserve"> PAGEREF _Toc242992539 \h </w:instrText>
             </w:r>
             <w:r>
               <w:rPr>
@@ -901,7 +901,7 @@
               <w14:ligatures w14:val="standardContextual"/>
             </w:rPr>
           </w:pPr>
-          <w:hyperlink w:anchor="_Toc242991184" w:history="1">
+          <w:hyperlink w:anchor="_Toc242992540" w:history="1">
             <w:r>
               <w:rPr>
                 <w:rStyle w:val="Hyperlink"/>
@@ -925,7 +925,7 @@
               <w:rPr>
                 <w:noProof/>
               </w:rPr>
-              <w:instrText xml:space="preserve"> PAGEREF _Toc242991184 \h </w:instrText>
+              <w:instrText xml:space="preserve"> PAGEREF _Toc242992540 \h </w:instrText>
             </w:r>
             <w:r>
               <w:rPr>
@@ -968,7 +968,7 @@
               <w14:ligatures w14:val="standardContextual"/>
             </w:rPr>
           </w:pPr>
-          <w:hyperlink w:anchor="_Toc242991185" w:history="1">
+          <w:hyperlink w:anchor="_Toc242992541" w:history="1">
             <w:r>
               <w:rPr>
                 <w:rStyle w:val="Hyperlink"/>
@@ -992,7 +992,7 @@
               <w:rPr>
                 <w:noProof/>
               </w:rPr>
-              <w:instrText xml:space="preserve"> PAGEREF _Toc242991185 \h </w:instrText>
+              <w:instrText xml:space="preserve"> PAGEREF _Toc242992541 \h </w:instrText>
             </w:r>
             <w:r>
               <w:rPr>
@@ -1035,7 +1035,7 @@
               <w14:ligatures w14:val="standardContextual"/>
             </w:rPr>
           </w:pPr>
-          <w:hyperlink w:anchor="_Toc242991186" w:history="1">
+          <w:hyperlink w:anchor="_Toc242992542" w:history="1">
             <w:r>
               <w:rPr>
                 <w:rStyle w:val="Hyperlink"/>
@@ -1059,7 +1059,7 @@
               <w:rPr>
                 <w:noProof/>
               </w:rPr>
-              <w:instrText xml:space="preserve"> PAGEREF _Toc242991186 \h </w:instrText>
+              <w:instrText xml:space="preserve"> PAGEREF _Toc242992542 \h </w:instrText>
             </w:r>
             <w:r>
               <w:rPr>
@@ -1102,7 +1102,7 @@
               <w14:ligatures w14:val="standardContextual"/>
             </w:rPr>
           </w:pPr>
-          <w:hyperlink w:anchor="_Toc242991187" w:history="1">
+          <w:hyperlink w:anchor="_Toc242992543" w:history="1">
             <w:r>
               <w:rPr>
                 <w:rStyle w:val="Hyperlink"/>
@@ -1126,7 +1126,7 @@
               <w:rPr>
                 <w:noProof/>
               </w:rPr>
-              <w:instrText xml:space="preserve"> PAGEREF _Toc242991187 \h </w:instrText>
+              <w:instrText xml:space="preserve"> PAGEREF _Toc242992543 \h </w:instrText>
             </w:r>
             <w:r>
               <w:rPr>
@@ -1169,7 +1169,7 @@
               <w14:ligatures w14:val="standardContextual"/>
             </w:rPr>
           </w:pPr>
-          <w:hyperlink w:anchor="_Toc242991188" w:history="1">
+          <w:hyperlink w:anchor="_Toc242992544" w:history="1">
             <w:r>
               <w:rPr>
                 <w:rStyle w:val="Hyperlink"/>
@@ -1193,7 +1193,7 @@
               <w:rPr>
                 <w:noProof/>
               </w:rPr>
-              <w:instrText xml:space="preserve"> PAGEREF _Toc242991188 \h </w:instrText>
+              <w:instrText xml:space="preserve"> PAGEREF _Toc242992544 \h </w:instrText>
             </w:r>
             <w:r>
               <w:rPr>
@@ -1236,7 +1236,7 @@
               <w14:ligatures w14:val="standardContextual"/>
             </w:rPr>
           </w:pPr>
-          <w:hyperlink w:anchor="_Toc242991189" w:history="1">
+          <w:hyperlink w:anchor="_Toc242992545" w:history="1">
             <w:r>
               <w:rPr>
                 <w:rStyle w:val="Hyperlink"/>
@@ -1260,7 +1260,7 @@
               <w:rPr>
                 <w:noProof/>
               </w:rPr>
-              <w:instrText xml:space="preserve"> PAGEREF _Toc242991189 \h </w:instrText>
+              <w:instrText xml:space="preserve"> PAGEREF _Toc242992545 \h </w:instrText>
             </w:r>
             <w:r>
               <w:rPr>
@@ -1303,7 +1303,7 @@
               <w14:ligatures w14:val="standardContextual"/>
             </w:rPr>
           </w:pPr>
-          <w:hyperlink w:anchor="_Toc242991190" w:history="1">
+          <w:hyperlink w:anchor="_Toc242992546" w:history="1">
             <w:r>
               <w:rPr>
                 <w:rStyle w:val="Hyperlink"/>
@@ -1327,7 +1327,7 @@
               <w:rPr>
                 <w:noProof/>
               </w:rPr>
-              <w:instrText xml:space="preserve"> PAGEREF _Toc242991190 \h </w:instrText>
+              <w:instrText xml:space="preserve"> PAGEREF _Toc242992546 \h </w:instrText>
             </w:r>
             <w:r>
               <w:rPr>
@@ -1370,7 +1370,7 @@
               <w14:ligatures w14:val="standardContextual"/>
             </w:rPr>
           </w:pPr>
-          <w:hyperlink w:anchor="_Toc242991191" w:history="1">
+          <w:hyperlink w:anchor="_Toc242992547" w:history="1">
             <w:r>
               <w:rPr>
                 <w:rStyle w:val="Hyperlink"/>
@@ -1394,7 +1394,7 @@
               <w:rPr>
                 <w:noProof/>
               </w:rPr>
-              <w:instrText xml:space="preserve"> PAGEREF _Toc242991191 \h </w:instrText>
+              <w:instrText xml:space="preserve"> PAGEREF _Toc242992547 \h </w:instrText>
             </w:r>
             <w:r>
               <w:rPr>
@@ -1437,7 +1437,7 @@
               <w14:ligatures w14:val="standardContextual"/>
             </w:rPr>
           </w:pPr>
-          <w:hyperlink w:anchor="_Toc242991192" w:history="1">
+          <w:hyperlink w:anchor="_Toc242992548" w:history="1">
             <w:r>
               <w:rPr>
                 <w:rStyle w:val="Hyperlink"/>
@@ -1461,7 +1461,7 @@
               <w:rPr>
                 <w:noProof/>
               </w:rPr>
-              <w:instrText xml:space="preserve"> PAGEREF _Toc242991192 \h </w:instrText>
+              <w:instrText xml:space="preserve"> PAGEREF _Toc242992548 \h </w:instrText>
             </w:r>
             <w:r>
               <w:rPr>
@@ -1504,7 +1504,7 @@
               <w14:ligatures w14:val="standardContextual"/>
             </w:rPr>
           </w:pPr>
-          <w:hyperlink w:anchor="_Toc242991193" w:history="1">
+          <w:hyperlink w:anchor="_Toc242992549" w:history="1">
             <w:r>
               <w:rPr>
                 <w:rStyle w:val="Hyperlink"/>
@@ -1528,7 +1528,7 @@
               <w:rPr>
                 <w:noProof/>
               </w:rPr>
-              <w:instrText xml:space="preserve"> PAGEREF _Toc242991193 \h </w:instrText>
+              <w:instrText xml:space="preserve"> PAGEREF _Toc242992549 \h </w:instrText>
             </w:r>
             <w:r>
               <w:rPr>
@@ -1571,7 +1571,7 @@
               <w14:ligatures w14:val="standardContextual"/>
             </w:rPr>
           </w:pPr>
-          <w:hyperlink w:anchor="_Toc242991194" w:history="1">
+          <w:hyperlink w:anchor="_Toc242992550" w:history="1">
             <w:r>
               <w:rPr>
                 <w:rStyle w:val="Hyperlink"/>
@@ -1595,7 +1595,7 @@
               <w:rPr>
                 <w:noProof/>
               </w:rPr>
-              <w:instrText xml:space="preserve"> PAGEREF _Toc242991194 \h </w:instrText>
+              <w:instrText xml:space="preserve"> PAGEREF _Toc242992550 \h </w:instrText>
             </w:r>
             <w:r>
               <w:rPr>
@@ -1638,7 +1638,7 @@
               <w14:ligatures w14:val="standardContextual"/>
             </w:rPr>
           </w:pPr>
-          <w:hyperlink w:anchor="_Toc242991195" w:history="1">
+          <w:hyperlink w:anchor="_Toc242992551" w:history="1">
             <w:r>
               <w:rPr>
                 <w:rStyle w:val="Hyperlink"/>
@@ -1662,7 +1662,7 @@
               <w:rPr>
                 <w:noProof/>
               </w:rPr>
-              <w:instrText xml:space="preserve"> PAGEREF _Toc242991195 \h </w:instrText>
+              <w:instrText xml:space="preserve"> PAGEREF _Toc242992551 \h </w:instrText>
             </w:r>
             <w:r>
               <w:rPr>
@@ -1705,7 +1705,7 @@
               <w14:ligatures w14:val="standardContextual"/>
             </w:rPr>
           </w:pPr>
-          <w:hyperlink w:anchor="_Toc242991196" w:history="1">
+          <w:hyperlink w:anchor="_Toc242992552" w:history="1">
             <w:r>
               <w:rPr>
                 <w:rStyle w:val="Hyperlink"/>
@@ -1729,7 +1729,7 @@
               <w:rPr>
                 <w:noProof/>
               </w:rPr>
-              <w:instrText xml:space="preserve"> PAGEREF _Toc242991196 \h </w:instrText>
+              <w:instrText xml:space="preserve"> PAGEREF _Toc242992552 \h </w:instrText>
             </w:r>
             <w:r>
               <w:rPr>
@@ -1772,7 +1772,7 @@
               <w14:ligatures w14:val="standardContextual"/>
             </w:rPr>
           </w:pPr>
-          <w:hyperlink w:anchor="_Toc242991197" w:history="1">
+          <w:hyperlink w:anchor="_Toc242992553" w:history="1">
             <w:r>
               <w:rPr>
                 <w:rStyle w:val="Hyperlink"/>
@@ -1796,7 +1796,7 @@
               <w:rPr>
                 <w:noProof/>
               </w:rPr>
-              <w:instrText xml:space="preserve"> PAGEREF _Toc242991197 \h </w:instrText>
+              <w:instrText xml:space="preserve"> PAGEREF _Toc242992553 \h </w:instrText>
             </w:r>
             <w:r>
               <w:rPr>
@@ -1839,7 +1839,7 @@
               <w14:ligatures w14:val="standardContextual"/>
             </w:rPr>
           </w:pPr>
-          <w:hyperlink w:anchor="_Toc242991198" w:history="1">
+          <w:hyperlink w:anchor="_Toc242992554" w:history="1">
             <w:r>
               <w:rPr>
                 <w:rStyle w:val="Hyperlink"/>
@@ -1863,7 +1863,7 @@
               <w:rPr>
                 <w:noProof/>
               </w:rPr>
-              <w:instrText xml:space="preserve"> PAGEREF _Toc242991198 \h </w:instrText>
+              <w:instrText xml:space="preserve"> PAGEREF _Toc242992554 \h </w:instrText>
             </w:r>
             <w:r>
               <w:rPr>
@@ -1906,7 +1906,7 @@
               <w14:ligatures w14:val="standardContextual"/>
             </w:rPr>
           </w:pPr>
-          <w:hyperlink w:anchor="_Toc242991199" w:history="1">
+          <w:hyperlink w:anchor="_Toc242992555" w:history="1">
             <w:r>
               <w:rPr>
                 <w:rStyle w:val="Hyperlink"/>
@@ -1930,7 +1930,7 @@
               <w:rPr>
                 <w:noProof/>
               </w:rPr>
-              <w:instrText xml:space="preserve"> PAGEREF _Toc242991199 \h </w:instrText>
+              <w:instrText xml:space="preserve"> PAGEREF _Toc242992555 \h </w:instrText>
             </w:r>
             <w:r>
               <w:rPr>
@@ -1973,7 +1973,7 @@
               <w14:ligatures w14:val="standardContextual"/>
             </w:rPr>
           </w:pPr>
-          <w:hyperlink w:anchor="_Toc242991200" w:history="1">
+          <w:hyperlink w:anchor="_Toc242992556" w:history="1">
             <w:r>
               <w:rPr>
                 <w:rStyle w:val="Hyperlink"/>
@@ -1997,7 +1997,7 @@
               <w:rPr>
                 <w:noProof/>
               </w:rPr>
-              <w:instrText xml:space="preserve"> PAGEREF _Toc242991200 \h </w:instrText>
+              <w:instrText xml:space="preserve"> PAGEREF _Toc242992556 \h </w:instrText>
             </w:r>
             <w:r>
               <w:rPr>
@@ -2040,7 +2040,7 @@
               <w14:ligatures w14:val="standardContextual"/>
             </w:rPr>
           </w:pPr>
-          <w:hyperlink w:anchor="_Toc242991201" w:history="1">
+          <w:hyperlink w:anchor="_Toc242992557" w:history="1">
             <w:r>
               <w:rPr>
                 <w:rStyle w:val="Hyperlink"/>
@@ -2064,7 +2064,7 @@
               <w:rPr>
                 <w:noProof/>
               </w:rPr>
-              <w:instrText xml:space="preserve"> PAGEREF _Toc242991201 \h </w:instrText>
+              <w:instrText xml:space="preserve"> PAGEREF _Toc242992557 \h </w:instrText>
             </w:r>
             <w:r>
               <w:rPr>
@@ -2107,7 +2107,7 @@
               <w14:ligatures w14:val="standardContextual"/>
             </w:rPr>
           </w:pPr>
-          <w:hyperlink w:anchor="_Toc242991202" w:history="1">
+          <w:hyperlink w:anchor="_Toc242992558" w:history="1">
             <w:r>
               <w:rPr>
                 <w:rStyle w:val="Hyperlink"/>
@@ -2131,7 +2131,7 @@
               <w:rPr>
                 <w:noProof/>
               </w:rPr>
-              <w:instrText xml:space="preserve"> PAGEREF _Toc242991202 \h </w:instrText>
+              <w:instrText xml:space="preserve"> PAGEREF _Toc242992558 \h </w:instrText>
             </w:r>
             <w:r>
               <w:rPr>
@@ -2174,7 +2174,7 @@
               <w14:ligatures w14:val="standardContextual"/>
             </w:rPr>
           </w:pPr>
-          <w:hyperlink w:anchor="_Toc242991203" w:history="1">
+          <w:hyperlink w:anchor="_Toc242992559" w:history="1">
             <w:r>
               <w:rPr>
                 <w:rStyle w:val="Hyperlink"/>
@@ -2198,7 +2198,7 @@
               <w:rPr>
                 <w:noProof/>
               </w:rPr>
-              <w:instrText xml:space="preserve"> PAGEREF _Toc242991203 \h </w:instrText>
+              <w:instrText xml:space="preserve"> PAGEREF _Toc242992559 \h </w:instrText>
             </w:r>
             <w:r>
               <w:rPr>
@@ -2241,7 +2241,7 @@
               <w14:ligatures w14:val="standardContextual"/>
             </w:rPr>
           </w:pPr>
-          <w:hyperlink w:anchor="_Toc242991204" w:history="1">
+          <w:hyperlink w:anchor="_Toc242992560" w:history="1">
             <w:r>
               <w:rPr>
                 <w:rStyle w:val="Hyperlink"/>
@@ -2265,7 +2265,7 @@
               <w:rPr>
                 <w:noProof/>
               </w:rPr>
-              <w:instrText xml:space="preserve"> PAGEREF _Toc242991204 \h </w:instrText>
+              <w:instrText xml:space="preserve"> PAGEREF _Toc242992560 \h </w:instrText>
             </w:r>
             <w:r>
               <w:rPr>
@@ -2308,7 +2308,7 @@
               <w14:ligatures w14:val="standardContextual"/>
             </w:rPr>
           </w:pPr>
-          <w:hyperlink w:anchor="_Toc242991205" w:history="1">
+          <w:hyperlink w:anchor="_Toc242992561" w:history="1">
             <w:r>
               <w:rPr>
                 <w:rStyle w:val="Hyperlink"/>
@@ -2332,7 +2332,7 @@
               <w:rPr>
                 <w:noProof/>
               </w:rPr>
-              <w:instrText xml:space="preserve"> PAGEREF _Toc242991205 \h </w:instrText>
+              <w:instrText xml:space="preserve"> PAGEREF _Toc242992561 \h </w:instrText>
             </w:r>
             <w:r>
               <w:rPr>
@@ -2375,7 +2375,7 @@
               <w14:ligatures w14:val="standardContextual"/>
             </w:rPr>
           </w:pPr>
-          <w:hyperlink w:anchor="_Toc242991206" w:history="1">
+          <w:hyperlink w:anchor="_Toc242992562" w:history="1">
             <w:r>
               <w:rPr>
                 <w:rStyle w:val="Hyperlink"/>
@@ -2399,7 +2399,7 @@
               <w:rPr>
                 <w:noProof/>
               </w:rPr>
-              <w:instrText xml:space="preserve"> PAGEREF _Toc242991206 \h </w:instrText>
+              <w:instrText xml:space="preserve"> PAGEREF _Toc242992562 \h </w:instrText>
             </w:r>
             <w:r>
               <w:rPr>
@@ -2442,7 +2442,7 @@
               <w14:ligatures w14:val="standardContextual"/>
             </w:rPr>
           </w:pPr>
-          <w:hyperlink w:anchor="_Toc242991207" w:history="1">
+          <w:hyperlink w:anchor="_Toc242992563" w:history="1">
             <w:r>
               <w:rPr>
                 <w:rStyle w:val="Hyperlink"/>
@@ -2466,7 +2466,7 @@
               <w:rPr>
                 <w:noProof/>
               </w:rPr>
-              <w:instrText xml:space="preserve"> PAGEREF _Toc242991207 \h </w:instrText>
+              <w:instrText xml:space="preserve"> PAGEREF _Toc242992563 \h </w:instrText>
             </w:r>
             <w:r>
               <w:rPr>
@@ -2509,7 +2509,7 @@
               <w14:ligatures w14:val="standardContextual"/>
             </w:rPr>
           </w:pPr>
-          <w:hyperlink w:anchor="_Toc242991208" w:history="1">
+          <w:hyperlink w:anchor="_Toc242992564" w:history="1">
             <w:r>
               <w:rPr>
                 <w:rStyle w:val="Hyperlink"/>
@@ -2533,7 +2533,7 @@
               <w:rPr>
                 <w:noProof/>
               </w:rPr>
-              <w:instrText xml:space="preserve"> PAGEREF _Toc242991208 \h </w:instrText>
+              <w:instrText xml:space="preserve"> PAGEREF _Toc242992564 \h </w:instrText>
             </w:r>
             <w:r>
               <w:rPr>
@@ -2576,7 +2576,7 @@
               <w14:ligatures w14:val="standardContextual"/>
             </w:rPr>
           </w:pPr>
-          <w:hyperlink w:anchor="_Toc242991209" w:history="1">
+          <w:hyperlink w:anchor="_Toc242992565" w:history="1">
             <w:r>
               <w:rPr>
                 <w:rStyle w:val="Hyperlink"/>
@@ -2600,7 +2600,7 @@
               <w:rPr>
                 <w:noProof/>
               </w:rPr>
-              <w:instrText xml:space="preserve"> PAGEREF _Toc242991209 \h </w:instrText>
+              <w:instrText xml:space="preserve"> PAGEREF _Toc242992565 \h </w:instrText>
             </w:r>
             <w:r>
               <w:rPr>
@@ -2643,7 +2643,7 @@
               <w14:ligatures w14:val="standardContextual"/>
             </w:rPr>
           </w:pPr>
-          <w:hyperlink w:anchor="_Toc242991210" w:history="1">
+          <w:hyperlink w:anchor="_Toc242992566" w:history="1">
             <w:r>
               <w:rPr>
                 <w:rStyle w:val="Hyperlink"/>
@@ -2667,7 +2667,7 @@
               <w:rPr>
                 <w:noProof/>
               </w:rPr>
-              <w:instrText xml:space="preserve"> PAGEREF _Toc242991210 \h </w:instrText>
+              <w:instrText xml:space="preserve"> PAGEREF _Toc242992566 \h </w:instrText>
             </w:r>
             <w:r>
               <w:rPr>
@@ -2710,7 +2710,7 @@
               <w14:ligatures w14:val="standardContextual"/>
             </w:rPr>
           </w:pPr>
-          <w:hyperlink w:anchor="_Toc242991211" w:history="1">
+          <w:hyperlink w:anchor="_Toc242992567" w:history="1">
             <w:r>
               <w:rPr>
                 <w:rStyle w:val="Hyperlink"/>
@@ -2734,7 +2734,7 @@
               <w:rPr>
                 <w:noProof/>
               </w:rPr>
-              <w:instrText xml:space="preserve"> PAGEREF _Toc242991211 \h </w:instrText>
+              <w:instrText xml:space="preserve"> PAGEREF _Toc242992567 \h </w:instrText>
             </w:r>
             <w:r>
               <w:rPr>
@@ -2777,7 +2777,7 @@
               <w14:ligatures w14:val="standardContextual"/>
             </w:rPr>
           </w:pPr>
-          <w:hyperlink w:anchor="_Toc242991212" w:history="1">
+          <w:hyperlink w:anchor="_Toc242992568" w:history="1">
             <w:r>
               <w:rPr>
                 <w:rStyle w:val="Hyperlink"/>
@@ -2801,7 +2801,7 @@
               <w:rPr>
                 <w:noProof/>
               </w:rPr>
-              <w:instrText xml:space="preserve"> PAGEREF _Toc242991212 \h </w:instrText>
+              <w:instrText xml:space="preserve"> PAGEREF _Toc242992568 \h </w:instrText>
             </w:r>
             <w:r>
               <w:rPr>
@@ -2844,7 +2844,7 @@
               <w14:ligatures w14:val="standardContextual"/>
             </w:rPr>
           </w:pPr>
-          <w:hyperlink w:anchor="_Toc242991213" w:history="1">
+          <w:hyperlink w:anchor="_Toc242992569" w:history="1">
             <w:r>
               <w:rPr>
                 <w:rStyle w:val="Hyperlink"/>
@@ -2868,7 +2868,7 @@
               <w:rPr>
                 <w:noProof/>
               </w:rPr>
-              <w:instrText xml:space="preserve"> PAGEREF _Toc242991213 \h </w:instrText>
+              <w:instrText xml:space="preserve"> PAGEREF _Toc242992569 \h </w:instrText>
             </w:r>
             <w:r>
               <w:rPr>
@@ -2911,7 +2911,7 @@
               <w14:ligatures w14:val="standardContextual"/>
             </w:rPr>
           </w:pPr>
-          <w:hyperlink w:anchor="_Toc242991214" w:history="1">
+          <w:hyperlink w:anchor="_Toc242992570" w:history="1">
             <w:r>
               <w:rPr>
                 <w:rStyle w:val="Hyperlink"/>
@@ -2935,7 +2935,7 @@
               <w:rPr>
                 <w:noProof/>
               </w:rPr>
-              <w:instrText xml:space="preserve"> PAGEREF _Toc242991214 \h </w:instrText>
+              <w:instrText xml:space="preserve"> PAGEREF _Toc242992570 \h </w:instrText>
             </w:r>
             <w:r>
               <w:rPr>
@@ -2978,7 +2978,7 @@
               <w14:ligatures w14:val="standardContextual"/>
             </w:rPr>
           </w:pPr>
-          <w:hyperlink w:anchor="_Toc242991215" w:history="1">
+          <w:hyperlink w:anchor="_Toc242992571" w:history="1">
             <w:r>
               <w:rPr>
                 <w:rStyle w:val="Hyperlink"/>
@@ -3002,7 +3002,7 @@
               <w:rPr>
                 <w:noProof/>
               </w:rPr>
-              <w:instrText xml:space="preserve"> PAGEREF _Toc242991215 \h </w:instrText>
+              <w:instrText xml:space="preserve"> PAGEREF _Toc242992571 \h </w:instrText>
             </w:r>
             <w:r>
               <w:rPr>
@@ -3045,7 +3045,7 @@
               <w14:ligatures w14:val="standardContextual"/>
             </w:rPr>
           </w:pPr>
-          <w:hyperlink w:anchor="_Toc242991216" w:history="1">
+          <w:hyperlink w:anchor="_Toc242992572" w:history="1">
             <w:r>
               <w:rPr>
                 <w:rStyle w:val="Hyperlink"/>
@@ -3069,7 +3069,7 @@
               <w:rPr>
                 <w:noProof/>
               </w:rPr>
-              <w:instrText xml:space="preserve"> PAGEREF _Toc242991216 \h </w:instrText>
+              <w:instrText xml:space="preserve"> PAGEREF _Toc242992572 \h </w:instrText>
             </w:r>
             <w:r>
               <w:rPr>
@@ -3112,7 +3112,7 @@
               <w14:ligatures w14:val="standardContextual"/>
             </w:rPr>
           </w:pPr>
-          <w:hyperlink w:anchor="_Toc242991217" w:history="1">
+          <w:hyperlink w:anchor="_Toc242992573" w:history="1">
             <w:r>
               <w:rPr>
                 <w:rStyle w:val="Hyperlink"/>
@@ -3136,7 +3136,7 @@
               <w:rPr>
                 <w:noProof/>
               </w:rPr>
-              <w:instrText xml:space="preserve"> PAGEREF _Toc242991217 \h </w:instrText>
+              <w:instrText xml:space="preserve"> PAGEREF _Toc242992573 \h </w:instrText>
             </w:r>
             <w:r>
               <w:rPr>
@@ -3179,7 +3179,7 @@
               <w14:ligatures w14:val="standardContextual"/>
             </w:rPr>
           </w:pPr>
-          <w:hyperlink w:anchor="_Toc242991218" w:history="1">
+          <w:hyperlink w:anchor="_Toc242992574" w:history="1">
             <w:r>
               <w:rPr>
                 <w:rStyle w:val="Hyperlink"/>
@@ -3203,7 +3203,7 @@
               <w:rPr>
                 <w:noProof/>
               </w:rPr>
-              <w:instrText xml:space="preserve"> PAGEREF _Toc242991218 \h </w:instrText>
+              <w:instrText xml:space="preserve"> PAGEREF _Toc242992574 \h </w:instrText>
             </w:r>
             <w:r>
               <w:rPr>
@@ -3246,7 +3246,7 @@
               <w14:ligatures w14:val="standardContextual"/>
             </w:rPr>
           </w:pPr>
-          <w:hyperlink w:anchor="_Toc242991219" w:history="1">
+          <w:hyperlink w:anchor="_Toc242992575" w:history="1">
             <w:r>
               <w:rPr>
                 <w:rStyle w:val="Hyperlink"/>
@@ -3270,7 +3270,7 @@
               <w:rPr>
                 <w:noProof/>
               </w:rPr>
-              <w:instrText xml:space="preserve"> PAGEREF _Toc242991219 \h </w:instrText>
+              <w:instrText xml:space="preserve"> PAGEREF _Toc242992575 \h </w:instrText>
             </w:r>
             <w:r>
               <w:rPr>
@@ -3340,7 +3340,7 @@
           <w:noProof/>
         </w:rPr>
         <w:drawing>
-          <wp:inline distT="0" distB="0" distL="0" distR="0" wp14:anchorId="48269D5E" wp14:editId="0C6FF193">
+          <wp:inline distT="0" distB="0" distL="0" distR="0" wp14:anchorId="40C1C901" wp14:editId="6548FF35">
             <wp:extent cx="5943600" cy="4210050"/>
             <wp:effectExtent l="0" t="0" r="0" b="0"/>
             <wp:docPr id="1" name="UnmanagedLayerScanner-thumbnail.png" descr="Unmanaged Layer Scanner in action: choosing managed solutions, scanning, filtering by type, comparing the layers of a form and a web resource, and deleting three unmanaged layers" title="Unmanaged Layer Scanner in action: choosing managed solutions, scanning, filtering by type, comparing the layers of a form and a web resource, and deleting three unmanaged layers"/>
@@ -3740,7 +3740,7 @@
                 <w:sz w:val="17"/>
                 <w:szCs w:val="17"/>
               </w:rPr>
-              <w:t>About 71,500 characters: the code is compressed inside the link and unpacked by the browser</w:t>
+              <w:t>About 72,000 characters: the code is compressed inside the link and unpacked by the browser</w:t>
             </w:r>
           </w:p>
         </w:tc>
@@ -4024,7 +4024,7 @@
         <w:pStyle w:val="Heading1"/>
         <w:keepNext/>
       </w:pPr>
-      <w:bookmarkStart w:id="0" w:name="_Toc242991173"/>
+      <w:bookmarkStart w:id="0" w:name="_Toc242992529"/>
       <w:r>
         <w:t>Features</w:t>
       </w:r>
@@ -4942,7 +4942,7 @@
         <w:pStyle w:val="Heading1"/>
         <w:keepNext/>
       </w:pPr>
-      <w:bookmarkStart w:id="1" w:name="_Toc242991174"/>
+      <w:bookmarkStart w:id="1" w:name="_Toc242992530"/>
       <w:r>
         <w:t>Screenshots</w:t>
       </w:r>
@@ -4971,7 +4971,7 @@
         <w:pStyle w:val="Heading2"/>
         <w:keepNext/>
       </w:pPr>
-      <w:bookmarkStart w:id="2" w:name="_Toc242991175"/>
+      <w:bookmarkStart w:id="2" w:name="_Toc242992531"/>
       <w:r>
         <w:t>Choosing what to check</w:t>
       </w:r>
@@ -5014,7 +5014,7 @@
           <w:noProof/>
         </w:rPr>
         <w:drawing>
-          <wp:inline distT="0" distB="0" distL="0" distR="0" wp14:anchorId="3D934063" wp14:editId="5519E157">
+          <wp:inline distT="0" distB="0" distL="0" distR="0" wp14:anchorId="3C7377E9" wp14:editId="34CBEF73">
             <wp:extent cx="5943600" cy="4229100"/>
             <wp:effectExtent l="0" t="0" r="0" b="0"/>
             <wp:docPr id="2" name="choose.png" descr="The choice screen: managed solutions, object types and the tables card" title="The choice screen: managed solutions, object types and the tables card"/>
@@ -5101,7 +5101,7 @@
           <w:noProof/>
         </w:rPr>
         <w:drawing>
-          <wp:inline distT="0" distB="0" distL="0" distR="0" wp14:anchorId="5CE6BC77" wp14:editId="1AD916B8">
+          <wp:inline distT="0" distB="0" distL="0" distR="0" wp14:anchorId="0EADE566" wp14:editId="40462CA2">
             <wp:extent cx="5943600" cy="4229100"/>
             <wp:effectExtent l="0" t="0" r="0" b="0"/>
             <wp:docPr id="3" name="tables.png" descr="The Choose tables dialog" title="The Choose tables dialog"/>
@@ -5178,7 +5178,7 @@
           <w:noProof/>
         </w:rPr>
         <w:drawing>
-          <wp:inline distT="0" distB="0" distL="0" distR="0" wp14:anchorId="1549637E" wp14:editId="3B7A99A9">
+          <wp:inline distT="0" distB="0" distL="0" distR="0" wp14:anchorId="5F2B0DA1" wp14:editId="11B6BDF8">
             <wp:extent cx="5943600" cy="4229100"/>
             <wp:effectExtent l="0" t="0" r="0" b="0"/>
             <wp:docPr id="4" name="scanning.png" descr="The scan in progress" title="The scan in progress"/>
@@ -5222,7 +5222,7 @@
         <w:pStyle w:val="Heading2"/>
         <w:keepNext/>
       </w:pPr>
-      <w:bookmarkStart w:id="3" w:name="_Toc242991176"/>
+      <w:bookmarkStart w:id="3" w:name="_Toc242992532"/>
       <w:r>
         <w:lastRenderedPageBreak/>
         <w:t>Results and filters</w:t>
@@ -5266,7 +5266,7 @@
           <w:noProof/>
         </w:rPr>
         <w:drawing>
-          <wp:inline distT="0" distB="0" distL="0" distR="0" wp14:anchorId="6965CDC5" wp14:editId="0193F58F">
+          <wp:inline distT="0" distB="0" distL="0" distR="0" wp14:anchorId="2AA29CD3" wp14:editId="3B671A4D">
             <wp:extent cx="5943600" cy="4229100"/>
             <wp:effectExtent l="0" t="0" r="0" b="0"/>
             <wp:docPr id="5" name="results.png" descr="The results grid" title="The results grid"/>
@@ -5343,7 +5343,7 @@
           <w:noProof/>
         </w:rPr>
         <w:drawing>
-          <wp:inline distT="0" distB="0" distL="0" distR="0" wp14:anchorId="24400D26" wp14:editId="48452600">
+          <wp:inline distT="0" distB="0" distL="0" distR="0" wp14:anchorId="7D68D908" wp14:editId="3A5AF8AD">
             <wp:extent cx="5943600" cy="4229100"/>
             <wp:effectExtent l="0" t="0" r="0" b="0"/>
             <wp:docPr id="6" name="column-filter.png" descr="The What changed column menu" title="The What changed column menu"/>
@@ -5410,7 +5410,7 @@
           <w:noProof/>
         </w:rPr>
         <w:drawing>
-          <wp:inline distT="0" distB="0" distL="0" distR="0" wp14:anchorId="1FCFA003" wp14:editId="7B3A5253">
+          <wp:inline distT="0" distB="0" distL="0" distR="0" wp14:anchorId="4F02C68F" wp14:editId="38884141">
             <wp:extent cx="5943600" cy="4229100"/>
             <wp:effectExtent l="0" t="0" r="0" b="0"/>
             <wp:docPr id="7" name="export.png" descr="The Export menu" title="The Export menu"/>
@@ -5454,7 +5454,7 @@
         <w:pStyle w:val="Heading2"/>
         <w:keepNext/>
       </w:pPr>
-      <w:bookmarkStart w:id="4" w:name="_Toc242991177"/>
+      <w:bookmarkStart w:id="4" w:name="_Toc242992533"/>
       <w:r>
         <w:lastRenderedPageBreak/>
         <w:t>Details of a component</w:t>
@@ -5498,7 +5498,7 @@
           <w:noProof/>
         </w:rPr>
         <w:drawing>
-          <wp:inline distT="0" distB="0" distL="0" distR="0" wp14:anchorId="0775460C" wp14:editId="390CF2A2">
+          <wp:inline distT="0" distB="0" distL="0" distR="0" wp14:anchorId="5E3C2444" wp14:editId="444833BF">
             <wp:extent cx="5943600" cy="4229100"/>
             <wp:effectExtent l="0" t="0" r="0" b="0"/>
             <wp:docPr id="8" name="details-compare.png" descr="The comparison of a form's layers" title="The comparison of a form's layers"/>
@@ -5565,7 +5565,7 @@
           <w:noProof/>
         </w:rPr>
         <w:drawing>
-          <wp:inline distT="0" distB="0" distL="0" distR="0" wp14:anchorId="40C4F423" wp14:editId="5ED6C0E6">
+          <wp:inline distT="0" distB="0" distL="0" distR="0" wp14:anchorId="20F60792" wp14:editId="198D3612">
             <wp:extent cx="5943600" cy="4229100"/>
             <wp:effectExtent l="0" t="0" r="0" b="0"/>
             <wp:docPr id="9" name="details-side-by-side.png" descr="A web resource compared side by side" title="A web resource compared side by side"/>
@@ -5632,7 +5632,7 @@
           <w:noProof/>
         </w:rPr>
         <w:drawing>
-          <wp:inline distT="0" distB="0" distL="0" distR="0" wp14:anchorId="6FB31DC1" wp14:editId="45896C06">
+          <wp:inline distT="0" distB="0" distL="0" distR="0" wp14:anchorId="596015B2" wp14:editId="562D409A">
             <wp:extent cx="5943600" cy="4229100"/>
             <wp:effectExtent l="0" t="0" r="0" b="0"/>
             <wp:docPr id="10" name="details-image.png" descr="Both images of an image web resource" title="Both images of an image web resource"/>
@@ -5728,7 +5728,7 @@
           <w:noProof/>
         </w:rPr>
         <w:drawing>
-          <wp:inline distT="0" distB="0" distL="0" distR="0" wp14:anchorId="44020636" wp14:editId="1CB50BE7">
+          <wp:inline distT="0" distB="0" distL="0" distR="0" wp14:anchorId="21144637" wp14:editId="21D65F89">
             <wp:extent cx="5943600" cy="4229100"/>
             <wp:effectExtent l="0" t="0" r="0" b="0"/>
             <wp:docPr id="11" name="details-file.png" descr="A web resource whose content is kept as a file: the content in effect shown for the Active layer only" title="A web resource whose content is kept as a file: the content in effect shown for the Active layer only"/>
@@ -5822,7 +5822,10 @@
         <w:t>JSON</w:t>
       </w:r>
       <w:r>
-        <w:t xml:space="preserve"> open the other tabs on that layer.</w:t>
+        <w:t xml:space="preserve"> open the other tabs on that layer. In a narrow window the table still fits: Publisher and Version go unde</w:t>
+      </w:r>
+      <w:r>
+        <w:t>r the solution's name.</w:t>
       </w:r>
     </w:p>
     <w:p>
@@ -5835,7 +5838,7 @@
           <w:noProof/>
         </w:rPr>
         <w:drawing>
-          <wp:inline distT="0" distB="0" distL="0" distR="0" wp14:anchorId="68965EED" wp14:editId="6BC4AB46">
+          <wp:inline distT="0" distB="0" distL="0" distR="0" wp14:anchorId="381BBD0C" wp14:editId="1B304AA1">
             <wp:extent cx="5943600" cy="4229100"/>
             <wp:effectExtent l="0" t="0" r="0" b="0"/>
             <wp:docPr id="12" name="details-layers.png" descr="The Layers tab" title="The Layers tab"/>
@@ -5922,7 +5925,7 @@
           <w:noProof/>
         </w:rPr>
         <w:drawing>
-          <wp:inline distT="0" distB="0" distL="0" distR="0" wp14:anchorId="72EB7BF6" wp14:editId="4EFF7CFC">
+          <wp:inline distT="0" distB="0" distL="0" distR="0" wp14:anchorId="26ABD117" wp14:editId="28812797">
             <wp:extent cx="5943600" cy="4229100"/>
             <wp:effectExtent l="0" t="0" r="0" b="0"/>
             <wp:docPr id="13" name="details-json.png" descr="The JSON tab showing a layer's Changes" title="The JSON tab showing a layer's Changes"/>
@@ -5989,7 +5992,7 @@
           <w:noProof/>
         </w:rPr>
         <w:drawing>
-          <wp:inline distT="0" distB="0" distL="0" distR="0" wp14:anchorId="3A6AA9B0" wp14:editId="28FC8C1F">
+          <wp:inline distT="0" distB="0" distL="0" distR="0" wp14:anchorId="7DD88339" wp14:editId="762F2AD3">
             <wp:extent cx="5943600" cy="4229100"/>
             <wp:effectExtent l="0" t="0" r="0" b="0"/>
             <wp:docPr id="14" name="details-children.png" descr="A role's privileges from Children, shown as a table" title="A role's privileges from Children, shown as a table"/>
@@ -6033,7 +6036,7 @@
         <w:pStyle w:val="Heading2"/>
         <w:keepNext/>
       </w:pPr>
-      <w:bookmarkStart w:id="5" w:name="_Toc242991178"/>
+      <w:bookmarkStart w:id="5" w:name="_Toc242992534"/>
       <w:r>
         <w:lastRenderedPageBreak/>
         <w:t>Deleting layers</w:t>
@@ -6077,7 +6080,7 @@
           <w:noProof/>
         </w:rPr>
         <w:drawing>
-          <wp:inline distT="0" distB="0" distL="0" distR="0" wp14:anchorId="7B984A2A" wp14:editId="1C622359">
+          <wp:inline distT="0" distB="0" distL="0" distR="0" wp14:anchorId="0A8ACA14" wp14:editId="09772AA0">
             <wp:extent cx="5943600" cy="4229100"/>
             <wp:effectExtent l="0" t="0" r="0" b="0"/>
             <wp:docPr id="15" name="delete-confirm.png" descr="The delete confirmation" title="The delete confirmation"/>
@@ -6154,7 +6157,7 @@
           <w:noProof/>
         </w:rPr>
         <w:drawing>
-          <wp:inline distT="0" distB="0" distL="0" distR="0" wp14:anchorId="7BF2CAFF" wp14:editId="2C628549">
+          <wp:inline distT="0" distB="0" distL="0" distR="0" wp14:anchorId="3BAAE8EF" wp14:editId="26B6E421">
             <wp:extent cx="5943600" cy="4229100"/>
             <wp:effectExtent l="0" t="0" r="0" b="0"/>
             <wp:docPr id="16" name="deleting.png" descr="Deleting in progress" title="Deleting in progress"/>
@@ -6221,7 +6224,7 @@
           <w:noProof/>
         </w:rPr>
         <w:drawing>
-          <wp:inline distT="0" distB="0" distL="0" distR="0" wp14:anchorId="5AA003AE" wp14:editId="47BA12F6">
+          <wp:inline distT="0" distB="0" distL="0" distR="0" wp14:anchorId="515A8E85" wp14:editId="1A1A5790">
             <wp:extent cx="5943600" cy="4229100"/>
             <wp:effectExtent l="0" t="0" r="0" b="0"/>
             <wp:docPr id="17" name="deleted.png" descr="The results after deleting three unmanaged layers" title="The results after deleting three unmanaged layers"/>
@@ -6265,7 +6268,7 @@
         <w:pStyle w:val="Heading2"/>
         <w:keepNext/>
       </w:pPr>
-      <w:bookmarkStart w:id="6" w:name="_Toc242991179"/>
+      <w:bookmarkStart w:id="6" w:name="_Toc242992535"/>
       <w:r>
         <w:lastRenderedPageBreak/>
         <w:t>Narrow window</w:t>
@@ -6309,7 +6312,7 @@
           <w:noProof/>
         </w:rPr>
         <w:drawing>
-          <wp:inline distT="0" distB="0" distL="0" distR="0" wp14:anchorId="48763EA9" wp14:editId="7B4EA452">
+          <wp:inline distT="0" distB="0" distL="0" distR="0" wp14:anchorId="7F9E0195" wp14:editId="6BAF9BE6">
             <wp:extent cx="5943600" cy="6524625"/>
             <wp:effectExtent l="0" t="0" r="0" b="0"/>
             <wp:docPr id="18" name="narrow.png" descr="The choice screen in a narrow window" title="The choice screen in a narrow window"/>
@@ -6353,7 +6356,7 @@
         <w:pStyle w:val="Heading1"/>
         <w:keepNext/>
       </w:pPr>
-      <w:bookmarkStart w:id="7" w:name="_Toc242991180"/>
+      <w:bookmarkStart w:id="7" w:name="_Toc242992536"/>
       <w:r>
         <w:t>Download</w:t>
       </w:r>
@@ -6971,7 +6974,7 @@
         <w:pStyle w:val="Heading1"/>
         <w:keepNext/>
       </w:pPr>
-      <w:bookmarkStart w:id="8" w:name="_Toc242991181"/>
+      <w:bookmarkStart w:id="8" w:name="_Toc242992537"/>
       <w:r>
         <w:t>Install</w:t>
       </w:r>
@@ -6982,7 +6985,7 @@
         <w:pStyle w:val="Heading2"/>
         <w:keepNext/>
       </w:pPr>
-      <w:bookmarkStart w:id="9" w:name="_Toc242991182"/>
+      <w:bookmarkStart w:id="9" w:name="_Toc242992538"/>
       <w:r>
         <w:t>Drag the button</w:t>
       </w:r>
@@ -7071,7 +7074,7 @@
         <w:pStyle w:val="Heading2"/>
         <w:keepNext/>
       </w:pPr>
-      <w:bookmarkStart w:id="10" w:name="_Toc242991183"/>
+      <w:bookmarkStart w:id="10" w:name="_Toc242992539"/>
       <w:r>
         <w:t>Create the favourite by hand</w:t>
       </w:r>
@@ -7217,7 +7220,7 @@
         <w:pStyle w:val="Heading2"/>
         <w:keepNext/>
       </w:pPr>
-      <w:bookmarkStart w:id="11" w:name="_Toc242991184"/>
+      <w:bookmarkStart w:id="11" w:name="_Toc242992540"/>
       <w:r>
         <w:t>Run it from the console</w:t>
       </w:r>
@@ -7312,7 +7315,7 @@
         <w:pStyle w:val="Heading2"/>
         <w:keepNext/>
       </w:pPr>
-      <w:bookmarkStart w:id="12" w:name="_Toc242991185"/>
+      <w:bookmarkStart w:id="12" w:name="_Toc242992541"/>
       <w:r>
         <w:t>When bookmarklets are blocked</w:t>
       </w:r>
@@ -7351,7 +7354,7 @@
         <w:pStyle w:val="Heading2"/>
         <w:keepNext/>
       </w:pPr>
-      <w:bookmarkStart w:id="13" w:name="_Toc242991186"/>
+      <w:bookmarkStart w:id="13" w:name="_Toc242992542"/>
       <w:r>
         <w:t>Update to a new version</w:t>
       </w:r>
@@ -7421,7 +7424,7 @@
         <w:pStyle w:val="Heading1"/>
         <w:keepNext/>
       </w:pPr>
-      <w:bookmarkStart w:id="14" w:name="_Toc242991187"/>
+      <w:bookmarkStart w:id="14" w:name="_Toc242992543"/>
       <w:r>
         <w:t>Use</w:t>
       </w:r>
@@ -7432,7 +7435,7 @@
         <w:pStyle w:val="Heading2"/>
         <w:keepNext/>
       </w:pPr>
-      <w:bookmarkStart w:id="15" w:name="_Toc242991188"/>
+      <w:bookmarkStart w:id="15" w:name="_Toc242992544"/>
       <w:r>
         <w:t>Open it</w:t>
       </w:r>
@@ -7618,7 +7621,7 @@
         <w:pStyle w:val="Heading2"/>
         <w:keepNext/>
       </w:pPr>
-      <w:bookmarkStart w:id="16" w:name="_Toc242991189"/>
+      <w:bookmarkStart w:id="16" w:name="_Toc242992545"/>
       <w:r>
         <w:t>Choose what to check</w:t>
       </w:r>
@@ -8343,7 +8346,7 @@
         <w:pStyle w:val="Heading2"/>
         <w:keepNext/>
       </w:pPr>
-      <w:bookmarkStart w:id="17" w:name="_Toc242991190"/>
+      <w:bookmarkStart w:id="17" w:name="_Toc242992546"/>
       <w:r>
         <w:t>Scan and stop</w:t>
       </w:r>
@@ -8871,7 +8874,7 @@
         <w:pStyle w:val="Heading2"/>
         <w:keepNext/>
       </w:pPr>
-      <w:bookmarkStart w:id="18" w:name="_Toc242991191"/>
+      <w:bookmarkStart w:id="18" w:name="_Toc242992547"/>
       <w:r>
         <w:t>The results</w:t>
       </w:r>
@@ -9495,7 +9498,7 @@
         <w:pStyle w:val="Heading3"/>
         <w:keepNext/>
       </w:pPr>
-      <w:bookmarkStart w:id="19" w:name="_Toc242991192"/>
+      <w:bookmarkStart w:id="19" w:name="_Toc242992548"/>
       <w:r>
         <w:t>Type bubbles</w:t>
       </w:r>
@@ -9547,7 +9550,7 @@
         <w:pStyle w:val="Heading3"/>
         <w:keepNext/>
       </w:pPr>
-      <w:bookmarkStart w:id="20" w:name="_Toc242991193"/>
+      <w:bookmarkStart w:id="20" w:name="_Toc242992549"/>
       <w:r>
         <w:t>Column menus</w:t>
       </w:r>
@@ -9794,7 +9797,7 @@
         <w:pStyle w:val="Heading3"/>
         <w:keepNext/>
       </w:pPr>
-      <w:bookmarkStart w:id="21" w:name="_Toc242991194"/>
+      <w:bookmarkStart w:id="21" w:name="_Toc242992550"/>
       <w:r>
         <w:lastRenderedPageBreak/>
         <w:t>Which page a row opens</w:t>
@@ -10187,7 +10190,7 @@
         <w:pStyle w:val="Heading3"/>
         <w:keepNext/>
       </w:pPr>
-      <w:bookmarkStart w:id="22" w:name="_Toc242991195"/>
+      <w:bookmarkStart w:id="22" w:name="_Toc242992551"/>
       <w:r>
         <w:t>Banners</w:t>
       </w:r>
@@ -10348,7 +10351,7 @@
         <w:pStyle w:val="Heading2"/>
         <w:keepNext/>
       </w:pPr>
-      <w:bookmarkStart w:id="23" w:name="_Toc242991196"/>
+      <w:bookmarkStart w:id="23" w:name="_Toc242992552"/>
       <w:r>
         <w:t>The details</w:t>
       </w:r>
@@ -10443,7 +10446,7 @@
         <w:pStyle w:val="Heading3"/>
         <w:keepNext/>
       </w:pPr>
-      <w:bookmarkStart w:id="24" w:name="_Toc242991197"/>
+      <w:bookmarkStart w:id="24" w:name="_Toc242992553"/>
       <w:r>
         <w:t>What changed</w:t>
       </w:r>
@@ -11032,7 +11035,7 @@
         <w:pStyle w:val="Heading3"/>
         <w:keepNext/>
       </w:pPr>
-      <w:bookmarkStart w:id="25" w:name="_Toc242991198"/>
+      <w:bookmarkStart w:id="25" w:name="_Toc242992554"/>
       <w:r>
         <w:t>Layers</w:t>
       </w:r>
@@ -11144,7 +11147,7 @@
         <w:pStyle w:val="Heading3"/>
         <w:keepNext/>
       </w:pPr>
-      <w:bookmarkStart w:id="26" w:name="_Toc242991199"/>
+      <w:bookmarkStart w:id="26" w:name="_Toc242992555"/>
       <w:r>
         <w:t>JSON</w:t>
       </w:r>
@@ -11235,7 +11238,7 @@
         <w:pStyle w:val="Heading2"/>
         <w:keepNext/>
       </w:pPr>
-      <w:bookmarkStart w:id="27" w:name="_Toc242991200"/>
+      <w:bookmarkStart w:id="27" w:name="_Toc242992556"/>
       <w:r>
         <w:lastRenderedPageBreak/>
         <w:t>Export</w:t>
@@ -11847,7 +11850,7 @@
         <w:pStyle w:val="Heading2"/>
         <w:keepNext/>
       </w:pPr>
-      <w:bookmarkStart w:id="28" w:name="_Toc242991201"/>
+      <w:bookmarkStart w:id="28" w:name="_Toc242992557"/>
       <w:r>
         <w:t>Deleting</w:t>
       </w:r>
@@ -12175,7 +12178,7 @@
         <w:pStyle w:val="Heading3"/>
         <w:keepNext/>
       </w:pPr>
-      <w:bookmarkStart w:id="29" w:name="_Toc242991202"/>
+      <w:bookmarkStart w:id="29" w:name="_Toc242992558"/>
       <w:r>
         <w:t>Outcomes</w:t>
       </w:r>
@@ -12851,7 +12854,7 @@
         <w:pStyle w:val="Heading3"/>
         <w:keepNext/>
       </w:pPr>
-      <w:bookmarkStart w:id="30" w:name="_Toc242991203"/>
+      <w:bookmarkStart w:id="30" w:name="_Toc242992559"/>
       <w:r>
         <w:t>The deletion log</w:t>
       </w:r>
@@ -12953,7 +12956,7 @@
         <w:pStyle w:val="Heading2"/>
         <w:keepNext/>
       </w:pPr>
-      <w:bookmarkStart w:id="31" w:name="_Toc242991204"/>
+      <w:bookmarkStart w:id="31" w:name="_Toc242992560"/>
       <w:r>
         <w:t>Keyboard</w:t>
       </w:r>
@@ -13835,7 +13838,7 @@
         <w:pStyle w:val="Heading1"/>
         <w:keepNext/>
       </w:pPr>
-      <w:bookmarkStart w:id="32" w:name="_Toc242991205"/>
+      <w:bookmarkStart w:id="32" w:name="_Toc242992561"/>
       <w:r>
         <w:t>Environment rules (optional)</w:t>
       </w:r>
@@ -14500,7 +14503,7 @@
         <w:pStyle w:val="Heading1"/>
         <w:keepNext/>
       </w:pPr>
-      <w:bookmarkStart w:id="33" w:name="_Toc242991206"/>
+      <w:bookmarkStart w:id="33" w:name="_Toc242992562"/>
       <w:r>
         <w:lastRenderedPageBreak/>
         <w:t>Safety</w:t>
@@ -15040,7 +15043,7 @@
         <w:pStyle w:val="Heading1"/>
         <w:keepNext/>
       </w:pPr>
-      <w:bookmarkStart w:id="34" w:name="_Toc242991207"/>
+      <w:bookmarkStart w:id="34" w:name="_Toc242992563"/>
       <w:r>
         <w:t>Messages</w:t>
       </w:r>
@@ -15071,7 +15074,7 @@
         <w:pStyle w:val="Heading2"/>
         <w:keepNext/>
       </w:pPr>
-      <w:bookmarkStart w:id="35" w:name="_Toc242991208"/>
+      <w:bookmarkStart w:id="35" w:name="_Toc242992564"/>
       <w:r>
         <w:t>Starting</w:t>
       </w:r>
@@ -15698,7 +15701,7 @@
         <w:pStyle w:val="Heading2"/>
         <w:keepNext/>
       </w:pPr>
-      <w:bookmarkStart w:id="36" w:name="_Toc242991209"/>
+      <w:bookmarkStart w:id="36" w:name="_Toc242992565"/>
       <w:r>
         <w:t>Choosing</w:t>
       </w:r>
@@ -16233,7 +16236,7 @@
         <w:pStyle w:val="Heading2"/>
         <w:keepNext/>
       </w:pPr>
-      <w:bookmarkStart w:id="37" w:name="_Toc242991210"/>
+      <w:bookmarkStart w:id="37" w:name="_Toc242992566"/>
       <w:r>
         <w:t>Scanning and results</w:t>
       </w:r>
@@ -17648,7 +17651,7 @@
         <w:pStyle w:val="Heading2"/>
         <w:keepNext/>
       </w:pPr>
-      <w:bookmarkStart w:id="38" w:name="_Toc242991211"/>
+      <w:bookmarkStart w:id="38" w:name="_Toc242992567"/>
       <w:r>
         <w:t>Details</w:t>
       </w:r>
@@ -18639,7 +18642,7 @@
         <w:pStyle w:val="Heading2"/>
         <w:keepNext/>
       </w:pPr>
-      <w:bookmarkStart w:id="39" w:name="_Toc242991212"/>
+      <w:bookmarkStart w:id="39" w:name="_Toc242992568"/>
       <w:r>
         <w:lastRenderedPageBreak/>
         <w:t>Deleting</w:t>
@@ -19474,7 +19477,7 @@
         <w:pStyle w:val="Heading1"/>
         <w:keepNext/>
       </w:pPr>
-      <w:bookmarkStart w:id="40" w:name="_Toc242991213"/>
+      <w:bookmarkStart w:id="40" w:name="_Toc242992569"/>
       <w:r>
         <w:t>Troubleshooting</w:t>
       </w:r>
@@ -21202,7 +21205,7 @@
         <w:pStyle w:val="Heading1"/>
         <w:keepNext/>
       </w:pPr>
-      <w:bookmarkStart w:id="41" w:name="_Toc242991214"/>
+      <w:bookmarkStart w:id="41" w:name="_Toc242992570"/>
       <w:r>
         <w:t>Limitations</w:t>
       </w:r>
@@ -21669,7 +21672,7 @@
         <w:pStyle w:val="Heading1"/>
         <w:keepNext/>
       </w:pPr>
-      <w:bookmarkStart w:id="42" w:name="_Toc242991215"/>
+      <w:bookmarkStart w:id="42" w:name="_Toc242992571"/>
       <w:r>
         <w:t>How it works</w:t>
       </w:r>
@@ -22781,7 +22784,7 @@
         <w:pStyle w:val="Heading1"/>
         <w:keepNext/>
       </w:pPr>
-      <w:bookmarkStart w:id="43" w:name="_Toc242991216"/>
+      <w:bookmarkStart w:id="43" w:name="_Toc242992572"/>
       <w:r>
         <w:t>Comparison with Solution Layers Explorer</w:t>
       </w:r>
@@ -23740,7 +23743,7 @@
         <w:pStyle w:val="Heading1"/>
         <w:keepNext/>
       </w:pPr>
-      <w:bookmarkStart w:id="44" w:name="_Toc242991217"/>
+      <w:bookmarkStart w:id="44" w:name="_Toc242992573"/>
       <w:r>
         <w:t>Repository layout</w:t>
       </w:r>
@@ -24769,7 +24772,7 @@
         <w:pStyle w:val="Heading1"/>
         <w:keepNext/>
       </w:pPr>
-      <w:bookmarkStart w:id="45" w:name="_Toc242991218"/>
+      <w:bookmarkStart w:id="45" w:name="_Toc242992574"/>
       <w:r>
         <w:t>Build</w:t>
       </w:r>
@@ -25052,7 +25055,7 @@
           <w:szCs w:val="18"/>
           <w:shd w:val="clear" w:color="auto" w:fill="F3F2F1"/>
         </w:rPr>
-        <w:t>bookmarklet 1.0.0: 71483 characters (165.6 KB unpacked)</w:t>
+        <w:t>bookmarklet 1.0.0: 71899 characters (166.6 KB unpacked)</w:t>
       </w:r>
       <w:r>
         <w:t>.</w:t>
@@ -25300,7 +25303,7 @@
         <w:pStyle w:val="Heading1"/>
         <w:keepNext/>
       </w:pPr>
-      <w:bookmarkStart w:id="46" w:name="_Toc242991219"/>
+      <w:bookmarkStart w:id="46" w:name="_Toc242992575"/>
       <w:r>
         <w:t>License</w:t>
       </w:r>
@@ -25522,10 +25525,96 @@
 <file path=word/numbering.xml><?xml version="1.0" encoding="utf-8"?>
 <w:numbering xmlns:wpc="http://schemas.microsoft.com/office/word/2010/wordprocessingCanvas" xmlns:cx="http://schemas.microsoft.com/office/drawing/2014/chartex" xmlns:cx1="http://schemas.microsoft.com/office/drawing/2015/9/8/chartex" xmlns:cx2="http://schemas.microsoft.com/office/drawing/2015/10/21/chartex" xmlns:cx3="http://schemas.microsoft.com/office/drawing/2016/5/9/chartex" xmlns:cx4="http://schemas.microsoft.com/office/drawing/2016/5/10/chartex" xmlns:cx5="http://schemas.microsoft.com/office/drawing/2016/5/11/chartex" xmlns:cx6="http://schemas.microsoft.com/office/drawing/2016/5/12/chartex" xmlns:cx7="http://schemas.microsoft.com/office/drawing/2016/5/13/chartex" xmlns:cx8="http://schemas.microsoft.com/office/drawing/2016/5/14/chartex" xmlns:mc="http://schemas.openxmlformats.org/markup-compatibility/2006" xmlns:aink="http://schemas.microsoft.com/office/drawing/2016/ink" xmlns:am3d="http://schemas.microsoft.com/office/drawing/2017/model3d" xmlns:o="urn:schemas-microsoft-com:office:office" xmlns:oel="http://schemas.microsoft.com/office/2019/extlst" xmlns:r="http://schemas.openxmlformats.org/officeDocument/2006/relationships" xmlns:m="http://schemas.openxmlformats.org/officeDocument/2006/math" xmlns:v="urn:schemas-microsoft-com:vml" xmlns:wp14="http://schemas.microsoft.com/office/word/2010/wordprocessingDrawing" xmlns:wp="http://schemas.openxmlformats.org/drawingml/2006/wordprocessingDrawing" xmlns:w10="urn:schemas-microsoft-com:office:word" xmlns:w="http://schemas.openxmlformats.org/wordprocessingml/2006/main" xmlns:w14="http://schemas.microsoft.com/office/word/2010/wordml" xmlns:w15="http://schemas.microsoft.com/office/word/2012/wordml" xmlns:w16cex="http://schemas.microsoft.com/office/word/2018/wordml/cex" xmlns:w16cid="http://schemas.microsoft.com/office/word/2016/wordml/cid" xmlns:w16="http://schemas.microsoft.com/office/word/2018/wordml" xmlns:w16sdtdh="http://schemas.microsoft.com/office/word/2020/wordml/sdtdatahash" xmlns:w16se="http://schemas.microsoft.com/office/word/2015/wordml/symex" xmlns:wpg="http://schemas.microsoft.com/office/word/2010/wordprocessingGroup" xmlns:wpi="http://schemas.microsoft.com/office/word/2010/wordprocessingInk" xmlns:wne="http://schemas.microsoft.com/office/word/2006/wordml" xmlns:wps="http://schemas.microsoft.com/office/word/2010/wordprocessingShape" mc:Ignorable="w14 w15 w16se w16cid w16 w16cex w16sdtdh wp14">
   <w:abstractNum w:abstractNumId="0" w15:restartNumberingAfterBreak="0">
-    <w:nsid w:val="03AF0193"/>
+    <w:nsid w:val="192D19BD"/>
     <w:multiLevelType w:val="hybridMultilevel"/>
-    <w:tmpl w:val="003C5796"/>
-    <w:lvl w:ilvl="0" w:tplc="ACB2B534">
+    <w:tmpl w:val="5E626744"/>
+    <w:lvl w:ilvl="0" w:tplc="0CD499DA" w:tentative="1">
+      <w:start w:val="1"/>
+      <w:numFmt w:val="bullet"/>
+      <w:lvlText w:val="●"/>
+      <w:lvlJc w:val="left"/>
+      <w:pPr>
+        <w:ind w:left="720" w:hanging="360"/>
+      </w:pPr>
+    </w:lvl>
+    <w:lvl w:ilvl="1" w:tplc="CA105FD6" w:tentative="1">
+      <w:start w:val="1"/>
+      <w:numFmt w:val="bullet"/>
+      <w:lvlText w:val="○"/>
+      <w:lvlJc w:val="left"/>
+      <w:pPr>
+        <w:ind w:left="1440" w:hanging="360"/>
+      </w:pPr>
+    </w:lvl>
+    <w:lvl w:ilvl="2" w:tplc="10E8D6C4" w:tentative="1">
+      <w:start w:val="1"/>
+      <w:numFmt w:val="bullet"/>
+      <w:lvlText w:val="■"/>
+      <w:lvlJc w:val="left"/>
+      <w:pPr>
+        <w:ind w:left="2160" w:hanging="360"/>
+      </w:pPr>
+    </w:lvl>
+    <w:lvl w:ilvl="3" w:tplc="9EBCFF20" w:tentative="1">
+      <w:start w:val="1"/>
+      <w:numFmt w:val="bullet"/>
+      <w:lvlText w:val="●"/>
+      <w:lvlJc w:val="left"/>
+      <w:pPr>
+        <w:ind w:left="2880" w:hanging="360"/>
+      </w:pPr>
+    </w:lvl>
+    <w:lvl w:ilvl="4" w:tplc="F32A2856" w:tentative="1">
+      <w:start w:val="1"/>
+      <w:numFmt w:val="bullet"/>
+      <w:lvlText w:val="○"/>
+      <w:lvlJc w:val="left"/>
+      <w:pPr>
+        <w:ind w:left="3600" w:hanging="360"/>
+      </w:pPr>
+    </w:lvl>
+    <w:lvl w:ilvl="5" w:tplc="F4AE57A2" w:tentative="1">
+      <w:start w:val="1"/>
+      <w:numFmt w:val="bullet"/>
+      <w:lvlText w:val="■"/>
+      <w:lvlJc w:val="left"/>
+      <w:pPr>
+        <w:ind w:left="4320" w:hanging="360"/>
+      </w:pPr>
+    </w:lvl>
+    <w:lvl w:ilvl="6" w:tplc="66E4D9BE" w:tentative="1">
+      <w:start w:val="1"/>
+      <w:numFmt w:val="bullet"/>
+      <w:lvlText w:val="●"/>
+      <w:lvlJc w:val="left"/>
+      <w:pPr>
+        <w:ind w:left="5040" w:hanging="360"/>
+      </w:pPr>
+    </w:lvl>
+    <w:lvl w:ilvl="7" w:tplc="E444C25C" w:tentative="1">
+      <w:start w:val="1"/>
+      <w:numFmt w:val="bullet"/>
+      <w:lvlText w:val="●"/>
+      <w:lvlJc w:val="left"/>
+      <w:pPr>
+        <w:ind w:left="5760" w:hanging="360"/>
+      </w:pPr>
+    </w:lvl>
+    <w:lvl w:ilvl="8" w:tplc="FD1CD07C" w:tentative="1">
+      <w:start w:val="1"/>
+      <w:numFmt w:val="bullet"/>
+      <w:lvlText w:val="●"/>
+      <w:lvlJc w:val="left"/>
+      <w:pPr>
+        <w:ind w:left="6480" w:hanging="360"/>
+      </w:pPr>
+    </w:lvl>
+  </w:abstractNum>
+  <w:abstractNum w:abstractNumId="1" w15:restartNumberingAfterBreak="0">
+    <w:nsid w:val="5E8140F4"/>
+    <w:multiLevelType w:val="hybridMultilevel"/>
+    <w:tmpl w:val="1EE8FC30"/>
+    <w:lvl w:ilvl="0" w:tplc="40440270">
       <w:start w:val="1"/>
       <w:numFmt w:val="bullet"/>
       <w:lvlText w:val="•"/>
@@ -25534,7 +25623,7 @@
         <w:ind w:left="360" w:hanging="260"/>
       </w:pPr>
     </w:lvl>
-    <w:lvl w:ilvl="1" w:tplc="18CC89A4" w:tentative="1">
+    <w:lvl w:ilvl="1" w:tplc="F64A338E" w:tentative="1">
       <w:start w:val="1"/>
       <w:numFmt w:val="bullet"/>
       <w:lvlText w:val="–"/>
@@ -25543,7 +25632,7 @@
         <w:ind w:left="720" w:hanging="260"/>
       </w:pPr>
     </w:lvl>
-    <w:lvl w:ilvl="2" w:tplc="D12ADECE" w:tentative="1">
+    <w:lvl w:ilvl="2" w:tplc="483C8360" w:tentative="1">
       <w:start w:val="1"/>
       <w:numFmt w:val="bullet"/>
       <w:lvlText w:val="◦"/>
@@ -25552,7 +25641,7 @@
         <w:ind w:left="1080" w:hanging="260"/>
       </w:pPr>
     </w:lvl>
-    <w:lvl w:ilvl="3" w:tplc="36B07D2E" w:tentative="1">
+    <w:lvl w:ilvl="3" w:tplc="57D02D8E" w:tentative="1">
       <w:start w:val="1"/>
       <w:numFmt w:val="bullet"/>
       <w:lvlText w:val="•"/>
@@ -25561,258 +25650,172 @@
         <w:ind w:left="1440" w:hanging="260"/>
       </w:pPr>
     </w:lvl>
-    <w:lvl w:ilvl="4" w:tplc="B9A81570">
+    <w:lvl w:ilvl="4" w:tplc="2FE6E35A">
       <w:numFmt w:val="decimal"/>
       <w:lvlText w:val=""/>
       <w:lvlJc w:val="left"/>
     </w:lvl>
-    <w:lvl w:ilvl="5" w:tplc="E1B46A64">
+    <w:lvl w:ilvl="5" w:tplc="720CA37C">
       <w:numFmt w:val="decimal"/>
       <w:lvlText w:val=""/>
       <w:lvlJc w:val="left"/>
     </w:lvl>
-    <w:lvl w:ilvl="6" w:tplc="FC04AF08">
+    <w:lvl w:ilvl="6" w:tplc="6B4CA3DA">
       <w:numFmt w:val="decimal"/>
       <w:lvlText w:val=""/>
       <w:lvlJc w:val="left"/>
     </w:lvl>
-    <w:lvl w:ilvl="7" w:tplc="6A78D98E">
+    <w:lvl w:ilvl="7" w:tplc="92C2ABB4">
       <w:numFmt w:val="decimal"/>
       <w:lvlText w:val=""/>
       <w:lvlJc w:val="left"/>
     </w:lvl>
-    <w:lvl w:ilvl="8" w:tplc="BF1C219E">
-      <w:numFmt w:val="decimal"/>
-      <w:lvlText w:val=""/>
-      <w:lvlJc w:val="left"/>
-    </w:lvl>
-  </w:abstractNum>
-  <w:abstractNum w:abstractNumId="1" w15:restartNumberingAfterBreak="0">
-    <w:nsid w:val="4CD418EC"/>
-    <w:multiLevelType w:val="hybridMultilevel"/>
-    <w:tmpl w:val="A25E979C"/>
-    <w:lvl w:ilvl="0" w:tplc="E7568C98">
-      <w:start w:val="1"/>
-      <w:numFmt w:val="decimal"/>
-      <w:lvlText w:val="%1."/>
-      <w:lvlJc w:val="left"/>
-      <w:pPr>
-        <w:ind w:left="360" w:hanging="300"/>
-      </w:pPr>
-    </w:lvl>
-    <w:lvl w:ilvl="1" w:tplc="445CE150" w:tentative="1">
-      <w:start w:val="1"/>
-      <w:numFmt w:val="lowerLetter"/>
-      <w:lvlText w:val="%2."/>
-      <w:lvlJc w:val="left"/>
-      <w:pPr>
-        <w:ind w:left="720" w:hanging="300"/>
-      </w:pPr>
-    </w:lvl>
-    <w:lvl w:ilvl="2" w:tplc="3AA6623A" w:tentative="1">
-      <w:start w:val="1"/>
-      <w:numFmt w:val="lowerRoman"/>
-      <w:lvlText w:val="%3."/>
-      <w:lvlJc w:val="left"/>
-      <w:pPr>
-        <w:ind w:left="1080" w:hanging="300"/>
-      </w:pPr>
-    </w:lvl>
-    <w:lvl w:ilvl="3" w:tplc="B4CEBAE8" w:tentative="1">
-      <w:start w:val="1"/>
-      <w:numFmt w:val="decimal"/>
-      <w:lvlText w:val="%4."/>
-      <w:lvlJc w:val="left"/>
-      <w:pPr>
-        <w:ind w:left="1440" w:hanging="300"/>
-      </w:pPr>
-    </w:lvl>
-    <w:lvl w:ilvl="4" w:tplc="E4A8AFC6">
-      <w:numFmt w:val="decimal"/>
-      <w:lvlText w:val=""/>
-      <w:lvlJc w:val="left"/>
-    </w:lvl>
-    <w:lvl w:ilvl="5" w:tplc="AEC8D764">
-      <w:numFmt w:val="decimal"/>
-      <w:lvlText w:val=""/>
-      <w:lvlJc w:val="left"/>
-    </w:lvl>
-    <w:lvl w:ilvl="6" w:tplc="985A5FA4">
-      <w:numFmt w:val="decimal"/>
-      <w:lvlText w:val=""/>
-      <w:lvlJc w:val="left"/>
-    </w:lvl>
-    <w:lvl w:ilvl="7" w:tplc="94C24688">
-      <w:numFmt w:val="decimal"/>
-      <w:lvlText w:val=""/>
-      <w:lvlJc w:val="left"/>
-    </w:lvl>
-    <w:lvl w:ilvl="8" w:tplc="377AA408">
+    <w:lvl w:ilvl="8" w:tplc="C20CBE56">
       <w:numFmt w:val="decimal"/>
       <w:lvlText w:val=""/>
       <w:lvlJc w:val="left"/>
     </w:lvl>
   </w:abstractNum>
   <w:abstractNum w:abstractNumId="2" w15:restartNumberingAfterBreak="0">
-    <w:nsid w:val="60805810"/>
+    <w:nsid w:val="7E4B663C"/>
     <w:multiLevelType w:val="hybridMultilevel"/>
-    <w:tmpl w:val="5A88A5DE"/>
-    <w:lvl w:ilvl="0" w:tplc="A9BAF77A" w:tentative="1">
+    <w:tmpl w:val="8E8E84CA"/>
+    <w:lvl w:ilvl="0" w:tplc="9DEE1FF0">
       <w:start w:val="1"/>
-      <w:numFmt w:val="bullet"/>
-      <w:lvlText w:val="●"/>
+      <w:numFmt w:val="decimal"/>
+      <w:lvlText w:val="%1."/>
       <w:lvlJc w:val="left"/>
       <w:pPr>
-        <w:ind w:left="720" w:hanging="360"/>
+        <w:ind w:left="360" w:hanging="300"/>
       </w:pPr>
     </w:lvl>
-    <w:lvl w:ilvl="1" w:tplc="BE78BB9E" w:tentative="1">
+    <w:lvl w:ilvl="1" w:tplc="B14C4E20" w:tentative="1">
       <w:start w:val="1"/>
-      <w:numFmt w:val="bullet"/>
-      <w:lvlText w:val="○"/>
+      <w:numFmt w:val="lowerLetter"/>
+      <w:lvlText w:val="%2."/>
       <w:lvlJc w:val="left"/>
       <w:pPr>
-        <w:ind w:left="1440" w:hanging="360"/>
+        <w:ind w:left="720" w:hanging="300"/>
       </w:pPr>
     </w:lvl>
-    <w:lvl w:ilvl="2" w:tplc="1B04B774" w:tentative="1">
+    <w:lvl w:ilvl="2" w:tplc="8058121E" w:tentative="1">
       <w:start w:val="1"/>
-      <w:numFmt w:val="bullet"/>
-      <w:lvlText w:val="■"/>
+      <w:numFmt w:val="lowerRoman"/>
+      <w:lvlText w:val="%3."/>
       <w:lvlJc w:val="left"/>
       <w:pPr>
-        <w:ind w:left="2160" w:hanging="360"/>
+        <w:ind w:left="1080" w:hanging="300"/>
       </w:pPr>
     </w:lvl>
-    <w:lvl w:ilvl="3" w:tplc="857C4606" w:tentative="1">
+    <w:lvl w:ilvl="3" w:tplc="4C387232" w:tentative="1">
       <w:start w:val="1"/>
-      <w:numFmt w:val="bullet"/>
-      <w:lvlText w:val="●"/>
+      <w:numFmt w:val="decimal"/>
+      <w:lvlText w:val="%4."/>
       <w:lvlJc w:val="left"/>
       <w:pPr>
-        <w:ind w:left="2880" w:hanging="360"/>
+        <w:ind w:left="1440" w:hanging="300"/>
       </w:pPr>
     </w:lvl>
-    <w:lvl w:ilvl="4" w:tplc="A28C431E" w:tentative="1">
-      <w:start w:val="1"/>
-      <w:numFmt w:val="bullet"/>
-      <w:lvlText w:val="○"/>
+    <w:lvl w:ilvl="4" w:tplc="4EF44198">
+      <w:numFmt w:val="decimal"/>
+      <w:lvlText w:val=""/>
       <w:lvlJc w:val="left"/>
-      <w:pPr>
-        <w:ind w:left="3600" w:hanging="360"/>
-      </w:pPr>
     </w:lvl>
-    <w:lvl w:ilvl="5" w:tplc="5B4032B6" w:tentative="1">
-      <w:start w:val="1"/>
-      <w:numFmt w:val="bullet"/>
-      <w:lvlText w:val="■"/>
+    <w:lvl w:ilvl="5" w:tplc="DDE678E4">
+      <w:numFmt w:val="decimal"/>
+      <w:lvlText w:val=""/>
       <w:lvlJc w:val="left"/>
-      <w:pPr>
-        <w:ind w:left="4320" w:hanging="360"/>
-      </w:pPr>
     </w:lvl>
-    <w:lvl w:ilvl="6" w:tplc="D04EC436" w:tentative="1">
-      <w:start w:val="1"/>
-      <w:numFmt w:val="bullet"/>
-      <w:lvlText w:val="●"/>
+    <w:lvl w:ilvl="6" w:tplc="4B4AEF30">
+      <w:numFmt w:val="decimal"/>
+      <w:lvlText w:val=""/>
       <w:lvlJc w:val="left"/>
-      <w:pPr>
-        <w:ind w:left="5040" w:hanging="360"/>
-      </w:pPr>
     </w:lvl>
-    <w:lvl w:ilvl="7" w:tplc="D2606A60" w:tentative="1">
-      <w:start w:val="1"/>
-      <w:numFmt w:val="bullet"/>
-      <w:lvlText w:val="●"/>
+    <w:lvl w:ilvl="7" w:tplc="828A658C">
+      <w:numFmt w:val="decimal"/>
+      <w:lvlText w:val=""/>
       <w:lvlJc w:val="left"/>
-      <w:pPr>
-        <w:ind w:left="5760" w:hanging="360"/>
-      </w:pPr>
     </w:lvl>
-    <w:lvl w:ilvl="8" w:tplc="7C1E1D46" w:tentative="1">
-      <w:start w:val="1"/>
-      <w:numFmt w:val="bullet"/>
-      <w:lvlText w:val="●"/>
+    <w:lvl w:ilvl="8" w:tplc="2D9C04F0">
+      <w:numFmt w:val="decimal"/>
+      <w:lvlText w:val=""/>
       <w:lvlJc w:val="left"/>
-      <w:pPr>
-        <w:ind w:left="6480" w:hanging="360"/>
-      </w:pPr>
     </w:lvl>
   </w:abstractNum>
-  <w:num w:numId="1" w16cid:durableId="1636521418">
+  <w:num w:numId="1" w16cid:durableId="889536310">
+    <w:abstractNumId w:val="0"/>
+    <w:lvlOverride w:ilvl="0">
+      <w:startOverride w:val="1"/>
+    </w:lvlOverride>
+  </w:num>
+  <w:num w:numId="2" w16cid:durableId="110631906">
+    <w:abstractNumId w:val="1"/>
+    <w:lvlOverride w:ilvl="0">
+      <w:startOverride w:val="1"/>
+    </w:lvlOverride>
+  </w:num>
+  <w:num w:numId="3" w16cid:durableId="12391232">
     <w:abstractNumId w:val="2"/>
     <w:lvlOverride w:ilvl="0">
       <w:startOverride w:val="1"/>
     </w:lvlOverride>
   </w:num>
-  <w:num w:numId="2" w16cid:durableId="1568683184">
-    <w:abstractNumId w:val="0"/>
+  <w:num w:numId="4" w16cid:durableId="1476993391">
+    <w:abstractNumId w:val="2"/>
     <w:lvlOverride w:ilvl="0">
       <w:startOverride w:val="1"/>
     </w:lvlOverride>
   </w:num>
-  <w:num w:numId="3" w16cid:durableId="191311893">
-    <w:abstractNumId w:val="1"/>
+  <w:num w:numId="5" w16cid:durableId="67534554">
+    <w:abstractNumId w:val="2"/>
     <w:lvlOverride w:ilvl="0">
       <w:startOverride w:val="1"/>
     </w:lvlOverride>
   </w:num>
-  <w:num w:numId="4" w16cid:durableId="2129886063">
-    <w:abstractNumId w:val="1"/>
+  <w:num w:numId="6" w16cid:durableId="861087298">
+    <w:abstractNumId w:val="2"/>
     <w:lvlOverride w:ilvl="0">
       <w:startOverride w:val="1"/>
     </w:lvlOverride>
   </w:num>
-  <w:num w:numId="5" w16cid:durableId="106580465">
-    <w:abstractNumId w:val="1"/>
+  <w:num w:numId="7" w16cid:durableId="1235124211">
+    <w:abstractNumId w:val="2"/>
     <w:lvlOverride w:ilvl="0">
       <w:startOverride w:val="1"/>
     </w:lvlOverride>
   </w:num>
-  <w:num w:numId="6" w16cid:durableId="1827355388">
-    <w:abstractNumId w:val="1"/>
+  <w:num w:numId="8" w16cid:durableId="197933722">
+    <w:abstractNumId w:val="2"/>
     <w:lvlOverride w:ilvl="0">
       <w:startOverride w:val="1"/>
     </w:lvlOverride>
   </w:num>
-  <w:num w:numId="7" w16cid:durableId="1955017924">
-    <w:abstractNumId w:val="1"/>
+  <w:num w:numId="9" w16cid:durableId="1054081139">
+    <w:abstractNumId w:val="2"/>
     <w:lvlOverride w:ilvl="0">
       <w:startOverride w:val="1"/>
     </w:lvlOverride>
   </w:num>
-  <w:num w:numId="8" w16cid:durableId="855537982">
-    <w:abstractNumId w:val="1"/>
+  <w:num w:numId="10" w16cid:durableId="13578769">
+    <w:abstractNumId w:val="2"/>
     <w:lvlOverride w:ilvl="0">
       <w:startOverride w:val="1"/>
     </w:lvlOverride>
   </w:num>
-  <w:num w:numId="9" w16cid:durableId="720859190">
-    <w:abstractNumId w:val="1"/>
+  <w:num w:numId="11" w16cid:durableId="14112908">
+    <w:abstractNumId w:val="2"/>
     <w:lvlOverride w:ilvl="0">
       <w:startOverride w:val="1"/>
     </w:lvlOverride>
   </w:num>
-  <w:num w:numId="10" w16cid:durableId="535241582">
-    <w:abstractNumId w:val="1"/>
+  <w:num w:numId="12" w16cid:durableId="620112174">
+    <w:abstractNumId w:val="2"/>
     <w:lvlOverride w:ilvl="0">
       <w:startOverride w:val="1"/>
     </w:lvlOverride>
   </w:num>
-  <w:num w:numId="11" w16cid:durableId="1655640435">
-    <w:abstractNumId w:val="1"/>
-    <w:lvlOverride w:ilvl="0">
-      <w:startOverride w:val="1"/>
-    </w:lvlOverride>
-  </w:num>
-  <w:num w:numId="12" w16cid:durableId="1045180498">
-    <w:abstractNumId w:val="1"/>
-    <w:lvlOverride w:ilvl="0">
-      <w:startOverride w:val="1"/>
-    </w:lvlOverride>
-  </w:num>
-  <w:num w:numId="13" w16cid:durableId="789054922">
-    <w:abstractNumId w:val="1"/>
+  <w:num w:numId="13" w16cid:durableId="1730152811">
+    <w:abstractNumId w:val="2"/>
     <w:lvlOverride w:ilvl="0">
       <w:startOverride w:val="1"/>
     </w:lvlOverride>
@@ -26457,7 +26460,7 @@
     <w:autoRedefine/>
     <w:uiPriority w:val="39"/>
     <w:unhideWhenUsed/>
-    <w:rsid w:val="00706994"/>
+    <w:rsid w:val="00AF376D"/>
     <w:pPr>
       <w:spacing w:after="100"/>
     </w:pPr>
@@ -26469,7 +26472,7 @@
     <w:autoRedefine/>
     <w:uiPriority w:val="39"/>
     <w:unhideWhenUsed/>
-    <w:rsid w:val="00706994"/>
+    <w:rsid w:val="00AF376D"/>
     <w:pPr>
       <w:spacing w:after="100"/>
       <w:ind w:left="200"/>
@@ -26482,7 +26485,7 @@
     <w:autoRedefine/>
     <w:uiPriority w:val="39"/>
     <w:unhideWhenUsed/>
-    <w:rsid w:val="00706994"/>
+    <w:rsid w:val="00AF376D"/>
     <w:pPr>
       <w:spacing w:after="100"/>
       <w:ind w:left="400"/>

</xml_diff>